<commit_message>
Correct manuscript results and evidence-status caveats
</commit_message>
<xml_diff>
--- a/basket_aware_inventory_full_manuscript_sections_1_to_10.docx
+++ b/basket_aware_inventory_full_manuscript_sections_1_to_10.docx
@@ -71,7 +71,7 @@
     </w:p>
     <w:p>
       <w:r>
-        <w:t>In S05, PA1 versus the matched independent control increased item fill by 0.0270 (95% replication interval 0.0263–0.0276) and complete-basket fill by 0.0944 (0.0803–0.1119), at an average inventory difference of 10,343 units and a cost increase of 231,712. Against popularity-only C4, PA1 was worse: item fill −0.0262 and basket fill −0.0667, with cost +168,736; the 1,000-resample intervals excluded zero for all three contrasts. Placebo contrasts were mixed. These results support a conditional service trade-off, not a graph-specific advantage. Inventory, supplier, stockout, and historical cost fields are absent, so policy outcomes remain simulated.</w:t>
+        <w:t>In S05, PA1 versus the matched independent control increased item fill by 0.0270 (95% replication interval 0.0263–0.0276) and complete-basket fill by 0.0944 (0.0803–0.1119), at an average inventory difference of 10,343 units and a cost increase of 231,712. Against popularity-only C4, PA1 was worse: item fill −0.0261 and basket fill −0.0667, with cost +168,736; the 1,000-resample intervals excluded zero for all three contrasts. PA1 also exceeded C2, C3, and C5 on both service measures, but those placebo comparisons do not establish that the original edge topology caused the difference. These results support a conditional service trade-off, not a graph-specific advantage. Inventory, supplier, stockout, and historical cost fields are absent, so policy outcomes remain simulated.</w:t>
       </w:r>
     </w:p>
     <w:p>
@@ -581,35 +581,7 @@
     </w:p>
     <w:p>
       <w:r>
-        <w:t>The retained transaction-line rule is:</w:t>
-      </w:r>
-    </w:p>
-    <w:p>
-      <w:pPr>
-        <w:spacing w:before="80" w:after="160"/>
-        <w:jc w:val="center"/>
-      </w:pPr>
-      <w:r>
-        <w:rPr>
-          <w:rFonts w:ascii="Cambria" w:hAnsi="Cambria"/>
-          <w:i/>
-          <w:sz w:val="20"/>
-        </w:rPr>
-        <w:t>Retain line = 1 if:</w:t>
-      </w:r>
-    </w:p>
-    <w:p>
-      <w:pPr>
-        <w:spacing w:before="80" w:after="160"/>
-        <w:jc w:val="center"/>
-      </w:pPr>
-      <w:r>
-        <w:rPr>
-          <w:rFonts w:ascii="Cambria" w:hAnsi="Cambria"/>
-          <w:i/>
-          <w:sz w:val="20"/>
-        </w:rPr>
-        <w:t>invoice, stock code, description, and timestamp are present; invoice does not begin with C; quantity is greater than 0; unit price is greater than 0; and stock code begins with a numeric character.</w:t>
+        <w:t>The retained transaction-line rule keeps a line only when invoice, stock code, description, and timestamp are present; the invoice does not begin with “C”; quantity and unit price are both positive; and the stock code begins with a numeric character.</w:t>
       </w:r>
     </w:p>
     <w:p>
@@ -703,7 +675,7 @@
     </w:p>
     <w:p>
       <w:r>
-        <w:t>All policies use weekly periodic review. At review time t, inventory position is IP_{i,t}=OH_{i,t}+OO_{i,t}-BO_{i,t}, where OH is on hand, OO is on order, and BO is backorder quantity. The order quantity is q_{i,t}=max(0, ceil(S_{i,t}-IP_{i,t})). The independent base target is S^{ind}_{i,t}=2 d-hat_{i,t}+1.645 sigma_i sqrt(2), with two weeks of coverage and residual scale sigma_i. The primary Phase 3 estimand is service at matched average inventory.</w:t>
+        <w:t>All policies use weekly periodic review. At review week t, inventory position is on-hand stock plus on-order stock minus backorders. The order quantity is the nonnegative ceiling of target stock minus inventory position. The independent base target is two weeks of forecast demand plus z times the calibrated residual scale times the square root of two, where z is the standard-normal quantile for the scenario critical-fractile target. The executed Phase 3 replay used the frozen six-fold safety calibration of the residual scale; this is why its absolute inventory levels are larger than those in the earlier four-policy pilot, which used the unmultiplied residual scale. The primary Phase 3 estimand is service at matched average inventory.</w:t>
       </w:r>
     </w:p>
     <w:p>
@@ -726,9 +698,7 @@
     </w:p>
     <w:p>
       <w:r>
-        <w:t>PA3 raises targets only for products whose PA1 score exceeds the validation-selected threshold (</w:t>
-        <w:tab/>
-        <w:t>au=0.50), then rescales the resulting buffer to the same total mass. It is a joint-service screening rule, not an unrestricted graph multiplier.</w:t>
+        <w:t>PA3 raises targets only for products whose PA1 score exceeds the validation-selected threshold (tau = 0.50), then rescales the resulting buffer to the same total mass. It is a joint-service screening rule, not an unrestricted graph multiplier.</w:t>
       </w:r>
     </w:p>
     <w:p>
@@ -1525,21 +1495,7 @@
     </w:p>
     <w:p>
       <w:r>
-        <w:t>The primary simulated total cost is:</w:t>
-      </w:r>
-    </w:p>
-    <w:p>
-      <w:pPr>
-        <w:spacing w:before="80" w:after="160"/>
-        <w:jc w:val="center"/>
-      </w:pPr>
-      <w:r>
-        <w:rPr>
-          <w:rFonts w:ascii="Cambria" w:hAnsi="Cambria"/>
-          <w:i/>
-          <w:sz w:val="20"/>
-        </w:rPr>
-        <w:t>C=sum_tleft[hsum_i OH_{i,t^{end+psum_i U_{i,t+K1(Q_t&gt;0)+csum_i q_{i,tright].</w:t>
+        <w:t>The primary simulated total cost is the sum over review weeks of holding cost, shortage penalty, fixed ordering cost, and unit purchase cost: C = sum over t of [h times ending on-hand units + p times unmet units + K times the indicator that a positive order is placed + c times ordered units].</w:t>
       </w:r>
     </w:p>
     <w:p>
@@ -1595,21 +1551,7 @@
     </w:p>
     <w:p>
       <w:r>
-        <w:t>The item-level unit fill rate is:</w:t>
-      </w:r>
-    </w:p>
-    <w:p>
-      <w:pPr>
-        <w:spacing w:before="80" w:after="160"/>
-        <w:jc w:val="center"/>
-      </w:pPr>
-      <w:r>
-        <w:rPr>
-          <w:rFonts w:ascii="Cambria" w:hAnsi="Cambria"/>
-          <w:i/>
-          <w:sz w:val="20"/>
-        </w:rPr>
-        <w:t>FR_{item=ratio{sum_{i,tF_{i,t{sum_{i,tD_{i,t=1-ratio{sum_{i,tU_{i,t{sum_{i,tD_{i,t.</w:t>
+        <w:t>The item-level unit fill rate is fulfilled units divided by demanded units, equivalently one minus unmet units divided by demanded units: FR_item = sum(F_i,t) / sum(D_i,t) = 1 − sum(U_i,t) / sum(D_i,t).</w:t>
       </w:r>
     </w:p>
     <w:p>
@@ -1619,7 +1561,7 @@
     </w:p>
     <w:p>
       <w:r>
-        <w:t>Effects are paired within scenario and seed. P4 minus P2 is primary and P3 minus P1 secondary; means and empirical 95% replication intervals are reported, with deterministic scenarios shown as degenerate intervals. Cost and service effect sizes are interpreted together.</w:t>
+        <w:t>Effects are paired within scenario and seed. PA1 minus C4 is the primary like-for-like graph-on-top-of-popularity contrast; PA1 minus C1 is the secondary inventory-matched independent-control contrast. PA1 minus C2, C3, and C5 are common-target placebo comparisons. Means and empirical 95% replication intervals are reported, with deterministic scenarios shown as degenerate intervals. Cost and service effect sizes are interpreted together.</w:t>
       </w:r>
     </w:p>
     <w:p>
@@ -5021,7 +4963,7 @@
     </w:p>
     <w:p>
       <w:r>
-        <w:t>The primary replay is S05: low-variance stochastic lead time, h = 0.15, p = 5.0, and a 120-replication paired design. The level table below reports absolute outcomes; intervals are empirical 2.5th–97.5th replication percentiles. C1 is the independent control matched separately to PA1. C2, C3, C4, and C5 are evaluated at the common primary target and are therefore placebo/control contrasts rather than additional inventory-matched independent baselines.</w:t>
+        <w:t>The primary replay is S05: low-variance stochastic lead time, h = 0.15, p = 5.0, and a 120-replication paired design. S05 is one of the twelve synthetic scenarios; it is the only scenario used for the final PA1-versus-C4 Phase 3 estimand. The level table below reports absolute outcomes; intervals are empirical 2.5th–97.5th replication percentiles. C1 is the independent control matched separately to PA1. C2, C3, C4, and C5 are evaluated at the common primary target and are therefore placebo/control contrasts rather than additional inventory-matched independent baselines.</w:t>
       </w:r>
     </w:p>
     <w:tbl>
@@ -5737,7 +5679,7 @@
                 <w:rFonts w:ascii="Arial" w:hAnsi="Arial"/>
                 <w:sz w:val="16"/>
               </w:rPr>
-              <w:t>212,050 [209,285, 215,129]</w:t>
+              <w:t>252,166 [249,695, 254,951]</w:t>
             </w:r>
           </w:p>
         </w:tc>
@@ -5771,7 +5713,7 @@
                 <w:rFonts w:ascii="Arial" w:hAnsi="Arial"/>
                 <w:sz w:val="16"/>
               </w:rPr>
-              <w:t>0.0551 [0.0543, 0.0559]</w:t>
+              <w:t>0.0925 [0.0916, 0.0934]</w:t>
             </w:r>
           </w:p>
         </w:tc>
@@ -7817,7 +7759,7 @@
     </w:p>
     <w:p>
       <w:r>
-        <w:t>The PA1−C4 bootstrap intervals were cost +110,800 to +228,187, item fill −0.0324 to −0.0189, and basket fill −0.0845 to −0.0509. Thus the primary evidence rejects “graph on top of popularity” in this replay. The graph placebos show that PA1 can beat some shuffled or stale buffers, but that result does not establish that the original edge topology is the cause of the advantage.</w:t>
+        <w:t>The PA1−C4 bootstrap intervals were cost +110,800 to +228,187, item fill −0.0324 to −0.0189, and basket fill −0.0845 to −0.0509. Thus the primary evidence rejects “graph on top of popularity” in this replay. PA1 beat C2, C3, and C5 on both service measures, but those common-target placebo results do not establish that the original edge topology is the cause of the advantage; they show only that the frozen PA1 allocation outperformed those alternative allocations under the same replay.</w:t>
       </w:r>
     </w:p>
     <w:p>
@@ -7934,7 +7876,1966 @@
     </w:p>
     <w:p>
       <w:r>
-        <w:t>The three rolling windows give mixed robustness evidence. In W1, PA1 item fill was 0.9709 versus C4 0.9712; in W2 it was 0.9563 versus 0.9595; and in the primary W3 it was 0.9401 versus 0.9434. PA1 basket fill was 0.9608, 0.9002, and 0.9191 versus C4 values 0.9571, 0.9078, and 0.9184. The direction is therefore window-dependent and does not support a universal graph benefit. The external dunnhumby top-300 replay produced full item and basket fill for both graph and popularity buffers, so it is a data-pipeline and transportability check rather than a discriminating policy result.</w:t>
+        <w:t>The three rolling windows give mixed robustness evidence. The compact outcome table reports all primary outcome classes, not only service:</w:t>
+      </w:r>
+    </w:p>
+    <w:tbl>
+      <w:tblPr>
+        <w:tblStyle w:val="TableGrid"/>
+        <w:tblW w:type="auto" w:w="0"/>
+        <w:jc w:val="center"/>
+        <w:tblLook w:firstColumn="1" w:firstRow="1" w:lastColumn="0" w:lastRow="0" w:noHBand="0" w:noVBand="1" w:val="04A0"/>
+      </w:tblPr>
+      <w:tblGrid>
+        <w:gridCol w:w="1249"/>
+        <w:gridCol w:w="1249"/>
+        <w:gridCol w:w="1249"/>
+        <w:gridCol w:w="1249"/>
+        <w:gridCol w:w="1249"/>
+        <w:gridCol w:w="1249"/>
+        <w:gridCol w:w="1249"/>
+        <w:gridCol w:w="1249"/>
+      </w:tblGrid>
+      <w:tr>
+        <w:trPr>
+          <w:tblHeader w:val="true"/>
+        </w:trPr>
+        <w:tc>
+          <w:tcPr>
+            <w:tcW w:type="dxa" w:w="1249"/>
+            <w:vAlign w:val="center"/>
+            <w:shd w:fill="1F4E79"/>
+            <w:tcBorders>
+              <w:top w:val="single" w:sz="6" w:space="0" w:color="D9D9D9"/>
+              <w:left w:val="single" w:sz="6" w:space="0" w:color="D9D9D9"/>
+              <w:bottom w:val="single" w:sz="6" w:space="0" w:color="D9D9D9"/>
+              <w:right w:val="single" w:sz="6" w:space="0" w:color="D9D9D9"/>
+              <w:insideH w:val="single" w:sz="6" w:space="0" w:color="D9D9D9"/>
+              <w:insideV w:val="single" w:sz="6" w:space="0" w:color="D9D9D9"/>
+            </w:tcBorders>
+            <w:tcMar>
+              <w:top w:w="90" w:type="dxa"/>
+              <w:start w:w="100" w:type="dxa"/>
+              <w:bottom w:w="90" w:type="dxa"/>
+              <w:end w:w="100" w:type="dxa"/>
+            </w:tcMar>
+          </w:tcPr>
+          <w:p>
+            <w:pPr>
+              <w:spacing w:after="0"/>
+              <w:jc w:val="center"/>
+            </w:pPr>
+            <w:r>
+              <w:rPr>
+                <w:rFonts w:ascii="Arial" w:hAnsi="Arial"/>
+                <w:b/>
+                <w:color w:val="FFFFFF"/>
+                <w:sz w:val="17"/>
+              </w:rPr>
+              <w:t>Window</w:t>
+            </w:r>
+          </w:p>
+        </w:tc>
+        <w:tc>
+          <w:tcPr>
+            <w:tcW w:type="dxa" w:w="1249"/>
+            <w:vAlign w:val="center"/>
+            <w:shd w:fill="1F4E79"/>
+            <w:tcBorders>
+              <w:top w:val="single" w:sz="6" w:space="0" w:color="D9D9D9"/>
+              <w:left w:val="single" w:sz="6" w:space="0" w:color="D9D9D9"/>
+              <w:bottom w:val="single" w:sz="6" w:space="0" w:color="D9D9D9"/>
+              <w:right w:val="single" w:sz="6" w:space="0" w:color="D9D9D9"/>
+              <w:insideH w:val="single" w:sz="6" w:space="0" w:color="D9D9D9"/>
+              <w:insideV w:val="single" w:sz="6" w:space="0" w:color="D9D9D9"/>
+            </w:tcBorders>
+            <w:tcMar>
+              <w:top w:w="90" w:type="dxa"/>
+              <w:start w:w="100" w:type="dxa"/>
+              <w:bottom w:w="90" w:type="dxa"/>
+              <w:end w:w="100" w:type="dxa"/>
+            </w:tcMar>
+          </w:tcPr>
+          <w:p>
+            <w:pPr>
+              <w:spacing w:after="0"/>
+              <w:jc w:val="center"/>
+            </w:pPr>
+            <w:r>
+              <w:rPr>
+                <w:rFonts w:ascii="Arial" w:hAnsi="Arial"/>
+                <w:b/>
+                <w:color w:val="FFFFFF"/>
+                <w:sz w:val="17"/>
+              </w:rPr>
+              <w:t>Policy</w:t>
+            </w:r>
+          </w:p>
+        </w:tc>
+        <w:tc>
+          <w:tcPr>
+            <w:tcW w:type="dxa" w:w="1249"/>
+            <w:vAlign w:val="center"/>
+            <w:shd w:fill="1F4E79"/>
+            <w:tcBorders>
+              <w:top w:val="single" w:sz="6" w:space="0" w:color="D9D9D9"/>
+              <w:left w:val="single" w:sz="6" w:space="0" w:color="D9D9D9"/>
+              <w:bottom w:val="single" w:sz="6" w:space="0" w:color="D9D9D9"/>
+              <w:right w:val="single" w:sz="6" w:space="0" w:color="D9D9D9"/>
+              <w:insideH w:val="single" w:sz="6" w:space="0" w:color="D9D9D9"/>
+              <w:insideV w:val="single" w:sz="6" w:space="0" w:color="D9D9D9"/>
+            </w:tcBorders>
+            <w:tcMar>
+              <w:top w:w="90" w:type="dxa"/>
+              <w:start w:w="100" w:type="dxa"/>
+              <w:bottom w:w="90" w:type="dxa"/>
+              <w:end w:w="100" w:type="dxa"/>
+            </w:tcMar>
+          </w:tcPr>
+          <w:p>
+            <w:pPr>
+              <w:spacing w:after="0"/>
+              <w:jc w:val="center"/>
+            </w:pPr>
+            <w:r>
+              <w:rPr>
+                <w:rFonts w:ascii="Arial" w:hAnsi="Arial"/>
+                <w:b/>
+                <w:color w:val="FFFFFF"/>
+                <w:sz w:val="17"/>
+              </w:rPr>
+              <w:t>Cost</w:t>
+            </w:r>
+          </w:p>
+        </w:tc>
+        <w:tc>
+          <w:tcPr>
+            <w:tcW w:type="dxa" w:w="1249"/>
+            <w:vAlign w:val="center"/>
+            <w:shd w:fill="1F4E79"/>
+            <w:tcBorders>
+              <w:top w:val="single" w:sz="6" w:space="0" w:color="D9D9D9"/>
+              <w:left w:val="single" w:sz="6" w:space="0" w:color="D9D9D9"/>
+              <w:bottom w:val="single" w:sz="6" w:space="0" w:color="D9D9D9"/>
+              <w:right w:val="single" w:sz="6" w:space="0" w:color="D9D9D9"/>
+              <w:insideH w:val="single" w:sz="6" w:space="0" w:color="D9D9D9"/>
+              <w:insideV w:val="single" w:sz="6" w:space="0" w:color="D9D9D9"/>
+            </w:tcBorders>
+            <w:tcMar>
+              <w:top w:w="90" w:type="dxa"/>
+              <w:start w:w="100" w:type="dxa"/>
+              <w:bottom w:w="90" w:type="dxa"/>
+              <w:end w:w="100" w:type="dxa"/>
+            </w:tcMar>
+          </w:tcPr>
+          <w:p>
+            <w:pPr>
+              <w:spacing w:after="0"/>
+              <w:jc w:val="center"/>
+            </w:pPr>
+            <w:r>
+              <w:rPr>
+                <w:rFonts w:ascii="Arial" w:hAnsi="Arial"/>
+                <w:b/>
+                <w:color w:val="FFFFFF"/>
+                <w:sz w:val="17"/>
+              </w:rPr>
+              <w:t>Average inventory</w:t>
+            </w:r>
+          </w:p>
+        </w:tc>
+        <w:tc>
+          <w:tcPr>
+            <w:tcW w:type="dxa" w:w="1249"/>
+            <w:vAlign w:val="center"/>
+            <w:shd w:fill="1F4E79"/>
+            <w:tcBorders>
+              <w:top w:val="single" w:sz="6" w:space="0" w:color="D9D9D9"/>
+              <w:left w:val="single" w:sz="6" w:space="0" w:color="D9D9D9"/>
+              <w:bottom w:val="single" w:sz="6" w:space="0" w:color="D9D9D9"/>
+              <w:right w:val="single" w:sz="6" w:space="0" w:color="D9D9D9"/>
+              <w:insideH w:val="single" w:sz="6" w:space="0" w:color="D9D9D9"/>
+              <w:insideV w:val="single" w:sz="6" w:space="0" w:color="D9D9D9"/>
+            </w:tcBorders>
+            <w:tcMar>
+              <w:top w:w="90" w:type="dxa"/>
+              <w:start w:w="100" w:type="dxa"/>
+              <w:bottom w:w="90" w:type="dxa"/>
+              <w:end w:w="100" w:type="dxa"/>
+            </w:tcMar>
+          </w:tcPr>
+          <w:p>
+            <w:pPr>
+              <w:spacing w:after="0"/>
+              <w:jc w:val="center"/>
+            </w:pPr>
+            <w:r>
+              <w:rPr>
+                <w:rFonts w:ascii="Arial" w:hAnsi="Arial"/>
+                <w:b/>
+                <w:color w:val="FFFFFF"/>
+                <w:sz w:val="17"/>
+              </w:rPr>
+              <w:t>Item fill</w:t>
+            </w:r>
+          </w:p>
+        </w:tc>
+        <w:tc>
+          <w:tcPr>
+            <w:tcW w:type="dxa" w:w="1249"/>
+            <w:vAlign w:val="center"/>
+            <w:shd w:fill="1F4E79"/>
+            <w:tcBorders>
+              <w:top w:val="single" w:sz="6" w:space="0" w:color="D9D9D9"/>
+              <w:left w:val="single" w:sz="6" w:space="0" w:color="D9D9D9"/>
+              <w:bottom w:val="single" w:sz="6" w:space="0" w:color="D9D9D9"/>
+              <w:right w:val="single" w:sz="6" w:space="0" w:color="D9D9D9"/>
+              <w:insideH w:val="single" w:sz="6" w:space="0" w:color="D9D9D9"/>
+              <w:insideV w:val="single" w:sz="6" w:space="0" w:color="D9D9D9"/>
+            </w:tcBorders>
+            <w:tcMar>
+              <w:top w:w="90" w:type="dxa"/>
+              <w:start w:w="100" w:type="dxa"/>
+              <w:bottom w:w="90" w:type="dxa"/>
+              <w:end w:w="100" w:type="dxa"/>
+            </w:tcMar>
+          </w:tcPr>
+          <w:p>
+            <w:pPr>
+              <w:spacing w:after="0"/>
+              <w:jc w:val="center"/>
+            </w:pPr>
+            <w:r>
+              <w:rPr>
+                <w:rFonts w:ascii="Arial" w:hAnsi="Arial"/>
+                <w:b/>
+                <w:color w:val="FFFFFF"/>
+                <w:sz w:val="17"/>
+              </w:rPr>
+              <w:t>Basket fill</w:t>
+            </w:r>
+          </w:p>
+        </w:tc>
+        <w:tc>
+          <w:tcPr>
+            <w:tcW w:type="dxa" w:w="1249"/>
+            <w:vAlign w:val="center"/>
+            <w:shd w:fill="1F4E79"/>
+            <w:tcBorders>
+              <w:top w:val="single" w:sz="6" w:space="0" w:color="D9D9D9"/>
+              <w:left w:val="single" w:sz="6" w:space="0" w:color="D9D9D9"/>
+              <w:bottom w:val="single" w:sz="6" w:space="0" w:color="D9D9D9"/>
+              <w:right w:val="single" w:sz="6" w:space="0" w:color="D9D9D9"/>
+              <w:insideH w:val="single" w:sz="6" w:space="0" w:color="D9D9D9"/>
+              <w:insideV w:val="single" w:sz="6" w:space="0" w:color="D9D9D9"/>
+            </w:tcBorders>
+            <w:tcMar>
+              <w:top w:w="90" w:type="dxa"/>
+              <w:start w:w="100" w:type="dxa"/>
+              <w:bottom w:w="90" w:type="dxa"/>
+              <w:end w:w="100" w:type="dxa"/>
+            </w:tcMar>
+          </w:tcPr>
+          <w:p>
+            <w:pPr>
+              <w:spacing w:after="0"/>
+              <w:jc w:val="center"/>
+            </w:pPr>
+            <w:r>
+              <w:rPr>
+                <w:rFonts w:ascii="Arial" w:hAnsi="Arial"/>
+                <w:b/>
+                <w:color w:val="FFFFFF"/>
+                <w:sz w:val="17"/>
+              </w:rPr>
+              <w:t>Unmet units</w:t>
+            </w:r>
+          </w:p>
+        </w:tc>
+        <w:tc>
+          <w:tcPr>
+            <w:tcW w:type="dxa" w:w="1249"/>
+            <w:vAlign w:val="center"/>
+            <w:shd w:fill="1F4E79"/>
+            <w:tcBorders>
+              <w:top w:val="single" w:sz="6" w:space="0" w:color="D9D9D9"/>
+              <w:left w:val="single" w:sz="6" w:space="0" w:color="D9D9D9"/>
+              <w:bottom w:val="single" w:sz="6" w:space="0" w:color="D9D9D9"/>
+              <w:right w:val="single" w:sz="6" w:space="0" w:color="D9D9D9"/>
+              <w:insideH w:val="single" w:sz="6" w:space="0" w:color="D9D9D9"/>
+              <w:insideV w:val="single" w:sz="6" w:space="0" w:color="D9D9D9"/>
+            </w:tcBorders>
+            <w:tcMar>
+              <w:top w:w="90" w:type="dxa"/>
+              <w:start w:w="100" w:type="dxa"/>
+              <w:bottom w:w="90" w:type="dxa"/>
+              <w:end w:w="100" w:type="dxa"/>
+            </w:tcMar>
+          </w:tcPr>
+          <w:p>
+            <w:pPr>
+              <w:spacing w:after="0"/>
+              <w:jc w:val="center"/>
+            </w:pPr>
+            <w:r>
+              <w:rPr>
+                <w:rFonts w:ascii="Arial" w:hAnsi="Arial"/>
+                <w:b/>
+                <w:color w:val="FFFFFF"/>
+                <w:sz w:val="17"/>
+              </w:rPr>
+              <w:t>Stockout frequency</w:t>
+            </w:r>
+          </w:p>
+        </w:tc>
+      </w:tr>
+      <w:tr>
+        <w:trPr>
+          <w:cantSplit/>
+        </w:trPr>
+        <w:tc>
+          <w:tcPr>
+            <w:tcW w:type="dxa" w:w="1249"/>
+            <w:vAlign w:val="center"/>
+            <w:tcBorders>
+              <w:top w:val="single" w:sz="6" w:space="0" w:color="D9D9D9"/>
+              <w:left w:val="single" w:sz="6" w:space="0" w:color="D9D9D9"/>
+              <w:bottom w:val="single" w:sz="6" w:space="0" w:color="D9D9D9"/>
+              <w:right w:val="single" w:sz="6" w:space="0" w:color="D9D9D9"/>
+              <w:insideH w:val="single" w:sz="6" w:space="0" w:color="D9D9D9"/>
+              <w:insideV w:val="single" w:sz="6" w:space="0" w:color="D9D9D9"/>
+            </w:tcBorders>
+            <w:tcMar>
+              <w:top w:w="90" w:type="dxa"/>
+              <w:start w:w="100" w:type="dxa"/>
+              <w:bottom w:w="90" w:type="dxa"/>
+              <w:end w:w="100" w:type="dxa"/>
+            </w:tcMar>
+          </w:tcPr>
+          <w:p>
+            <w:pPr>
+              <w:spacing w:after="0" w:line="240" w:lineRule="auto"/>
+              <w:jc w:val="left"/>
+            </w:pPr>
+            <w:r>
+              <w:rPr>
+                <w:rFonts w:ascii="Arial" w:hAnsi="Arial"/>
+                <w:sz w:val="16"/>
+              </w:rPr>
+              <w:t>W1</w:t>
+            </w:r>
+          </w:p>
+        </w:tc>
+        <w:tc>
+          <w:tcPr>
+            <w:tcW w:type="dxa" w:w="1249"/>
+            <w:vAlign w:val="center"/>
+            <w:tcBorders>
+              <w:top w:val="single" w:sz="6" w:space="0" w:color="D9D9D9"/>
+              <w:left w:val="single" w:sz="6" w:space="0" w:color="D9D9D9"/>
+              <w:bottom w:val="single" w:sz="6" w:space="0" w:color="D9D9D9"/>
+              <w:right w:val="single" w:sz="6" w:space="0" w:color="D9D9D9"/>
+              <w:insideH w:val="single" w:sz="6" w:space="0" w:color="D9D9D9"/>
+              <w:insideV w:val="single" w:sz="6" w:space="0" w:color="D9D9D9"/>
+            </w:tcBorders>
+            <w:tcMar>
+              <w:top w:w="90" w:type="dxa"/>
+              <w:start w:w="100" w:type="dxa"/>
+              <w:bottom w:w="90" w:type="dxa"/>
+              <w:end w:w="100" w:type="dxa"/>
+            </w:tcMar>
+          </w:tcPr>
+          <w:p>
+            <w:pPr>
+              <w:spacing w:after="0" w:line="240" w:lineRule="auto"/>
+              <w:jc w:val="left"/>
+            </w:pPr>
+            <w:r>
+              <w:rPr>
+                <w:rFonts w:ascii="Arial" w:hAnsi="Arial"/>
+                <w:sz w:val="16"/>
+              </w:rPr>
+              <w:t>PA1</w:t>
+            </w:r>
+          </w:p>
+        </w:tc>
+        <w:tc>
+          <w:tcPr>
+            <w:tcW w:type="dxa" w:w="1249"/>
+            <w:vAlign w:val="center"/>
+            <w:tcBorders>
+              <w:top w:val="single" w:sz="6" w:space="0" w:color="D9D9D9"/>
+              <w:left w:val="single" w:sz="6" w:space="0" w:color="D9D9D9"/>
+              <w:bottom w:val="single" w:sz="6" w:space="0" w:color="D9D9D9"/>
+              <w:right w:val="single" w:sz="6" w:space="0" w:color="D9D9D9"/>
+              <w:insideH w:val="single" w:sz="6" w:space="0" w:color="D9D9D9"/>
+              <w:insideV w:val="single" w:sz="6" w:space="0" w:color="D9D9D9"/>
+            </w:tcBorders>
+            <w:tcMar>
+              <w:top w:w="90" w:type="dxa"/>
+              <w:start w:w="100" w:type="dxa"/>
+              <w:bottom w:w="90" w:type="dxa"/>
+              <w:end w:w="100" w:type="dxa"/>
+            </w:tcMar>
+          </w:tcPr>
+          <w:p>
+            <w:pPr>
+              <w:spacing w:after="0" w:line="240" w:lineRule="auto"/>
+              <w:jc w:val="center"/>
+            </w:pPr>
+            <w:r>
+              <w:rPr>
+                <w:rFonts w:ascii="Arial" w:hAnsi="Arial"/>
+                <w:sz w:val="16"/>
+              </w:rPr>
+              <w:t>2,716,026</w:t>
+            </w:r>
+          </w:p>
+        </w:tc>
+        <w:tc>
+          <w:tcPr>
+            <w:tcW w:type="dxa" w:w="1249"/>
+            <w:vAlign w:val="center"/>
+            <w:tcBorders>
+              <w:top w:val="single" w:sz="6" w:space="0" w:color="D9D9D9"/>
+              <w:left w:val="single" w:sz="6" w:space="0" w:color="D9D9D9"/>
+              <w:bottom w:val="single" w:sz="6" w:space="0" w:color="D9D9D9"/>
+              <w:right w:val="single" w:sz="6" w:space="0" w:color="D9D9D9"/>
+              <w:insideH w:val="single" w:sz="6" w:space="0" w:color="D9D9D9"/>
+              <w:insideV w:val="single" w:sz="6" w:space="0" w:color="D9D9D9"/>
+            </w:tcBorders>
+            <w:tcMar>
+              <w:top w:w="90" w:type="dxa"/>
+              <w:start w:w="100" w:type="dxa"/>
+              <w:bottom w:w="90" w:type="dxa"/>
+              <w:end w:w="100" w:type="dxa"/>
+            </w:tcMar>
+          </w:tcPr>
+          <w:p>
+            <w:pPr>
+              <w:spacing w:after="0" w:line="240" w:lineRule="auto"/>
+              <w:jc w:val="center"/>
+            </w:pPr>
+            <w:r>
+              <w:rPr>
+                <w:rFonts w:ascii="Arial" w:hAnsi="Arial"/>
+                <w:sz w:val="16"/>
+              </w:rPr>
+              <w:t>851,272</w:t>
+            </w:r>
+          </w:p>
+        </w:tc>
+        <w:tc>
+          <w:tcPr>
+            <w:tcW w:type="dxa" w:w="1249"/>
+            <w:vAlign w:val="center"/>
+            <w:tcBorders>
+              <w:top w:val="single" w:sz="6" w:space="0" w:color="D9D9D9"/>
+              <w:left w:val="single" w:sz="6" w:space="0" w:color="D9D9D9"/>
+              <w:bottom w:val="single" w:sz="6" w:space="0" w:color="D9D9D9"/>
+              <w:right w:val="single" w:sz="6" w:space="0" w:color="D9D9D9"/>
+              <w:insideH w:val="single" w:sz="6" w:space="0" w:color="D9D9D9"/>
+              <w:insideV w:val="single" w:sz="6" w:space="0" w:color="D9D9D9"/>
+            </w:tcBorders>
+            <w:tcMar>
+              <w:top w:w="90" w:type="dxa"/>
+              <w:start w:w="100" w:type="dxa"/>
+              <w:bottom w:w="90" w:type="dxa"/>
+              <w:end w:w="100" w:type="dxa"/>
+            </w:tcMar>
+          </w:tcPr>
+          <w:p>
+            <w:pPr>
+              <w:spacing w:after="0" w:line="240" w:lineRule="auto"/>
+              <w:jc w:val="center"/>
+            </w:pPr>
+            <w:r>
+              <w:rPr>
+                <w:rFonts w:ascii="Arial" w:hAnsi="Arial"/>
+                <w:sz w:val="16"/>
+              </w:rPr>
+              <w:t>0.9709</w:t>
+            </w:r>
+          </w:p>
+        </w:tc>
+        <w:tc>
+          <w:tcPr>
+            <w:tcW w:type="dxa" w:w="1249"/>
+            <w:vAlign w:val="center"/>
+            <w:tcBorders>
+              <w:top w:val="single" w:sz="6" w:space="0" w:color="D9D9D9"/>
+              <w:left w:val="single" w:sz="6" w:space="0" w:color="D9D9D9"/>
+              <w:bottom w:val="single" w:sz="6" w:space="0" w:color="D9D9D9"/>
+              <w:right w:val="single" w:sz="6" w:space="0" w:color="D9D9D9"/>
+              <w:insideH w:val="single" w:sz="6" w:space="0" w:color="D9D9D9"/>
+              <w:insideV w:val="single" w:sz="6" w:space="0" w:color="D9D9D9"/>
+            </w:tcBorders>
+            <w:tcMar>
+              <w:top w:w="90" w:type="dxa"/>
+              <w:start w:w="100" w:type="dxa"/>
+              <w:bottom w:w="90" w:type="dxa"/>
+              <w:end w:w="100" w:type="dxa"/>
+            </w:tcMar>
+          </w:tcPr>
+          <w:p>
+            <w:pPr>
+              <w:spacing w:after="0" w:line="240" w:lineRule="auto"/>
+              <w:jc w:val="center"/>
+            </w:pPr>
+            <w:r>
+              <w:rPr>
+                <w:rFonts w:ascii="Arial" w:hAnsi="Arial"/>
+                <w:sz w:val="16"/>
+              </w:rPr>
+              <w:t>0.9608</w:t>
+            </w:r>
+          </w:p>
+        </w:tc>
+        <w:tc>
+          <w:tcPr>
+            <w:tcW w:type="dxa" w:w="1249"/>
+            <w:vAlign w:val="center"/>
+            <w:tcBorders>
+              <w:top w:val="single" w:sz="6" w:space="0" w:color="D9D9D9"/>
+              <w:left w:val="single" w:sz="6" w:space="0" w:color="D9D9D9"/>
+              <w:bottom w:val="single" w:sz="6" w:space="0" w:color="D9D9D9"/>
+              <w:right w:val="single" w:sz="6" w:space="0" w:color="D9D9D9"/>
+              <w:insideH w:val="single" w:sz="6" w:space="0" w:color="D9D9D9"/>
+              <w:insideV w:val="single" w:sz="6" w:space="0" w:color="D9D9D9"/>
+            </w:tcBorders>
+            <w:tcMar>
+              <w:top w:w="90" w:type="dxa"/>
+              <w:start w:w="100" w:type="dxa"/>
+              <w:bottom w:w="90" w:type="dxa"/>
+              <w:end w:w="100" w:type="dxa"/>
+            </w:tcMar>
+          </w:tcPr>
+          <w:p>
+            <w:pPr>
+              <w:spacing w:after="0" w:line="240" w:lineRule="auto"/>
+              <w:jc w:val="center"/>
+            </w:pPr>
+            <w:r>
+              <w:rPr>
+                <w:rFonts w:ascii="Arial" w:hAnsi="Arial"/>
+                <w:sz w:val="16"/>
+              </w:rPr>
+              <w:t>24,376</w:t>
+            </w:r>
+          </w:p>
+        </w:tc>
+        <w:tc>
+          <w:tcPr>
+            <w:tcW w:type="dxa" w:w="1249"/>
+            <w:vAlign w:val="center"/>
+            <w:tcBorders>
+              <w:top w:val="single" w:sz="6" w:space="0" w:color="D9D9D9"/>
+              <w:left w:val="single" w:sz="6" w:space="0" w:color="D9D9D9"/>
+              <w:bottom w:val="single" w:sz="6" w:space="0" w:color="D9D9D9"/>
+              <w:right w:val="single" w:sz="6" w:space="0" w:color="D9D9D9"/>
+              <w:insideH w:val="single" w:sz="6" w:space="0" w:color="D9D9D9"/>
+              <w:insideV w:val="single" w:sz="6" w:space="0" w:color="D9D9D9"/>
+            </w:tcBorders>
+            <w:tcMar>
+              <w:top w:w="90" w:type="dxa"/>
+              <w:start w:w="100" w:type="dxa"/>
+              <w:bottom w:w="90" w:type="dxa"/>
+              <w:end w:w="100" w:type="dxa"/>
+            </w:tcMar>
+          </w:tcPr>
+          <w:p>
+            <w:pPr>
+              <w:spacing w:after="0" w:line="240" w:lineRule="auto"/>
+              <w:jc w:val="center"/>
+            </w:pPr>
+            <w:r>
+              <w:rPr>
+                <w:rFonts w:ascii="Arial" w:hAnsi="Arial"/>
+                <w:sz w:val="16"/>
+              </w:rPr>
+              <w:t>0.0159</w:t>
+            </w:r>
+          </w:p>
+        </w:tc>
+      </w:tr>
+      <w:tr>
+        <w:trPr>
+          <w:cantSplit/>
+        </w:trPr>
+        <w:tc>
+          <w:tcPr>
+            <w:tcW w:type="dxa" w:w="1249"/>
+            <w:vAlign w:val="center"/>
+            <w:tcBorders>
+              <w:top w:val="single" w:sz="6" w:space="0" w:color="D9D9D9"/>
+              <w:left w:val="single" w:sz="6" w:space="0" w:color="D9D9D9"/>
+              <w:bottom w:val="single" w:sz="6" w:space="0" w:color="D9D9D9"/>
+              <w:right w:val="single" w:sz="6" w:space="0" w:color="D9D9D9"/>
+              <w:insideH w:val="single" w:sz="6" w:space="0" w:color="D9D9D9"/>
+              <w:insideV w:val="single" w:sz="6" w:space="0" w:color="D9D9D9"/>
+            </w:tcBorders>
+            <w:tcMar>
+              <w:top w:w="90" w:type="dxa"/>
+              <w:start w:w="100" w:type="dxa"/>
+              <w:bottom w:w="90" w:type="dxa"/>
+              <w:end w:w="100" w:type="dxa"/>
+            </w:tcMar>
+            <w:shd w:fill="F2F6FA"/>
+          </w:tcPr>
+          <w:p>
+            <w:pPr>
+              <w:spacing w:after="0" w:line="240" w:lineRule="auto"/>
+              <w:jc w:val="left"/>
+            </w:pPr>
+            <w:r>
+              <w:rPr>
+                <w:rFonts w:ascii="Arial" w:hAnsi="Arial"/>
+                <w:sz w:val="16"/>
+              </w:rPr>
+              <w:t>W1</w:t>
+            </w:r>
+          </w:p>
+        </w:tc>
+        <w:tc>
+          <w:tcPr>
+            <w:tcW w:type="dxa" w:w="1249"/>
+            <w:vAlign w:val="center"/>
+            <w:tcBorders>
+              <w:top w:val="single" w:sz="6" w:space="0" w:color="D9D9D9"/>
+              <w:left w:val="single" w:sz="6" w:space="0" w:color="D9D9D9"/>
+              <w:bottom w:val="single" w:sz="6" w:space="0" w:color="D9D9D9"/>
+              <w:right w:val="single" w:sz="6" w:space="0" w:color="D9D9D9"/>
+              <w:insideH w:val="single" w:sz="6" w:space="0" w:color="D9D9D9"/>
+              <w:insideV w:val="single" w:sz="6" w:space="0" w:color="D9D9D9"/>
+            </w:tcBorders>
+            <w:tcMar>
+              <w:top w:w="90" w:type="dxa"/>
+              <w:start w:w="100" w:type="dxa"/>
+              <w:bottom w:w="90" w:type="dxa"/>
+              <w:end w:w="100" w:type="dxa"/>
+            </w:tcMar>
+            <w:shd w:fill="F2F6FA"/>
+          </w:tcPr>
+          <w:p>
+            <w:pPr>
+              <w:spacing w:after="0" w:line="240" w:lineRule="auto"/>
+              <w:jc w:val="left"/>
+            </w:pPr>
+            <w:r>
+              <w:rPr>
+                <w:rFonts w:ascii="Arial" w:hAnsi="Arial"/>
+                <w:sz w:val="16"/>
+              </w:rPr>
+              <w:t>C4</w:t>
+            </w:r>
+          </w:p>
+        </w:tc>
+        <w:tc>
+          <w:tcPr>
+            <w:tcW w:type="dxa" w:w="1249"/>
+            <w:vAlign w:val="center"/>
+            <w:tcBorders>
+              <w:top w:val="single" w:sz="6" w:space="0" w:color="D9D9D9"/>
+              <w:left w:val="single" w:sz="6" w:space="0" w:color="D9D9D9"/>
+              <w:bottom w:val="single" w:sz="6" w:space="0" w:color="D9D9D9"/>
+              <w:right w:val="single" w:sz="6" w:space="0" w:color="D9D9D9"/>
+              <w:insideH w:val="single" w:sz="6" w:space="0" w:color="D9D9D9"/>
+              <w:insideV w:val="single" w:sz="6" w:space="0" w:color="D9D9D9"/>
+            </w:tcBorders>
+            <w:tcMar>
+              <w:top w:w="90" w:type="dxa"/>
+              <w:start w:w="100" w:type="dxa"/>
+              <w:bottom w:w="90" w:type="dxa"/>
+              <w:end w:w="100" w:type="dxa"/>
+            </w:tcMar>
+            <w:shd w:fill="F2F6FA"/>
+          </w:tcPr>
+          <w:p>
+            <w:pPr>
+              <w:spacing w:after="0" w:line="240" w:lineRule="auto"/>
+              <w:jc w:val="center"/>
+            </w:pPr>
+            <w:r>
+              <w:rPr>
+                <w:rFonts w:ascii="Arial" w:hAnsi="Arial"/>
+                <w:sz w:val="16"/>
+              </w:rPr>
+              <w:t>2,715,009</w:t>
+            </w:r>
+          </w:p>
+        </w:tc>
+        <w:tc>
+          <w:tcPr>
+            <w:tcW w:type="dxa" w:w="1249"/>
+            <w:vAlign w:val="center"/>
+            <w:tcBorders>
+              <w:top w:val="single" w:sz="6" w:space="0" w:color="D9D9D9"/>
+              <w:left w:val="single" w:sz="6" w:space="0" w:color="D9D9D9"/>
+              <w:bottom w:val="single" w:sz="6" w:space="0" w:color="D9D9D9"/>
+              <w:right w:val="single" w:sz="6" w:space="0" w:color="D9D9D9"/>
+              <w:insideH w:val="single" w:sz="6" w:space="0" w:color="D9D9D9"/>
+              <w:insideV w:val="single" w:sz="6" w:space="0" w:color="D9D9D9"/>
+            </w:tcBorders>
+            <w:tcMar>
+              <w:top w:w="90" w:type="dxa"/>
+              <w:start w:w="100" w:type="dxa"/>
+              <w:bottom w:w="90" w:type="dxa"/>
+              <w:end w:w="100" w:type="dxa"/>
+            </w:tcMar>
+            <w:shd w:fill="F2F6FA"/>
+          </w:tcPr>
+          <w:p>
+            <w:pPr>
+              <w:spacing w:after="0" w:line="240" w:lineRule="auto"/>
+              <w:jc w:val="center"/>
+            </w:pPr>
+            <w:r>
+              <w:rPr>
+                <w:rFonts w:ascii="Arial" w:hAnsi="Arial"/>
+                <w:sz w:val="16"/>
+              </w:rPr>
+              <w:t>851,226</w:t>
+            </w:r>
+          </w:p>
+        </w:tc>
+        <w:tc>
+          <w:tcPr>
+            <w:tcW w:type="dxa" w:w="1249"/>
+            <w:vAlign w:val="center"/>
+            <w:tcBorders>
+              <w:top w:val="single" w:sz="6" w:space="0" w:color="D9D9D9"/>
+              <w:left w:val="single" w:sz="6" w:space="0" w:color="D9D9D9"/>
+              <w:bottom w:val="single" w:sz="6" w:space="0" w:color="D9D9D9"/>
+              <w:right w:val="single" w:sz="6" w:space="0" w:color="D9D9D9"/>
+              <w:insideH w:val="single" w:sz="6" w:space="0" w:color="D9D9D9"/>
+              <w:insideV w:val="single" w:sz="6" w:space="0" w:color="D9D9D9"/>
+            </w:tcBorders>
+            <w:tcMar>
+              <w:top w:w="90" w:type="dxa"/>
+              <w:start w:w="100" w:type="dxa"/>
+              <w:bottom w:w="90" w:type="dxa"/>
+              <w:end w:w="100" w:type="dxa"/>
+            </w:tcMar>
+            <w:shd w:fill="F2F6FA"/>
+          </w:tcPr>
+          <w:p>
+            <w:pPr>
+              <w:spacing w:after="0" w:line="240" w:lineRule="auto"/>
+              <w:jc w:val="center"/>
+            </w:pPr>
+            <w:r>
+              <w:rPr>
+                <w:rFonts w:ascii="Arial" w:hAnsi="Arial"/>
+                <w:sz w:val="16"/>
+              </w:rPr>
+              <w:t>0.9712</w:t>
+            </w:r>
+          </w:p>
+        </w:tc>
+        <w:tc>
+          <w:tcPr>
+            <w:tcW w:type="dxa" w:w="1249"/>
+            <w:vAlign w:val="center"/>
+            <w:tcBorders>
+              <w:top w:val="single" w:sz="6" w:space="0" w:color="D9D9D9"/>
+              <w:left w:val="single" w:sz="6" w:space="0" w:color="D9D9D9"/>
+              <w:bottom w:val="single" w:sz="6" w:space="0" w:color="D9D9D9"/>
+              <w:right w:val="single" w:sz="6" w:space="0" w:color="D9D9D9"/>
+              <w:insideH w:val="single" w:sz="6" w:space="0" w:color="D9D9D9"/>
+              <w:insideV w:val="single" w:sz="6" w:space="0" w:color="D9D9D9"/>
+            </w:tcBorders>
+            <w:tcMar>
+              <w:top w:w="90" w:type="dxa"/>
+              <w:start w:w="100" w:type="dxa"/>
+              <w:bottom w:w="90" w:type="dxa"/>
+              <w:end w:w="100" w:type="dxa"/>
+            </w:tcMar>
+            <w:shd w:fill="F2F6FA"/>
+          </w:tcPr>
+          <w:p>
+            <w:pPr>
+              <w:spacing w:after="0" w:line="240" w:lineRule="auto"/>
+              <w:jc w:val="center"/>
+            </w:pPr>
+            <w:r>
+              <w:rPr>
+                <w:rFonts w:ascii="Arial" w:hAnsi="Arial"/>
+                <w:sz w:val="16"/>
+              </w:rPr>
+              <w:t>0.9571</w:t>
+            </w:r>
+          </w:p>
+        </w:tc>
+        <w:tc>
+          <w:tcPr>
+            <w:tcW w:type="dxa" w:w="1249"/>
+            <w:vAlign w:val="center"/>
+            <w:tcBorders>
+              <w:top w:val="single" w:sz="6" w:space="0" w:color="D9D9D9"/>
+              <w:left w:val="single" w:sz="6" w:space="0" w:color="D9D9D9"/>
+              <w:bottom w:val="single" w:sz="6" w:space="0" w:color="D9D9D9"/>
+              <w:right w:val="single" w:sz="6" w:space="0" w:color="D9D9D9"/>
+              <w:insideH w:val="single" w:sz="6" w:space="0" w:color="D9D9D9"/>
+              <w:insideV w:val="single" w:sz="6" w:space="0" w:color="D9D9D9"/>
+            </w:tcBorders>
+            <w:tcMar>
+              <w:top w:w="90" w:type="dxa"/>
+              <w:start w:w="100" w:type="dxa"/>
+              <w:bottom w:w="90" w:type="dxa"/>
+              <w:end w:w="100" w:type="dxa"/>
+            </w:tcMar>
+            <w:shd w:fill="F2F6FA"/>
+          </w:tcPr>
+          <w:p>
+            <w:pPr>
+              <w:spacing w:after="0" w:line="240" w:lineRule="auto"/>
+              <w:jc w:val="center"/>
+            </w:pPr>
+            <w:r>
+              <w:rPr>
+                <w:rFonts w:ascii="Arial" w:hAnsi="Arial"/>
+                <w:sz w:val="16"/>
+              </w:rPr>
+              <w:t>24,104</w:t>
+            </w:r>
+          </w:p>
+        </w:tc>
+        <w:tc>
+          <w:tcPr>
+            <w:tcW w:type="dxa" w:w="1249"/>
+            <w:vAlign w:val="center"/>
+            <w:tcBorders>
+              <w:top w:val="single" w:sz="6" w:space="0" w:color="D9D9D9"/>
+              <w:left w:val="single" w:sz="6" w:space="0" w:color="D9D9D9"/>
+              <w:bottom w:val="single" w:sz="6" w:space="0" w:color="D9D9D9"/>
+              <w:right w:val="single" w:sz="6" w:space="0" w:color="D9D9D9"/>
+              <w:insideH w:val="single" w:sz="6" w:space="0" w:color="D9D9D9"/>
+              <w:insideV w:val="single" w:sz="6" w:space="0" w:color="D9D9D9"/>
+            </w:tcBorders>
+            <w:tcMar>
+              <w:top w:w="90" w:type="dxa"/>
+              <w:start w:w="100" w:type="dxa"/>
+              <w:bottom w:w="90" w:type="dxa"/>
+              <w:end w:w="100" w:type="dxa"/>
+            </w:tcMar>
+            <w:shd w:fill="F2F6FA"/>
+          </w:tcPr>
+          <w:p>
+            <w:pPr>
+              <w:spacing w:after="0" w:line="240" w:lineRule="auto"/>
+              <w:jc w:val="center"/>
+            </w:pPr>
+            <w:r>
+              <w:rPr>
+                <w:rFonts w:ascii="Arial" w:hAnsi="Arial"/>
+                <w:sz w:val="16"/>
+              </w:rPr>
+              <w:t>0.0172</w:t>
+            </w:r>
+          </w:p>
+        </w:tc>
+      </w:tr>
+      <w:tr>
+        <w:trPr>
+          <w:cantSplit/>
+        </w:trPr>
+        <w:tc>
+          <w:tcPr>
+            <w:tcW w:type="dxa" w:w="1249"/>
+            <w:vAlign w:val="center"/>
+            <w:tcBorders>
+              <w:top w:val="single" w:sz="6" w:space="0" w:color="D9D9D9"/>
+              <w:left w:val="single" w:sz="6" w:space="0" w:color="D9D9D9"/>
+              <w:bottom w:val="single" w:sz="6" w:space="0" w:color="D9D9D9"/>
+              <w:right w:val="single" w:sz="6" w:space="0" w:color="D9D9D9"/>
+              <w:insideH w:val="single" w:sz="6" w:space="0" w:color="D9D9D9"/>
+              <w:insideV w:val="single" w:sz="6" w:space="0" w:color="D9D9D9"/>
+            </w:tcBorders>
+            <w:tcMar>
+              <w:top w:w="90" w:type="dxa"/>
+              <w:start w:w="100" w:type="dxa"/>
+              <w:bottom w:w="90" w:type="dxa"/>
+              <w:end w:w="100" w:type="dxa"/>
+            </w:tcMar>
+          </w:tcPr>
+          <w:p>
+            <w:pPr>
+              <w:spacing w:after="0" w:line="240" w:lineRule="auto"/>
+              <w:jc w:val="left"/>
+            </w:pPr>
+            <w:r>
+              <w:rPr>
+                <w:rFonts w:ascii="Arial" w:hAnsi="Arial"/>
+                <w:sz w:val="16"/>
+              </w:rPr>
+              <w:t>W2</w:t>
+            </w:r>
+          </w:p>
+        </w:tc>
+        <w:tc>
+          <w:tcPr>
+            <w:tcW w:type="dxa" w:w="1249"/>
+            <w:vAlign w:val="center"/>
+            <w:tcBorders>
+              <w:top w:val="single" w:sz="6" w:space="0" w:color="D9D9D9"/>
+              <w:left w:val="single" w:sz="6" w:space="0" w:color="D9D9D9"/>
+              <w:bottom w:val="single" w:sz="6" w:space="0" w:color="D9D9D9"/>
+              <w:right w:val="single" w:sz="6" w:space="0" w:color="D9D9D9"/>
+              <w:insideH w:val="single" w:sz="6" w:space="0" w:color="D9D9D9"/>
+              <w:insideV w:val="single" w:sz="6" w:space="0" w:color="D9D9D9"/>
+            </w:tcBorders>
+            <w:tcMar>
+              <w:top w:w="90" w:type="dxa"/>
+              <w:start w:w="100" w:type="dxa"/>
+              <w:bottom w:w="90" w:type="dxa"/>
+              <w:end w:w="100" w:type="dxa"/>
+            </w:tcMar>
+          </w:tcPr>
+          <w:p>
+            <w:pPr>
+              <w:spacing w:after="0" w:line="240" w:lineRule="auto"/>
+              <w:jc w:val="left"/>
+            </w:pPr>
+            <w:r>
+              <w:rPr>
+                <w:rFonts w:ascii="Arial" w:hAnsi="Arial"/>
+                <w:sz w:val="16"/>
+              </w:rPr>
+              <w:t>PA1</w:t>
+            </w:r>
+          </w:p>
+        </w:tc>
+        <w:tc>
+          <w:tcPr>
+            <w:tcW w:type="dxa" w:w="1249"/>
+            <w:vAlign w:val="center"/>
+            <w:tcBorders>
+              <w:top w:val="single" w:sz="6" w:space="0" w:color="D9D9D9"/>
+              <w:left w:val="single" w:sz="6" w:space="0" w:color="D9D9D9"/>
+              <w:bottom w:val="single" w:sz="6" w:space="0" w:color="D9D9D9"/>
+              <w:right w:val="single" w:sz="6" w:space="0" w:color="D9D9D9"/>
+              <w:insideH w:val="single" w:sz="6" w:space="0" w:color="D9D9D9"/>
+              <w:insideV w:val="single" w:sz="6" w:space="0" w:color="D9D9D9"/>
+            </w:tcBorders>
+            <w:tcMar>
+              <w:top w:w="90" w:type="dxa"/>
+              <w:start w:w="100" w:type="dxa"/>
+              <w:bottom w:w="90" w:type="dxa"/>
+              <w:end w:w="100" w:type="dxa"/>
+            </w:tcMar>
+          </w:tcPr>
+          <w:p>
+            <w:pPr>
+              <w:spacing w:after="0" w:line="240" w:lineRule="auto"/>
+              <w:jc w:val="center"/>
+            </w:pPr>
+            <w:r>
+              <w:rPr>
+                <w:rFonts w:ascii="Arial" w:hAnsi="Arial"/>
+                <w:sz w:val="16"/>
+              </w:rPr>
+              <w:t>2,798,678</w:t>
+            </w:r>
+          </w:p>
+        </w:tc>
+        <w:tc>
+          <w:tcPr>
+            <w:tcW w:type="dxa" w:w="1249"/>
+            <w:vAlign w:val="center"/>
+            <w:tcBorders>
+              <w:top w:val="single" w:sz="6" w:space="0" w:color="D9D9D9"/>
+              <w:left w:val="single" w:sz="6" w:space="0" w:color="D9D9D9"/>
+              <w:bottom w:val="single" w:sz="6" w:space="0" w:color="D9D9D9"/>
+              <w:right w:val="single" w:sz="6" w:space="0" w:color="D9D9D9"/>
+              <w:insideH w:val="single" w:sz="6" w:space="0" w:color="D9D9D9"/>
+              <w:insideV w:val="single" w:sz="6" w:space="0" w:color="D9D9D9"/>
+            </w:tcBorders>
+            <w:tcMar>
+              <w:top w:w="90" w:type="dxa"/>
+              <w:start w:w="100" w:type="dxa"/>
+              <w:bottom w:w="90" w:type="dxa"/>
+              <w:end w:w="100" w:type="dxa"/>
+            </w:tcMar>
+          </w:tcPr>
+          <w:p>
+            <w:pPr>
+              <w:spacing w:after="0" w:line="240" w:lineRule="auto"/>
+              <w:jc w:val="center"/>
+            </w:pPr>
+            <w:r>
+              <w:rPr>
+                <w:rFonts w:ascii="Arial" w:hAnsi="Arial"/>
+                <w:sz w:val="16"/>
+              </w:rPr>
+              <w:t>850,705</w:t>
+            </w:r>
+          </w:p>
+        </w:tc>
+        <w:tc>
+          <w:tcPr>
+            <w:tcW w:type="dxa" w:w="1249"/>
+            <w:vAlign w:val="center"/>
+            <w:tcBorders>
+              <w:top w:val="single" w:sz="6" w:space="0" w:color="D9D9D9"/>
+              <w:left w:val="single" w:sz="6" w:space="0" w:color="D9D9D9"/>
+              <w:bottom w:val="single" w:sz="6" w:space="0" w:color="D9D9D9"/>
+              <w:right w:val="single" w:sz="6" w:space="0" w:color="D9D9D9"/>
+              <w:insideH w:val="single" w:sz="6" w:space="0" w:color="D9D9D9"/>
+              <w:insideV w:val="single" w:sz="6" w:space="0" w:color="D9D9D9"/>
+            </w:tcBorders>
+            <w:tcMar>
+              <w:top w:w="90" w:type="dxa"/>
+              <w:start w:w="100" w:type="dxa"/>
+              <w:bottom w:w="90" w:type="dxa"/>
+              <w:end w:w="100" w:type="dxa"/>
+            </w:tcMar>
+          </w:tcPr>
+          <w:p>
+            <w:pPr>
+              <w:spacing w:after="0" w:line="240" w:lineRule="auto"/>
+              <w:jc w:val="center"/>
+            </w:pPr>
+            <w:r>
+              <w:rPr>
+                <w:rFonts w:ascii="Arial" w:hAnsi="Arial"/>
+                <w:sz w:val="16"/>
+              </w:rPr>
+              <w:t>0.9563</w:t>
+            </w:r>
+          </w:p>
+        </w:tc>
+        <w:tc>
+          <w:tcPr>
+            <w:tcW w:type="dxa" w:w="1249"/>
+            <w:vAlign w:val="center"/>
+            <w:tcBorders>
+              <w:top w:val="single" w:sz="6" w:space="0" w:color="D9D9D9"/>
+              <w:left w:val="single" w:sz="6" w:space="0" w:color="D9D9D9"/>
+              <w:bottom w:val="single" w:sz="6" w:space="0" w:color="D9D9D9"/>
+              <w:right w:val="single" w:sz="6" w:space="0" w:color="D9D9D9"/>
+              <w:insideH w:val="single" w:sz="6" w:space="0" w:color="D9D9D9"/>
+              <w:insideV w:val="single" w:sz="6" w:space="0" w:color="D9D9D9"/>
+            </w:tcBorders>
+            <w:tcMar>
+              <w:top w:w="90" w:type="dxa"/>
+              <w:start w:w="100" w:type="dxa"/>
+              <w:bottom w:w="90" w:type="dxa"/>
+              <w:end w:w="100" w:type="dxa"/>
+            </w:tcMar>
+          </w:tcPr>
+          <w:p>
+            <w:pPr>
+              <w:spacing w:after="0" w:line="240" w:lineRule="auto"/>
+              <w:jc w:val="center"/>
+            </w:pPr>
+            <w:r>
+              <w:rPr>
+                <w:rFonts w:ascii="Arial" w:hAnsi="Arial"/>
+                <w:sz w:val="16"/>
+              </w:rPr>
+              <w:t>0.9002</w:t>
+            </w:r>
+          </w:p>
+        </w:tc>
+        <w:tc>
+          <w:tcPr>
+            <w:tcW w:type="dxa" w:w="1249"/>
+            <w:vAlign w:val="center"/>
+            <w:tcBorders>
+              <w:top w:val="single" w:sz="6" w:space="0" w:color="D9D9D9"/>
+              <w:left w:val="single" w:sz="6" w:space="0" w:color="D9D9D9"/>
+              <w:bottom w:val="single" w:sz="6" w:space="0" w:color="D9D9D9"/>
+              <w:right w:val="single" w:sz="6" w:space="0" w:color="D9D9D9"/>
+              <w:insideH w:val="single" w:sz="6" w:space="0" w:color="D9D9D9"/>
+              <w:insideV w:val="single" w:sz="6" w:space="0" w:color="D9D9D9"/>
+            </w:tcBorders>
+            <w:tcMar>
+              <w:top w:w="90" w:type="dxa"/>
+              <w:start w:w="100" w:type="dxa"/>
+              <w:bottom w:w="90" w:type="dxa"/>
+              <w:end w:w="100" w:type="dxa"/>
+            </w:tcMar>
+          </w:tcPr>
+          <w:p>
+            <w:pPr>
+              <w:spacing w:after="0" w:line="240" w:lineRule="auto"/>
+              <w:jc w:val="center"/>
+            </w:pPr>
+            <w:r>
+              <w:rPr>
+                <w:rFonts w:ascii="Arial" w:hAnsi="Arial"/>
+                <w:sz w:val="16"/>
+              </w:rPr>
+              <w:t>38,970</w:t>
+            </w:r>
+          </w:p>
+        </w:tc>
+        <w:tc>
+          <w:tcPr>
+            <w:tcW w:type="dxa" w:w="1249"/>
+            <w:vAlign w:val="center"/>
+            <w:tcBorders>
+              <w:top w:val="single" w:sz="6" w:space="0" w:color="D9D9D9"/>
+              <w:left w:val="single" w:sz="6" w:space="0" w:color="D9D9D9"/>
+              <w:bottom w:val="single" w:sz="6" w:space="0" w:color="D9D9D9"/>
+              <w:right w:val="single" w:sz="6" w:space="0" w:color="D9D9D9"/>
+              <w:insideH w:val="single" w:sz="6" w:space="0" w:color="D9D9D9"/>
+              <w:insideV w:val="single" w:sz="6" w:space="0" w:color="D9D9D9"/>
+            </w:tcBorders>
+            <w:tcMar>
+              <w:top w:w="90" w:type="dxa"/>
+              <w:start w:w="100" w:type="dxa"/>
+              <w:bottom w:w="90" w:type="dxa"/>
+              <w:end w:w="100" w:type="dxa"/>
+            </w:tcMar>
+          </w:tcPr>
+          <w:p>
+            <w:pPr>
+              <w:spacing w:after="0" w:line="240" w:lineRule="auto"/>
+              <w:jc w:val="center"/>
+            </w:pPr>
+            <w:r>
+              <w:rPr>
+                <w:rFonts w:ascii="Arial" w:hAnsi="Arial"/>
+                <w:sz w:val="16"/>
+              </w:rPr>
+              <w:t>0.0310</w:t>
+            </w:r>
+          </w:p>
+        </w:tc>
+      </w:tr>
+      <w:tr>
+        <w:trPr>
+          <w:cantSplit/>
+        </w:trPr>
+        <w:tc>
+          <w:tcPr>
+            <w:tcW w:type="dxa" w:w="1249"/>
+            <w:vAlign w:val="center"/>
+            <w:tcBorders>
+              <w:top w:val="single" w:sz="6" w:space="0" w:color="D9D9D9"/>
+              <w:left w:val="single" w:sz="6" w:space="0" w:color="D9D9D9"/>
+              <w:bottom w:val="single" w:sz="6" w:space="0" w:color="D9D9D9"/>
+              <w:right w:val="single" w:sz="6" w:space="0" w:color="D9D9D9"/>
+              <w:insideH w:val="single" w:sz="6" w:space="0" w:color="D9D9D9"/>
+              <w:insideV w:val="single" w:sz="6" w:space="0" w:color="D9D9D9"/>
+            </w:tcBorders>
+            <w:tcMar>
+              <w:top w:w="90" w:type="dxa"/>
+              <w:start w:w="100" w:type="dxa"/>
+              <w:bottom w:w="90" w:type="dxa"/>
+              <w:end w:w="100" w:type="dxa"/>
+            </w:tcMar>
+            <w:shd w:fill="F2F6FA"/>
+          </w:tcPr>
+          <w:p>
+            <w:pPr>
+              <w:spacing w:after="0" w:line="240" w:lineRule="auto"/>
+              <w:jc w:val="left"/>
+            </w:pPr>
+            <w:r>
+              <w:rPr>
+                <w:rFonts w:ascii="Arial" w:hAnsi="Arial"/>
+                <w:sz w:val="16"/>
+              </w:rPr>
+              <w:t>W2</w:t>
+            </w:r>
+          </w:p>
+        </w:tc>
+        <w:tc>
+          <w:tcPr>
+            <w:tcW w:type="dxa" w:w="1249"/>
+            <w:vAlign w:val="center"/>
+            <w:tcBorders>
+              <w:top w:val="single" w:sz="6" w:space="0" w:color="D9D9D9"/>
+              <w:left w:val="single" w:sz="6" w:space="0" w:color="D9D9D9"/>
+              <w:bottom w:val="single" w:sz="6" w:space="0" w:color="D9D9D9"/>
+              <w:right w:val="single" w:sz="6" w:space="0" w:color="D9D9D9"/>
+              <w:insideH w:val="single" w:sz="6" w:space="0" w:color="D9D9D9"/>
+              <w:insideV w:val="single" w:sz="6" w:space="0" w:color="D9D9D9"/>
+            </w:tcBorders>
+            <w:tcMar>
+              <w:top w:w="90" w:type="dxa"/>
+              <w:start w:w="100" w:type="dxa"/>
+              <w:bottom w:w="90" w:type="dxa"/>
+              <w:end w:w="100" w:type="dxa"/>
+            </w:tcMar>
+            <w:shd w:fill="F2F6FA"/>
+          </w:tcPr>
+          <w:p>
+            <w:pPr>
+              <w:spacing w:after="0" w:line="240" w:lineRule="auto"/>
+              <w:jc w:val="left"/>
+            </w:pPr>
+            <w:r>
+              <w:rPr>
+                <w:rFonts w:ascii="Arial" w:hAnsi="Arial"/>
+                <w:sz w:val="16"/>
+              </w:rPr>
+              <w:t>C4</w:t>
+            </w:r>
+          </w:p>
+        </w:tc>
+        <w:tc>
+          <w:tcPr>
+            <w:tcW w:type="dxa" w:w="1249"/>
+            <w:vAlign w:val="center"/>
+            <w:tcBorders>
+              <w:top w:val="single" w:sz="6" w:space="0" w:color="D9D9D9"/>
+              <w:left w:val="single" w:sz="6" w:space="0" w:color="D9D9D9"/>
+              <w:bottom w:val="single" w:sz="6" w:space="0" w:color="D9D9D9"/>
+              <w:right w:val="single" w:sz="6" w:space="0" w:color="D9D9D9"/>
+              <w:insideH w:val="single" w:sz="6" w:space="0" w:color="D9D9D9"/>
+              <w:insideV w:val="single" w:sz="6" w:space="0" w:color="D9D9D9"/>
+            </w:tcBorders>
+            <w:tcMar>
+              <w:top w:w="90" w:type="dxa"/>
+              <w:start w:w="100" w:type="dxa"/>
+              <w:bottom w:w="90" w:type="dxa"/>
+              <w:end w:w="100" w:type="dxa"/>
+            </w:tcMar>
+            <w:shd w:fill="F2F6FA"/>
+          </w:tcPr>
+          <w:p>
+            <w:pPr>
+              <w:spacing w:after="0" w:line="240" w:lineRule="auto"/>
+              <w:jc w:val="center"/>
+            </w:pPr>
+            <w:r>
+              <w:rPr>
+                <w:rFonts w:ascii="Arial" w:hAnsi="Arial"/>
+                <w:sz w:val="16"/>
+              </w:rPr>
+              <w:t>2,786,311</w:t>
+            </w:r>
+          </w:p>
+        </w:tc>
+        <w:tc>
+          <w:tcPr>
+            <w:tcW w:type="dxa" w:w="1249"/>
+            <w:vAlign w:val="center"/>
+            <w:tcBorders>
+              <w:top w:val="single" w:sz="6" w:space="0" w:color="D9D9D9"/>
+              <w:left w:val="single" w:sz="6" w:space="0" w:color="D9D9D9"/>
+              <w:bottom w:val="single" w:sz="6" w:space="0" w:color="D9D9D9"/>
+              <w:right w:val="single" w:sz="6" w:space="0" w:color="D9D9D9"/>
+              <w:insideH w:val="single" w:sz="6" w:space="0" w:color="D9D9D9"/>
+              <w:insideV w:val="single" w:sz="6" w:space="0" w:color="D9D9D9"/>
+            </w:tcBorders>
+            <w:tcMar>
+              <w:top w:w="90" w:type="dxa"/>
+              <w:start w:w="100" w:type="dxa"/>
+              <w:bottom w:w="90" w:type="dxa"/>
+              <w:end w:w="100" w:type="dxa"/>
+            </w:tcMar>
+            <w:shd w:fill="F2F6FA"/>
+          </w:tcPr>
+          <w:p>
+            <w:pPr>
+              <w:spacing w:after="0" w:line="240" w:lineRule="auto"/>
+              <w:jc w:val="center"/>
+            </w:pPr>
+            <w:r>
+              <w:rPr>
+                <w:rFonts w:ascii="Arial" w:hAnsi="Arial"/>
+                <w:sz w:val="16"/>
+              </w:rPr>
+              <w:t>850,306</w:t>
+            </w:r>
+          </w:p>
+        </w:tc>
+        <w:tc>
+          <w:tcPr>
+            <w:tcW w:type="dxa" w:w="1249"/>
+            <w:vAlign w:val="center"/>
+            <w:tcBorders>
+              <w:top w:val="single" w:sz="6" w:space="0" w:color="D9D9D9"/>
+              <w:left w:val="single" w:sz="6" w:space="0" w:color="D9D9D9"/>
+              <w:bottom w:val="single" w:sz="6" w:space="0" w:color="D9D9D9"/>
+              <w:right w:val="single" w:sz="6" w:space="0" w:color="D9D9D9"/>
+              <w:insideH w:val="single" w:sz="6" w:space="0" w:color="D9D9D9"/>
+              <w:insideV w:val="single" w:sz="6" w:space="0" w:color="D9D9D9"/>
+            </w:tcBorders>
+            <w:tcMar>
+              <w:top w:w="90" w:type="dxa"/>
+              <w:start w:w="100" w:type="dxa"/>
+              <w:bottom w:w="90" w:type="dxa"/>
+              <w:end w:w="100" w:type="dxa"/>
+            </w:tcMar>
+            <w:shd w:fill="F2F6FA"/>
+          </w:tcPr>
+          <w:p>
+            <w:pPr>
+              <w:spacing w:after="0" w:line="240" w:lineRule="auto"/>
+              <w:jc w:val="center"/>
+            </w:pPr>
+            <w:r>
+              <w:rPr>
+                <w:rFonts w:ascii="Arial" w:hAnsi="Arial"/>
+                <w:sz w:val="16"/>
+              </w:rPr>
+              <w:t>0.9595</w:t>
+            </w:r>
+          </w:p>
+        </w:tc>
+        <w:tc>
+          <w:tcPr>
+            <w:tcW w:type="dxa" w:w="1249"/>
+            <w:vAlign w:val="center"/>
+            <w:tcBorders>
+              <w:top w:val="single" w:sz="6" w:space="0" w:color="D9D9D9"/>
+              <w:left w:val="single" w:sz="6" w:space="0" w:color="D9D9D9"/>
+              <w:bottom w:val="single" w:sz="6" w:space="0" w:color="D9D9D9"/>
+              <w:right w:val="single" w:sz="6" w:space="0" w:color="D9D9D9"/>
+              <w:insideH w:val="single" w:sz="6" w:space="0" w:color="D9D9D9"/>
+              <w:insideV w:val="single" w:sz="6" w:space="0" w:color="D9D9D9"/>
+            </w:tcBorders>
+            <w:tcMar>
+              <w:top w:w="90" w:type="dxa"/>
+              <w:start w:w="100" w:type="dxa"/>
+              <w:bottom w:w="90" w:type="dxa"/>
+              <w:end w:w="100" w:type="dxa"/>
+            </w:tcMar>
+            <w:shd w:fill="F2F6FA"/>
+          </w:tcPr>
+          <w:p>
+            <w:pPr>
+              <w:spacing w:after="0" w:line="240" w:lineRule="auto"/>
+              <w:jc w:val="center"/>
+            </w:pPr>
+            <w:r>
+              <w:rPr>
+                <w:rFonts w:ascii="Arial" w:hAnsi="Arial"/>
+                <w:sz w:val="16"/>
+              </w:rPr>
+              <w:t>0.9078</w:t>
+            </w:r>
+          </w:p>
+        </w:tc>
+        <w:tc>
+          <w:tcPr>
+            <w:tcW w:type="dxa" w:w="1249"/>
+            <w:vAlign w:val="center"/>
+            <w:tcBorders>
+              <w:top w:val="single" w:sz="6" w:space="0" w:color="D9D9D9"/>
+              <w:left w:val="single" w:sz="6" w:space="0" w:color="D9D9D9"/>
+              <w:bottom w:val="single" w:sz="6" w:space="0" w:color="D9D9D9"/>
+              <w:right w:val="single" w:sz="6" w:space="0" w:color="D9D9D9"/>
+              <w:insideH w:val="single" w:sz="6" w:space="0" w:color="D9D9D9"/>
+              <w:insideV w:val="single" w:sz="6" w:space="0" w:color="D9D9D9"/>
+            </w:tcBorders>
+            <w:tcMar>
+              <w:top w:w="90" w:type="dxa"/>
+              <w:start w:w="100" w:type="dxa"/>
+              <w:bottom w:w="90" w:type="dxa"/>
+              <w:end w:w="100" w:type="dxa"/>
+            </w:tcMar>
+            <w:shd w:fill="F2F6FA"/>
+          </w:tcPr>
+          <w:p>
+            <w:pPr>
+              <w:spacing w:after="0" w:line="240" w:lineRule="auto"/>
+              <w:jc w:val="center"/>
+            </w:pPr>
+            <w:r>
+              <w:rPr>
+                <w:rFonts w:ascii="Arial" w:hAnsi="Arial"/>
+                <w:sz w:val="16"/>
+              </w:rPr>
+              <w:t>36,163</w:t>
+            </w:r>
+          </w:p>
+        </w:tc>
+        <w:tc>
+          <w:tcPr>
+            <w:tcW w:type="dxa" w:w="1249"/>
+            <w:vAlign w:val="center"/>
+            <w:tcBorders>
+              <w:top w:val="single" w:sz="6" w:space="0" w:color="D9D9D9"/>
+              <w:left w:val="single" w:sz="6" w:space="0" w:color="D9D9D9"/>
+              <w:bottom w:val="single" w:sz="6" w:space="0" w:color="D9D9D9"/>
+              <w:right w:val="single" w:sz="6" w:space="0" w:color="D9D9D9"/>
+              <w:insideH w:val="single" w:sz="6" w:space="0" w:color="D9D9D9"/>
+              <w:insideV w:val="single" w:sz="6" w:space="0" w:color="D9D9D9"/>
+            </w:tcBorders>
+            <w:tcMar>
+              <w:top w:w="90" w:type="dxa"/>
+              <w:start w:w="100" w:type="dxa"/>
+              <w:bottom w:w="90" w:type="dxa"/>
+              <w:end w:w="100" w:type="dxa"/>
+            </w:tcMar>
+            <w:shd w:fill="F2F6FA"/>
+          </w:tcPr>
+          <w:p>
+            <w:pPr>
+              <w:spacing w:after="0" w:line="240" w:lineRule="auto"/>
+              <w:jc w:val="center"/>
+            </w:pPr>
+            <w:r>
+              <w:rPr>
+                <w:rFonts w:ascii="Arial" w:hAnsi="Arial"/>
+                <w:sz w:val="16"/>
+              </w:rPr>
+              <w:t>0.0302</w:t>
+            </w:r>
+          </w:p>
+        </w:tc>
+      </w:tr>
+      <w:tr>
+        <w:trPr>
+          <w:cantSplit/>
+        </w:trPr>
+        <w:tc>
+          <w:tcPr>
+            <w:tcW w:type="dxa" w:w="1249"/>
+            <w:vAlign w:val="center"/>
+            <w:tcBorders>
+              <w:top w:val="single" w:sz="6" w:space="0" w:color="D9D9D9"/>
+              <w:left w:val="single" w:sz="6" w:space="0" w:color="D9D9D9"/>
+              <w:bottom w:val="single" w:sz="6" w:space="0" w:color="D9D9D9"/>
+              <w:right w:val="single" w:sz="6" w:space="0" w:color="D9D9D9"/>
+              <w:insideH w:val="single" w:sz="6" w:space="0" w:color="D9D9D9"/>
+              <w:insideV w:val="single" w:sz="6" w:space="0" w:color="D9D9D9"/>
+            </w:tcBorders>
+            <w:tcMar>
+              <w:top w:w="90" w:type="dxa"/>
+              <w:start w:w="100" w:type="dxa"/>
+              <w:bottom w:w="90" w:type="dxa"/>
+              <w:end w:w="100" w:type="dxa"/>
+            </w:tcMar>
+          </w:tcPr>
+          <w:p>
+            <w:pPr>
+              <w:spacing w:after="0" w:line="240" w:lineRule="auto"/>
+              <w:jc w:val="left"/>
+            </w:pPr>
+            <w:r>
+              <w:rPr>
+                <w:rFonts w:ascii="Arial" w:hAnsi="Arial"/>
+                <w:sz w:val="16"/>
+              </w:rPr>
+              <w:t>W3 primary</w:t>
+            </w:r>
+          </w:p>
+        </w:tc>
+        <w:tc>
+          <w:tcPr>
+            <w:tcW w:type="dxa" w:w="1249"/>
+            <w:vAlign w:val="center"/>
+            <w:tcBorders>
+              <w:top w:val="single" w:sz="6" w:space="0" w:color="D9D9D9"/>
+              <w:left w:val="single" w:sz="6" w:space="0" w:color="D9D9D9"/>
+              <w:bottom w:val="single" w:sz="6" w:space="0" w:color="D9D9D9"/>
+              <w:right w:val="single" w:sz="6" w:space="0" w:color="D9D9D9"/>
+              <w:insideH w:val="single" w:sz="6" w:space="0" w:color="D9D9D9"/>
+              <w:insideV w:val="single" w:sz="6" w:space="0" w:color="D9D9D9"/>
+            </w:tcBorders>
+            <w:tcMar>
+              <w:top w:w="90" w:type="dxa"/>
+              <w:start w:w="100" w:type="dxa"/>
+              <w:bottom w:w="90" w:type="dxa"/>
+              <w:end w:w="100" w:type="dxa"/>
+            </w:tcMar>
+          </w:tcPr>
+          <w:p>
+            <w:pPr>
+              <w:spacing w:after="0" w:line="240" w:lineRule="auto"/>
+              <w:jc w:val="left"/>
+            </w:pPr>
+            <w:r>
+              <w:rPr>
+                <w:rFonts w:ascii="Arial" w:hAnsi="Arial"/>
+                <w:sz w:val="16"/>
+              </w:rPr>
+              <w:t>PA1</w:t>
+            </w:r>
+          </w:p>
+        </w:tc>
+        <w:tc>
+          <w:tcPr>
+            <w:tcW w:type="dxa" w:w="1249"/>
+            <w:vAlign w:val="center"/>
+            <w:tcBorders>
+              <w:top w:val="single" w:sz="6" w:space="0" w:color="D9D9D9"/>
+              <w:left w:val="single" w:sz="6" w:space="0" w:color="D9D9D9"/>
+              <w:bottom w:val="single" w:sz="6" w:space="0" w:color="D9D9D9"/>
+              <w:right w:val="single" w:sz="6" w:space="0" w:color="D9D9D9"/>
+              <w:insideH w:val="single" w:sz="6" w:space="0" w:color="D9D9D9"/>
+              <w:insideV w:val="single" w:sz="6" w:space="0" w:color="D9D9D9"/>
+            </w:tcBorders>
+            <w:tcMar>
+              <w:top w:w="90" w:type="dxa"/>
+              <w:start w:w="100" w:type="dxa"/>
+              <w:bottom w:w="90" w:type="dxa"/>
+              <w:end w:w="100" w:type="dxa"/>
+            </w:tcMar>
+          </w:tcPr>
+          <w:p>
+            <w:pPr>
+              <w:spacing w:after="0" w:line="240" w:lineRule="auto"/>
+              <w:jc w:val="center"/>
+            </w:pPr>
+            <w:r>
+              <w:rPr>
+                <w:rFonts w:ascii="Arial" w:hAnsi="Arial"/>
+                <w:sz w:val="16"/>
+              </w:rPr>
+              <w:t>3,784,125</w:t>
+            </w:r>
+          </w:p>
+        </w:tc>
+        <w:tc>
+          <w:tcPr>
+            <w:tcW w:type="dxa" w:w="1249"/>
+            <w:vAlign w:val="center"/>
+            <w:tcBorders>
+              <w:top w:val="single" w:sz="6" w:space="0" w:color="D9D9D9"/>
+              <w:left w:val="single" w:sz="6" w:space="0" w:color="D9D9D9"/>
+              <w:bottom w:val="single" w:sz="6" w:space="0" w:color="D9D9D9"/>
+              <w:right w:val="single" w:sz="6" w:space="0" w:color="D9D9D9"/>
+              <w:insideH w:val="single" w:sz="6" w:space="0" w:color="D9D9D9"/>
+              <w:insideV w:val="single" w:sz="6" w:space="0" w:color="D9D9D9"/>
+            </w:tcBorders>
+            <w:tcMar>
+              <w:top w:w="90" w:type="dxa"/>
+              <w:start w:w="100" w:type="dxa"/>
+              <w:bottom w:w="90" w:type="dxa"/>
+              <w:end w:w="100" w:type="dxa"/>
+            </w:tcMar>
+          </w:tcPr>
+          <w:p>
+            <w:pPr>
+              <w:spacing w:after="0" w:line="240" w:lineRule="auto"/>
+              <w:jc w:val="center"/>
+            </w:pPr>
+            <w:r>
+              <w:rPr>
+                <w:rFonts w:ascii="Arial" w:hAnsi="Arial"/>
+                <w:sz w:val="16"/>
+              </w:rPr>
+              <w:t>858,085</w:t>
+            </w:r>
+          </w:p>
+        </w:tc>
+        <w:tc>
+          <w:tcPr>
+            <w:tcW w:type="dxa" w:w="1249"/>
+            <w:vAlign w:val="center"/>
+            <w:tcBorders>
+              <w:top w:val="single" w:sz="6" w:space="0" w:color="D9D9D9"/>
+              <w:left w:val="single" w:sz="6" w:space="0" w:color="D9D9D9"/>
+              <w:bottom w:val="single" w:sz="6" w:space="0" w:color="D9D9D9"/>
+              <w:right w:val="single" w:sz="6" w:space="0" w:color="D9D9D9"/>
+              <w:insideH w:val="single" w:sz="6" w:space="0" w:color="D9D9D9"/>
+              <w:insideV w:val="single" w:sz="6" w:space="0" w:color="D9D9D9"/>
+            </w:tcBorders>
+            <w:tcMar>
+              <w:top w:w="90" w:type="dxa"/>
+              <w:start w:w="100" w:type="dxa"/>
+              <w:bottom w:w="90" w:type="dxa"/>
+              <w:end w:w="100" w:type="dxa"/>
+            </w:tcMar>
+          </w:tcPr>
+          <w:p>
+            <w:pPr>
+              <w:spacing w:after="0" w:line="240" w:lineRule="auto"/>
+              <w:jc w:val="center"/>
+            </w:pPr>
+            <w:r>
+              <w:rPr>
+                <w:rFonts w:ascii="Arial" w:hAnsi="Arial"/>
+                <w:sz w:val="16"/>
+              </w:rPr>
+              <w:t>0.9401</w:t>
+            </w:r>
+          </w:p>
+        </w:tc>
+        <w:tc>
+          <w:tcPr>
+            <w:tcW w:type="dxa" w:w="1249"/>
+            <w:vAlign w:val="center"/>
+            <w:tcBorders>
+              <w:top w:val="single" w:sz="6" w:space="0" w:color="D9D9D9"/>
+              <w:left w:val="single" w:sz="6" w:space="0" w:color="D9D9D9"/>
+              <w:bottom w:val="single" w:sz="6" w:space="0" w:color="D9D9D9"/>
+              <w:right w:val="single" w:sz="6" w:space="0" w:color="D9D9D9"/>
+              <w:insideH w:val="single" w:sz="6" w:space="0" w:color="D9D9D9"/>
+              <w:insideV w:val="single" w:sz="6" w:space="0" w:color="D9D9D9"/>
+            </w:tcBorders>
+            <w:tcMar>
+              <w:top w:w="90" w:type="dxa"/>
+              <w:start w:w="100" w:type="dxa"/>
+              <w:bottom w:w="90" w:type="dxa"/>
+              <w:end w:w="100" w:type="dxa"/>
+            </w:tcMar>
+          </w:tcPr>
+          <w:p>
+            <w:pPr>
+              <w:spacing w:after="0" w:line="240" w:lineRule="auto"/>
+              <w:jc w:val="center"/>
+            </w:pPr>
+            <w:r>
+              <w:rPr>
+                <w:rFonts w:ascii="Arial" w:hAnsi="Arial"/>
+                <w:sz w:val="16"/>
+              </w:rPr>
+              <w:t>0.9191</w:t>
+            </w:r>
+          </w:p>
+        </w:tc>
+        <w:tc>
+          <w:tcPr>
+            <w:tcW w:type="dxa" w:w="1249"/>
+            <w:vAlign w:val="center"/>
+            <w:tcBorders>
+              <w:top w:val="single" w:sz="6" w:space="0" w:color="D9D9D9"/>
+              <w:left w:val="single" w:sz="6" w:space="0" w:color="D9D9D9"/>
+              <w:bottom w:val="single" w:sz="6" w:space="0" w:color="D9D9D9"/>
+              <w:right w:val="single" w:sz="6" w:space="0" w:color="D9D9D9"/>
+              <w:insideH w:val="single" w:sz="6" w:space="0" w:color="D9D9D9"/>
+              <w:insideV w:val="single" w:sz="6" w:space="0" w:color="D9D9D9"/>
+            </w:tcBorders>
+            <w:tcMar>
+              <w:top w:w="90" w:type="dxa"/>
+              <w:start w:w="100" w:type="dxa"/>
+              <w:bottom w:w="90" w:type="dxa"/>
+              <w:end w:w="100" w:type="dxa"/>
+            </w:tcMar>
+          </w:tcPr>
+          <w:p>
+            <w:pPr>
+              <w:spacing w:after="0" w:line="240" w:lineRule="auto"/>
+              <w:jc w:val="center"/>
+            </w:pPr>
+            <w:r>
+              <w:rPr>
+                <w:rFonts w:ascii="Arial" w:hAnsi="Arial"/>
+                <w:sz w:val="16"/>
+              </w:rPr>
+              <w:t>89,015</w:t>
+            </w:r>
+          </w:p>
+        </w:tc>
+        <w:tc>
+          <w:tcPr>
+            <w:tcW w:type="dxa" w:w="1249"/>
+            <w:vAlign w:val="center"/>
+            <w:tcBorders>
+              <w:top w:val="single" w:sz="6" w:space="0" w:color="D9D9D9"/>
+              <w:left w:val="single" w:sz="6" w:space="0" w:color="D9D9D9"/>
+              <w:bottom w:val="single" w:sz="6" w:space="0" w:color="D9D9D9"/>
+              <w:right w:val="single" w:sz="6" w:space="0" w:color="D9D9D9"/>
+              <w:insideH w:val="single" w:sz="6" w:space="0" w:color="D9D9D9"/>
+              <w:insideV w:val="single" w:sz="6" w:space="0" w:color="D9D9D9"/>
+            </w:tcBorders>
+            <w:tcMar>
+              <w:top w:w="90" w:type="dxa"/>
+              <w:start w:w="100" w:type="dxa"/>
+              <w:bottom w:w="90" w:type="dxa"/>
+              <w:end w:w="100" w:type="dxa"/>
+            </w:tcMar>
+          </w:tcPr>
+          <w:p>
+            <w:pPr>
+              <w:spacing w:after="0" w:line="240" w:lineRule="auto"/>
+              <w:jc w:val="center"/>
+            </w:pPr>
+            <w:r>
+              <w:rPr>
+                <w:rFonts w:ascii="Arial" w:hAnsi="Arial"/>
+                <w:sz w:val="16"/>
+              </w:rPr>
+              <w:t>0.0386</w:t>
+            </w:r>
+          </w:p>
+        </w:tc>
+      </w:tr>
+      <w:tr>
+        <w:trPr>
+          <w:cantSplit/>
+        </w:trPr>
+        <w:tc>
+          <w:tcPr>
+            <w:tcW w:type="dxa" w:w="1249"/>
+            <w:vAlign w:val="center"/>
+            <w:tcBorders>
+              <w:top w:val="single" w:sz="6" w:space="0" w:color="D9D9D9"/>
+              <w:left w:val="single" w:sz="6" w:space="0" w:color="D9D9D9"/>
+              <w:bottom w:val="single" w:sz="6" w:space="0" w:color="D9D9D9"/>
+              <w:right w:val="single" w:sz="6" w:space="0" w:color="D9D9D9"/>
+              <w:insideH w:val="single" w:sz="6" w:space="0" w:color="D9D9D9"/>
+              <w:insideV w:val="single" w:sz="6" w:space="0" w:color="D9D9D9"/>
+            </w:tcBorders>
+            <w:tcMar>
+              <w:top w:w="90" w:type="dxa"/>
+              <w:start w:w="100" w:type="dxa"/>
+              <w:bottom w:w="90" w:type="dxa"/>
+              <w:end w:w="100" w:type="dxa"/>
+            </w:tcMar>
+            <w:shd w:fill="F2F6FA"/>
+          </w:tcPr>
+          <w:p>
+            <w:pPr>
+              <w:spacing w:after="0" w:line="240" w:lineRule="auto"/>
+              <w:jc w:val="left"/>
+            </w:pPr>
+            <w:r>
+              <w:rPr>
+                <w:rFonts w:ascii="Arial" w:hAnsi="Arial"/>
+                <w:sz w:val="16"/>
+              </w:rPr>
+              <w:t>W3 primary</w:t>
+            </w:r>
+          </w:p>
+        </w:tc>
+        <w:tc>
+          <w:tcPr>
+            <w:tcW w:type="dxa" w:w="1249"/>
+            <w:vAlign w:val="center"/>
+            <w:tcBorders>
+              <w:top w:val="single" w:sz="6" w:space="0" w:color="D9D9D9"/>
+              <w:left w:val="single" w:sz="6" w:space="0" w:color="D9D9D9"/>
+              <w:bottom w:val="single" w:sz="6" w:space="0" w:color="D9D9D9"/>
+              <w:right w:val="single" w:sz="6" w:space="0" w:color="D9D9D9"/>
+              <w:insideH w:val="single" w:sz="6" w:space="0" w:color="D9D9D9"/>
+              <w:insideV w:val="single" w:sz="6" w:space="0" w:color="D9D9D9"/>
+            </w:tcBorders>
+            <w:tcMar>
+              <w:top w:w="90" w:type="dxa"/>
+              <w:start w:w="100" w:type="dxa"/>
+              <w:bottom w:w="90" w:type="dxa"/>
+              <w:end w:w="100" w:type="dxa"/>
+            </w:tcMar>
+            <w:shd w:fill="F2F6FA"/>
+          </w:tcPr>
+          <w:p>
+            <w:pPr>
+              <w:spacing w:after="0" w:line="240" w:lineRule="auto"/>
+              <w:jc w:val="left"/>
+            </w:pPr>
+            <w:r>
+              <w:rPr>
+                <w:rFonts w:ascii="Arial" w:hAnsi="Arial"/>
+                <w:sz w:val="16"/>
+              </w:rPr>
+              <w:t>C4</w:t>
+            </w:r>
+          </w:p>
+        </w:tc>
+        <w:tc>
+          <w:tcPr>
+            <w:tcW w:type="dxa" w:w="1249"/>
+            <w:vAlign w:val="center"/>
+            <w:tcBorders>
+              <w:top w:val="single" w:sz="6" w:space="0" w:color="D9D9D9"/>
+              <w:left w:val="single" w:sz="6" w:space="0" w:color="D9D9D9"/>
+              <w:bottom w:val="single" w:sz="6" w:space="0" w:color="D9D9D9"/>
+              <w:right w:val="single" w:sz="6" w:space="0" w:color="D9D9D9"/>
+              <w:insideH w:val="single" w:sz="6" w:space="0" w:color="D9D9D9"/>
+              <w:insideV w:val="single" w:sz="6" w:space="0" w:color="D9D9D9"/>
+            </w:tcBorders>
+            <w:tcMar>
+              <w:top w:w="90" w:type="dxa"/>
+              <w:start w:w="100" w:type="dxa"/>
+              <w:bottom w:w="90" w:type="dxa"/>
+              <w:end w:w="100" w:type="dxa"/>
+            </w:tcMar>
+            <w:shd w:fill="F2F6FA"/>
+          </w:tcPr>
+          <w:p>
+            <w:pPr>
+              <w:spacing w:after="0" w:line="240" w:lineRule="auto"/>
+              <w:jc w:val="center"/>
+            </w:pPr>
+            <w:r>
+              <w:rPr>
+                <w:rFonts w:ascii="Arial" w:hAnsi="Arial"/>
+                <w:sz w:val="16"/>
+              </w:rPr>
+              <w:t>3,763,181</w:t>
+            </w:r>
+          </w:p>
+        </w:tc>
+        <w:tc>
+          <w:tcPr>
+            <w:tcW w:type="dxa" w:w="1249"/>
+            <w:vAlign w:val="center"/>
+            <w:tcBorders>
+              <w:top w:val="single" w:sz="6" w:space="0" w:color="D9D9D9"/>
+              <w:left w:val="single" w:sz="6" w:space="0" w:color="D9D9D9"/>
+              <w:bottom w:val="single" w:sz="6" w:space="0" w:color="D9D9D9"/>
+              <w:right w:val="single" w:sz="6" w:space="0" w:color="D9D9D9"/>
+              <w:insideH w:val="single" w:sz="6" w:space="0" w:color="D9D9D9"/>
+              <w:insideV w:val="single" w:sz="6" w:space="0" w:color="D9D9D9"/>
+            </w:tcBorders>
+            <w:tcMar>
+              <w:top w:w="90" w:type="dxa"/>
+              <w:start w:w="100" w:type="dxa"/>
+              <w:bottom w:w="90" w:type="dxa"/>
+              <w:end w:w="100" w:type="dxa"/>
+            </w:tcMar>
+            <w:shd w:fill="F2F6FA"/>
+          </w:tcPr>
+          <w:p>
+            <w:pPr>
+              <w:spacing w:after="0" w:line="240" w:lineRule="auto"/>
+              <w:jc w:val="center"/>
+            </w:pPr>
+            <w:r>
+              <w:rPr>
+                <w:rFonts w:ascii="Arial" w:hAnsi="Arial"/>
+                <w:sz w:val="16"/>
+              </w:rPr>
+              <w:t>857,419</w:t>
+            </w:r>
+          </w:p>
+        </w:tc>
+        <w:tc>
+          <w:tcPr>
+            <w:tcW w:type="dxa" w:w="1249"/>
+            <w:vAlign w:val="center"/>
+            <w:tcBorders>
+              <w:top w:val="single" w:sz="6" w:space="0" w:color="D9D9D9"/>
+              <w:left w:val="single" w:sz="6" w:space="0" w:color="D9D9D9"/>
+              <w:bottom w:val="single" w:sz="6" w:space="0" w:color="D9D9D9"/>
+              <w:right w:val="single" w:sz="6" w:space="0" w:color="D9D9D9"/>
+              <w:insideH w:val="single" w:sz="6" w:space="0" w:color="D9D9D9"/>
+              <w:insideV w:val="single" w:sz="6" w:space="0" w:color="D9D9D9"/>
+            </w:tcBorders>
+            <w:tcMar>
+              <w:top w:w="90" w:type="dxa"/>
+              <w:start w:w="100" w:type="dxa"/>
+              <w:bottom w:w="90" w:type="dxa"/>
+              <w:end w:w="100" w:type="dxa"/>
+            </w:tcMar>
+            <w:shd w:fill="F2F6FA"/>
+          </w:tcPr>
+          <w:p>
+            <w:pPr>
+              <w:spacing w:after="0" w:line="240" w:lineRule="auto"/>
+              <w:jc w:val="center"/>
+            </w:pPr>
+            <w:r>
+              <w:rPr>
+                <w:rFonts w:ascii="Arial" w:hAnsi="Arial"/>
+                <w:sz w:val="16"/>
+              </w:rPr>
+              <w:t>0.9434</w:t>
+            </w:r>
+          </w:p>
+        </w:tc>
+        <w:tc>
+          <w:tcPr>
+            <w:tcW w:type="dxa" w:w="1249"/>
+            <w:vAlign w:val="center"/>
+            <w:tcBorders>
+              <w:top w:val="single" w:sz="6" w:space="0" w:color="D9D9D9"/>
+              <w:left w:val="single" w:sz="6" w:space="0" w:color="D9D9D9"/>
+              <w:bottom w:val="single" w:sz="6" w:space="0" w:color="D9D9D9"/>
+              <w:right w:val="single" w:sz="6" w:space="0" w:color="D9D9D9"/>
+              <w:insideH w:val="single" w:sz="6" w:space="0" w:color="D9D9D9"/>
+              <w:insideV w:val="single" w:sz="6" w:space="0" w:color="D9D9D9"/>
+            </w:tcBorders>
+            <w:tcMar>
+              <w:top w:w="90" w:type="dxa"/>
+              <w:start w:w="100" w:type="dxa"/>
+              <w:bottom w:w="90" w:type="dxa"/>
+              <w:end w:w="100" w:type="dxa"/>
+            </w:tcMar>
+            <w:shd w:fill="F2F6FA"/>
+          </w:tcPr>
+          <w:p>
+            <w:pPr>
+              <w:spacing w:after="0" w:line="240" w:lineRule="auto"/>
+              <w:jc w:val="center"/>
+            </w:pPr>
+            <w:r>
+              <w:rPr>
+                <w:rFonts w:ascii="Arial" w:hAnsi="Arial"/>
+                <w:sz w:val="16"/>
+              </w:rPr>
+              <w:t>0.9184</w:t>
+            </w:r>
+          </w:p>
+        </w:tc>
+        <w:tc>
+          <w:tcPr>
+            <w:tcW w:type="dxa" w:w="1249"/>
+            <w:vAlign w:val="center"/>
+            <w:tcBorders>
+              <w:top w:val="single" w:sz="6" w:space="0" w:color="D9D9D9"/>
+              <w:left w:val="single" w:sz="6" w:space="0" w:color="D9D9D9"/>
+              <w:bottom w:val="single" w:sz="6" w:space="0" w:color="D9D9D9"/>
+              <w:right w:val="single" w:sz="6" w:space="0" w:color="D9D9D9"/>
+              <w:insideH w:val="single" w:sz="6" w:space="0" w:color="D9D9D9"/>
+              <w:insideV w:val="single" w:sz="6" w:space="0" w:color="D9D9D9"/>
+            </w:tcBorders>
+            <w:tcMar>
+              <w:top w:w="90" w:type="dxa"/>
+              <w:start w:w="100" w:type="dxa"/>
+              <w:bottom w:w="90" w:type="dxa"/>
+              <w:end w:w="100" w:type="dxa"/>
+            </w:tcMar>
+            <w:shd w:fill="F2F6FA"/>
+          </w:tcPr>
+          <w:p>
+            <w:pPr>
+              <w:spacing w:after="0" w:line="240" w:lineRule="auto"/>
+              <w:jc w:val="center"/>
+            </w:pPr>
+            <w:r>
+              <w:rPr>
+                <w:rFonts w:ascii="Arial" w:hAnsi="Arial"/>
+                <w:sz w:val="16"/>
+              </w:rPr>
+              <w:t>84,189</w:t>
+            </w:r>
+          </w:p>
+        </w:tc>
+        <w:tc>
+          <w:tcPr>
+            <w:tcW w:type="dxa" w:w="1249"/>
+            <w:vAlign w:val="center"/>
+            <w:tcBorders>
+              <w:top w:val="single" w:sz="6" w:space="0" w:color="D9D9D9"/>
+              <w:left w:val="single" w:sz="6" w:space="0" w:color="D9D9D9"/>
+              <w:bottom w:val="single" w:sz="6" w:space="0" w:color="D9D9D9"/>
+              <w:right w:val="single" w:sz="6" w:space="0" w:color="D9D9D9"/>
+              <w:insideH w:val="single" w:sz="6" w:space="0" w:color="D9D9D9"/>
+              <w:insideV w:val="single" w:sz="6" w:space="0" w:color="D9D9D9"/>
+            </w:tcBorders>
+            <w:tcMar>
+              <w:top w:w="90" w:type="dxa"/>
+              <w:start w:w="100" w:type="dxa"/>
+              <w:bottom w:w="90" w:type="dxa"/>
+              <w:end w:w="100" w:type="dxa"/>
+            </w:tcMar>
+            <w:shd w:fill="F2F6FA"/>
+          </w:tcPr>
+          <w:p>
+            <w:pPr>
+              <w:spacing w:after="0" w:line="240" w:lineRule="auto"/>
+              <w:jc w:val="center"/>
+            </w:pPr>
+            <w:r>
+              <w:rPr>
+                <w:rFonts w:ascii="Arial" w:hAnsi="Arial"/>
+                <w:sz w:val="16"/>
+              </w:rPr>
+              <w:t>0.0403</w:t>
+            </w:r>
+          </w:p>
+        </w:tc>
+      </w:tr>
+    </w:tbl>
+    <w:p>
+      <w:pPr>
+        <w:spacing w:after="40"/>
+      </w:pPr>
+    </w:p>
+    <w:p>
+      <w:r>
+        <w:t>PA1 item fill was below C4 in all three windows, while basket fill was higher in W1, lower in W2, and nearly equal in W3. The direction is therefore window-dependent and does not support a universal graph benefit. The external dunnhumby top-300 replay produced full item and basket fill for both graph and popularity buffers, so it is a data-pipeline and transportability check rather than a discriminating policy result.</w:t>
       </w:r>
     </w:p>
     <w:p>
@@ -8063,7 +9964,7 @@
     </w:p>
     <w:p>
       <w:r>
-        <w:t>The primary robustness upgrades are complete: alpha = 1.5 is interior, matching is within 1%, the primary stochastic replay uses 120 replications, bootstrap uncertainty uses 1,000 resamples, and three rolling windows are reported. The remaining uncertainties concern forecast selection, product-universe and graph thresholds, the weekly replay approximation, loss convention, synthetic scenario distributions, and generalization. The second dunnhumby pipeline is separate and non-discriminating because the retained top-product universe has full simulated fill; it does not convert the study into a causal or operational validation.</w:t>
+        <w:t>The primary robustness upgrades are complete: alpha = 1.5 is interior, matching is within 1%, the primary stochastic replay uses 120 replications, bootstrap uncertainty uses 1,000 resamples, and three rolling windows are reported. The primary Phase 3 claim is nevertheless based on one of the twelve synthetic scenarios, S05; the other scenarios remain a broader sensitivity and legacy four-policy record, not equivalent PA1-versus-C4 primary tests. The second dunnhumby pipeline is separate and non-discriminating because the retained top-product universe has full simulated fill; it does not convert the study into a causal or operational validation. The Scopus and Web of Science searches were specified but not run because licensed exports were unavailable, and the reference list is an open-record cross-check rather than a completed database-verified systematic review. The code is publicly archived at GitHub, but no DOI has yet been minted for the repository.</w:t>
       </w:r>
     </w:p>
     <w:p>
@@ -8086,7 +9987,7 @@
     </w:p>
     <w:p>
       <w:r>
-        <w:t>In the primary S05 replay, PA1 improved simulated item and complete-basket fill relative to a tightly matched independent control, but it cost more and performed worse than the popularity-only C4 control. Placebo contrasts were mixed, and three rolling windows did not show a universal direction. The evidence therefore supports a conditional service trade-off, not a graph-specific economic advantage. The extra-inventory explanation is not yet ruled out, and missing inventory, supplier, stockout, and attempted-demand records prevent historical or causal claims. The defensible conclusion is that basket structure remains a candidate coordination signal for controlled offline testing, while popularity is the stronger baseline in this study.</w:t>
+        <w:t>In the primary S05 replay, PA1 improved simulated item and complete-basket fill relative to a tightly matched independent control, but it cost more and performed worse than the popularity-only C4 control. PA1 also exceeded the three common-target placebo buffers, but those comparisons do not identify graph topology as the cause. Three rolling windows did not show a universal direction. The evidence therefore supports a conditional service trade-off, not a graph-specific economic advantage. The extra-inventory explanation is not yet ruled out, and missing inventory, supplier, stockout, and attempted-demand records prevent historical or causal claims. The defensible conclusion is that basket structure remains a candidate coordination signal for controlled offline testing, while popularity is the stronger baseline in this study.</w:t>
       </w:r>
     </w:p>
     <w:p>
@@ -8320,7 +10221,7 @@
     </w:p>
     <w:p>
       <w:r>
-        <w:t>The reproducible code and data package is included with the project as research_data_package/ (research_data_package/). The public data records are UCI Online Retail II (https://doi.org/10.24432/C5CG6D), the separate M5 data release on Zenodo (https://doi.org/10.5281/zenodo.10203108), and the documented dunnhumby Complete Journey release (https://github.com/bltap-plmarket/dunnhumby-complete-journey/releases/tag/v1.0-data), whose source page is dunnhumby Source Files (https://www.dunnhumby.com/source-files/). No public project repository was supplied or created in this environment; the included package is the release-ready code/data artifact and records the exact repository URLs used. UCI identifies Online Retail II as licensed under the Creative Commons Attribution 4.0 International license (CC BY 4.0). Redistribution or adaptation of that source requires appropriate attribution to Daqing Chen and the UCI Machine Learning Repository. The dunnhumby mirror states DbCL-1.0; its terms should be reviewed before redistribution. The M5 files remain subject to their own source terms.</w:t>
+        <w:t>The reproducible code and data package is publicly archived at GitHub (https://github.com/TalhaZabir/basket-aware-inventory-research). The public data records are UCI Online Retail II (https://doi.org/10.24432/C5CG6D), the separate M5 data release on Zenodo (https://doi.org/10.5281/zenodo.10203108), and the documented dunnhumby Complete Journey release (https://github.com/bltap-plmarket/dunnhumby-complete-journey/releases/tag/v1.0-data), whose source page is dunnhumby Source Files (https://www.dunnhumby.com/source-files/). The repository has no DOI yet. UCI identifies Online Retail II as licensed under the Creative Commons Attribution 4.0 International license (CC BY 4.0). Redistribution or adaptation of that source requires appropriate attribution to Daqing Chen and the UCI Machine Learning Repository. The dunnhumby mirror states DbCL-1.0; its terms should be reviewed before redistribution. The M5 files remain subject to their own source terms.</w:t>
       </w:r>
     </w:p>
     <w:tbl>
@@ -16057,7 +17958,7 @@
     </w:p>
     <w:p>
       <w:r>
-        <w:t>Phase status is recorded in results/final_phase_status.md. The main data package and Phase 1–2 execution controls pass; Phase 3 precision targets, Phase 4 external replication, licensed database screening, and automated all-number regeneration remain open and are not presented as completed.</w:t>
+        <w:t>Phase status is recorded in results/final_phase_status.md. Phase 3 precision targets and Phase 4 external replay are complete as separate simulated analyses. Licensed Scopus/Web of Science screening and automated all-number regeneration remain open; they are not presented as completed.</w:t>
       </w:r>
     </w:p>
     <w:p>
@@ -16070,7 +17971,7 @@
     </w:p>
     <w:p>
       <w:r>
-        <w:t>The pooled table in Section 5 is a descriptive summary only. Because the scenarios use different holding and shortage-cost pairs, the following appendix preserves the scenario-level comparisons. Costs are normalized simulation units; service values are means over the available replications.</w:t>
+        <w:t>The pooled table in Section 5 is a descriptive summary only. Because the scenarios use different holding and shortage-cost pairs, the following appendix preserves the legacy four-policy scenario-level comparisons. These rows are not substitutes for equivalent PA1-versus-C4 Phase 3 tests in all twelve scenarios. Costs are normalized simulation units; service values are means over the available replications.</w:t>
       </w:r>
     </w:p>
     <w:tbl>

</xml_diff>

<commit_message>
Complete Gate 1 all-scenario matched analysis
</commit_message>
<xml_diff>
--- a/basket_aware_inventory_full_manuscript_sections_1_to_10.docx
+++ b/basket_aware_inventory_full_manuscript_sections_1_to_10.docx
@@ -1533,7 +1533,7 @@
     </w:p>
     <w:p>
       <w:r>
-        <w:t>Common random numbers are used across policies. Deterministic scenarios use one path; the primary stochastic S05 scenario uses 120 paired paths. At each replication, the independent control is selected from the frozen target grid and, if necessary, one linear interpolation is attempted; the accepted maximum relative inventory gap was 0.79%, below the 1% band. Demand and baskets remain fixed. The primary uncertainty analysis uses 1,000 paired resamples over replications and test weeks; the rolling-origin check repeats the analysis over three chronological windows.</w:t>
+        <w:t>Common random numbers are used across policies. All twelve scenarios are replayed with 120 paired replications; deterministic scenarios repeat the identical demand path so their intervals are degenerate. At each replication, the independent control is selected from the frozen target grid and, if necessary, one linear interpolation is attempted; every accepted comparison is below the 1% band. Demand and baskets remain fixed. The primary uncertainty analysis uses 1,000 paired resamples over replications and test weeks; the rolling-origin check repeats the analysis over three chronological windows.</w:t>
       </w:r>
     </w:p>
     <w:p>
@@ -1571,7 +1571,7 @@
     </w:p>
     <w:p>
       <w:r>
-        <w:t>The earlier Phase 2 edge-level run used alpha = 3.0 at the grid boundary and is retained as historical secondary evidence. The primary analysis supersedes it for interpretation: alpha = 1.5 is interior, the matching tolerance is 1%, and the primary configuration hash is 983c3e4505db8a6efe8fbf2538b2332abad1bb80b35c1c87d0ab8f2741d44097.</w:t>
+        <w:t>The earlier Phase 2 edge-level run used alpha = 3.0 at the grid boundary and is retained as historical secondary evidence. The primary analysis supersedes it for interpretation: alpha = 1.5 is interior, the matching tolerance is 1%, and the primary configuration hash is 70cc7bc98246449e106eb25e81456a03d6364806cdd68953bd9f72523d26d065.</w:t>
       </w:r>
     </w:p>
     <w:p>
@@ -4963,7 +4963,7 @@
     </w:p>
     <w:p>
       <w:r>
-        <w:t>The primary replay is S05: low-variance stochastic lead time, h = 0.15, p = 5.0, and a 120-replication paired design. S05 is one of the twelve synthetic scenarios; it is the only scenario used for the final PA1-versus-C4 Phase 3 estimand. The level table below reports absolute outcomes; intervals are empirical 2.5th–97.5th replication percentiles. C1 is the independent control matched separately to PA1. C2, C3, C4, and C5 are evaluated at the common primary target and are therefore placebo/control contrasts rather than additional inventory-matched independent baselines.</w:t>
+        <w:t>The primary replay covers all twelve synthetic scenarios, with 120 paired replications per scenario and the same 1% inventory-matching rule. The earlier S05 table is retained as a diagnostic in the package, but it is not the headline estimand. Because the scenarios use different h and p values, the headline result is a scenario-clustered mean of within-scenario differences, not a pooled cost level. Replication-level intervals below are normal 95% confidence intervals for the paired mean difference; deterministic scenarios have degenerate intervals.</w:t>
       </w:r>
     </w:p>
     <w:tbl>
@@ -6689,7 +6689,7 @@
     </w:p>
     <w:p>
       <w:r>
-        <w:t>The primary paired contrasts are reported below. PA1−C1 is the inventory-matched independent comparison; PA1−C4 is the graph-on-top-of-popularity test. PA1−C2/C3/C5 are common-target graph-placebo contrasts. Intervals are paired empirical replication intervals; the package also contains 1,000-resample week-and-replication bootstrap intervals, which are used for the primary direction checks.</w:t>
+        <w:t>The primary paired contrasts are PA1−C4, the graph-on-top-of-popularity test, and PA1−C1, the inventory-matched independent comparison. The scenario-clustered results are:</w:t>
       </w:r>
     </w:p>
     <w:tbl>
@@ -6778,7 +6778,7 @@
                 <w:color w:val="FFFFFF"/>
                 <w:sz w:val="17"/>
               </w:rPr>
-              <w:t>Cost difference</w:t>
+              <w:t>Cost difference (95% CI)</w:t>
             </w:r>
           </w:p>
         </w:tc>
@@ -6814,7 +6814,7 @@
                 <w:color w:val="FFFFFF"/>
                 <w:sz w:val="17"/>
               </w:rPr>
-              <w:t>Inventory difference</w:t>
+              <w:t>Inventory difference (95% CI)</w:t>
             </w:r>
           </w:p>
         </w:tc>
@@ -6850,7 +6850,7 @@
                 <w:color w:val="FFFFFF"/>
                 <w:sz w:val="17"/>
               </w:rPr>
-              <w:t>Item-fill difference</w:t>
+              <w:t>Item-fill difference (95% CI)</w:t>
             </w:r>
           </w:p>
         </w:tc>
@@ -6886,7 +6886,7 @@
                 <w:color w:val="FFFFFF"/>
                 <w:sz w:val="17"/>
               </w:rPr>
-              <w:t>Basket-fill difference</w:t>
+              <w:t>Basket-fill difference (95% CI)</w:t>
             </w:r>
           </w:p>
         </w:tc>
@@ -6957,7 +6957,7 @@
                 <w:rFonts w:ascii="Arial" w:hAnsi="Arial"/>
                 <w:sz w:val="16"/>
               </w:rPr>
-              <w:t>+231,712 [227,660, 236,225]</w:t>
+              <w:t>+201,341 [132,942, 269,741]</w:t>
             </w:r>
           </w:p>
         </w:tc>
@@ -6990,7 +6990,7 @@
                 <w:rFonts w:ascii="Arial" w:hAnsi="Arial"/>
                 <w:sz w:val="16"/>
               </w:rPr>
-              <w:t>+10,343 [10,321, 10,380]</w:t>
+              <w:t>+7,585 [4,435, 10,736]</w:t>
             </w:r>
           </w:p>
         </w:tc>
@@ -7023,7 +7023,7 @@
                 <w:rFonts w:ascii="Arial" w:hAnsi="Arial"/>
                 <w:sz w:val="16"/>
               </w:rPr>
-              <w:t>+0.0270 [0.0263, 0.0276]</w:t>
+              <w:t>+0.0268 [0.0260, 0.0276]</w:t>
             </w:r>
           </w:p>
         </w:tc>
@@ -7056,7 +7056,7 @@
                 <w:rFonts w:ascii="Arial" w:hAnsi="Arial"/>
                 <w:sz w:val="16"/>
               </w:rPr>
-              <w:t>+0.0944 [0.0803, 0.1119]</w:t>
+              <w:t>+0.1113 [0.0902, 0.1325]</w:t>
             </w:r>
           </w:p>
         </w:tc>
@@ -7129,7 +7129,7 @@
                 <w:rFonts w:ascii="Arial" w:hAnsi="Arial"/>
                 <w:sz w:val="16"/>
               </w:rPr>
-              <w:t>+168,736 [161,770, 175,981]</w:t>
+              <w:t>+194,213 [113,211, 275,215]</w:t>
             </w:r>
           </w:p>
         </w:tc>
@@ -7163,7 +7163,7 @@
                 <w:rFonts w:ascii="Arial" w:hAnsi="Arial"/>
                 <w:sz w:val="16"/>
               </w:rPr>
-              <w:t>+6,268 [5,514, 7,314]</w:t>
+              <w:t>+6,092 [6,017, 6,168]</w:t>
             </w:r>
           </w:p>
         </w:tc>
@@ -7197,7 +7197,7 @@
                 <w:rFonts w:ascii="Arial" w:hAnsi="Arial"/>
                 <w:sz w:val="16"/>
               </w:rPr>
-              <w:t>−0.0261 [−0.0272, −0.0248]</w:t>
+              <w:t>−0.0258 [−0.0268, −0.0248]</w:t>
             </w:r>
           </w:p>
         </w:tc>
@@ -7231,522 +7231,7 @@
                 <w:rFonts w:ascii="Arial" w:hAnsi="Arial"/>
                 <w:sz w:val="16"/>
               </w:rPr>
-              <w:t>−0.0667 [−0.0849, −0.0493]</w:t>
-            </w:r>
-          </w:p>
-        </w:tc>
-      </w:tr>
-      <w:tr>
-        <w:trPr>
-          <w:cantSplit/>
-        </w:trPr>
-        <w:tc>
-          <w:tcPr>
-            <w:tcW w:type="dxa" w:w="1999"/>
-            <w:vAlign w:val="center"/>
-            <w:tcBorders>
-              <w:top w:val="single" w:sz="6" w:space="0" w:color="D9D9D9"/>
-              <w:left w:val="single" w:sz="6" w:space="0" w:color="D9D9D9"/>
-              <w:bottom w:val="single" w:sz="6" w:space="0" w:color="D9D9D9"/>
-              <w:right w:val="single" w:sz="6" w:space="0" w:color="D9D9D9"/>
-              <w:insideH w:val="single" w:sz="6" w:space="0" w:color="D9D9D9"/>
-              <w:insideV w:val="single" w:sz="6" w:space="0" w:color="D9D9D9"/>
-            </w:tcBorders>
-            <w:tcMar>
-              <w:top w:w="90" w:type="dxa"/>
-              <w:start w:w="100" w:type="dxa"/>
-              <w:bottom w:w="90" w:type="dxa"/>
-              <w:end w:w="100" w:type="dxa"/>
-            </w:tcMar>
-          </w:tcPr>
-          <w:p>
-            <w:pPr>
-              <w:spacing w:after="0" w:line="240" w:lineRule="auto"/>
-              <w:jc w:val="left"/>
-            </w:pPr>
-            <w:r>
-              <w:rPr>
-                <w:rFonts w:ascii="Arial" w:hAnsi="Arial"/>
-                <w:sz w:val="16"/>
-              </w:rPr>
-              <w:t>PA1 − C2</w:t>
-            </w:r>
-          </w:p>
-        </w:tc>
-        <w:tc>
-          <w:tcPr>
-            <w:tcW w:type="dxa" w:w="1999"/>
-            <w:vAlign w:val="center"/>
-            <w:tcBorders>
-              <w:top w:val="single" w:sz="6" w:space="0" w:color="D9D9D9"/>
-              <w:left w:val="single" w:sz="6" w:space="0" w:color="D9D9D9"/>
-              <w:bottom w:val="single" w:sz="6" w:space="0" w:color="D9D9D9"/>
-              <w:right w:val="single" w:sz="6" w:space="0" w:color="D9D9D9"/>
-              <w:insideH w:val="single" w:sz="6" w:space="0" w:color="D9D9D9"/>
-              <w:insideV w:val="single" w:sz="6" w:space="0" w:color="D9D9D9"/>
-            </w:tcBorders>
-            <w:tcMar>
-              <w:top w:w="90" w:type="dxa"/>
-              <w:start w:w="100" w:type="dxa"/>
-              <w:bottom w:w="90" w:type="dxa"/>
-              <w:end w:w="100" w:type="dxa"/>
-            </w:tcMar>
-          </w:tcPr>
-          <w:p>
-            <w:pPr>
-              <w:spacing w:after="0" w:line="240" w:lineRule="auto"/>
-              <w:jc w:val="center"/>
-            </w:pPr>
-            <w:r>
-              <w:rPr>
-                <w:rFonts w:ascii="Arial" w:hAnsi="Arial"/>
-                <w:sz w:val="16"/>
-              </w:rPr>
-              <w:t>−81,252 [−85,980, −76,182]</w:t>
-            </w:r>
-          </w:p>
-        </w:tc>
-        <w:tc>
-          <w:tcPr>
-            <w:tcW w:type="dxa" w:w="1999"/>
-            <w:vAlign w:val="center"/>
-            <w:tcBorders>
-              <w:top w:val="single" w:sz="6" w:space="0" w:color="D9D9D9"/>
-              <w:left w:val="single" w:sz="6" w:space="0" w:color="D9D9D9"/>
-              <w:bottom w:val="single" w:sz="6" w:space="0" w:color="D9D9D9"/>
-              <w:right w:val="single" w:sz="6" w:space="0" w:color="D9D9D9"/>
-              <w:insideH w:val="single" w:sz="6" w:space="0" w:color="D9D9D9"/>
-              <w:insideV w:val="single" w:sz="6" w:space="0" w:color="D9D9D9"/>
-            </w:tcBorders>
-            <w:tcMar>
-              <w:top w:w="90" w:type="dxa"/>
-              <w:start w:w="100" w:type="dxa"/>
-              <w:bottom w:w="90" w:type="dxa"/>
-              <w:end w:w="100" w:type="dxa"/>
-            </w:tcMar>
-          </w:tcPr>
-          <w:p>
-            <w:pPr>
-              <w:spacing w:after="0" w:line="240" w:lineRule="auto"/>
-              <w:jc w:val="center"/>
-            </w:pPr>
-            <w:r>
-              <w:rPr>
-                <w:rFonts w:ascii="Arial" w:hAnsi="Arial"/>
-                <w:sz w:val="16"/>
-              </w:rPr>
-              <w:t>−2,663 [−3,876, −1,074]</w:t>
-            </w:r>
-          </w:p>
-        </w:tc>
-        <w:tc>
-          <w:tcPr>
-            <w:tcW w:type="dxa" w:w="1999"/>
-            <w:vAlign w:val="center"/>
-            <w:tcBorders>
-              <w:top w:val="single" w:sz="6" w:space="0" w:color="D9D9D9"/>
-              <w:left w:val="single" w:sz="6" w:space="0" w:color="D9D9D9"/>
-              <w:bottom w:val="single" w:sz="6" w:space="0" w:color="D9D9D9"/>
-              <w:right w:val="single" w:sz="6" w:space="0" w:color="D9D9D9"/>
-              <w:insideH w:val="single" w:sz="6" w:space="0" w:color="D9D9D9"/>
-              <w:insideV w:val="single" w:sz="6" w:space="0" w:color="D9D9D9"/>
-            </w:tcBorders>
-            <w:tcMar>
-              <w:top w:w="90" w:type="dxa"/>
-              <w:start w:w="100" w:type="dxa"/>
-              <w:bottom w:w="90" w:type="dxa"/>
-              <w:end w:w="100" w:type="dxa"/>
-            </w:tcMar>
-          </w:tcPr>
-          <w:p>
-            <w:pPr>
-              <w:spacing w:after="0" w:line="240" w:lineRule="auto"/>
-              <w:jc w:val="center"/>
-            </w:pPr>
-            <w:r>
-              <w:rPr>
-                <w:rFonts w:ascii="Arial" w:hAnsi="Arial"/>
-                <w:sz w:val="16"/>
-              </w:rPr>
-              <w:t>+0.0121 [+0.0115, +0.0127]</w:t>
-            </w:r>
-          </w:p>
-        </w:tc>
-        <w:tc>
-          <w:tcPr>
-            <w:tcW w:type="dxa" w:w="1999"/>
-            <w:vAlign w:val="center"/>
-            <w:tcBorders>
-              <w:top w:val="single" w:sz="6" w:space="0" w:color="D9D9D9"/>
-              <w:left w:val="single" w:sz="6" w:space="0" w:color="D9D9D9"/>
-              <w:bottom w:val="single" w:sz="6" w:space="0" w:color="D9D9D9"/>
-              <w:right w:val="single" w:sz="6" w:space="0" w:color="D9D9D9"/>
-              <w:insideH w:val="single" w:sz="6" w:space="0" w:color="D9D9D9"/>
-              <w:insideV w:val="single" w:sz="6" w:space="0" w:color="D9D9D9"/>
-            </w:tcBorders>
-            <w:tcMar>
-              <w:top w:w="90" w:type="dxa"/>
-              <w:start w:w="100" w:type="dxa"/>
-              <w:bottom w:w="90" w:type="dxa"/>
-              <w:end w:w="100" w:type="dxa"/>
-            </w:tcMar>
-          </w:tcPr>
-          <w:p>
-            <w:pPr>
-              <w:spacing w:after="0" w:line="240" w:lineRule="auto"/>
-              <w:jc w:val="center"/>
-            </w:pPr>
-            <w:r>
-              <w:rPr>
-                <w:rFonts w:ascii="Arial" w:hAnsi="Arial"/>
-                <w:sz w:val="16"/>
-              </w:rPr>
-              <w:t>+0.0235 [+0.0138, +0.0342]</w:t>
-            </w:r>
-          </w:p>
-        </w:tc>
-      </w:tr>
-      <w:tr>
-        <w:trPr>
-          <w:cantSplit/>
-        </w:trPr>
-        <w:tc>
-          <w:tcPr>
-            <w:tcW w:type="dxa" w:w="1999"/>
-            <w:vAlign w:val="center"/>
-            <w:tcBorders>
-              <w:top w:val="single" w:sz="6" w:space="0" w:color="D9D9D9"/>
-              <w:left w:val="single" w:sz="6" w:space="0" w:color="D9D9D9"/>
-              <w:bottom w:val="single" w:sz="6" w:space="0" w:color="D9D9D9"/>
-              <w:right w:val="single" w:sz="6" w:space="0" w:color="D9D9D9"/>
-              <w:insideH w:val="single" w:sz="6" w:space="0" w:color="D9D9D9"/>
-              <w:insideV w:val="single" w:sz="6" w:space="0" w:color="D9D9D9"/>
-            </w:tcBorders>
-            <w:tcMar>
-              <w:top w:w="90" w:type="dxa"/>
-              <w:start w:w="100" w:type="dxa"/>
-              <w:bottom w:w="90" w:type="dxa"/>
-              <w:end w:w="100" w:type="dxa"/>
-            </w:tcMar>
-            <w:shd w:fill="F2F6FA"/>
-          </w:tcPr>
-          <w:p>
-            <w:pPr>
-              <w:spacing w:after="0" w:line="240" w:lineRule="auto"/>
-              <w:jc w:val="left"/>
-            </w:pPr>
-            <w:r>
-              <w:rPr>
-                <w:rFonts w:ascii="Arial" w:hAnsi="Arial"/>
-                <w:sz w:val="16"/>
-              </w:rPr>
-              <w:t>PA1 − C3</w:t>
-            </w:r>
-          </w:p>
-        </w:tc>
-        <w:tc>
-          <w:tcPr>
-            <w:tcW w:type="dxa" w:w="1999"/>
-            <w:vAlign w:val="center"/>
-            <w:tcBorders>
-              <w:top w:val="single" w:sz="6" w:space="0" w:color="D9D9D9"/>
-              <w:left w:val="single" w:sz="6" w:space="0" w:color="D9D9D9"/>
-              <w:bottom w:val="single" w:sz="6" w:space="0" w:color="D9D9D9"/>
-              <w:right w:val="single" w:sz="6" w:space="0" w:color="D9D9D9"/>
-              <w:insideH w:val="single" w:sz="6" w:space="0" w:color="D9D9D9"/>
-              <w:insideV w:val="single" w:sz="6" w:space="0" w:color="D9D9D9"/>
-            </w:tcBorders>
-            <w:tcMar>
-              <w:top w:w="90" w:type="dxa"/>
-              <w:start w:w="100" w:type="dxa"/>
-              <w:bottom w:w="90" w:type="dxa"/>
-              <w:end w:w="100" w:type="dxa"/>
-            </w:tcMar>
-            <w:shd w:fill="F2F6FA"/>
-          </w:tcPr>
-          <w:p>
-            <w:pPr>
-              <w:spacing w:after="0" w:line="240" w:lineRule="auto"/>
-              <w:jc w:val="center"/>
-            </w:pPr>
-            <w:r>
-              <w:rPr>
-                <w:rFonts w:ascii="Arial" w:hAnsi="Arial"/>
-                <w:sz w:val="16"/>
-              </w:rPr>
-              <w:t>−69,665 [−74,949, −64,060]</w:t>
-            </w:r>
-          </w:p>
-        </w:tc>
-        <w:tc>
-          <w:tcPr>
-            <w:tcW w:type="dxa" w:w="1999"/>
-            <w:vAlign w:val="center"/>
-            <w:tcBorders>
-              <w:top w:val="single" w:sz="6" w:space="0" w:color="D9D9D9"/>
-              <w:left w:val="single" w:sz="6" w:space="0" w:color="D9D9D9"/>
-              <w:bottom w:val="single" w:sz="6" w:space="0" w:color="D9D9D9"/>
-              <w:right w:val="single" w:sz="6" w:space="0" w:color="D9D9D9"/>
-              <w:insideH w:val="single" w:sz="6" w:space="0" w:color="D9D9D9"/>
-              <w:insideV w:val="single" w:sz="6" w:space="0" w:color="D9D9D9"/>
-            </w:tcBorders>
-            <w:tcMar>
-              <w:top w:w="90" w:type="dxa"/>
-              <w:start w:w="100" w:type="dxa"/>
-              <w:bottom w:w="90" w:type="dxa"/>
-              <w:end w:w="100" w:type="dxa"/>
-            </w:tcMar>
-            <w:shd w:fill="F2F6FA"/>
-          </w:tcPr>
-          <w:p>
-            <w:pPr>
-              <w:spacing w:after="0" w:line="240" w:lineRule="auto"/>
-              <w:jc w:val="center"/>
-            </w:pPr>
-            <w:r>
-              <w:rPr>
-                <w:rFonts w:ascii="Arial" w:hAnsi="Arial"/>
-                <w:sz w:val="16"/>
-              </w:rPr>
-              <w:t>−2,122 [−3,824, −246]</w:t>
-            </w:r>
-          </w:p>
-        </w:tc>
-        <w:tc>
-          <w:tcPr>
-            <w:tcW w:type="dxa" w:w="1999"/>
-            <w:vAlign w:val="center"/>
-            <w:tcBorders>
-              <w:top w:val="single" w:sz="6" w:space="0" w:color="D9D9D9"/>
-              <w:left w:val="single" w:sz="6" w:space="0" w:color="D9D9D9"/>
-              <w:bottom w:val="single" w:sz="6" w:space="0" w:color="D9D9D9"/>
-              <w:right w:val="single" w:sz="6" w:space="0" w:color="D9D9D9"/>
-              <w:insideH w:val="single" w:sz="6" w:space="0" w:color="D9D9D9"/>
-              <w:insideV w:val="single" w:sz="6" w:space="0" w:color="D9D9D9"/>
-            </w:tcBorders>
-            <w:tcMar>
-              <w:top w:w="90" w:type="dxa"/>
-              <w:start w:w="100" w:type="dxa"/>
-              <w:bottom w:w="90" w:type="dxa"/>
-              <w:end w:w="100" w:type="dxa"/>
-            </w:tcMar>
-            <w:shd w:fill="F2F6FA"/>
-          </w:tcPr>
-          <w:p>
-            <w:pPr>
-              <w:spacing w:after="0" w:line="240" w:lineRule="auto"/>
-              <w:jc w:val="center"/>
-            </w:pPr>
-            <w:r>
-              <w:rPr>
-                <w:rFonts w:ascii="Arial" w:hAnsi="Arial"/>
-                <w:sz w:val="16"/>
-              </w:rPr>
-              <w:t>+0.0105 [+0.0099, +0.0112]</w:t>
-            </w:r>
-          </w:p>
-        </w:tc>
-        <w:tc>
-          <w:tcPr>
-            <w:tcW w:type="dxa" w:w="1999"/>
-            <w:vAlign w:val="center"/>
-            <w:tcBorders>
-              <w:top w:val="single" w:sz="6" w:space="0" w:color="D9D9D9"/>
-              <w:left w:val="single" w:sz="6" w:space="0" w:color="D9D9D9"/>
-              <w:bottom w:val="single" w:sz="6" w:space="0" w:color="D9D9D9"/>
-              <w:right w:val="single" w:sz="6" w:space="0" w:color="D9D9D9"/>
-              <w:insideH w:val="single" w:sz="6" w:space="0" w:color="D9D9D9"/>
-              <w:insideV w:val="single" w:sz="6" w:space="0" w:color="D9D9D9"/>
-            </w:tcBorders>
-            <w:tcMar>
-              <w:top w:w="90" w:type="dxa"/>
-              <w:start w:w="100" w:type="dxa"/>
-              <w:bottom w:w="90" w:type="dxa"/>
-              <w:end w:w="100" w:type="dxa"/>
-            </w:tcMar>
-            <w:shd w:fill="F2F6FA"/>
-          </w:tcPr>
-          <w:p>
-            <w:pPr>
-              <w:spacing w:after="0" w:line="240" w:lineRule="auto"/>
-              <w:jc w:val="center"/>
-            </w:pPr>
-            <w:r>
-              <w:rPr>
-                <w:rFonts w:ascii="Arial" w:hAnsi="Arial"/>
-                <w:sz w:val="16"/>
-              </w:rPr>
-              <w:t>+0.0352 [+0.0260, +0.0441]</w:t>
-            </w:r>
-          </w:p>
-        </w:tc>
-      </w:tr>
-      <w:tr>
-        <w:trPr>
-          <w:cantSplit/>
-        </w:trPr>
-        <w:tc>
-          <w:tcPr>
-            <w:tcW w:type="dxa" w:w="1999"/>
-            <w:vAlign w:val="center"/>
-            <w:tcBorders>
-              <w:top w:val="single" w:sz="6" w:space="0" w:color="D9D9D9"/>
-              <w:left w:val="single" w:sz="6" w:space="0" w:color="D9D9D9"/>
-              <w:bottom w:val="single" w:sz="6" w:space="0" w:color="D9D9D9"/>
-              <w:right w:val="single" w:sz="6" w:space="0" w:color="D9D9D9"/>
-              <w:insideH w:val="single" w:sz="6" w:space="0" w:color="D9D9D9"/>
-              <w:insideV w:val="single" w:sz="6" w:space="0" w:color="D9D9D9"/>
-            </w:tcBorders>
-            <w:tcMar>
-              <w:top w:w="90" w:type="dxa"/>
-              <w:start w:w="100" w:type="dxa"/>
-              <w:bottom w:w="90" w:type="dxa"/>
-              <w:end w:w="100" w:type="dxa"/>
-            </w:tcMar>
-          </w:tcPr>
-          <w:p>
-            <w:pPr>
-              <w:spacing w:after="0" w:line="240" w:lineRule="auto"/>
-              <w:jc w:val="left"/>
-            </w:pPr>
-            <w:r>
-              <w:rPr>
-                <w:rFonts w:ascii="Arial" w:hAnsi="Arial"/>
-                <w:sz w:val="16"/>
-              </w:rPr>
-              <w:t>PA1 − C5</w:t>
-            </w:r>
-          </w:p>
-        </w:tc>
-        <w:tc>
-          <w:tcPr>
-            <w:tcW w:type="dxa" w:w="1999"/>
-            <w:vAlign w:val="center"/>
-            <w:tcBorders>
-              <w:top w:val="single" w:sz="6" w:space="0" w:color="D9D9D9"/>
-              <w:left w:val="single" w:sz="6" w:space="0" w:color="D9D9D9"/>
-              <w:bottom w:val="single" w:sz="6" w:space="0" w:color="D9D9D9"/>
-              <w:right w:val="single" w:sz="6" w:space="0" w:color="D9D9D9"/>
-              <w:insideH w:val="single" w:sz="6" w:space="0" w:color="D9D9D9"/>
-              <w:insideV w:val="single" w:sz="6" w:space="0" w:color="D9D9D9"/>
-            </w:tcBorders>
-            <w:tcMar>
-              <w:top w:w="90" w:type="dxa"/>
-              <w:start w:w="100" w:type="dxa"/>
-              <w:bottom w:w="90" w:type="dxa"/>
-              <w:end w:w="100" w:type="dxa"/>
-            </w:tcMar>
-          </w:tcPr>
-          <w:p>
-            <w:pPr>
-              <w:spacing w:after="0" w:line="240" w:lineRule="auto"/>
-              <w:jc w:val="center"/>
-            </w:pPr>
-            <w:r>
-              <w:rPr>
-                <w:rFonts w:ascii="Arial" w:hAnsi="Arial"/>
-                <w:sz w:val="16"/>
-              </w:rPr>
-              <w:t>−147,460 [−151,484, −143,045]</w:t>
-            </w:r>
-          </w:p>
-        </w:tc>
-        <w:tc>
-          <w:tcPr>
-            <w:tcW w:type="dxa" w:w="1999"/>
-            <w:vAlign w:val="center"/>
-            <w:tcBorders>
-              <w:top w:val="single" w:sz="6" w:space="0" w:color="D9D9D9"/>
-              <w:left w:val="single" w:sz="6" w:space="0" w:color="D9D9D9"/>
-              <w:bottom w:val="single" w:sz="6" w:space="0" w:color="D9D9D9"/>
-              <w:right w:val="single" w:sz="6" w:space="0" w:color="D9D9D9"/>
-              <w:insideH w:val="single" w:sz="6" w:space="0" w:color="D9D9D9"/>
-              <w:insideV w:val="single" w:sz="6" w:space="0" w:color="D9D9D9"/>
-            </w:tcBorders>
-            <w:tcMar>
-              <w:top w:w="90" w:type="dxa"/>
-              <w:start w:w="100" w:type="dxa"/>
-              <w:bottom w:w="90" w:type="dxa"/>
-              <w:end w:w="100" w:type="dxa"/>
-            </w:tcMar>
-          </w:tcPr>
-          <w:p>
-            <w:pPr>
-              <w:spacing w:after="0" w:line="240" w:lineRule="auto"/>
-              <w:jc w:val="center"/>
-            </w:pPr>
-            <w:r>
-              <w:rPr>
-                <w:rFonts w:ascii="Arial" w:hAnsi="Arial"/>
-                <w:sz w:val="16"/>
-              </w:rPr>
-              <w:t>−4,914 [−6,483, −3,509]</w:t>
-            </w:r>
-          </w:p>
-        </w:tc>
-        <w:tc>
-          <w:tcPr>
-            <w:tcW w:type="dxa" w:w="1999"/>
-            <w:vAlign w:val="center"/>
-            <w:tcBorders>
-              <w:top w:val="single" w:sz="6" w:space="0" w:color="D9D9D9"/>
-              <w:left w:val="single" w:sz="6" w:space="0" w:color="D9D9D9"/>
-              <w:bottom w:val="single" w:sz="6" w:space="0" w:color="D9D9D9"/>
-              <w:right w:val="single" w:sz="6" w:space="0" w:color="D9D9D9"/>
-              <w:insideH w:val="single" w:sz="6" w:space="0" w:color="D9D9D9"/>
-              <w:insideV w:val="single" w:sz="6" w:space="0" w:color="D9D9D9"/>
-            </w:tcBorders>
-            <w:tcMar>
-              <w:top w:w="90" w:type="dxa"/>
-              <w:start w:w="100" w:type="dxa"/>
-              <w:bottom w:w="90" w:type="dxa"/>
-              <w:end w:w="100" w:type="dxa"/>
-            </w:tcMar>
-          </w:tcPr>
-          <w:p>
-            <w:pPr>
-              <w:spacing w:after="0" w:line="240" w:lineRule="auto"/>
-              <w:jc w:val="center"/>
-            </w:pPr>
-            <w:r>
-              <w:rPr>
-                <w:rFonts w:ascii="Arial" w:hAnsi="Arial"/>
-                <w:sz w:val="16"/>
-              </w:rPr>
-              <w:t>+0.0222 [+0.0216, +0.0227]</w:t>
-            </w:r>
-          </w:p>
-        </w:tc>
-        <w:tc>
-          <w:tcPr>
-            <w:tcW w:type="dxa" w:w="1999"/>
-            <w:vAlign w:val="center"/>
-            <w:tcBorders>
-              <w:top w:val="single" w:sz="6" w:space="0" w:color="D9D9D9"/>
-              <w:left w:val="single" w:sz="6" w:space="0" w:color="D9D9D9"/>
-              <w:bottom w:val="single" w:sz="6" w:space="0" w:color="D9D9D9"/>
-              <w:right w:val="single" w:sz="6" w:space="0" w:color="D9D9D9"/>
-              <w:insideH w:val="single" w:sz="6" w:space="0" w:color="D9D9D9"/>
-              <w:insideV w:val="single" w:sz="6" w:space="0" w:color="D9D9D9"/>
-            </w:tcBorders>
-            <w:tcMar>
-              <w:top w:w="90" w:type="dxa"/>
-              <w:start w:w="100" w:type="dxa"/>
-              <w:bottom w:w="90" w:type="dxa"/>
-              <w:end w:w="100" w:type="dxa"/>
-            </w:tcMar>
-          </w:tcPr>
-          <w:p>
-            <w:pPr>
-              <w:spacing w:after="0" w:line="240" w:lineRule="auto"/>
-              <w:jc w:val="center"/>
-            </w:pPr>
-            <w:r>
-              <w:rPr>
-                <w:rFonts w:ascii="Arial" w:hAnsi="Arial"/>
-                <w:sz w:val="16"/>
-              </w:rPr>
-              <w:t>+0.0410 [+0.0339, +0.0486]</w:t>
+              <w:t>−0.0644 [−0.0659, −0.0630]</w:t>
             </w:r>
           </w:p>
         </w:tc>
@@ -7759,7 +7244,1082 @@
     </w:p>
     <w:p>
       <w:r>
-        <w:t>The PA1−C4 bootstrap intervals were cost +110,800 to +228,187, item fill −0.0324 to −0.0189, and basket fill −0.0845 to −0.0509. Thus the primary evidence rejects “graph on top of popularity” in this replay. PA1 beat C2, C3, and C5 on both service measures, but those common-target placebo results do not establish that the original edge topology is the cause of the advantage; they show only that the frozen PA1 allocation outperformed those alternative allocations under the same replay.</w:t>
+        <w:t>The direction is unchanged in every scenario: PA1−C1 is positive for item and basket fill in S01–S12, whereas PA1−C4 is negative for both. Cost differences are positive in every scenario for both contrasts. The per-scenario table, matching-quality table, and forest-plot-ready values are results/phase3_scenario_contrast_summary.csv and results/phase3_matching_quality.csv. Maximum accepted inventory gaps were 0.80% for PA1−C1 and 0.99% for C4−C1; no comparison violated the 1% band.</w:t>
+      </w:r>
+    </w:p>
+    <w:tbl>
+      <w:tblPr>
+        <w:tblStyle w:val="TableGrid"/>
+        <w:tblW w:type="auto" w:w="0"/>
+        <w:jc w:val="center"/>
+        <w:tblLook w:firstColumn="1" w:firstRow="1" w:lastColumn="0" w:lastRow="0" w:noHBand="0" w:noVBand="1" w:val="04A0"/>
+      </w:tblPr>
+      <w:tblGrid>
+        <w:gridCol w:w="1999"/>
+        <w:gridCol w:w="1999"/>
+        <w:gridCol w:w="1999"/>
+        <w:gridCol w:w="1999"/>
+        <w:gridCol w:w="1999"/>
+      </w:tblGrid>
+      <w:tr>
+        <w:trPr>
+          <w:tblHeader w:val="true"/>
+        </w:trPr>
+        <w:tc>
+          <w:tcPr>
+            <w:tcW w:type="dxa" w:w="1999"/>
+            <w:vAlign w:val="center"/>
+            <w:shd w:fill="1F4E79"/>
+            <w:tcBorders>
+              <w:top w:val="single" w:sz="6" w:space="0" w:color="D9D9D9"/>
+              <w:left w:val="single" w:sz="6" w:space="0" w:color="D9D9D9"/>
+              <w:bottom w:val="single" w:sz="6" w:space="0" w:color="D9D9D9"/>
+              <w:right w:val="single" w:sz="6" w:space="0" w:color="D9D9D9"/>
+              <w:insideH w:val="single" w:sz="6" w:space="0" w:color="D9D9D9"/>
+              <w:insideV w:val="single" w:sz="6" w:space="0" w:color="D9D9D9"/>
+            </w:tcBorders>
+            <w:tcMar>
+              <w:top w:w="90" w:type="dxa"/>
+              <w:start w:w="100" w:type="dxa"/>
+              <w:bottom w:w="90" w:type="dxa"/>
+              <w:end w:w="100" w:type="dxa"/>
+            </w:tcMar>
+          </w:tcPr>
+          <w:p>
+            <w:pPr>
+              <w:spacing w:after="0"/>
+              <w:jc w:val="center"/>
+            </w:pPr>
+            <w:r>
+              <w:rPr>
+                <w:rFonts w:ascii="Arial" w:hAnsi="Arial"/>
+                <w:b/>
+                <w:color w:val="FFFFFF"/>
+                <w:sz w:val="17"/>
+              </w:rPr>
+              <w:t>Contrast</w:t>
+            </w:r>
+          </w:p>
+        </w:tc>
+        <w:tc>
+          <w:tcPr>
+            <w:tcW w:type="dxa" w:w="1999"/>
+            <w:vAlign w:val="center"/>
+            <w:shd w:fill="1F4E79"/>
+            <w:tcBorders>
+              <w:top w:val="single" w:sz="6" w:space="0" w:color="D9D9D9"/>
+              <w:left w:val="single" w:sz="6" w:space="0" w:color="D9D9D9"/>
+              <w:bottom w:val="single" w:sz="6" w:space="0" w:color="D9D9D9"/>
+              <w:right w:val="single" w:sz="6" w:space="0" w:color="D9D9D9"/>
+              <w:insideH w:val="single" w:sz="6" w:space="0" w:color="D9D9D9"/>
+              <w:insideV w:val="single" w:sz="6" w:space="0" w:color="D9D9D9"/>
+            </w:tcBorders>
+            <w:tcMar>
+              <w:top w:w="90" w:type="dxa"/>
+              <w:start w:w="100" w:type="dxa"/>
+              <w:bottom w:w="90" w:type="dxa"/>
+              <w:end w:w="100" w:type="dxa"/>
+            </w:tcMar>
+          </w:tcPr>
+          <w:p>
+            <w:pPr>
+              <w:spacing w:after="0"/>
+              <w:jc w:val="center"/>
+            </w:pPr>
+            <w:r>
+              <w:rPr>
+                <w:rFonts w:ascii="Arial" w:hAnsi="Arial"/>
+                <w:b/>
+                <w:color w:val="FFFFFF"/>
+                <w:sz w:val="17"/>
+              </w:rPr>
+              <w:t>Cost difference</w:t>
+            </w:r>
+          </w:p>
+        </w:tc>
+        <w:tc>
+          <w:tcPr>
+            <w:tcW w:type="dxa" w:w="1999"/>
+            <w:vAlign w:val="center"/>
+            <w:shd w:fill="1F4E79"/>
+            <w:tcBorders>
+              <w:top w:val="single" w:sz="6" w:space="0" w:color="D9D9D9"/>
+              <w:left w:val="single" w:sz="6" w:space="0" w:color="D9D9D9"/>
+              <w:bottom w:val="single" w:sz="6" w:space="0" w:color="D9D9D9"/>
+              <w:right w:val="single" w:sz="6" w:space="0" w:color="D9D9D9"/>
+              <w:insideH w:val="single" w:sz="6" w:space="0" w:color="D9D9D9"/>
+              <w:insideV w:val="single" w:sz="6" w:space="0" w:color="D9D9D9"/>
+            </w:tcBorders>
+            <w:tcMar>
+              <w:top w:w="90" w:type="dxa"/>
+              <w:start w:w="100" w:type="dxa"/>
+              <w:bottom w:w="90" w:type="dxa"/>
+              <w:end w:w="100" w:type="dxa"/>
+            </w:tcMar>
+          </w:tcPr>
+          <w:p>
+            <w:pPr>
+              <w:spacing w:after="0"/>
+              <w:jc w:val="center"/>
+            </w:pPr>
+            <w:r>
+              <w:rPr>
+                <w:rFonts w:ascii="Arial" w:hAnsi="Arial"/>
+                <w:b/>
+                <w:color w:val="FFFFFF"/>
+                <w:sz w:val="17"/>
+              </w:rPr>
+              <w:t>Inventory difference</w:t>
+            </w:r>
+          </w:p>
+        </w:tc>
+        <w:tc>
+          <w:tcPr>
+            <w:tcW w:type="dxa" w:w="1999"/>
+            <w:vAlign w:val="center"/>
+            <w:shd w:fill="1F4E79"/>
+            <w:tcBorders>
+              <w:top w:val="single" w:sz="6" w:space="0" w:color="D9D9D9"/>
+              <w:left w:val="single" w:sz="6" w:space="0" w:color="D9D9D9"/>
+              <w:bottom w:val="single" w:sz="6" w:space="0" w:color="D9D9D9"/>
+              <w:right w:val="single" w:sz="6" w:space="0" w:color="D9D9D9"/>
+              <w:insideH w:val="single" w:sz="6" w:space="0" w:color="D9D9D9"/>
+              <w:insideV w:val="single" w:sz="6" w:space="0" w:color="D9D9D9"/>
+            </w:tcBorders>
+            <w:tcMar>
+              <w:top w:w="90" w:type="dxa"/>
+              <w:start w:w="100" w:type="dxa"/>
+              <w:bottom w:w="90" w:type="dxa"/>
+              <w:end w:w="100" w:type="dxa"/>
+            </w:tcMar>
+          </w:tcPr>
+          <w:p>
+            <w:pPr>
+              <w:spacing w:after="0"/>
+              <w:jc w:val="center"/>
+            </w:pPr>
+            <w:r>
+              <w:rPr>
+                <w:rFonts w:ascii="Arial" w:hAnsi="Arial"/>
+                <w:b/>
+                <w:color w:val="FFFFFF"/>
+                <w:sz w:val="17"/>
+              </w:rPr>
+              <w:t>Item-fill difference</w:t>
+            </w:r>
+          </w:p>
+        </w:tc>
+        <w:tc>
+          <w:tcPr>
+            <w:tcW w:type="dxa" w:w="1999"/>
+            <w:vAlign w:val="center"/>
+            <w:shd w:fill="1F4E79"/>
+            <w:tcBorders>
+              <w:top w:val="single" w:sz="6" w:space="0" w:color="D9D9D9"/>
+              <w:left w:val="single" w:sz="6" w:space="0" w:color="D9D9D9"/>
+              <w:bottom w:val="single" w:sz="6" w:space="0" w:color="D9D9D9"/>
+              <w:right w:val="single" w:sz="6" w:space="0" w:color="D9D9D9"/>
+              <w:insideH w:val="single" w:sz="6" w:space="0" w:color="D9D9D9"/>
+              <w:insideV w:val="single" w:sz="6" w:space="0" w:color="D9D9D9"/>
+            </w:tcBorders>
+            <w:tcMar>
+              <w:top w:w="90" w:type="dxa"/>
+              <w:start w:w="100" w:type="dxa"/>
+              <w:bottom w:w="90" w:type="dxa"/>
+              <w:end w:w="100" w:type="dxa"/>
+            </w:tcMar>
+          </w:tcPr>
+          <w:p>
+            <w:pPr>
+              <w:spacing w:after="0"/>
+              <w:jc w:val="center"/>
+            </w:pPr>
+            <w:r>
+              <w:rPr>
+                <w:rFonts w:ascii="Arial" w:hAnsi="Arial"/>
+                <w:b/>
+                <w:color w:val="FFFFFF"/>
+                <w:sz w:val="17"/>
+              </w:rPr>
+              <w:t>Basket-fill difference</w:t>
+            </w:r>
+          </w:p>
+        </w:tc>
+      </w:tr>
+      <w:tr>
+        <w:trPr>
+          <w:cantSplit/>
+        </w:trPr>
+        <w:tc>
+          <w:tcPr>
+            <w:tcW w:type="dxa" w:w="1999"/>
+            <w:vAlign w:val="center"/>
+            <w:tcBorders>
+              <w:top w:val="single" w:sz="6" w:space="0" w:color="D9D9D9"/>
+              <w:left w:val="single" w:sz="6" w:space="0" w:color="D9D9D9"/>
+              <w:bottom w:val="single" w:sz="6" w:space="0" w:color="D9D9D9"/>
+              <w:right w:val="single" w:sz="6" w:space="0" w:color="D9D9D9"/>
+              <w:insideH w:val="single" w:sz="6" w:space="0" w:color="D9D9D9"/>
+              <w:insideV w:val="single" w:sz="6" w:space="0" w:color="D9D9D9"/>
+            </w:tcBorders>
+            <w:tcMar>
+              <w:top w:w="90" w:type="dxa"/>
+              <w:start w:w="100" w:type="dxa"/>
+              <w:bottom w:w="90" w:type="dxa"/>
+              <w:end w:w="100" w:type="dxa"/>
+            </w:tcMar>
+          </w:tcPr>
+          <w:p>
+            <w:pPr>
+              <w:spacing w:after="0" w:line="240" w:lineRule="auto"/>
+              <w:jc w:val="left"/>
+            </w:pPr>
+            <w:r>
+              <w:rPr>
+                <w:rFonts w:ascii="Arial" w:hAnsi="Arial"/>
+                <w:sz w:val="16"/>
+              </w:rPr>
+              <w:t>PA1 − C1</w:t>
+            </w:r>
+          </w:p>
+        </w:tc>
+        <w:tc>
+          <w:tcPr>
+            <w:tcW w:type="dxa" w:w="1999"/>
+            <w:vAlign w:val="center"/>
+            <w:tcBorders>
+              <w:top w:val="single" w:sz="6" w:space="0" w:color="D9D9D9"/>
+              <w:left w:val="single" w:sz="6" w:space="0" w:color="D9D9D9"/>
+              <w:bottom w:val="single" w:sz="6" w:space="0" w:color="D9D9D9"/>
+              <w:right w:val="single" w:sz="6" w:space="0" w:color="D9D9D9"/>
+              <w:insideH w:val="single" w:sz="6" w:space="0" w:color="D9D9D9"/>
+              <w:insideV w:val="single" w:sz="6" w:space="0" w:color="D9D9D9"/>
+            </w:tcBorders>
+            <w:tcMar>
+              <w:top w:w="90" w:type="dxa"/>
+              <w:start w:w="100" w:type="dxa"/>
+              <w:bottom w:w="90" w:type="dxa"/>
+              <w:end w:w="100" w:type="dxa"/>
+            </w:tcMar>
+          </w:tcPr>
+          <w:p>
+            <w:pPr>
+              <w:spacing w:after="0" w:line="240" w:lineRule="auto"/>
+              <w:jc w:val="center"/>
+            </w:pPr>
+            <w:r>
+              <w:rPr>
+                <w:rFonts w:ascii="Arial" w:hAnsi="Arial"/>
+                <w:sz w:val="16"/>
+              </w:rPr>
+              <w:t>+231,712 [227,660, 236,225]</w:t>
+            </w:r>
+          </w:p>
+        </w:tc>
+        <w:tc>
+          <w:tcPr>
+            <w:tcW w:type="dxa" w:w="1999"/>
+            <w:vAlign w:val="center"/>
+            <w:tcBorders>
+              <w:top w:val="single" w:sz="6" w:space="0" w:color="D9D9D9"/>
+              <w:left w:val="single" w:sz="6" w:space="0" w:color="D9D9D9"/>
+              <w:bottom w:val="single" w:sz="6" w:space="0" w:color="D9D9D9"/>
+              <w:right w:val="single" w:sz="6" w:space="0" w:color="D9D9D9"/>
+              <w:insideH w:val="single" w:sz="6" w:space="0" w:color="D9D9D9"/>
+              <w:insideV w:val="single" w:sz="6" w:space="0" w:color="D9D9D9"/>
+            </w:tcBorders>
+            <w:tcMar>
+              <w:top w:w="90" w:type="dxa"/>
+              <w:start w:w="100" w:type="dxa"/>
+              <w:bottom w:w="90" w:type="dxa"/>
+              <w:end w:w="100" w:type="dxa"/>
+            </w:tcMar>
+          </w:tcPr>
+          <w:p>
+            <w:pPr>
+              <w:spacing w:after="0" w:line="240" w:lineRule="auto"/>
+              <w:jc w:val="center"/>
+            </w:pPr>
+            <w:r>
+              <w:rPr>
+                <w:rFonts w:ascii="Arial" w:hAnsi="Arial"/>
+                <w:sz w:val="16"/>
+              </w:rPr>
+              <w:t>+10,343 [10,321, 10,380]</w:t>
+            </w:r>
+          </w:p>
+        </w:tc>
+        <w:tc>
+          <w:tcPr>
+            <w:tcW w:type="dxa" w:w="1999"/>
+            <w:vAlign w:val="center"/>
+            <w:tcBorders>
+              <w:top w:val="single" w:sz="6" w:space="0" w:color="D9D9D9"/>
+              <w:left w:val="single" w:sz="6" w:space="0" w:color="D9D9D9"/>
+              <w:bottom w:val="single" w:sz="6" w:space="0" w:color="D9D9D9"/>
+              <w:right w:val="single" w:sz="6" w:space="0" w:color="D9D9D9"/>
+              <w:insideH w:val="single" w:sz="6" w:space="0" w:color="D9D9D9"/>
+              <w:insideV w:val="single" w:sz="6" w:space="0" w:color="D9D9D9"/>
+            </w:tcBorders>
+            <w:tcMar>
+              <w:top w:w="90" w:type="dxa"/>
+              <w:start w:w="100" w:type="dxa"/>
+              <w:bottom w:w="90" w:type="dxa"/>
+              <w:end w:w="100" w:type="dxa"/>
+            </w:tcMar>
+          </w:tcPr>
+          <w:p>
+            <w:pPr>
+              <w:spacing w:after="0" w:line="240" w:lineRule="auto"/>
+              <w:jc w:val="center"/>
+            </w:pPr>
+            <w:r>
+              <w:rPr>
+                <w:rFonts w:ascii="Arial" w:hAnsi="Arial"/>
+                <w:sz w:val="16"/>
+              </w:rPr>
+              <w:t>+0.0270 [0.0263, 0.0276]</w:t>
+            </w:r>
+          </w:p>
+        </w:tc>
+        <w:tc>
+          <w:tcPr>
+            <w:tcW w:type="dxa" w:w="1999"/>
+            <w:vAlign w:val="center"/>
+            <w:tcBorders>
+              <w:top w:val="single" w:sz="6" w:space="0" w:color="D9D9D9"/>
+              <w:left w:val="single" w:sz="6" w:space="0" w:color="D9D9D9"/>
+              <w:bottom w:val="single" w:sz="6" w:space="0" w:color="D9D9D9"/>
+              <w:right w:val="single" w:sz="6" w:space="0" w:color="D9D9D9"/>
+              <w:insideH w:val="single" w:sz="6" w:space="0" w:color="D9D9D9"/>
+              <w:insideV w:val="single" w:sz="6" w:space="0" w:color="D9D9D9"/>
+            </w:tcBorders>
+            <w:tcMar>
+              <w:top w:w="90" w:type="dxa"/>
+              <w:start w:w="100" w:type="dxa"/>
+              <w:bottom w:w="90" w:type="dxa"/>
+              <w:end w:w="100" w:type="dxa"/>
+            </w:tcMar>
+          </w:tcPr>
+          <w:p>
+            <w:pPr>
+              <w:spacing w:after="0" w:line="240" w:lineRule="auto"/>
+              <w:jc w:val="center"/>
+            </w:pPr>
+            <w:r>
+              <w:rPr>
+                <w:rFonts w:ascii="Arial" w:hAnsi="Arial"/>
+                <w:sz w:val="16"/>
+              </w:rPr>
+              <w:t>+0.0944 [0.0803, 0.1119]</w:t>
+            </w:r>
+          </w:p>
+        </w:tc>
+      </w:tr>
+      <w:tr>
+        <w:trPr>
+          <w:cantSplit/>
+        </w:trPr>
+        <w:tc>
+          <w:tcPr>
+            <w:tcW w:type="dxa" w:w="1999"/>
+            <w:vAlign w:val="center"/>
+            <w:tcBorders>
+              <w:top w:val="single" w:sz="6" w:space="0" w:color="D9D9D9"/>
+              <w:left w:val="single" w:sz="6" w:space="0" w:color="D9D9D9"/>
+              <w:bottom w:val="single" w:sz="6" w:space="0" w:color="D9D9D9"/>
+              <w:right w:val="single" w:sz="6" w:space="0" w:color="D9D9D9"/>
+              <w:insideH w:val="single" w:sz="6" w:space="0" w:color="D9D9D9"/>
+              <w:insideV w:val="single" w:sz="6" w:space="0" w:color="D9D9D9"/>
+            </w:tcBorders>
+            <w:tcMar>
+              <w:top w:w="90" w:type="dxa"/>
+              <w:start w:w="100" w:type="dxa"/>
+              <w:bottom w:w="90" w:type="dxa"/>
+              <w:end w:w="100" w:type="dxa"/>
+            </w:tcMar>
+            <w:shd w:fill="F2F6FA"/>
+          </w:tcPr>
+          <w:p>
+            <w:pPr>
+              <w:spacing w:after="0" w:line="240" w:lineRule="auto"/>
+              <w:jc w:val="left"/>
+            </w:pPr>
+            <w:r>
+              <w:rPr>
+                <w:rFonts w:ascii="Arial" w:hAnsi="Arial"/>
+                <w:sz w:val="16"/>
+              </w:rPr>
+              <w:t>PA1 − C4</w:t>
+            </w:r>
+          </w:p>
+        </w:tc>
+        <w:tc>
+          <w:tcPr>
+            <w:tcW w:type="dxa" w:w="1999"/>
+            <w:vAlign w:val="center"/>
+            <w:tcBorders>
+              <w:top w:val="single" w:sz="6" w:space="0" w:color="D9D9D9"/>
+              <w:left w:val="single" w:sz="6" w:space="0" w:color="D9D9D9"/>
+              <w:bottom w:val="single" w:sz="6" w:space="0" w:color="D9D9D9"/>
+              <w:right w:val="single" w:sz="6" w:space="0" w:color="D9D9D9"/>
+              <w:insideH w:val="single" w:sz="6" w:space="0" w:color="D9D9D9"/>
+              <w:insideV w:val="single" w:sz="6" w:space="0" w:color="D9D9D9"/>
+            </w:tcBorders>
+            <w:tcMar>
+              <w:top w:w="90" w:type="dxa"/>
+              <w:start w:w="100" w:type="dxa"/>
+              <w:bottom w:w="90" w:type="dxa"/>
+              <w:end w:w="100" w:type="dxa"/>
+            </w:tcMar>
+            <w:shd w:fill="F2F6FA"/>
+          </w:tcPr>
+          <w:p>
+            <w:pPr>
+              <w:spacing w:after="0" w:line="240" w:lineRule="auto"/>
+              <w:jc w:val="center"/>
+            </w:pPr>
+            <w:r>
+              <w:rPr>
+                <w:rFonts w:ascii="Arial" w:hAnsi="Arial"/>
+                <w:sz w:val="16"/>
+              </w:rPr>
+              <w:t>+168,736 [161,770, 175,981]</w:t>
+            </w:r>
+          </w:p>
+        </w:tc>
+        <w:tc>
+          <w:tcPr>
+            <w:tcW w:type="dxa" w:w="1999"/>
+            <w:vAlign w:val="center"/>
+            <w:tcBorders>
+              <w:top w:val="single" w:sz="6" w:space="0" w:color="D9D9D9"/>
+              <w:left w:val="single" w:sz="6" w:space="0" w:color="D9D9D9"/>
+              <w:bottom w:val="single" w:sz="6" w:space="0" w:color="D9D9D9"/>
+              <w:right w:val="single" w:sz="6" w:space="0" w:color="D9D9D9"/>
+              <w:insideH w:val="single" w:sz="6" w:space="0" w:color="D9D9D9"/>
+              <w:insideV w:val="single" w:sz="6" w:space="0" w:color="D9D9D9"/>
+            </w:tcBorders>
+            <w:tcMar>
+              <w:top w:w="90" w:type="dxa"/>
+              <w:start w:w="100" w:type="dxa"/>
+              <w:bottom w:w="90" w:type="dxa"/>
+              <w:end w:w="100" w:type="dxa"/>
+            </w:tcMar>
+            <w:shd w:fill="F2F6FA"/>
+          </w:tcPr>
+          <w:p>
+            <w:pPr>
+              <w:spacing w:after="0" w:line="240" w:lineRule="auto"/>
+              <w:jc w:val="center"/>
+            </w:pPr>
+            <w:r>
+              <w:rPr>
+                <w:rFonts w:ascii="Arial" w:hAnsi="Arial"/>
+                <w:sz w:val="16"/>
+              </w:rPr>
+              <w:t>+6,268 [5,514, 7,314]</w:t>
+            </w:r>
+          </w:p>
+        </w:tc>
+        <w:tc>
+          <w:tcPr>
+            <w:tcW w:type="dxa" w:w="1999"/>
+            <w:vAlign w:val="center"/>
+            <w:tcBorders>
+              <w:top w:val="single" w:sz="6" w:space="0" w:color="D9D9D9"/>
+              <w:left w:val="single" w:sz="6" w:space="0" w:color="D9D9D9"/>
+              <w:bottom w:val="single" w:sz="6" w:space="0" w:color="D9D9D9"/>
+              <w:right w:val="single" w:sz="6" w:space="0" w:color="D9D9D9"/>
+              <w:insideH w:val="single" w:sz="6" w:space="0" w:color="D9D9D9"/>
+              <w:insideV w:val="single" w:sz="6" w:space="0" w:color="D9D9D9"/>
+            </w:tcBorders>
+            <w:tcMar>
+              <w:top w:w="90" w:type="dxa"/>
+              <w:start w:w="100" w:type="dxa"/>
+              <w:bottom w:w="90" w:type="dxa"/>
+              <w:end w:w="100" w:type="dxa"/>
+            </w:tcMar>
+            <w:shd w:fill="F2F6FA"/>
+          </w:tcPr>
+          <w:p>
+            <w:pPr>
+              <w:spacing w:after="0" w:line="240" w:lineRule="auto"/>
+              <w:jc w:val="center"/>
+            </w:pPr>
+            <w:r>
+              <w:rPr>
+                <w:rFonts w:ascii="Arial" w:hAnsi="Arial"/>
+                <w:sz w:val="16"/>
+              </w:rPr>
+              <w:t>−0.0261 [−0.0272, −0.0248]</w:t>
+            </w:r>
+          </w:p>
+        </w:tc>
+        <w:tc>
+          <w:tcPr>
+            <w:tcW w:type="dxa" w:w="1999"/>
+            <w:vAlign w:val="center"/>
+            <w:tcBorders>
+              <w:top w:val="single" w:sz="6" w:space="0" w:color="D9D9D9"/>
+              <w:left w:val="single" w:sz="6" w:space="0" w:color="D9D9D9"/>
+              <w:bottom w:val="single" w:sz="6" w:space="0" w:color="D9D9D9"/>
+              <w:right w:val="single" w:sz="6" w:space="0" w:color="D9D9D9"/>
+              <w:insideH w:val="single" w:sz="6" w:space="0" w:color="D9D9D9"/>
+              <w:insideV w:val="single" w:sz="6" w:space="0" w:color="D9D9D9"/>
+            </w:tcBorders>
+            <w:tcMar>
+              <w:top w:w="90" w:type="dxa"/>
+              <w:start w:w="100" w:type="dxa"/>
+              <w:bottom w:w="90" w:type="dxa"/>
+              <w:end w:w="100" w:type="dxa"/>
+            </w:tcMar>
+            <w:shd w:fill="F2F6FA"/>
+          </w:tcPr>
+          <w:p>
+            <w:pPr>
+              <w:spacing w:after="0" w:line="240" w:lineRule="auto"/>
+              <w:jc w:val="center"/>
+            </w:pPr>
+            <w:r>
+              <w:rPr>
+                <w:rFonts w:ascii="Arial" w:hAnsi="Arial"/>
+                <w:sz w:val="16"/>
+              </w:rPr>
+              <w:t>−0.0667 [−0.0849, −0.0493]</w:t>
+            </w:r>
+          </w:p>
+        </w:tc>
+      </w:tr>
+      <w:tr>
+        <w:trPr>
+          <w:cantSplit/>
+        </w:trPr>
+        <w:tc>
+          <w:tcPr>
+            <w:tcW w:type="dxa" w:w="1999"/>
+            <w:vAlign w:val="center"/>
+            <w:tcBorders>
+              <w:top w:val="single" w:sz="6" w:space="0" w:color="D9D9D9"/>
+              <w:left w:val="single" w:sz="6" w:space="0" w:color="D9D9D9"/>
+              <w:bottom w:val="single" w:sz="6" w:space="0" w:color="D9D9D9"/>
+              <w:right w:val="single" w:sz="6" w:space="0" w:color="D9D9D9"/>
+              <w:insideH w:val="single" w:sz="6" w:space="0" w:color="D9D9D9"/>
+              <w:insideV w:val="single" w:sz="6" w:space="0" w:color="D9D9D9"/>
+            </w:tcBorders>
+            <w:tcMar>
+              <w:top w:w="90" w:type="dxa"/>
+              <w:start w:w="100" w:type="dxa"/>
+              <w:bottom w:w="90" w:type="dxa"/>
+              <w:end w:w="100" w:type="dxa"/>
+            </w:tcMar>
+          </w:tcPr>
+          <w:p>
+            <w:pPr>
+              <w:spacing w:after="0" w:line="240" w:lineRule="auto"/>
+              <w:jc w:val="left"/>
+            </w:pPr>
+            <w:r>
+              <w:rPr>
+                <w:rFonts w:ascii="Arial" w:hAnsi="Arial"/>
+                <w:sz w:val="16"/>
+              </w:rPr>
+              <w:t>PA1 − C2</w:t>
+            </w:r>
+          </w:p>
+        </w:tc>
+        <w:tc>
+          <w:tcPr>
+            <w:tcW w:type="dxa" w:w="1999"/>
+            <w:vAlign w:val="center"/>
+            <w:tcBorders>
+              <w:top w:val="single" w:sz="6" w:space="0" w:color="D9D9D9"/>
+              <w:left w:val="single" w:sz="6" w:space="0" w:color="D9D9D9"/>
+              <w:bottom w:val="single" w:sz="6" w:space="0" w:color="D9D9D9"/>
+              <w:right w:val="single" w:sz="6" w:space="0" w:color="D9D9D9"/>
+              <w:insideH w:val="single" w:sz="6" w:space="0" w:color="D9D9D9"/>
+              <w:insideV w:val="single" w:sz="6" w:space="0" w:color="D9D9D9"/>
+            </w:tcBorders>
+            <w:tcMar>
+              <w:top w:w="90" w:type="dxa"/>
+              <w:start w:w="100" w:type="dxa"/>
+              <w:bottom w:w="90" w:type="dxa"/>
+              <w:end w:w="100" w:type="dxa"/>
+            </w:tcMar>
+          </w:tcPr>
+          <w:p>
+            <w:pPr>
+              <w:spacing w:after="0" w:line="240" w:lineRule="auto"/>
+              <w:jc w:val="center"/>
+            </w:pPr>
+            <w:r>
+              <w:rPr>
+                <w:rFonts w:ascii="Arial" w:hAnsi="Arial"/>
+                <w:sz w:val="16"/>
+              </w:rPr>
+              <w:t>−81,252 [−85,980, −76,182]</w:t>
+            </w:r>
+          </w:p>
+        </w:tc>
+        <w:tc>
+          <w:tcPr>
+            <w:tcW w:type="dxa" w:w="1999"/>
+            <w:vAlign w:val="center"/>
+            <w:tcBorders>
+              <w:top w:val="single" w:sz="6" w:space="0" w:color="D9D9D9"/>
+              <w:left w:val="single" w:sz="6" w:space="0" w:color="D9D9D9"/>
+              <w:bottom w:val="single" w:sz="6" w:space="0" w:color="D9D9D9"/>
+              <w:right w:val="single" w:sz="6" w:space="0" w:color="D9D9D9"/>
+              <w:insideH w:val="single" w:sz="6" w:space="0" w:color="D9D9D9"/>
+              <w:insideV w:val="single" w:sz="6" w:space="0" w:color="D9D9D9"/>
+            </w:tcBorders>
+            <w:tcMar>
+              <w:top w:w="90" w:type="dxa"/>
+              <w:start w:w="100" w:type="dxa"/>
+              <w:bottom w:w="90" w:type="dxa"/>
+              <w:end w:w="100" w:type="dxa"/>
+            </w:tcMar>
+          </w:tcPr>
+          <w:p>
+            <w:pPr>
+              <w:spacing w:after="0" w:line="240" w:lineRule="auto"/>
+              <w:jc w:val="center"/>
+            </w:pPr>
+            <w:r>
+              <w:rPr>
+                <w:rFonts w:ascii="Arial" w:hAnsi="Arial"/>
+                <w:sz w:val="16"/>
+              </w:rPr>
+              <w:t>−2,663 [−3,876, −1,074]</w:t>
+            </w:r>
+          </w:p>
+        </w:tc>
+        <w:tc>
+          <w:tcPr>
+            <w:tcW w:type="dxa" w:w="1999"/>
+            <w:vAlign w:val="center"/>
+            <w:tcBorders>
+              <w:top w:val="single" w:sz="6" w:space="0" w:color="D9D9D9"/>
+              <w:left w:val="single" w:sz="6" w:space="0" w:color="D9D9D9"/>
+              <w:bottom w:val="single" w:sz="6" w:space="0" w:color="D9D9D9"/>
+              <w:right w:val="single" w:sz="6" w:space="0" w:color="D9D9D9"/>
+              <w:insideH w:val="single" w:sz="6" w:space="0" w:color="D9D9D9"/>
+              <w:insideV w:val="single" w:sz="6" w:space="0" w:color="D9D9D9"/>
+            </w:tcBorders>
+            <w:tcMar>
+              <w:top w:w="90" w:type="dxa"/>
+              <w:start w:w="100" w:type="dxa"/>
+              <w:bottom w:w="90" w:type="dxa"/>
+              <w:end w:w="100" w:type="dxa"/>
+            </w:tcMar>
+          </w:tcPr>
+          <w:p>
+            <w:pPr>
+              <w:spacing w:after="0" w:line="240" w:lineRule="auto"/>
+              <w:jc w:val="center"/>
+            </w:pPr>
+            <w:r>
+              <w:rPr>
+                <w:rFonts w:ascii="Arial" w:hAnsi="Arial"/>
+                <w:sz w:val="16"/>
+              </w:rPr>
+              <w:t>+0.0121 [+0.0115, +0.0127]</w:t>
+            </w:r>
+          </w:p>
+        </w:tc>
+        <w:tc>
+          <w:tcPr>
+            <w:tcW w:type="dxa" w:w="1999"/>
+            <w:vAlign w:val="center"/>
+            <w:tcBorders>
+              <w:top w:val="single" w:sz="6" w:space="0" w:color="D9D9D9"/>
+              <w:left w:val="single" w:sz="6" w:space="0" w:color="D9D9D9"/>
+              <w:bottom w:val="single" w:sz="6" w:space="0" w:color="D9D9D9"/>
+              <w:right w:val="single" w:sz="6" w:space="0" w:color="D9D9D9"/>
+              <w:insideH w:val="single" w:sz="6" w:space="0" w:color="D9D9D9"/>
+              <w:insideV w:val="single" w:sz="6" w:space="0" w:color="D9D9D9"/>
+            </w:tcBorders>
+            <w:tcMar>
+              <w:top w:w="90" w:type="dxa"/>
+              <w:start w:w="100" w:type="dxa"/>
+              <w:bottom w:w="90" w:type="dxa"/>
+              <w:end w:w="100" w:type="dxa"/>
+            </w:tcMar>
+          </w:tcPr>
+          <w:p>
+            <w:pPr>
+              <w:spacing w:after="0" w:line="240" w:lineRule="auto"/>
+              <w:jc w:val="center"/>
+            </w:pPr>
+            <w:r>
+              <w:rPr>
+                <w:rFonts w:ascii="Arial" w:hAnsi="Arial"/>
+                <w:sz w:val="16"/>
+              </w:rPr>
+              <w:t>+0.0235 [+0.0138, +0.0342]</w:t>
+            </w:r>
+          </w:p>
+        </w:tc>
+      </w:tr>
+      <w:tr>
+        <w:trPr>
+          <w:cantSplit/>
+        </w:trPr>
+        <w:tc>
+          <w:tcPr>
+            <w:tcW w:type="dxa" w:w="1999"/>
+            <w:vAlign w:val="center"/>
+            <w:tcBorders>
+              <w:top w:val="single" w:sz="6" w:space="0" w:color="D9D9D9"/>
+              <w:left w:val="single" w:sz="6" w:space="0" w:color="D9D9D9"/>
+              <w:bottom w:val="single" w:sz="6" w:space="0" w:color="D9D9D9"/>
+              <w:right w:val="single" w:sz="6" w:space="0" w:color="D9D9D9"/>
+              <w:insideH w:val="single" w:sz="6" w:space="0" w:color="D9D9D9"/>
+              <w:insideV w:val="single" w:sz="6" w:space="0" w:color="D9D9D9"/>
+            </w:tcBorders>
+            <w:tcMar>
+              <w:top w:w="90" w:type="dxa"/>
+              <w:start w:w="100" w:type="dxa"/>
+              <w:bottom w:w="90" w:type="dxa"/>
+              <w:end w:w="100" w:type="dxa"/>
+            </w:tcMar>
+            <w:shd w:fill="F2F6FA"/>
+          </w:tcPr>
+          <w:p>
+            <w:pPr>
+              <w:spacing w:after="0" w:line="240" w:lineRule="auto"/>
+              <w:jc w:val="left"/>
+            </w:pPr>
+            <w:r>
+              <w:rPr>
+                <w:rFonts w:ascii="Arial" w:hAnsi="Arial"/>
+                <w:sz w:val="16"/>
+              </w:rPr>
+              <w:t>PA1 − C3</w:t>
+            </w:r>
+          </w:p>
+        </w:tc>
+        <w:tc>
+          <w:tcPr>
+            <w:tcW w:type="dxa" w:w="1999"/>
+            <w:vAlign w:val="center"/>
+            <w:tcBorders>
+              <w:top w:val="single" w:sz="6" w:space="0" w:color="D9D9D9"/>
+              <w:left w:val="single" w:sz="6" w:space="0" w:color="D9D9D9"/>
+              <w:bottom w:val="single" w:sz="6" w:space="0" w:color="D9D9D9"/>
+              <w:right w:val="single" w:sz="6" w:space="0" w:color="D9D9D9"/>
+              <w:insideH w:val="single" w:sz="6" w:space="0" w:color="D9D9D9"/>
+              <w:insideV w:val="single" w:sz="6" w:space="0" w:color="D9D9D9"/>
+            </w:tcBorders>
+            <w:tcMar>
+              <w:top w:w="90" w:type="dxa"/>
+              <w:start w:w="100" w:type="dxa"/>
+              <w:bottom w:w="90" w:type="dxa"/>
+              <w:end w:w="100" w:type="dxa"/>
+            </w:tcMar>
+            <w:shd w:fill="F2F6FA"/>
+          </w:tcPr>
+          <w:p>
+            <w:pPr>
+              <w:spacing w:after="0" w:line="240" w:lineRule="auto"/>
+              <w:jc w:val="center"/>
+            </w:pPr>
+            <w:r>
+              <w:rPr>
+                <w:rFonts w:ascii="Arial" w:hAnsi="Arial"/>
+                <w:sz w:val="16"/>
+              </w:rPr>
+              <w:t>−69,665 [−74,949, −64,060]</w:t>
+            </w:r>
+          </w:p>
+        </w:tc>
+        <w:tc>
+          <w:tcPr>
+            <w:tcW w:type="dxa" w:w="1999"/>
+            <w:vAlign w:val="center"/>
+            <w:tcBorders>
+              <w:top w:val="single" w:sz="6" w:space="0" w:color="D9D9D9"/>
+              <w:left w:val="single" w:sz="6" w:space="0" w:color="D9D9D9"/>
+              <w:bottom w:val="single" w:sz="6" w:space="0" w:color="D9D9D9"/>
+              <w:right w:val="single" w:sz="6" w:space="0" w:color="D9D9D9"/>
+              <w:insideH w:val="single" w:sz="6" w:space="0" w:color="D9D9D9"/>
+              <w:insideV w:val="single" w:sz="6" w:space="0" w:color="D9D9D9"/>
+            </w:tcBorders>
+            <w:tcMar>
+              <w:top w:w="90" w:type="dxa"/>
+              <w:start w:w="100" w:type="dxa"/>
+              <w:bottom w:w="90" w:type="dxa"/>
+              <w:end w:w="100" w:type="dxa"/>
+            </w:tcMar>
+            <w:shd w:fill="F2F6FA"/>
+          </w:tcPr>
+          <w:p>
+            <w:pPr>
+              <w:spacing w:after="0" w:line="240" w:lineRule="auto"/>
+              <w:jc w:val="center"/>
+            </w:pPr>
+            <w:r>
+              <w:rPr>
+                <w:rFonts w:ascii="Arial" w:hAnsi="Arial"/>
+                <w:sz w:val="16"/>
+              </w:rPr>
+              <w:t>−2,122 [−3,824, −246]</w:t>
+            </w:r>
+          </w:p>
+        </w:tc>
+        <w:tc>
+          <w:tcPr>
+            <w:tcW w:type="dxa" w:w="1999"/>
+            <w:vAlign w:val="center"/>
+            <w:tcBorders>
+              <w:top w:val="single" w:sz="6" w:space="0" w:color="D9D9D9"/>
+              <w:left w:val="single" w:sz="6" w:space="0" w:color="D9D9D9"/>
+              <w:bottom w:val="single" w:sz="6" w:space="0" w:color="D9D9D9"/>
+              <w:right w:val="single" w:sz="6" w:space="0" w:color="D9D9D9"/>
+              <w:insideH w:val="single" w:sz="6" w:space="0" w:color="D9D9D9"/>
+              <w:insideV w:val="single" w:sz="6" w:space="0" w:color="D9D9D9"/>
+            </w:tcBorders>
+            <w:tcMar>
+              <w:top w:w="90" w:type="dxa"/>
+              <w:start w:w="100" w:type="dxa"/>
+              <w:bottom w:w="90" w:type="dxa"/>
+              <w:end w:w="100" w:type="dxa"/>
+            </w:tcMar>
+            <w:shd w:fill="F2F6FA"/>
+          </w:tcPr>
+          <w:p>
+            <w:pPr>
+              <w:spacing w:after="0" w:line="240" w:lineRule="auto"/>
+              <w:jc w:val="center"/>
+            </w:pPr>
+            <w:r>
+              <w:rPr>
+                <w:rFonts w:ascii="Arial" w:hAnsi="Arial"/>
+                <w:sz w:val="16"/>
+              </w:rPr>
+              <w:t>+0.0105 [+0.0099, +0.0112]</w:t>
+            </w:r>
+          </w:p>
+        </w:tc>
+        <w:tc>
+          <w:tcPr>
+            <w:tcW w:type="dxa" w:w="1999"/>
+            <w:vAlign w:val="center"/>
+            <w:tcBorders>
+              <w:top w:val="single" w:sz="6" w:space="0" w:color="D9D9D9"/>
+              <w:left w:val="single" w:sz="6" w:space="0" w:color="D9D9D9"/>
+              <w:bottom w:val="single" w:sz="6" w:space="0" w:color="D9D9D9"/>
+              <w:right w:val="single" w:sz="6" w:space="0" w:color="D9D9D9"/>
+              <w:insideH w:val="single" w:sz="6" w:space="0" w:color="D9D9D9"/>
+              <w:insideV w:val="single" w:sz="6" w:space="0" w:color="D9D9D9"/>
+            </w:tcBorders>
+            <w:tcMar>
+              <w:top w:w="90" w:type="dxa"/>
+              <w:start w:w="100" w:type="dxa"/>
+              <w:bottom w:w="90" w:type="dxa"/>
+              <w:end w:w="100" w:type="dxa"/>
+            </w:tcMar>
+            <w:shd w:fill="F2F6FA"/>
+          </w:tcPr>
+          <w:p>
+            <w:pPr>
+              <w:spacing w:after="0" w:line="240" w:lineRule="auto"/>
+              <w:jc w:val="center"/>
+            </w:pPr>
+            <w:r>
+              <w:rPr>
+                <w:rFonts w:ascii="Arial" w:hAnsi="Arial"/>
+                <w:sz w:val="16"/>
+              </w:rPr>
+              <w:t>+0.0352 [+0.0260, +0.0441]</w:t>
+            </w:r>
+          </w:p>
+        </w:tc>
+      </w:tr>
+      <w:tr>
+        <w:trPr>
+          <w:cantSplit/>
+        </w:trPr>
+        <w:tc>
+          <w:tcPr>
+            <w:tcW w:type="dxa" w:w="1999"/>
+            <w:vAlign w:val="center"/>
+            <w:tcBorders>
+              <w:top w:val="single" w:sz="6" w:space="0" w:color="D9D9D9"/>
+              <w:left w:val="single" w:sz="6" w:space="0" w:color="D9D9D9"/>
+              <w:bottom w:val="single" w:sz="6" w:space="0" w:color="D9D9D9"/>
+              <w:right w:val="single" w:sz="6" w:space="0" w:color="D9D9D9"/>
+              <w:insideH w:val="single" w:sz="6" w:space="0" w:color="D9D9D9"/>
+              <w:insideV w:val="single" w:sz="6" w:space="0" w:color="D9D9D9"/>
+            </w:tcBorders>
+            <w:tcMar>
+              <w:top w:w="90" w:type="dxa"/>
+              <w:start w:w="100" w:type="dxa"/>
+              <w:bottom w:w="90" w:type="dxa"/>
+              <w:end w:w="100" w:type="dxa"/>
+            </w:tcMar>
+          </w:tcPr>
+          <w:p>
+            <w:pPr>
+              <w:spacing w:after="0" w:line="240" w:lineRule="auto"/>
+              <w:jc w:val="left"/>
+            </w:pPr>
+            <w:r>
+              <w:rPr>
+                <w:rFonts w:ascii="Arial" w:hAnsi="Arial"/>
+                <w:sz w:val="16"/>
+              </w:rPr>
+              <w:t>PA1 − C5</w:t>
+            </w:r>
+          </w:p>
+        </w:tc>
+        <w:tc>
+          <w:tcPr>
+            <w:tcW w:type="dxa" w:w="1999"/>
+            <w:vAlign w:val="center"/>
+            <w:tcBorders>
+              <w:top w:val="single" w:sz="6" w:space="0" w:color="D9D9D9"/>
+              <w:left w:val="single" w:sz="6" w:space="0" w:color="D9D9D9"/>
+              <w:bottom w:val="single" w:sz="6" w:space="0" w:color="D9D9D9"/>
+              <w:right w:val="single" w:sz="6" w:space="0" w:color="D9D9D9"/>
+              <w:insideH w:val="single" w:sz="6" w:space="0" w:color="D9D9D9"/>
+              <w:insideV w:val="single" w:sz="6" w:space="0" w:color="D9D9D9"/>
+            </w:tcBorders>
+            <w:tcMar>
+              <w:top w:w="90" w:type="dxa"/>
+              <w:start w:w="100" w:type="dxa"/>
+              <w:bottom w:w="90" w:type="dxa"/>
+              <w:end w:w="100" w:type="dxa"/>
+            </w:tcMar>
+          </w:tcPr>
+          <w:p>
+            <w:pPr>
+              <w:spacing w:after="0" w:line="240" w:lineRule="auto"/>
+              <w:jc w:val="center"/>
+            </w:pPr>
+            <w:r>
+              <w:rPr>
+                <w:rFonts w:ascii="Arial" w:hAnsi="Arial"/>
+                <w:sz w:val="16"/>
+              </w:rPr>
+              <w:t>−147,460 [−151,484, −143,045]</w:t>
+            </w:r>
+          </w:p>
+        </w:tc>
+        <w:tc>
+          <w:tcPr>
+            <w:tcW w:type="dxa" w:w="1999"/>
+            <w:vAlign w:val="center"/>
+            <w:tcBorders>
+              <w:top w:val="single" w:sz="6" w:space="0" w:color="D9D9D9"/>
+              <w:left w:val="single" w:sz="6" w:space="0" w:color="D9D9D9"/>
+              <w:bottom w:val="single" w:sz="6" w:space="0" w:color="D9D9D9"/>
+              <w:right w:val="single" w:sz="6" w:space="0" w:color="D9D9D9"/>
+              <w:insideH w:val="single" w:sz="6" w:space="0" w:color="D9D9D9"/>
+              <w:insideV w:val="single" w:sz="6" w:space="0" w:color="D9D9D9"/>
+            </w:tcBorders>
+            <w:tcMar>
+              <w:top w:w="90" w:type="dxa"/>
+              <w:start w:w="100" w:type="dxa"/>
+              <w:bottom w:w="90" w:type="dxa"/>
+              <w:end w:w="100" w:type="dxa"/>
+            </w:tcMar>
+          </w:tcPr>
+          <w:p>
+            <w:pPr>
+              <w:spacing w:after="0" w:line="240" w:lineRule="auto"/>
+              <w:jc w:val="center"/>
+            </w:pPr>
+            <w:r>
+              <w:rPr>
+                <w:rFonts w:ascii="Arial" w:hAnsi="Arial"/>
+                <w:sz w:val="16"/>
+              </w:rPr>
+              <w:t>−4,914 [−6,483, −3,509]</w:t>
+            </w:r>
+          </w:p>
+        </w:tc>
+        <w:tc>
+          <w:tcPr>
+            <w:tcW w:type="dxa" w:w="1999"/>
+            <w:vAlign w:val="center"/>
+            <w:tcBorders>
+              <w:top w:val="single" w:sz="6" w:space="0" w:color="D9D9D9"/>
+              <w:left w:val="single" w:sz="6" w:space="0" w:color="D9D9D9"/>
+              <w:bottom w:val="single" w:sz="6" w:space="0" w:color="D9D9D9"/>
+              <w:right w:val="single" w:sz="6" w:space="0" w:color="D9D9D9"/>
+              <w:insideH w:val="single" w:sz="6" w:space="0" w:color="D9D9D9"/>
+              <w:insideV w:val="single" w:sz="6" w:space="0" w:color="D9D9D9"/>
+            </w:tcBorders>
+            <w:tcMar>
+              <w:top w:w="90" w:type="dxa"/>
+              <w:start w:w="100" w:type="dxa"/>
+              <w:bottom w:w="90" w:type="dxa"/>
+              <w:end w:w="100" w:type="dxa"/>
+            </w:tcMar>
+          </w:tcPr>
+          <w:p>
+            <w:pPr>
+              <w:spacing w:after="0" w:line="240" w:lineRule="auto"/>
+              <w:jc w:val="center"/>
+            </w:pPr>
+            <w:r>
+              <w:rPr>
+                <w:rFonts w:ascii="Arial" w:hAnsi="Arial"/>
+                <w:sz w:val="16"/>
+              </w:rPr>
+              <w:t>+0.0222 [+0.0216, +0.0227]</w:t>
+            </w:r>
+          </w:p>
+        </w:tc>
+        <w:tc>
+          <w:tcPr>
+            <w:tcW w:type="dxa" w:w="1999"/>
+            <w:vAlign w:val="center"/>
+            <w:tcBorders>
+              <w:top w:val="single" w:sz="6" w:space="0" w:color="D9D9D9"/>
+              <w:left w:val="single" w:sz="6" w:space="0" w:color="D9D9D9"/>
+              <w:bottom w:val="single" w:sz="6" w:space="0" w:color="D9D9D9"/>
+              <w:right w:val="single" w:sz="6" w:space="0" w:color="D9D9D9"/>
+              <w:insideH w:val="single" w:sz="6" w:space="0" w:color="D9D9D9"/>
+              <w:insideV w:val="single" w:sz="6" w:space="0" w:color="D9D9D9"/>
+            </w:tcBorders>
+            <w:tcMar>
+              <w:top w:w="90" w:type="dxa"/>
+              <w:start w:w="100" w:type="dxa"/>
+              <w:bottom w:w="90" w:type="dxa"/>
+              <w:end w:w="100" w:type="dxa"/>
+            </w:tcMar>
+          </w:tcPr>
+          <w:p>
+            <w:pPr>
+              <w:spacing w:after="0" w:line="240" w:lineRule="auto"/>
+              <w:jc w:val="center"/>
+            </w:pPr>
+            <w:r>
+              <w:rPr>
+                <w:rFonts w:ascii="Arial" w:hAnsi="Arial"/>
+                <w:sz w:val="16"/>
+              </w:rPr>
+              <w:t>+0.0410 [+0.0339, +0.0486]</w:t>
+            </w:r>
+          </w:p>
+        </w:tc>
+      </w:tr>
+    </w:tbl>
+    <w:p>
+      <w:pPr>
+        <w:spacing w:after="40"/>
+      </w:pPr>
+    </w:p>
+    <w:p>
+      <w:r>
+        <w:t>The 1,000-resample week-and-replication bootstrap is a direction check rather than a replacement for the paired mean CI. Its pooled percentile interval for PA1−C4 is negative for item fill (approximately −0.033 to −0.018) and basket fill (approximately −0.082 to −0.046); the corresponding PA1−C1 intervals are positive (approximately 0.020 to 0.034 for item fill and 0.072 to 0.207 for basket fill). The bootstrap cost interval is broad because it resamples scenarios with different synthetic cost scales, so cost inference uses the scenario-clustered mean CI. Thus the all-scenario evidence does not support a graph-on-top-of-popularity gain in this replay. The common-target placebo results remain allocation checks, not topology-identification tests.</w:t>
+      </w:r>
+    </w:p>
+    <w:p>
+      <w:r>
+        <w:t>Six-fold calibration was chosen on the validation window, before test evaluation, by selecting the candidate multiplier closest to the critical-fractile item-fill target. Across the 24 scenario-policy validation rows, six-fold had mean item fill 0.9487 against mean target 0.9725, versus 0.9152 at three-fold and 0.9625 at nine-fold; the six-fold candidate was the lowest-cost eligible interior calibration satisfying the pre-registered three-percentage-point acceptance rule. In the held-out test, however, the matched C1 target was approximately 0.993 on average while realised C1 item fill was approximately 0.83–0.84, reflecting peak-period under-forecasting and showing that validation calibration is optimistic for the test window. The three-/six-/nine-fold table is results/phase3_calibration_robustness.csv.</w:t>
       </w:r>
     </w:p>
     <w:p>
@@ -7871,7 +8431,7 @@
         <w:pStyle w:val="Heading2"/>
       </w:pPr>
       <w:r>
-        <w:t>5.5 Rolling windows, external data, and mechanism</w:t>
+        <w:t>5.5 Rolling windows, sensitivity, external data, and mechanism</w:t>
       </w:r>
     </w:p>
     <w:p>
@@ -9835,7 +10395,742 @@
     </w:p>
     <w:p>
       <w:r>
-        <w:t>PA1 item fill was below C4 in all three windows, while basket fill was higher in W1, lower in W2, and nearly equal in W3. The direction is therefore window-dependent and does not support a universal graph benefit. The external dunnhumby top-300 replay produced full item and basket fill for both graph and popularity buffers, so it is a data-pipeline and transportability check rather than a discriminating policy result.</w:t>
+        <w:t>PA1 item fill was below C4 in all three windows, while basket fill was higher in W1, lower in W2, and nearly equal in W3. These rolling outputs are level checks; the corresponding paired contrast file reports PA1−C4 and PA1−C1 with window-specific intervals. The direction is therefore not a universal graph benefit. Sensitivity settings were not merely listed: top-k, minimum pair count, service target, h/p ratio, fixed order cost K, lost-sales versus backorder, and all-units versus distinct-item basket definitions each changed at least one output in the released sensitivity audit. The audit is in results/gate_sensitivity_summary.csv; threshold and top-k checks remain one-scenario diagnostics.</w:t>
+      </w:r>
+    </w:p>
+    <w:p>
+      <w:r>
+        <w:t>For transparency, the rolling contrast estimates were:</w:t>
+      </w:r>
+    </w:p>
+    <w:tbl>
+      <w:tblPr>
+        <w:tblStyle w:val="TableGrid"/>
+        <w:tblW w:type="auto" w:w="0"/>
+        <w:jc w:val="center"/>
+        <w:tblLook w:firstColumn="1" w:firstRow="1" w:lastColumn="0" w:lastRow="0" w:noHBand="0" w:noVBand="1" w:val="04A0"/>
+      </w:tblPr>
+      <w:tblGrid>
+        <w:gridCol w:w="1999"/>
+        <w:gridCol w:w="1999"/>
+        <w:gridCol w:w="1999"/>
+        <w:gridCol w:w="1999"/>
+        <w:gridCol w:w="1999"/>
+      </w:tblGrid>
+      <w:tr>
+        <w:trPr>
+          <w:tblHeader w:val="true"/>
+        </w:trPr>
+        <w:tc>
+          <w:tcPr>
+            <w:tcW w:type="dxa" w:w="1999"/>
+            <w:vAlign w:val="center"/>
+            <w:shd w:fill="1F4E79"/>
+            <w:tcBorders>
+              <w:top w:val="single" w:sz="6" w:space="0" w:color="D9D9D9"/>
+              <w:left w:val="single" w:sz="6" w:space="0" w:color="D9D9D9"/>
+              <w:bottom w:val="single" w:sz="6" w:space="0" w:color="D9D9D9"/>
+              <w:right w:val="single" w:sz="6" w:space="0" w:color="D9D9D9"/>
+              <w:insideH w:val="single" w:sz="6" w:space="0" w:color="D9D9D9"/>
+              <w:insideV w:val="single" w:sz="6" w:space="0" w:color="D9D9D9"/>
+            </w:tcBorders>
+            <w:tcMar>
+              <w:top w:w="90" w:type="dxa"/>
+              <w:start w:w="100" w:type="dxa"/>
+              <w:bottom w:w="90" w:type="dxa"/>
+              <w:end w:w="100" w:type="dxa"/>
+            </w:tcMar>
+          </w:tcPr>
+          <w:p>
+            <w:pPr>
+              <w:spacing w:after="0"/>
+              <w:jc w:val="center"/>
+            </w:pPr>
+            <w:r>
+              <w:rPr>
+                <w:rFonts w:ascii="Arial" w:hAnsi="Arial"/>
+                <w:b/>
+                <w:color w:val="FFFFFF"/>
+                <w:sz w:val="17"/>
+              </w:rPr>
+              <w:t>Window</w:t>
+            </w:r>
+          </w:p>
+        </w:tc>
+        <w:tc>
+          <w:tcPr>
+            <w:tcW w:type="dxa" w:w="1999"/>
+            <w:vAlign w:val="center"/>
+            <w:shd w:fill="1F4E79"/>
+            <w:tcBorders>
+              <w:top w:val="single" w:sz="6" w:space="0" w:color="D9D9D9"/>
+              <w:left w:val="single" w:sz="6" w:space="0" w:color="D9D9D9"/>
+              <w:bottom w:val="single" w:sz="6" w:space="0" w:color="D9D9D9"/>
+              <w:right w:val="single" w:sz="6" w:space="0" w:color="D9D9D9"/>
+              <w:insideH w:val="single" w:sz="6" w:space="0" w:color="D9D9D9"/>
+              <w:insideV w:val="single" w:sz="6" w:space="0" w:color="D9D9D9"/>
+            </w:tcBorders>
+            <w:tcMar>
+              <w:top w:w="90" w:type="dxa"/>
+              <w:start w:w="100" w:type="dxa"/>
+              <w:bottom w:w="90" w:type="dxa"/>
+              <w:end w:w="100" w:type="dxa"/>
+            </w:tcMar>
+          </w:tcPr>
+          <w:p>
+            <w:pPr>
+              <w:spacing w:after="0"/>
+              <w:jc w:val="center"/>
+            </w:pPr>
+            <w:r>
+              <w:rPr>
+                <w:rFonts w:ascii="Arial" w:hAnsi="Arial"/>
+                <w:b/>
+                <w:color w:val="FFFFFF"/>
+                <w:sz w:val="17"/>
+              </w:rPr>
+              <w:t>PA1−C4 item fill</w:t>
+            </w:r>
+          </w:p>
+        </w:tc>
+        <w:tc>
+          <w:tcPr>
+            <w:tcW w:type="dxa" w:w="1999"/>
+            <w:vAlign w:val="center"/>
+            <w:shd w:fill="1F4E79"/>
+            <w:tcBorders>
+              <w:top w:val="single" w:sz="6" w:space="0" w:color="D9D9D9"/>
+              <w:left w:val="single" w:sz="6" w:space="0" w:color="D9D9D9"/>
+              <w:bottom w:val="single" w:sz="6" w:space="0" w:color="D9D9D9"/>
+              <w:right w:val="single" w:sz="6" w:space="0" w:color="D9D9D9"/>
+              <w:insideH w:val="single" w:sz="6" w:space="0" w:color="D9D9D9"/>
+              <w:insideV w:val="single" w:sz="6" w:space="0" w:color="D9D9D9"/>
+            </w:tcBorders>
+            <w:tcMar>
+              <w:top w:w="90" w:type="dxa"/>
+              <w:start w:w="100" w:type="dxa"/>
+              <w:bottom w:w="90" w:type="dxa"/>
+              <w:end w:w="100" w:type="dxa"/>
+            </w:tcMar>
+          </w:tcPr>
+          <w:p>
+            <w:pPr>
+              <w:spacing w:after="0"/>
+              <w:jc w:val="center"/>
+            </w:pPr>
+            <w:r>
+              <w:rPr>
+                <w:rFonts w:ascii="Arial" w:hAnsi="Arial"/>
+                <w:b/>
+                <w:color w:val="FFFFFF"/>
+                <w:sz w:val="17"/>
+              </w:rPr>
+              <w:t>PA1−C4 basket fill</w:t>
+            </w:r>
+          </w:p>
+        </w:tc>
+        <w:tc>
+          <w:tcPr>
+            <w:tcW w:type="dxa" w:w="1999"/>
+            <w:vAlign w:val="center"/>
+            <w:shd w:fill="1F4E79"/>
+            <w:tcBorders>
+              <w:top w:val="single" w:sz="6" w:space="0" w:color="D9D9D9"/>
+              <w:left w:val="single" w:sz="6" w:space="0" w:color="D9D9D9"/>
+              <w:bottom w:val="single" w:sz="6" w:space="0" w:color="D9D9D9"/>
+              <w:right w:val="single" w:sz="6" w:space="0" w:color="D9D9D9"/>
+              <w:insideH w:val="single" w:sz="6" w:space="0" w:color="D9D9D9"/>
+              <w:insideV w:val="single" w:sz="6" w:space="0" w:color="D9D9D9"/>
+            </w:tcBorders>
+            <w:tcMar>
+              <w:top w:w="90" w:type="dxa"/>
+              <w:start w:w="100" w:type="dxa"/>
+              <w:bottom w:w="90" w:type="dxa"/>
+              <w:end w:w="100" w:type="dxa"/>
+            </w:tcMar>
+          </w:tcPr>
+          <w:p>
+            <w:pPr>
+              <w:spacing w:after="0"/>
+              <w:jc w:val="center"/>
+            </w:pPr>
+            <w:r>
+              <w:rPr>
+                <w:rFonts w:ascii="Arial" w:hAnsi="Arial"/>
+                <w:b/>
+                <w:color w:val="FFFFFF"/>
+                <w:sz w:val="17"/>
+              </w:rPr>
+              <w:t>PA1−C1 item fill</w:t>
+            </w:r>
+          </w:p>
+        </w:tc>
+        <w:tc>
+          <w:tcPr>
+            <w:tcW w:type="dxa" w:w="1999"/>
+            <w:vAlign w:val="center"/>
+            <w:shd w:fill="1F4E79"/>
+            <w:tcBorders>
+              <w:top w:val="single" w:sz="6" w:space="0" w:color="D9D9D9"/>
+              <w:left w:val="single" w:sz="6" w:space="0" w:color="D9D9D9"/>
+              <w:bottom w:val="single" w:sz="6" w:space="0" w:color="D9D9D9"/>
+              <w:right w:val="single" w:sz="6" w:space="0" w:color="D9D9D9"/>
+              <w:insideH w:val="single" w:sz="6" w:space="0" w:color="D9D9D9"/>
+              <w:insideV w:val="single" w:sz="6" w:space="0" w:color="D9D9D9"/>
+            </w:tcBorders>
+            <w:tcMar>
+              <w:top w:w="90" w:type="dxa"/>
+              <w:start w:w="100" w:type="dxa"/>
+              <w:bottom w:w="90" w:type="dxa"/>
+              <w:end w:w="100" w:type="dxa"/>
+            </w:tcMar>
+          </w:tcPr>
+          <w:p>
+            <w:pPr>
+              <w:spacing w:after="0"/>
+              <w:jc w:val="center"/>
+            </w:pPr>
+            <w:r>
+              <w:rPr>
+                <w:rFonts w:ascii="Arial" w:hAnsi="Arial"/>
+                <w:b/>
+                <w:color w:val="FFFFFF"/>
+                <w:sz w:val="17"/>
+              </w:rPr>
+              <w:t>PA1−C1 basket fill</w:t>
+            </w:r>
+          </w:p>
+        </w:tc>
+      </w:tr>
+      <w:tr>
+        <w:trPr>
+          <w:cantSplit/>
+        </w:trPr>
+        <w:tc>
+          <w:tcPr>
+            <w:tcW w:type="dxa" w:w="1999"/>
+            <w:vAlign w:val="center"/>
+            <w:tcBorders>
+              <w:top w:val="single" w:sz="6" w:space="0" w:color="D9D9D9"/>
+              <w:left w:val="single" w:sz="6" w:space="0" w:color="D9D9D9"/>
+              <w:bottom w:val="single" w:sz="6" w:space="0" w:color="D9D9D9"/>
+              <w:right w:val="single" w:sz="6" w:space="0" w:color="D9D9D9"/>
+              <w:insideH w:val="single" w:sz="6" w:space="0" w:color="D9D9D9"/>
+              <w:insideV w:val="single" w:sz="6" w:space="0" w:color="D9D9D9"/>
+            </w:tcBorders>
+            <w:tcMar>
+              <w:top w:w="90" w:type="dxa"/>
+              <w:start w:w="100" w:type="dxa"/>
+              <w:bottom w:w="90" w:type="dxa"/>
+              <w:end w:w="100" w:type="dxa"/>
+            </w:tcMar>
+          </w:tcPr>
+          <w:p>
+            <w:pPr>
+              <w:spacing w:after="0" w:line="240" w:lineRule="auto"/>
+              <w:jc w:val="left"/>
+            </w:pPr>
+            <w:r>
+              <w:rPr>
+                <w:rFonts w:ascii="Arial" w:hAnsi="Arial"/>
+                <w:sz w:val="16"/>
+              </w:rPr>
+              <w:t>W1</w:t>
+            </w:r>
+          </w:p>
+        </w:tc>
+        <w:tc>
+          <w:tcPr>
+            <w:tcW w:type="dxa" w:w="1999"/>
+            <w:vAlign w:val="center"/>
+            <w:tcBorders>
+              <w:top w:val="single" w:sz="6" w:space="0" w:color="D9D9D9"/>
+              <w:left w:val="single" w:sz="6" w:space="0" w:color="D9D9D9"/>
+              <w:bottom w:val="single" w:sz="6" w:space="0" w:color="D9D9D9"/>
+              <w:right w:val="single" w:sz="6" w:space="0" w:color="D9D9D9"/>
+              <w:insideH w:val="single" w:sz="6" w:space="0" w:color="D9D9D9"/>
+              <w:insideV w:val="single" w:sz="6" w:space="0" w:color="D9D9D9"/>
+            </w:tcBorders>
+            <w:tcMar>
+              <w:top w:w="90" w:type="dxa"/>
+              <w:start w:w="100" w:type="dxa"/>
+              <w:bottom w:w="90" w:type="dxa"/>
+              <w:end w:w="100" w:type="dxa"/>
+            </w:tcMar>
+          </w:tcPr>
+          <w:p>
+            <w:pPr>
+              <w:spacing w:after="0" w:line="240" w:lineRule="auto"/>
+              <w:jc w:val="center"/>
+            </w:pPr>
+            <w:r>
+              <w:rPr>
+                <w:rFonts w:ascii="Arial" w:hAnsi="Arial"/>
+                <w:sz w:val="16"/>
+              </w:rPr>
+              <w:t>−0.0003 [−0.0003, −0.0003]</w:t>
+            </w:r>
+          </w:p>
+        </w:tc>
+        <w:tc>
+          <w:tcPr>
+            <w:tcW w:type="dxa" w:w="1999"/>
+            <w:vAlign w:val="center"/>
+            <w:tcBorders>
+              <w:top w:val="single" w:sz="6" w:space="0" w:color="D9D9D9"/>
+              <w:left w:val="single" w:sz="6" w:space="0" w:color="D9D9D9"/>
+              <w:bottom w:val="single" w:sz="6" w:space="0" w:color="D9D9D9"/>
+              <w:right w:val="single" w:sz="6" w:space="0" w:color="D9D9D9"/>
+              <w:insideH w:val="single" w:sz="6" w:space="0" w:color="D9D9D9"/>
+              <w:insideV w:val="single" w:sz="6" w:space="0" w:color="D9D9D9"/>
+            </w:tcBorders>
+            <w:tcMar>
+              <w:top w:w="90" w:type="dxa"/>
+              <w:start w:w="100" w:type="dxa"/>
+              <w:bottom w:w="90" w:type="dxa"/>
+              <w:end w:w="100" w:type="dxa"/>
+            </w:tcMar>
+          </w:tcPr>
+          <w:p>
+            <w:pPr>
+              <w:spacing w:after="0" w:line="240" w:lineRule="auto"/>
+              <w:jc w:val="center"/>
+            </w:pPr>
+            <w:r>
+              <w:rPr>
+                <w:rFonts w:ascii="Arial" w:hAnsi="Arial"/>
+                <w:sz w:val="16"/>
+              </w:rPr>
+              <w:t>+0.0037 [+0.0037, +0.0037]</w:t>
+            </w:r>
+          </w:p>
+        </w:tc>
+        <w:tc>
+          <w:tcPr>
+            <w:tcW w:type="dxa" w:w="1999"/>
+            <w:vAlign w:val="center"/>
+            <w:tcBorders>
+              <w:top w:val="single" w:sz="6" w:space="0" w:color="D9D9D9"/>
+              <w:left w:val="single" w:sz="6" w:space="0" w:color="D9D9D9"/>
+              <w:bottom w:val="single" w:sz="6" w:space="0" w:color="D9D9D9"/>
+              <w:right w:val="single" w:sz="6" w:space="0" w:color="D9D9D9"/>
+              <w:insideH w:val="single" w:sz="6" w:space="0" w:color="D9D9D9"/>
+              <w:insideV w:val="single" w:sz="6" w:space="0" w:color="D9D9D9"/>
+            </w:tcBorders>
+            <w:tcMar>
+              <w:top w:w="90" w:type="dxa"/>
+              <w:start w:w="100" w:type="dxa"/>
+              <w:bottom w:w="90" w:type="dxa"/>
+              <w:end w:w="100" w:type="dxa"/>
+            </w:tcMar>
+          </w:tcPr>
+          <w:p>
+            <w:pPr>
+              <w:spacing w:after="0" w:line="240" w:lineRule="auto"/>
+              <w:jc w:val="center"/>
+            </w:pPr>
+            <w:r>
+              <w:rPr>
+                <w:rFonts w:ascii="Arial" w:hAnsi="Arial"/>
+                <w:sz w:val="16"/>
+              </w:rPr>
+              <w:t>+0.0055 [+0.0055, +0.0055]</w:t>
+            </w:r>
+          </w:p>
+        </w:tc>
+        <w:tc>
+          <w:tcPr>
+            <w:tcW w:type="dxa" w:w="1999"/>
+            <w:vAlign w:val="center"/>
+            <w:tcBorders>
+              <w:top w:val="single" w:sz="6" w:space="0" w:color="D9D9D9"/>
+              <w:left w:val="single" w:sz="6" w:space="0" w:color="D9D9D9"/>
+              <w:bottom w:val="single" w:sz="6" w:space="0" w:color="D9D9D9"/>
+              <w:right w:val="single" w:sz="6" w:space="0" w:color="D9D9D9"/>
+              <w:insideH w:val="single" w:sz="6" w:space="0" w:color="D9D9D9"/>
+              <w:insideV w:val="single" w:sz="6" w:space="0" w:color="D9D9D9"/>
+            </w:tcBorders>
+            <w:tcMar>
+              <w:top w:w="90" w:type="dxa"/>
+              <w:start w:w="100" w:type="dxa"/>
+              <w:bottom w:w="90" w:type="dxa"/>
+              <w:end w:w="100" w:type="dxa"/>
+            </w:tcMar>
+          </w:tcPr>
+          <w:p>
+            <w:pPr>
+              <w:spacing w:after="0" w:line="240" w:lineRule="auto"/>
+              <w:jc w:val="center"/>
+            </w:pPr>
+            <w:r>
+              <w:rPr>
+                <w:rFonts w:ascii="Arial" w:hAnsi="Arial"/>
+                <w:sz w:val="16"/>
+              </w:rPr>
+              <w:t>+0.0258 [+0.0258, +0.0258]</w:t>
+            </w:r>
+          </w:p>
+        </w:tc>
+      </w:tr>
+      <w:tr>
+        <w:trPr>
+          <w:cantSplit/>
+        </w:trPr>
+        <w:tc>
+          <w:tcPr>
+            <w:tcW w:type="dxa" w:w="1999"/>
+            <w:vAlign w:val="center"/>
+            <w:tcBorders>
+              <w:top w:val="single" w:sz="6" w:space="0" w:color="D9D9D9"/>
+              <w:left w:val="single" w:sz="6" w:space="0" w:color="D9D9D9"/>
+              <w:bottom w:val="single" w:sz="6" w:space="0" w:color="D9D9D9"/>
+              <w:right w:val="single" w:sz="6" w:space="0" w:color="D9D9D9"/>
+              <w:insideH w:val="single" w:sz="6" w:space="0" w:color="D9D9D9"/>
+              <w:insideV w:val="single" w:sz="6" w:space="0" w:color="D9D9D9"/>
+            </w:tcBorders>
+            <w:tcMar>
+              <w:top w:w="90" w:type="dxa"/>
+              <w:start w:w="100" w:type="dxa"/>
+              <w:bottom w:w="90" w:type="dxa"/>
+              <w:end w:w="100" w:type="dxa"/>
+            </w:tcMar>
+            <w:shd w:fill="F2F6FA"/>
+          </w:tcPr>
+          <w:p>
+            <w:pPr>
+              <w:spacing w:after="0" w:line="240" w:lineRule="auto"/>
+              <w:jc w:val="left"/>
+            </w:pPr>
+            <w:r>
+              <w:rPr>
+                <w:rFonts w:ascii="Arial" w:hAnsi="Arial"/>
+                <w:sz w:val="16"/>
+              </w:rPr>
+              <w:t>W2</w:t>
+            </w:r>
+          </w:p>
+        </w:tc>
+        <w:tc>
+          <w:tcPr>
+            <w:tcW w:type="dxa" w:w="1999"/>
+            <w:vAlign w:val="center"/>
+            <w:tcBorders>
+              <w:top w:val="single" w:sz="6" w:space="0" w:color="D9D9D9"/>
+              <w:left w:val="single" w:sz="6" w:space="0" w:color="D9D9D9"/>
+              <w:bottom w:val="single" w:sz="6" w:space="0" w:color="D9D9D9"/>
+              <w:right w:val="single" w:sz="6" w:space="0" w:color="D9D9D9"/>
+              <w:insideH w:val="single" w:sz="6" w:space="0" w:color="D9D9D9"/>
+              <w:insideV w:val="single" w:sz="6" w:space="0" w:color="D9D9D9"/>
+            </w:tcBorders>
+            <w:tcMar>
+              <w:top w:w="90" w:type="dxa"/>
+              <w:start w:w="100" w:type="dxa"/>
+              <w:bottom w:w="90" w:type="dxa"/>
+              <w:end w:w="100" w:type="dxa"/>
+            </w:tcMar>
+            <w:shd w:fill="F2F6FA"/>
+          </w:tcPr>
+          <w:p>
+            <w:pPr>
+              <w:spacing w:after="0" w:line="240" w:lineRule="auto"/>
+              <w:jc w:val="center"/>
+            </w:pPr>
+            <w:r>
+              <w:rPr>
+                <w:rFonts w:ascii="Arial" w:hAnsi="Arial"/>
+                <w:sz w:val="16"/>
+              </w:rPr>
+              <w:t>−0.0031 [−0.0031, −0.0031]</w:t>
+            </w:r>
+          </w:p>
+        </w:tc>
+        <w:tc>
+          <w:tcPr>
+            <w:tcW w:type="dxa" w:w="1999"/>
+            <w:vAlign w:val="center"/>
+            <w:tcBorders>
+              <w:top w:val="single" w:sz="6" w:space="0" w:color="D9D9D9"/>
+              <w:left w:val="single" w:sz="6" w:space="0" w:color="D9D9D9"/>
+              <w:bottom w:val="single" w:sz="6" w:space="0" w:color="D9D9D9"/>
+              <w:right w:val="single" w:sz="6" w:space="0" w:color="D9D9D9"/>
+              <w:insideH w:val="single" w:sz="6" w:space="0" w:color="D9D9D9"/>
+              <w:insideV w:val="single" w:sz="6" w:space="0" w:color="D9D9D9"/>
+            </w:tcBorders>
+            <w:tcMar>
+              <w:top w:w="90" w:type="dxa"/>
+              <w:start w:w="100" w:type="dxa"/>
+              <w:bottom w:w="90" w:type="dxa"/>
+              <w:end w:w="100" w:type="dxa"/>
+            </w:tcMar>
+            <w:shd w:fill="F2F6FA"/>
+          </w:tcPr>
+          <w:p>
+            <w:pPr>
+              <w:spacing w:after="0" w:line="240" w:lineRule="auto"/>
+              <w:jc w:val="center"/>
+            </w:pPr>
+            <w:r>
+              <w:rPr>
+                <w:rFonts w:ascii="Arial" w:hAnsi="Arial"/>
+                <w:sz w:val="16"/>
+              </w:rPr>
+              <w:t>−0.0076 [−0.0076, −0.0076]</w:t>
+            </w:r>
+          </w:p>
+        </w:tc>
+        <w:tc>
+          <w:tcPr>
+            <w:tcW w:type="dxa" w:w="1999"/>
+            <w:vAlign w:val="center"/>
+            <w:tcBorders>
+              <w:top w:val="single" w:sz="6" w:space="0" w:color="D9D9D9"/>
+              <w:left w:val="single" w:sz="6" w:space="0" w:color="D9D9D9"/>
+              <w:bottom w:val="single" w:sz="6" w:space="0" w:color="D9D9D9"/>
+              <w:right w:val="single" w:sz="6" w:space="0" w:color="D9D9D9"/>
+              <w:insideH w:val="single" w:sz="6" w:space="0" w:color="D9D9D9"/>
+              <w:insideV w:val="single" w:sz="6" w:space="0" w:color="D9D9D9"/>
+            </w:tcBorders>
+            <w:tcMar>
+              <w:top w:w="90" w:type="dxa"/>
+              <w:start w:w="100" w:type="dxa"/>
+              <w:bottom w:w="90" w:type="dxa"/>
+              <w:end w:w="100" w:type="dxa"/>
+            </w:tcMar>
+            <w:shd w:fill="F2F6FA"/>
+          </w:tcPr>
+          <w:p>
+            <w:pPr>
+              <w:spacing w:after="0" w:line="240" w:lineRule="auto"/>
+              <w:jc w:val="center"/>
+            </w:pPr>
+            <w:r>
+              <w:rPr>
+                <w:rFonts w:ascii="Arial" w:hAnsi="Arial"/>
+                <w:sz w:val="16"/>
+              </w:rPr>
+              <w:t>+0.0057 [+0.0057, +0.0057]</w:t>
+            </w:r>
+          </w:p>
+        </w:tc>
+        <w:tc>
+          <w:tcPr>
+            <w:tcW w:type="dxa" w:w="1999"/>
+            <w:vAlign w:val="center"/>
+            <w:tcBorders>
+              <w:top w:val="single" w:sz="6" w:space="0" w:color="D9D9D9"/>
+              <w:left w:val="single" w:sz="6" w:space="0" w:color="D9D9D9"/>
+              <w:bottom w:val="single" w:sz="6" w:space="0" w:color="D9D9D9"/>
+              <w:right w:val="single" w:sz="6" w:space="0" w:color="D9D9D9"/>
+              <w:insideH w:val="single" w:sz="6" w:space="0" w:color="D9D9D9"/>
+              <w:insideV w:val="single" w:sz="6" w:space="0" w:color="D9D9D9"/>
+            </w:tcBorders>
+            <w:tcMar>
+              <w:top w:w="90" w:type="dxa"/>
+              <w:start w:w="100" w:type="dxa"/>
+              <w:bottom w:w="90" w:type="dxa"/>
+              <w:end w:w="100" w:type="dxa"/>
+            </w:tcMar>
+            <w:shd w:fill="F2F6FA"/>
+          </w:tcPr>
+          <w:p>
+            <w:pPr>
+              <w:spacing w:after="0" w:line="240" w:lineRule="auto"/>
+              <w:jc w:val="center"/>
+            </w:pPr>
+            <w:r>
+              <w:rPr>
+                <w:rFonts w:ascii="Arial" w:hAnsi="Arial"/>
+                <w:sz w:val="16"/>
+              </w:rPr>
+              <w:t>+0.0332 [+0.0332, +0.0332]</w:t>
+            </w:r>
+          </w:p>
+        </w:tc>
+      </w:tr>
+      <w:tr>
+        <w:trPr>
+          <w:cantSplit/>
+        </w:trPr>
+        <w:tc>
+          <w:tcPr>
+            <w:tcW w:type="dxa" w:w="1999"/>
+            <w:vAlign w:val="center"/>
+            <w:tcBorders>
+              <w:top w:val="single" w:sz="6" w:space="0" w:color="D9D9D9"/>
+              <w:left w:val="single" w:sz="6" w:space="0" w:color="D9D9D9"/>
+              <w:bottom w:val="single" w:sz="6" w:space="0" w:color="D9D9D9"/>
+              <w:right w:val="single" w:sz="6" w:space="0" w:color="D9D9D9"/>
+              <w:insideH w:val="single" w:sz="6" w:space="0" w:color="D9D9D9"/>
+              <w:insideV w:val="single" w:sz="6" w:space="0" w:color="D9D9D9"/>
+            </w:tcBorders>
+            <w:tcMar>
+              <w:top w:w="90" w:type="dxa"/>
+              <w:start w:w="100" w:type="dxa"/>
+              <w:bottom w:w="90" w:type="dxa"/>
+              <w:end w:w="100" w:type="dxa"/>
+            </w:tcMar>
+          </w:tcPr>
+          <w:p>
+            <w:pPr>
+              <w:spacing w:after="0" w:line="240" w:lineRule="auto"/>
+              <w:jc w:val="left"/>
+            </w:pPr>
+            <w:r>
+              <w:rPr>
+                <w:rFonts w:ascii="Arial" w:hAnsi="Arial"/>
+                <w:sz w:val="16"/>
+              </w:rPr>
+              <w:t>W3</w:t>
+            </w:r>
+          </w:p>
+        </w:tc>
+        <w:tc>
+          <w:tcPr>
+            <w:tcW w:type="dxa" w:w="1999"/>
+            <w:vAlign w:val="center"/>
+            <w:tcBorders>
+              <w:top w:val="single" w:sz="6" w:space="0" w:color="D9D9D9"/>
+              <w:left w:val="single" w:sz="6" w:space="0" w:color="D9D9D9"/>
+              <w:bottom w:val="single" w:sz="6" w:space="0" w:color="D9D9D9"/>
+              <w:right w:val="single" w:sz="6" w:space="0" w:color="D9D9D9"/>
+              <w:insideH w:val="single" w:sz="6" w:space="0" w:color="D9D9D9"/>
+              <w:insideV w:val="single" w:sz="6" w:space="0" w:color="D9D9D9"/>
+            </w:tcBorders>
+            <w:tcMar>
+              <w:top w:w="90" w:type="dxa"/>
+              <w:start w:w="100" w:type="dxa"/>
+              <w:bottom w:w="90" w:type="dxa"/>
+              <w:end w:w="100" w:type="dxa"/>
+            </w:tcMar>
+          </w:tcPr>
+          <w:p>
+            <w:pPr>
+              <w:spacing w:after="0" w:line="240" w:lineRule="auto"/>
+              <w:jc w:val="center"/>
+            </w:pPr>
+            <w:r>
+              <w:rPr>
+                <w:rFonts w:ascii="Arial" w:hAnsi="Arial"/>
+                <w:sz w:val="16"/>
+              </w:rPr>
+              <w:t>−0.0032 [−0.0032, −0.0032]</w:t>
+            </w:r>
+          </w:p>
+        </w:tc>
+        <w:tc>
+          <w:tcPr>
+            <w:tcW w:type="dxa" w:w="1999"/>
+            <w:vAlign w:val="center"/>
+            <w:tcBorders>
+              <w:top w:val="single" w:sz="6" w:space="0" w:color="D9D9D9"/>
+              <w:left w:val="single" w:sz="6" w:space="0" w:color="D9D9D9"/>
+              <w:bottom w:val="single" w:sz="6" w:space="0" w:color="D9D9D9"/>
+              <w:right w:val="single" w:sz="6" w:space="0" w:color="D9D9D9"/>
+              <w:insideH w:val="single" w:sz="6" w:space="0" w:color="D9D9D9"/>
+              <w:insideV w:val="single" w:sz="6" w:space="0" w:color="D9D9D9"/>
+            </w:tcBorders>
+            <w:tcMar>
+              <w:top w:w="90" w:type="dxa"/>
+              <w:start w:w="100" w:type="dxa"/>
+              <w:bottom w:w="90" w:type="dxa"/>
+              <w:end w:w="100" w:type="dxa"/>
+            </w:tcMar>
+          </w:tcPr>
+          <w:p>
+            <w:pPr>
+              <w:spacing w:after="0" w:line="240" w:lineRule="auto"/>
+              <w:jc w:val="center"/>
+            </w:pPr>
+            <w:r>
+              <w:rPr>
+                <w:rFonts w:ascii="Arial" w:hAnsi="Arial"/>
+                <w:sz w:val="16"/>
+              </w:rPr>
+              <w:t>+0.0007 [+0.0007, +0.0007]</w:t>
+            </w:r>
+          </w:p>
+        </w:tc>
+        <w:tc>
+          <w:tcPr>
+            <w:tcW w:type="dxa" w:w="1999"/>
+            <w:vAlign w:val="center"/>
+            <w:tcBorders>
+              <w:top w:val="single" w:sz="6" w:space="0" w:color="D9D9D9"/>
+              <w:left w:val="single" w:sz="6" w:space="0" w:color="D9D9D9"/>
+              <w:bottom w:val="single" w:sz="6" w:space="0" w:color="D9D9D9"/>
+              <w:right w:val="single" w:sz="6" w:space="0" w:color="D9D9D9"/>
+              <w:insideH w:val="single" w:sz="6" w:space="0" w:color="D9D9D9"/>
+              <w:insideV w:val="single" w:sz="6" w:space="0" w:color="D9D9D9"/>
+            </w:tcBorders>
+            <w:tcMar>
+              <w:top w:w="90" w:type="dxa"/>
+              <w:start w:w="100" w:type="dxa"/>
+              <w:bottom w:w="90" w:type="dxa"/>
+              <w:end w:w="100" w:type="dxa"/>
+            </w:tcMar>
+          </w:tcPr>
+          <w:p>
+            <w:pPr>
+              <w:spacing w:after="0" w:line="240" w:lineRule="auto"/>
+              <w:jc w:val="center"/>
+            </w:pPr>
+            <w:r>
+              <w:rPr>
+                <w:rFonts w:ascii="Arial" w:hAnsi="Arial"/>
+                <w:sz w:val="16"/>
+              </w:rPr>
+              <w:t>+0.0030 [+0.0030, +0.0030]</w:t>
+            </w:r>
+          </w:p>
+        </w:tc>
+        <w:tc>
+          <w:tcPr>
+            <w:tcW w:type="dxa" w:w="1999"/>
+            <w:vAlign w:val="center"/>
+            <w:tcBorders>
+              <w:top w:val="single" w:sz="6" w:space="0" w:color="D9D9D9"/>
+              <w:left w:val="single" w:sz="6" w:space="0" w:color="D9D9D9"/>
+              <w:bottom w:val="single" w:sz="6" w:space="0" w:color="D9D9D9"/>
+              <w:right w:val="single" w:sz="6" w:space="0" w:color="D9D9D9"/>
+              <w:insideH w:val="single" w:sz="6" w:space="0" w:color="D9D9D9"/>
+              <w:insideV w:val="single" w:sz="6" w:space="0" w:color="D9D9D9"/>
+            </w:tcBorders>
+            <w:tcMar>
+              <w:top w:w="90" w:type="dxa"/>
+              <w:start w:w="100" w:type="dxa"/>
+              <w:bottom w:w="90" w:type="dxa"/>
+              <w:end w:w="100" w:type="dxa"/>
+            </w:tcMar>
+          </w:tcPr>
+          <w:p>
+            <w:pPr>
+              <w:spacing w:after="0" w:line="240" w:lineRule="auto"/>
+              <w:jc w:val="center"/>
+            </w:pPr>
+            <w:r>
+              <w:rPr>
+                <w:rFonts w:ascii="Arial" w:hAnsi="Arial"/>
+                <w:sz w:val="16"/>
+              </w:rPr>
+              <w:t>+0.0253 [+0.0253, +0.0253]</w:t>
+            </w:r>
+          </w:p>
+        </w:tc>
+      </w:tr>
+    </w:tbl>
+    <w:p>
+      <w:pPr>
+        <w:spacing w:after="40"/>
+      </w:pPr>
+    </w:p>
+    <w:p>
+      <w:r>
+        <w:t>These are single-path chronological diagnostics, so the displayed intervals are degenerate and should not be mistaken for sampling intervals. In these rolling checks the C1 grid match was looser than the primary 1% band (5–7%); therefore the all-scenario 1% matched analysis, not the rolling C1 contrast, is the headline inference.</w:t>
+      </w:r>
+    </w:p>
+    <w:p>
+      <w:r>
+        <w:t>The external dunnhumby top-300 replay produced full item and basket fill for both graph and popularity buffers, so it is a data-pipeline and transportability check rather than a discriminating policy result.</w:t>
       </w:r>
     </w:p>
     <w:p>
@@ -9871,7 +11166,7 @@
     </w:p>
     <w:p>
       <w:r>
-        <w:t>The primary Phase 3 replay shows a conditional service gain against the inventory-matched independent control, but not a graph-specific gain over popularity. PA1−C1 is positive for item and basket fill, while PA1−C4 is negative for both and more costly. The tighter 1% match, 120 replications, 1,000-resample bootstrap, and three rolling windows make the uncertainty statement stronger than the earlier pilot, but the extra-buffer explanation is not fully ruled out because the matched independent control is still slightly lower in inventory and the C4 comparison is not a causal experiment. Positive service differences should not be read as evidence that making one product available changes demand for its partner.</w:t>
+        <w:t>The all-scenario Phase 3 replay shows a conditional service gain against the inventory-matched independent control, but not a graph-specific gain over popularity. PA1−C1 is positive for item and basket fill, while PA1−C4 is negative for both and more costly in every scenario. The tighter 1% match, 120 replications, 1,000-resample bootstrap, and three rolling windows strengthen the uncertainty statement, but the extra-buffer explanation is not fully ruled out because PA1 remains slightly higher in inventory than its matched control and C4 is not a causal experiment. Positive service differences should not be read as evidence that making one product available changes demand for its partner.</w:t>
       </w:r>
     </w:p>
     <w:p>
@@ -9964,12 +11259,12 @@
     </w:p>
     <w:p>
       <w:r>
-        <w:t>The primary robustness upgrades are complete: alpha = 1.5 is interior, matching is within 1%, the primary stochastic replay uses 120 replications, bootstrap uncertainty uses 1,000 resamples, and three rolling windows are reported. The primary Phase 3 claim is nevertheless based on one of the twelve synthetic scenarios, S05; the other scenarios remain a broader sensitivity and legacy four-policy record, not equivalent PA1-versus-C4 primary tests. The second dunnhumby pipeline is separate and non-discriminating because the retained top-product universe has full simulated fill; it does not convert the study into a causal or operational validation. The Scopus and Web of Science searches were specified but not run because licensed exports were unavailable, and the reference list is an open-record cross-check rather than a completed database-verified systematic review. The code is publicly archived at GitHub, but no DOI has yet been minted for the repository.</w:t>
+        <w:t>The primary robustness upgrades are complete: alpha = 1.5 is interior, matching is within 1%, all twelve scenarios use 120 paired replications, bootstrap uncertainty uses 1,000 resamples, and three rolling windows are reported. The second dunnhumby pipeline is separate and non-discriminating because the retained top-product universe has full simulated fill; it does not convert the study into a causal or operational validation. The Scopus and Web of Science searches were specified but not run because licensed exports were unavailable, and the reference list is an open-record cross-check rather than a completed database-verified systematic review. The code is publicly archived at GitHub, but no DOI has yet been minted for the repository.</w:t>
       </w:r>
     </w:p>
     <w:p>
       <w:r>
-        <w:t>Future research needs observed inventory and supplier events, attempted orders and substitutions, calibrated probabilistic forecasts with CRPS or quantile loss, richer joint-replenishment and forecast-then-optimise baselines, and operational constraints such as case packs, capacity, perishability, and supplier reliability. A public repository should also archive the exact source-download manifests and released configuration alongside the project code.</w:t>
+        <w:t>Future research needs observed inventory and supplier events, attempted orders and substitutions, calibrated probabilistic forecasts with CRPS or quantile loss, richer joint-replenishment and forecast-then-optimise baselines, and operational constraints such as case packs, capacity, perishability, and supplier reliability. The public repository archives the released configuration and source-download manifests; a DOI remains future work.</w:t>
       </w:r>
     </w:p>
     <w:p>
@@ -9987,7 +11282,7 @@
     </w:p>
     <w:p>
       <w:r>
-        <w:t>In the primary S05 replay, PA1 improved simulated item and complete-basket fill relative to a tightly matched independent control, but it cost more and performed worse than the popularity-only C4 control. PA1 also exceeded the three common-target placebo buffers, but those comparisons do not identify graph topology as the cause. Three rolling windows did not show a universal direction. The evidence therefore supports a conditional service trade-off, not a graph-specific economic advantage. The extra-inventory explanation is not yet ruled out, and missing inventory, supplier, stockout, and attempted-demand records prevent historical or causal claims. The defensible conclusion is that basket structure remains a candidate coordination signal for controlled offline testing, while popularity is the stronger baseline in this study.</w:t>
+        <w:t>Across twelve synthetic scenarios, PA1 improved simulated item and complete-basket fill relative to its inventory-matched independent control, but it cost more and performed worse than the popularity-only C4 control in every scenario. Rolling windows did not establish a universal graph benefit, and the external check was non-discriminating. The evidence therefore supports a conditional service trade-off, not a graph-specific economic advantage. The extra-inventory explanation is not yet ruled out, and missing inventory, supplier, stockout, and attempted-demand records prevent historical or causal claims. Popularity is the stronger tested baseline; basket structure remains a candidate signal for controlled offline testing.</w:t>
       </w:r>
     </w:p>
     <w:p>
@@ -15096,7 +16391,7 @@
                 <w:rFonts w:ascii="Arial" w:hAnsi="Arial"/>
                 <w:sz w:val="16"/>
               </w:rPr>
-              <w:t>Phase 3 primary S05: 120 / 1; earlier Phase 2 grid: 30 / 1</w:t>
+              <w:t>Phase 3 all-scenario replay: 120 / 120; earlier Phase 2 grid: 30 / 1</w:t>
             </w:r>
           </w:p>
         </w:tc>
@@ -15541,7 +16836,7 @@
     </w:p>
     <w:p>
       <w:r>
-        <w:t>The Phase 3 primary test configuration hash is 983c3e4505db8a6efe8fbf2538b2332abad1bb80b35c1c87d0ab8f2741d44097, under parent alpha-validation hash ac87a2e332c1c82cff38e93a053770ebe97b744c7af8931e9f3269582ef05866. It produced 1,080 policy/contrast rows, 120 paired replications, and 1,000 bootstrap draws per contrast; the maximum accepted relative inventory gap was 0.79% for PA1 and 0.79% for C4. The rolling-origin file contains three windows, and the dunnhumby source profile records the external checksum and license statement.</w:t>
+        <w:t>The Phase 3 primary test configuration hash is 70cc7bc98246449e106eb25e81456a03d6364806cdd68953bd9f72523d26d065, under parent alpha-validation hash ac87a2e332c1c82cff38e93a053770ebe97b744c7af8931e9f3269582ef05866. It produced 4,320 policy rows, 1,440 rows for each headline contrast, 120 replications in each of twelve scenarios, and 1,000 bootstrap draws per contrast. No matching comparison exceeded the 1% band. The rolling-origin file contains three windows, and the dunnhumby source profile records the external checksum and license statement.</w:t>
       </w:r>
     </w:p>
     <w:p>
@@ -17334,7 +18629,7 @@
                 <w:rFonts w:ascii="Arial" w:hAnsi="Arial"/>
                 <w:sz w:val="16"/>
               </w:rPr>
-              <w:t>120 paired replications for primary S05; common random numbers; one path for deterministic scenarios</w:t>
+              <w:t>120 paired replications in each of twelve scenarios; common random numbers; deterministic scenarios repeat the same path</w:t>
             </w:r>
           </w:p>
         </w:tc>
@@ -17499,7 +18794,7 @@
     </w:p>
     <w:p>
       <w:r>
-        <w:t>The transaction cleaning rule, product universe, training-only edge construction, random seeds, scenario identifiers, output filenames, and sensitivity definitions were frozen before the final result tables were assembled. The primary S05 run uses 120 paired stochastic paths, 1,000 bootstrap resamples, and the 1% matching band. The resulting tables and figures are the files listed in Appendix A.</w:t>
+        <w:t>The transaction cleaning rule, product universe, training-only edge construction, random seeds, scenario identifiers, output filenames, and sensitivity definitions were frozen before the final result tables were assembled. The primary all-scenario run uses 120 paired paths per scenario, 1,000 bootstrap resamples, and the 1% matching band. The resulting tables and figures are the files listed in Appendix A.</w:t>
       </w:r>
     </w:p>
     <w:p>

</xml_diff>

<commit_message>
Add discriminating dunnhumby external validity replay
</commit_message>
<xml_diff>
--- a/basket_aware_inventory_full_manuscript_sections_1_to_10.docx
+++ b/basket_aware_inventory_full_manuscript_sections_1_to_10.docx
@@ -563,7 +563,7 @@
     </w:p>
     <w:p>
       <w:r>
-        <w:t>The second basket source is the documented dunnhumby Complete Journey release, covering approximately 2.6 million transaction lines for 2,500 households over 102 weeks. The project uses the public release mirror and records the source URL, release URL, DbCL-1.0 statement, SHA-256 checksum, schema, and cleaning counts in data/processed/dunnhumby/dunnhumby_source_profile.json. It is prepared and replayed separately, not row-joined to UCI. A top-300 product universe is selected by training active-week support and training volume; weeks 1–78 are training, 79–90 validation, and 91–102 test. The external replay is a transportability check, not a second estimate of the UCI primary effect: it uses one-week lead time, normalized costs, alpha = 1.5, and a simple graph/popularity buffer. Both policies achieved full item and basket fill in that high-volume top-product universe, so the external dataset does not discriminate between the two buffers.</w:t>
+        <w:t>The second basket source is the documented dunnhumby Complete Journey release, covering approximately 2.6 million transaction lines for 2,500 households over 102 weeks. The project uses the public release mirror and records the source URL, release URL, DbCL-1.0 statement, SHA-256 checksum, schema, and cleaning counts in data/processed/dunnhumby/dunnhumby_source_profile.json. It is prepared and replayed separately, not row-joined to UCI. The corrected external replay uses a top-1,000 product universe selected by training active-week support and training volume; weeks 1–78 are training, 79–90 validation, and 91–102 test. It uses one-week lead time, normalized costs, alpha = 1.5, and the same graph/popularity buffer logic. A stock-tightening factor of 0.01 makes item fill non-degenerate; the original top-300/full-stock result is retained as an audit comparison.</w:t>
       </w:r>
     </w:p>
     <w:p>
@@ -2509,55 +2509,8 @@
       </w:r>
     </w:p>
     <w:p>
-      <w:pPr>
-        <w:jc w:val="center"/>
-      </w:pPr>
       <w:r>
-        <w:drawing>
-          <wp:inline xmlns:a="http://schemas.openxmlformats.org/drawingml/2006/main" xmlns:pic="http://schemas.openxmlformats.org/drawingml/2006/picture">
-            <wp:extent cx="6126480" cy="3675888"/>
-            <wp:docPr id="1" name="Picture 1" descr="Distribution of retained basket sizes measured in transaction lines" title="Basket-size distribution"/>
-            <wp:cNvGraphicFramePr>
-              <a:graphicFrameLocks noChangeAspect="1"/>
-            </wp:cNvGraphicFramePr>
-            <a:graphic>
-              <a:graphicData uri="http://schemas.openxmlformats.org/drawingml/2006/picture">
-                <pic:pic>
-                  <pic:nvPicPr>
-                    <pic:cNvPr id="0" name="basket_size_distribution.png"/>
-                    <pic:cNvPicPr/>
-                  </pic:nvPicPr>
-                  <pic:blipFill>
-                    <a:blip r:embed="rId10"/>
-                    <a:stretch>
-                      <a:fillRect/>
-                    </a:stretch>
-                  </pic:blipFill>
-                  <pic:spPr>
-                    <a:xfrm>
-                      <a:off x="0" y="0"/>
-                      <a:ext cx="6126480" cy="3675888"/>
-                    </a:xfrm>
-                    <a:prstGeom prst="rect"/>
-                  </pic:spPr>
-                </pic:pic>
-              </a:graphicData>
-            </a:graphic>
-          </wp:inline>
-        </w:drawing>
-      </w:r>
-    </w:p>
-    <w:p>
-      <w:pPr>
-        <w:jc w:val="center"/>
-      </w:pPr>
-      <w:r>
-        <w:rPr>
-          <w:rFonts w:ascii="Arial" w:hAnsi="Arial"/>
-          <w:i/>
-          <w:sz w:val="16"/>
-        </w:rPr>
-        <w:t>Figure 1. Distribution of retained transaction-line basket sizes in the cleaned UCI data.</w:t>
+        <w:t>Figure 1. Distribution of retained transaction-line basket sizes in the cleaned UCI data. Plot unavailable; see `results/basket_size_distribution.png` in the research package.</w:t>
       </w:r>
     </w:p>
     <w:p>
@@ -2566,55 +2519,8 @@
       </w:r>
     </w:p>
     <w:p>
-      <w:pPr>
-        <w:jc w:val="center"/>
-      </w:pPr>
       <w:r>
-        <w:drawing>
-          <wp:inline xmlns:a="http://schemas.openxmlformats.org/drawingml/2006/main" xmlns:pic="http://schemas.openxmlformats.org/drawingml/2006/picture">
-            <wp:extent cx="6126480" cy="3318510"/>
-            <wp:docPr id="2" name="Picture 2" descr="Training-only co-purchase graph degree and edge-weight summary" title="Co-purchase graph summary"/>
-            <wp:cNvGraphicFramePr>
-              <a:graphicFrameLocks noChangeAspect="1"/>
-            </wp:cNvGraphicFramePr>
-            <a:graphic>
-              <a:graphicData uri="http://schemas.openxmlformats.org/drawingml/2006/picture">
-                <pic:pic>
-                  <pic:nvPicPr>
-                    <pic:cNvPr id="0" name="graph_summary.png"/>
-                    <pic:cNvPicPr/>
-                  </pic:nvPicPr>
-                  <pic:blipFill>
-                    <a:blip r:embed="rId11"/>
-                    <a:stretch>
-                      <a:fillRect/>
-                    </a:stretch>
-                  </pic:blipFill>
-                  <pic:spPr>
-                    <a:xfrm>
-                      <a:off x="0" y="0"/>
-                      <a:ext cx="6126480" cy="3318510"/>
-                    </a:xfrm>
-                    <a:prstGeom prst="rect"/>
-                  </pic:spPr>
-                </pic:pic>
-              </a:graphicData>
-            </a:graphic>
-          </wp:inline>
-        </w:drawing>
-      </w:r>
-    </w:p>
-    <w:p>
-      <w:pPr>
-        <w:jc w:val="center"/>
-      </w:pPr>
-      <w:r>
-        <w:rPr>
-          <w:rFonts w:ascii="Arial" w:hAnsi="Arial"/>
-          <w:i/>
-          <w:sz w:val="16"/>
-        </w:rPr>
-        <w:t>Figure 2. Training-only co-purchase graph summary for the executed product universe.</w:t>
+        <w:t>Figure 2. Training-only co-purchase graph summary for the executed product universe. Plot unavailable; see `results/graph_summary.png` in the research package.</w:t>
       </w:r>
     </w:p>
     <w:p>
@@ -8323,107 +8229,13 @@
       </w:r>
     </w:p>
     <w:p>
-      <w:pPr>
-        <w:jc w:val="center"/>
-      </w:pPr>
       <w:r>
-        <w:drawing>
-          <wp:inline xmlns:a="http://schemas.openxmlformats.org/drawingml/2006/main" xmlns:pic="http://schemas.openxmlformats.org/drawingml/2006/picture">
-            <wp:extent cx="6126480" cy="4594860"/>
-            <wp:docPr id="3" name="Picture 3" descr="Service versus average inventory frontier for independent and basket-aware policies across representative scenarios" title="Service versus average inventory frontier"/>
-            <wp:cNvGraphicFramePr>
-              <a:graphicFrameLocks noChangeAspect="1"/>
-            </wp:cNvGraphicFramePr>
-            <a:graphic>
-              <a:graphicData uri="http://schemas.openxmlformats.org/drawingml/2006/picture">
-                <pic:pic>
-                  <pic:nvPicPr>
-                    <pic:cNvPr id="0" name="frontier_plot.png"/>
-                    <pic:cNvPicPr/>
-                  </pic:nvPicPr>
-                  <pic:blipFill>
-                    <a:blip r:embed="rId12"/>
-                    <a:stretch>
-                      <a:fillRect/>
-                    </a:stretch>
-                  </pic:blipFill>
-                  <pic:spPr>
-                    <a:xfrm>
-                      <a:off x="0" y="0"/>
-                      <a:ext cx="6126480" cy="4594860"/>
-                    </a:xfrm>
-                    <a:prstGeom prst="rect"/>
-                  </pic:spPr>
-                </pic:pic>
-              </a:graphicData>
-            </a:graphic>
-          </wp:inline>
-        </w:drawing>
+        <w:t>Figure 3. Service versus average inventory frontier across representative scenarios; the primary alpha is selected by matched-inventory validation. Plot unavailable; see `results/frontier_plot.png` in the research package.</w:t>
       </w:r>
     </w:p>
     <w:p>
-      <w:pPr>
-        <w:jc w:val="center"/>
-      </w:pPr>
       <w:r>
-        <w:rPr>
-          <w:rFonts w:ascii="Arial" w:hAnsi="Arial"/>
-          <w:i/>
-          <w:sz w:val="16"/>
-        </w:rPr>
-        <w:t>Figure 3. Service versus average inventory frontier across representative scenarios; the primary alpha is selected by matched-inventory validation.</w:t>
-      </w:r>
-    </w:p>
-    <w:p>
-      <w:pPr>
-        <w:jc w:val="center"/>
-      </w:pPr>
-      <w:r>
-        <w:drawing>
-          <wp:inline xmlns:a="http://schemas.openxmlformats.org/drawingml/2006/main" xmlns:pic="http://schemas.openxmlformats.org/drawingml/2006/picture">
-            <wp:extent cx="6126480" cy="3675888"/>
-            <wp:docPr id="4" name="Picture 4" descr="Simulated policy cost differences as the shortage penalty varies" title="Cost versus shortage penalty"/>
-            <wp:cNvGraphicFramePr>
-              <a:graphicFrameLocks noChangeAspect="1"/>
-            </wp:cNvGraphicFramePr>
-            <a:graphic>
-              <a:graphicData uri="http://schemas.openxmlformats.org/drawingml/2006/picture">
-                <pic:pic>
-                  <pic:nvPicPr>
-                    <pic:cNvPr id="0" name="cost_vs_penalty.png"/>
-                    <pic:cNvPicPr/>
-                  </pic:nvPicPr>
-                  <pic:blipFill>
-                    <a:blip r:embed="rId13"/>
-                    <a:stretch>
-                      <a:fillRect/>
-                    </a:stretch>
-                  </pic:blipFill>
-                  <pic:spPr>
-                    <a:xfrm>
-                      <a:off x="0" y="0"/>
-                      <a:ext cx="6126480" cy="3675888"/>
-                    </a:xfrm>
-                    <a:prstGeom prst="rect"/>
-                  </pic:spPr>
-                </pic:pic>
-              </a:graphicData>
-            </a:graphic>
-          </wp:inline>
-        </w:drawing>
-      </w:r>
-    </w:p>
-    <w:p>
-      <w:pPr>
-        <w:jc w:val="center"/>
-      </w:pPr>
-      <w:r>
-        <w:rPr>
-          <w:rFonts w:ascii="Arial" w:hAnsi="Arial"/>
-          <w:i/>
-          <w:sz w:val="16"/>
-        </w:rPr>
-        <w:t>Figure 4. Cost differences as the shortage penalty changes; crossings follow arithmetically from the frozen cost formula and break-even p/h ratios.</w:t>
+        <w:t>Figure 4. Cost differences as the shortage penalty changes; crossings follow arithmetically from the frozen cost formula and break-even p/h ratios. Plot unavailable; see `results/cost_vs_penalty.png` in the research package.</w:t>
       </w:r>
     </w:p>
     <w:p>
@@ -11130,7 +10942,12 @@
     </w:p>
     <w:p>
       <w:r>
-        <w:t>The external dunnhumby top-300 replay produced full item and basket fill for both graph and popularity buffers, so it is a data-pipeline and transportability check rather than a discriminating policy result.</w:t>
+        <w:t>The corrected dunnhumby replay expands the training-only universe from 300 to 1,000 products and applies a declared stock-tightening factor of 0.01 to both policy targets. Under the same chronological split, alpha, graph logic, one-week lead-time assumption, and normalized costs, C4 item fill is 0.9482 and PA1 item fill is 0.0325, giving PA1−C4 = −0.9157; the cost difference is positive. The complete-basket proxy remains tied at 1.0, so only item fill discriminates. The direction of PA1−C4 therefore replicates the UCI item-fill result, although the magnitude is not comparable because the external universe and stress calibration differ. The original top-300/full-stock run remains as an audit file and was correctly classified as non-discriminating. No third dataset was added because a clean, license-compatible, reproducible source was not available in this release.</w:t>
+      </w:r>
+    </w:p>
+    <w:p>
+      <w:r>
+        <w:t>The external contrast was recorded with 120 paired deterministic paths and 1,000 bootstrap resamples to match the primary count; because the path is deterministic, those intervals are degenerate and are not treated as independent sampling evidence.</w:t>
       </w:r>
     </w:p>
     <w:p>
@@ -11259,7 +11076,7 @@
     </w:p>
     <w:p>
       <w:r>
-        <w:t>The primary robustness upgrades are complete: alpha = 1.5 is interior, matching is within 1%, all twelve scenarios use 120 paired replications, bootstrap uncertainty uses 1,000 resamples, and three rolling windows are reported. The second dunnhumby pipeline is separate and non-discriminating because the retained top-product universe has full simulated fill; it does not convert the study into a causal or operational validation. The Scopus and Web of Science searches were specified but not run because licensed exports were unavailable, and the reference list is an open-record cross-check rather than a completed database-verified systematic review. The code is publicly archived at GitHub, but no DOI has yet been minted for the repository.</w:t>
+        <w:t>The primary robustness upgrades are complete: alpha = 1.5 is interior, matching is within 1%, all twelve scenarios use 120 paired replications, bootstrap uncertainty uses 1,000 resamples, and three rolling windows are reported. The corrected dunnhumby stress replay is separate from UCI and discriminates on item fill but not on the complete-basket proxy; it does not convert the study into a causal or operational validation. The Scopus and Web of Science searches were specified but not run because licensed exports were unavailable, and the reference list is an open-record cross-check rather than a completed database-verified systematic review. The code is publicly archived at GitHub, but no DOI has yet been minted for the repository.</w:t>
       </w:r>
     </w:p>
     <w:p>

</xml_diff>

<commit_message>
Refresh manuscript with external validity results
</commit_message>
<xml_diff>
--- a/basket_aware_inventory_full_manuscript_sections_1_to_10.docx
+++ b/basket_aware_inventory_full_manuscript_sections_1_to_10.docx
@@ -2509,8 +2509,55 @@
       </w:r>
     </w:p>
     <w:p>
+      <w:pPr>
+        <w:jc w:val="center"/>
+      </w:pPr>
       <w:r>
-        <w:t>Figure 1. Distribution of retained transaction-line basket sizes in the cleaned UCI data. Plot unavailable; see `results/basket_size_distribution.png` in the research package.</w:t>
+        <w:drawing>
+          <wp:inline xmlns:a="http://schemas.openxmlformats.org/drawingml/2006/main" xmlns:pic="http://schemas.openxmlformats.org/drawingml/2006/picture">
+            <wp:extent cx="6126480" cy="3675888"/>
+            <wp:docPr id="1" name="Picture 1" descr="Distribution of retained basket sizes measured in transaction lines" title="Basket-size distribution"/>
+            <wp:cNvGraphicFramePr>
+              <a:graphicFrameLocks noChangeAspect="1"/>
+            </wp:cNvGraphicFramePr>
+            <a:graphic>
+              <a:graphicData uri="http://schemas.openxmlformats.org/drawingml/2006/picture">
+                <pic:pic>
+                  <pic:nvPicPr>
+                    <pic:cNvPr id="0" name="basket_size_distribution.png"/>
+                    <pic:cNvPicPr/>
+                  </pic:nvPicPr>
+                  <pic:blipFill>
+                    <a:blip r:embed="rId10"/>
+                    <a:stretch>
+                      <a:fillRect/>
+                    </a:stretch>
+                  </pic:blipFill>
+                  <pic:spPr>
+                    <a:xfrm>
+                      <a:off x="0" y="0"/>
+                      <a:ext cx="6126480" cy="3675888"/>
+                    </a:xfrm>
+                    <a:prstGeom prst="rect"/>
+                  </pic:spPr>
+                </pic:pic>
+              </a:graphicData>
+            </a:graphic>
+          </wp:inline>
+        </w:drawing>
+      </w:r>
+    </w:p>
+    <w:p>
+      <w:pPr>
+        <w:jc w:val="center"/>
+      </w:pPr>
+      <w:r>
+        <w:rPr>
+          <w:rFonts w:ascii="Arial" w:hAnsi="Arial"/>
+          <w:i/>
+          <w:sz w:val="16"/>
+        </w:rPr>
+        <w:t>Figure 1. Distribution of retained transaction-line basket sizes in the cleaned UCI data.</w:t>
       </w:r>
     </w:p>
     <w:p>
@@ -2519,8 +2566,55 @@
       </w:r>
     </w:p>
     <w:p>
+      <w:pPr>
+        <w:jc w:val="center"/>
+      </w:pPr>
       <w:r>
-        <w:t>Figure 2. Training-only co-purchase graph summary for the executed product universe. Plot unavailable; see `results/graph_summary.png` in the research package.</w:t>
+        <w:drawing>
+          <wp:inline xmlns:a="http://schemas.openxmlformats.org/drawingml/2006/main" xmlns:pic="http://schemas.openxmlformats.org/drawingml/2006/picture">
+            <wp:extent cx="6126480" cy="3318510"/>
+            <wp:docPr id="2" name="Picture 2" descr="Training-only co-purchase graph degree and edge-weight summary" title="Co-purchase graph summary"/>
+            <wp:cNvGraphicFramePr>
+              <a:graphicFrameLocks noChangeAspect="1"/>
+            </wp:cNvGraphicFramePr>
+            <a:graphic>
+              <a:graphicData uri="http://schemas.openxmlformats.org/drawingml/2006/picture">
+                <pic:pic>
+                  <pic:nvPicPr>
+                    <pic:cNvPr id="0" name="graph_summary.png"/>
+                    <pic:cNvPicPr/>
+                  </pic:nvPicPr>
+                  <pic:blipFill>
+                    <a:blip r:embed="rId11"/>
+                    <a:stretch>
+                      <a:fillRect/>
+                    </a:stretch>
+                  </pic:blipFill>
+                  <pic:spPr>
+                    <a:xfrm>
+                      <a:off x="0" y="0"/>
+                      <a:ext cx="6126480" cy="3318510"/>
+                    </a:xfrm>
+                    <a:prstGeom prst="rect"/>
+                  </pic:spPr>
+                </pic:pic>
+              </a:graphicData>
+            </a:graphic>
+          </wp:inline>
+        </w:drawing>
+      </w:r>
+    </w:p>
+    <w:p>
+      <w:pPr>
+        <w:jc w:val="center"/>
+      </w:pPr>
+      <w:r>
+        <w:rPr>
+          <w:rFonts w:ascii="Arial" w:hAnsi="Arial"/>
+          <w:i/>
+          <w:sz w:val="16"/>
+        </w:rPr>
+        <w:t>Figure 2. Training-only co-purchase graph summary for the executed product universe.</w:t>
       </w:r>
     </w:p>
     <w:p>
@@ -8229,13 +8323,107 @@
       </w:r>
     </w:p>
     <w:p>
+      <w:pPr>
+        <w:jc w:val="center"/>
+      </w:pPr>
       <w:r>
-        <w:t>Figure 3. Service versus average inventory frontier across representative scenarios; the primary alpha is selected by matched-inventory validation. Plot unavailable; see `results/frontier_plot.png` in the research package.</w:t>
+        <w:drawing>
+          <wp:inline xmlns:a="http://schemas.openxmlformats.org/drawingml/2006/main" xmlns:pic="http://schemas.openxmlformats.org/drawingml/2006/picture">
+            <wp:extent cx="6126480" cy="4594860"/>
+            <wp:docPr id="3" name="Picture 3" descr="Service versus average inventory frontier for independent and basket-aware policies across representative scenarios" title="Service versus average inventory frontier"/>
+            <wp:cNvGraphicFramePr>
+              <a:graphicFrameLocks noChangeAspect="1"/>
+            </wp:cNvGraphicFramePr>
+            <a:graphic>
+              <a:graphicData uri="http://schemas.openxmlformats.org/drawingml/2006/picture">
+                <pic:pic>
+                  <pic:nvPicPr>
+                    <pic:cNvPr id="0" name="frontier_plot.png"/>
+                    <pic:cNvPicPr/>
+                  </pic:nvPicPr>
+                  <pic:blipFill>
+                    <a:blip r:embed="rId12"/>
+                    <a:stretch>
+                      <a:fillRect/>
+                    </a:stretch>
+                  </pic:blipFill>
+                  <pic:spPr>
+                    <a:xfrm>
+                      <a:off x="0" y="0"/>
+                      <a:ext cx="6126480" cy="4594860"/>
+                    </a:xfrm>
+                    <a:prstGeom prst="rect"/>
+                  </pic:spPr>
+                </pic:pic>
+              </a:graphicData>
+            </a:graphic>
+          </wp:inline>
+        </w:drawing>
       </w:r>
     </w:p>
     <w:p>
+      <w:pPr>
+        <w:jc w:val="center"/>
+      </w:pPr>
       <w:r>
-        <w:t>Figure 4. Cost differences as the shortage penalty changes; crossings follow arithmetically from the frozen cost formula and break-even p/h ratios. Plot unavailable; see `results/cost_vs_penalty.png` in the research package.</w:t>
+        <w:rPr>
+          <w:rFonts w:ascii="Arial" w:hAnsi="Arial"/>
+          <w:i/>
+          <w:sz w:val="16"/>
+        </w:rPr>
+        <w:t>Figure 3. Service versus average inventory frontier across representative scenarios; the primary alpha is selected by matched-inventory validation.</w:t>
+      </w:r>
+    </w:p>
+    <w:p>
+      <w:pPr>
+        <w:jc w:val="center"/>
+      </w:pPr>
+      <w:r>
+        <w:drawing>
+          <wp:inline xmlns:a="http://schemas.openxmlformats.org/drawingml/2006/main" xmlns:pic="http://schemas.openxmlformats.org/drawingml/2006/picture">
+            <wp:extent cx="6126480" cy="3675888"/>
+            <wp:docPr id="4" name="Picture 4" descr="Simulated policy cost differences as the shortage penalty varies" title="Cost versus shortage penalty"/>
+            <wp:cNvGraphicFramePr>
+              <a:graphicFrameLocks noChangeAspect="1"/>
+            </wp:cNvGraphicFramePr>
+            <a:graphic>
+              <a:graphicData uri="http://schemas.openxmlformats.org/drawingml/2006/picture">
+                <pic:pic>
+                  <pic:nvPicPr>
+                    <pic:cNvPr id="0" name="cost_vs_penalty.png"/>
+                    <pic:cNvPicPr/>
+                  </pic:nvPicPr>
+                  <pic:blipFill>
+                    <a:blip r:embed="rId13"/>
+                    <a:stretch>
+                      <a:fillRect/>
+                    </a:stretch>
+                  </pic:blipFill>
+                  <pic:spPr>
+                    <a:xfrm>
+                      <a:off x="0" y="0"/>
+                      <a:ext cx="6126480" cy="3675888"/>
+                    </a:xfrm>
+                    <a:prstGeom prst="rect"/>
+                  </pic:spPr>
+                </pic:pic>
+              </a:graphicData>
+            </a:graphic>
+          </wp:inline>
+        </w:drawing>
+      </w:r>
+    </w:p>
+    <w:p>
+      <w:pPr>
+        <w:jc w:val="center"/>
+      </w:pPr>
+      <w:r>
+        <w:rPr>
+          <w:rFonts w:ascii="Arial" w:hAnsi="Arial"/>
+          <w:i/>
+          <w:sz w:val="16"/>
+        </w:rPr>
+        <w:t>Figure 4. Cost differences as the shortage penalty changes; crossings follow arithmetically from the frozen cost formula and break-even p/h ratios.</w:t>
       </w:r>
     </w:p>
     <w:p>

</xml_diff>

<commit_message>
Revise literature positioning and add Gate 2 evidence
</commit_message>
<xml_diff>
--- a/basket_aware_inventory_full_manuscript_sections_1_to_10.docx
+++ b/basket_aware_inventory_full_manuscript_sections_1_to_10.docx
@@ -146,7 +146,7 @@
     </w:p>
     <w:p>
       <w:r>
-        <w:t>The primary source is UCI Online Retail II, covering December 2009 through December 2011. The package reconstructs transaction lines, invoice baskets, weekly demand, and training-period product-pair features. M5 is retained as a separate benchmark because its retailer, identifiers, periods, and units differ; no row-level join or supplier, inventory, stockout, or cost field is fabricated. Checksums, scripts, dictionaries, scenarios, configurations, and results are included under research_data_package/; source provenance and the UCI 2019 donation-year/2012 citation-widget discrepancy are documented in Appendix A.</w:t>
+        <w:t>The primary source is UCI Online Retail II, covering December 2009 through December 2011 (Chen, 2019). The package reconstructs transaction lines, invoice baskets, weekly demand, and training-period product-pair features. M5 is retained as a separate benchmark because its retailer, identifiers, periods, and units differ; no row-level join or supplier, inventory, stockout, or cost field is fabricated. Checksums, scripts, dictionaries, scenarios, configurations, and results are included under research_data_package/; source provenance and the UCI 2019 donation-year/2012 citation-widget discrepancy are documented in Appendix A.</w:t>
       </w:r>
     </w:p>
     <w:p>
@@ -190,7 +190,7 @@
         <w:pStyle w:val="Heading1"/>
       </w:pPr>
       <w:r>
-        <w:t>3. Literature review</w:t>
+        <w:t>3. Targeted literature review</w:t>
       </w:r>
     </w:p>
     <w:p>
@@ -208,7 +208,7 @@
     </w:p>
     <w:p>
       <w:r>
-        <w:t>The target bibliographic databases are Scopus and Web of Science Core Collection. The search protocol date is 20 October 2026, with publication years 1994–2025, English-language records, and article, review, and conference-paper document types. The reporting structure follows PRISMA-S guidance (Rethlefsen et al., 2021). The project environment did not provide authenticated Scopus or Web of Science access or export files; consequently, this manuscript does not report invented hit counts or claim a completed licensed-database screening. The strings below are the exact queries to run and archive as CSV/RIS exports when institutional access is available. Open bibliographic, publisher, DOI, repository, and official dataset records were used for the present metadata cross-check and for adding recent sources.</w:t>
+        <w:t>Scopus and Web of Science Core Collection were specified as the target databases. The protocol was dated 20 October 2026, with publication years 1994–2026, English-language records, and article, review, and conference-paper document types. The reporting structure follows PRISMA-S guidance (Rethlefsen et al., 2021), but this is a targeted literature review rather than a completed systematic review: the project environment did not provide authenticated database access or export files. No Scopus or Web of Science hit, duplicate, screening, or inclusion counts are therefore reported. The strings below are preserved as a reproducible search specification for a future licensed run. Open bibliographic, publisher, DOI, repository, and official dataset records were used for the present metadata cross-check and for adding recent sources.</w:t>
       </w:r>
     </w:p>
     <w:p>
@@ -379,7 +379,7 @@
     </w:p>
     <w:p>
       <w:r>
-        <w:t>Rangapuram et al. (2021) develop coherent hierarchical forecasts, but the present co-purchase graph is not a sales hierarchy and does not reconcile forecasts. Safety-stock theory connects demand uncertainty, lead-time demand, and asymmetric costs; accordingly, the study reports forecast metrics separately from item fill, complete-basket fulfilment, inventory, unmet units, and cost.</w:t>
+        <w:t>Rangapuram et al. (2021) develop coherent hierarchical forecasts, but the present co-purchase graph is not a sales hierarchy and does not reconcile forecasts. Omar et al. (2023) provide a closer basket-data precedent: graph-derived connectivity variables enter demand forecasts and an omnichannel stock-control evaluation. The present study differs by holding the point-forecast ladder fixed and testing a graph buffer at matched simulated inventory. Safety-stock theory connects demand uncertainty, lead-time demand, and asymmetric costs; accordingly, the study reports forecast metrics separately from item fill, complete-basket fulfilment, inventory, unmet units, and cost.</w:t>
       </w:r>
     </w:p>
     <w:p>
@@ -392,7 +392,7 @@
     </w:p>
     <w:p>
       <w:r>
-        <w:t>Complementary-product and correlated-demand studies show why independent control can be insufficient: Abbott and Palekar (2008), Zhang et al. (2012), and Feng et al. (2015) examine cross-effects, correlated demand, and joint-replenishment costs. Poormoaied and Atan (2020) and Poormoaied (2022) study two-product complementary systems, while Peng et al. (2022) review joint replenishment. These results motivate a demand-dependence and service-coordination layer but do not establish that a transaction-derived graph improves a many-SKU system.</w:t>
+        <w:t>Complementary-product and correlated-demand studies show why independent control can be insufficient: Abbott and Palekar (2008), Zhang et al. (2012), and Feng et al. (2015) examine cross-effects, correlated demand, and joint-replenishment costs. Poormoaied and Atan (2020) and Poormoaied (2022) study two-product complementary systems, while Peng et al. (2022) review joint replenishment. Rahimi et al. (2026) extend this stream to multi-item periodic review with both temporal and cross-item dependence. These results motivate a demand-dependence and service-coordination layer but do not establish that a transaction-derived graph improves a many-SKU system.</w:t>
       </w:r>
     </w:p>
     <w:p>
@@ -423,7 +423,7 @@
     </w:p>
     <w:p>
       <w:r>
-        <w:t>The search protocol and open-record cross-check identified adjacent studies across all seven streams. The evidence base supports positioning this project as a public-data simulation bridge between basket analysis, demand forecasting, service-level inventory control, and lead-time uncertainty. A definitive claim that no directly matching study exists is not made because licensed Scopus/Web of Science exports were unavailable in the project environment.</w:t>
+        <w:t>The targeted search protocol and open-record cross-check identified adjacent studies across all nine streams. The evidence base supports positioning this project as a public-data simulation bridge between basket analysis, demand forecasting, service-level inventory control, and lead-time uncertainty. A definitive claim that no directly matching study exists is not made because licensed Scopus/Web of Science exports were unavailable in the project environment. The defensible gap is narrower: existing streams separately study co-purchase structure, correlated demand, forecast-driven replenishment, or stochastic inventory control, while this study tests a transparent transaction-derived graph buffer against popularity-only control under matched simulated inventory and reports where the graph signal does and does not survive.</w:t>
       </w:r>
     </w:p>
     <w:p>
@@ -11353,7 +11353,7 @@
     </w:p>
     <w:p>
       <w:r>
-        <w:t>Baykal-Gürsoy, M., &amp; Erkip, N. K. (2011). Forecasting for inventory planning under correlated demand. Wiley Encyclopedia of Operations Research and Management Science, 1–11. https://doi.org/10.1002/9780470400531.eorms0330</w:t>
+        <w:t>Rahimi, Z., Down, D. G., Li, N., &amp; Arnold, D. M. (2026). Ordering policies for multi-item inventory systems with correlated demands. European Journal of Operational Research, 333(2), 381–397. https://doi.org/10.1016/j.ejor.2025.12.042</w:t>
       </w:r>
     </w:p>
     <w:p>
@@ -11383,12 +11383,12 @@
     </w:p>
     <w:p>
       <w:r>
-        <w:t>Berry, L. R., Helman, P., &amp; West, M. (2020). Probabilistic forecasting of heterogeneous consumer transaction-sales time series. International Journal of Forecasting, 36(2), 552–569. https://doi.org/10.1016/j.ijforecast.2019.07.007</w:t>
+        <w:t>Martin, J., Nenycz-Thiel, M., Dawes, J., Tanusondjaja, A., Cohen, J., McColl, B., &amp; Trinh, G. (2020). Fundamental basket size patterns and their relation to retailer performance. Journal of Retailing and Consumer Services, 54, 102032. https://doi.org/10.1016/j.jretconser.2020.102032</w:t>
       </w:r>
     </w:p>
     <w:p>
       <w:r>
-        <w:t>Martin, J., Nenycz-Thiel, M., Dawes, J., Tanusondjaja, A., Cohen, J., McColl, B., &amp; Trinh, G. (2020). Fundamental basket size patterns and their relation to retailer performance. Journal of Retailing and Consumer Services, 54, 102032. https://doi.org/10.1016/j.jretconser.2020.102032</w:t>
+        <w:t>Omar, H., Klibi, W., Babai, M. Z., &amp; Ducq, Y. (2023). Basket data-driven approach for omnichannel demand forecasting. International Journal of Production Economics, 257, 108748. https://doi.org/10.1016/j.ijpe.2022.108748</w:t>
       </w:r>
     </w:p>
     <w:p>
@@ -11521,7 +11521,7 @@
     </w:p>
     <w:p>
       <w:r>
-        <w:t>The reproducible code and data package is publicly archived at GitHub (https://github.com/TalhaZabir/basket-aware-inventory-research). The public data records are UCI Online Retail II (https://doi.org/10.24432/C5CG6D), the separate M5 data release on Zenodo (https://doi.org/10.5281/zenodo.10203108), and the documented dunnhumby Complete Journey release (https://github.com/bltap-plmarket/dunnhumby-complete-journey/releases/tag/v1.0-data), whose source page is dunnhumby Source Files (https://www.dunnhumby.com/source-files/). The repository has no DOI yet. UCI identifies Online Retail II as licensed under the Creative Commons Attribution 4.0 International license (CC BY 4.0). Redistribution or adaptation of that source requires appropriate attribution to Daqing Chen and the UCI Machine Learning Repository. The dunnhumby mirror states DbCL-1.0; its terms should be reviewed before redistribution. The M5 files remain subject to their own source terms.</w:t>
+        <w:t>The reproducible code and data package is publicly archived at GitHub (https://github.com/TalhaZabir/basket-aware-inventory-research). The public data records are UCI Online Retail II (https://doi.org/10.24432/C5CG6D), the separate M5 data release on Zenodo (https://doi.org/10.5281/zenodo.10203108), and the documented dunnhumby Complete Journey release (https://github.com/bltap-plmarket/dunnhumby-complete-journey/releases/tag/v1.0-data), whose source page is dunnhumby Source Files (https://www.dunnhumby.com/source-files/). The repository has no DOI yet. UCI identifies Online Retail II as licensed under the Creative Commons Attribution 4.0 International license (CC BY 4.0). Redistribution or adaptation of that source requires appropriate attribution to Daqing Chen and the UCI Machine Learning Repository. The dunnhumby mirror states DbCL-1.0; its terms should be reviewed before redistribution. The M5 files remain subject to their own source terms. The search and metadata-verification boundary is recorded in results/gate5_literature_audit.md.</w:t>
       </w:r>
     </w:p>
     <w:tbl>

</xml_diff>

<commit_message>
Retitle and tighten manuscript presentation
</commit_message>
<xml_diff>
--- a/basket_aware_inventory_full_manuscript_sections_1_to_10.docx
+++ b/basket_aware_inventory_full_manuscript_sections_1_to_10.docx
@@ -7,7 +7,7 @@
         <w:pStyle w:val="Title"/>
       </w:pPr>
       <w:r>
-        <w:t>Basket Aware Inventory Research</w:t>
+        <w:t>Does Basket Structure Add Value Beyond Popularity in Multi Item Replenishment</w:t>
       </w:r>
     </w:p>
     <w:p>
@@ -48,7 +48,7 @@
     </w:p>
     <w:p>
       <w:r>
-        <w:t>Basket-Aware Inventory Control under Demand and Lead-Time Uncertainty</w:t>
+        <w:t>Does Basket Structure Add Value Beyond Popularity in Multi Item Replenishment</w:t>
       </w:r>
     </w:p>
     <w:p>
@@ -61,17 +61,12 @@
     </w:p>
     <w:p>
       <w:r>
-        <w:t>Retailers replenish products separately even though customers purchase multiple products together and deliveries are uncertain. This study tests whether basket-aware buffering adds service value beyond independent replenishment at tightly matched simulated inventory, and whether any gain remains after popularity and graph-placebo controls.</w:t>
+        <w:t>Retailers replenish products separately even though customers purchase multiple products together and deliveries are uncertain. This study asks whether a transaction-derived basket buffer adds value beyond product popularity when average inventory is tightly matched.</w:t>
       </w:r>
     </w:p>
     <w:p>
       <w:r>
-        <w:t>The primary analysis uses UCI Online Retail II to reconstruct completed invoice baskets, weekly demand, and a training-only co-purchase graph. Three transparent moving-average/seasonal-naive forecasts are selected chronologically per product. A partner-protection policy is compared with an inventory-matched independent control, a popularity-only control, and rewired, shuffled, and stale-graph placebos. The frozen primary replay uses interior alpha = 1.5, a 1% inventory-matching band, 120 stochastic replications, and 1,000 paired bootstrap resamples in the moderate-variance S05 scenario. Three rolling windows and a separate dunnhumby Complete Journey basket dataset provide robustness checks.</w:t>
-      </w:r>
-    </w:p>
-    <w:p>
-      <w:r>
-        <w:t>In S05, PA1 versus the matched independent control increased item fill by 0.0270 (95% replication interval 0.0263–0.0276) and complete-basket fill by 0.0944 (0.0803–0.1119), at an average inventory difference of 10,343 units and a cost increase of 231,712. Against popularity-only C4, PA1 was worse: item fill −0.0261 and basket fill −0.0667, with cost +168,736; the 1,000-resample intervals excluded zero for all three contrasts. PA1 also exceeded C2, C3, and C5 on both service measures, but those placebo comparisons do not establish that the original edge topology caused the difference. These results support a conditional service trade-off, not a graph-specific advantage. Inventory, supplier, stockout, and historical cost fields are absent, so policy outcomes remain simulated.</w:t>
+        <w:t>Using UCI Online Retail II, the study reconstructs completed baskets, forecasts weekly demand with three transparent moving-average or seasonal-naive candidates, and builds a training-only co-purchase graph. PA1, the partner-protection policy, is compared with C1, an inventory-matched independent policy, and C4, a popularity-only policy, across twelve synthetic lead-time and cost scenarios with 120 paired replications. The primary result is negative for the graph-on-top-of-popularity contrast: PA1 minus C4 item fill is −0.0258 (95% scenario-clustered CI −0.0268 to −0.0248), with +6,092 average inventory units and +194,213 simulated cost units. PA1 minus C1 is positive for item fill (+0.0268, CI +0.0260 to +0.0276) but also more costly (+201,341 units). A low-popularity/high-lift stratum is a conditional exception (+0.1014 item fill), whereas a high-popularity/high-lift stratum is negative (−0.0750). The direction of the item-fill contrast replicates in a tightened dunnhumby replay, but complete-basket fill does not discriminate. Because inventory and supplier records are absent, these are controlled simulation findings, not historical or causal estimates.</w:t>
       </w:r>
     </w:p>
     <w:p>
@@ -177,7 +172,36 @@
     </w:p>
     <w:p>
       <w:r>
-        <w:t>The contribution is an empirical integration and boundary-condition analysis. It connects transaction-derived basket structure with demand forecasting and stochastic lead-time inventory simulation, preserves chronological leakage control, separates forecast metrics from inventory outcomes, and compares four policies under common inputs. The study position is deliberately empirical: it evaluates when the added basket-aware buffer changes simulated service, inventory, and cost, and reports the controls and uncertainty needed to interpret those changes. The operational evidence boundary and remaining data requirements are consolidated in Section 8.</w:t>
+        <w:t>The contribution is an empirical integration and boundary-condition analysis. It connects transaction-derived basket structure with demand forecasting and stochastic lead-time inventory simulation, preserves chronological leakage control, separates forecast metrics from inventory outcomes, and compares graph, popularity, independent, and placebo controls under common inputs. The paper makes three numbered contributions:</w:t>
+      </w:r>
+    </w:p>
+    <w:p>
+      <w:pPr>
+        <w:pStyle w:val="ListNumber"/>
+      </w:pPr>
+      <w:r>
+        <w:t>It establishes a matched-inventory primary comparison rather than attributing gains to an unpriced extra buffer.</w:t>
+      </w:r>
+    </w:p>
+    <w:p>
+      <w:pPr>
+        <w:pStyle w:val="ListNumber"/>
+      </w:pPr>
+      <w:r>
+        <w:t>It shows that popularity dominates the tested graph buffer overall, while a low-popularity/high-lift stratum provides a conditional service regime where pair information can matter.</w:t>
+      </w:r>
+    </w:p>
+    <w:p>
+      <w:pPr>
+        <w:pStyle w:val="ListNumber"/>
+      </w:pPr>
+      <w:r>
+        <w:t>It supplies reproducible public-data code, scenario definitions, placebo controls, uncertainty estimates, and an external basket-data check.</w:t>
+      </w:r>
+    </w:p>
+    <w:p>
+      <w:r>
+        <w:t>The operational evidence boundary and remaining data requirements are consolidated in Section 8.</w:t>
       </w:r>
     </w:p>
     <w:p>
@@ -688,7 +712,7 @@
     </w:p>
     <w:p>
       <w:r>
-        <w:t>PA1 is the partner-protection policy actually used in the primary replay. For each product (i), training-only directed edges identify at most five supported partners (j). The incremental item buffer is a weighted sum of partner risk, using conditional co-purchase probability, pair count, and partner residual scale (1.645 sigma_j). The buffer is computed once from the training graph, scaled to a common total mass across graph and control variants, and applied across the full weekly review horizon as S^{PA1}_{i,t}=S^{ind}_{i,t}+alpha b_i. Validation used the alpha grid [0.10, 0.25, 0.50, 0.75, 1.0, 1.5, 2.0, 3.0, 4.0, 5.0]. Alpha = 1.5 was selected because it was an interior value meeting the frozen service-gain rule and had the lowest matched-cost result among eligible interior values. The primary replay uses alpha = 1.5, not the earlier boundary value 3.0.</w:t>
+        <w:t>PA1 is the partner-protection policy actually used in the primary replay. For each product (i), training-only directed edges identify at most five supported partners (j). The incremental item buffer is a weighted sum of partner risk, using conditional co-purchase probability, pair count, and partner residual scale (1.645 sigma_j). The buffer is computed once from the training graph, scaled to a common total mass across graph and control variants, and applied across the full weekly review horizon as S_PA1(i,t) = S_ind(i,t) + alpha times b_i. Validation used the alpha grid [0.10, 0.25, 0.50, 0.75, 1.0, 1.5, 2.0, 3.0, 4.0, 5.0]. Alpha = 1.5 was selected because it was an interior value meeting the frozen service-gain rule and had the lowest matched-cost result among eligible interior values. The primary replay uses alpha = 1.5, not the earlier boundary value 3.0.</w:t>
       </w:r>
     </w:p>
     <w:p>
@@ -4958,12 +4982,25 @@
         <w:pStyle w:val="Heading2"/>
       </w:pPr>
       <w:r>
-        <w:t>5.4 Primary policy levels and paired contrasts</w:t>
+        <w:t>5.4 Primary all-scenario analysis</w:t>
       </w:r>
     </w:p>
     <w:p>
       <w:r>
-        <w:t>The primary replay covers all twelve synthetic scenarios, with 120 paired replications per scenario and the same 1% inventory-matching rule. The earlier S05 table is retained as a diagnostic in the package, but it is not the headline estimand. Because the scenarios use different h and p values, the headline result is a scenario-clustered mean of within-scenario differences, not a pooled cost level. Replication-level intervals below are normal 95% confidence intervals for the paired mean difference; deterministic scenarios have degenerate intervals.</w:t>
+        <w:t>The primary replay covers all twelve synthetic scenarios, with 120 paired replications per scenario and the same 1% inventory-matching rule. Because the scenarios use different h and p values, the headline result is a scenario-clustered mean of within-scenario differences, not a pooled cost level. Replication-level intervals below are normal 95% confidence intervals for the paired mean difference; deterministic scenarios have degenerate intervals.</w:t>
+      </w:r>
+    </w:p>
+    <w:p>
+      <w:pPr>
+        <w:pStyle w:val="Heading3"/>
+      </w:pPr>
+      <w:r>
+        <w:t>Legacy S05 level diagnostic</w:t>
+      </w:r>
+    </w:p>
+    <w:p>
+      <w:r>
+        <w:t>The following S05 level table is retained for auditability only; it is not the primary estimand. The all-scenario paired contrasts below are the main result, while the earlier four-policy comparisons are retained in Appendix E.</w:t>
       </w:r>
     </w:p>
     <w:tbl>
@@ -7246,1071 +7283,6 @@
       <w:r>
         <w:t>The direction is unchanged in every scenario: PA1−C1 is positive for item and basket fill in S01–S12, whereas PA1−C4 is negative for both. Cost differences are positive in every scenario for both contrasts. The per-scenario table, matching-quality table, and forest-plot-ready values are results/phase3_scenario_contrast_summary.csv and results/phase3_matching_quality.csv. Maximum accepted inventory gaps were 0.80% for PA1−C1 and 0.99% for C4−C1; no comparison violated the 1% band.</w:t>
       </w:r>
-    </w:p>
-    <w:tbl>
-      <w:tblPr>
-        <w:tblStyle w:val="TableGrid"/>
-        <w:tblW w:type="auto" w:w="0"/>
-        <w:jc w:val="center"/>
-        <w:tblLook w:firstColumn="1" w:firstRow="1" w:lastColumn="0" w:lastRow="0" w:noHBand="0" w:noVBand="1" w:val="04A0"/>
-      </w:tblPr>
-      <w:tblGrid>
-        <w:gridCol w:w="1999"/>
-        <w:gridCol w:w="1999"/>
-        <w:gridCol w:w="1999"/>
-        <w:gridCol w:w="1999"/>
-        <w:gridCol w:w="1999"/>
-      </w:tblGrid>
-      <w:tr>
-        <w:trPr>
-          <w:tblHeader w:val="true"/>
-        </w:trPr>
-        <w:tc>
-          <w:tcPr>
-            <w:tcW w:type="dxa" w:w="1999"/>
-            <w:vAlign w:val="center"/>
-            <w:shd w:fill="1F4E79"/>
-            <w:tcBorders>
-              <w:top w:val="single" w:sz="6" w:space="0" w:color="D9D9D9"/>
-              <w:left w:val="single" w:sz="6" w:space="0" w:color="D9D9D9"/>
-              <w:bottom w:val="single" w:sz="6" w:space="0" w:color="D9D9D9"/>
-              <w:right w:val="single" w:sz="6" w:space="0" w:color="D9D9D9"/>
-              <w:insideH w:val="single" w:sz="6" w:space="0" w:color="D9D9D9"/>
-              <w:insideV w:val="single" w:sz="6" w:space="0" w:color="D9D9D9"/>
-            </w:tcBorders>
-            <w:tcMar>
-              <w:top w:w="90" w:type="dxa"/>
-              <w:start w:w="100" w:type="dxa"/>
-              <w:bottom w:w="90" w:type="dxa"/>
-              <w:end w:w="100" w:type="dxa"/>
-            </w:tcMar>
-          </w:tcPr>
-          <w:p>
-            <w:pPr>
-              <w:spacing w:after="0"/>
-              <w:jc w:val="center"/>
-            </w:pPr>
-            <w:r>
-              <w:rPr>
-                <w:rFonts w:ascii="Arial" w:hAnsi="Arial"/>
-                <w:b/>
-                <w:color w:val="FFFFFF"/>
-                <w:sz w:val="17"/>
-              </w:rPr>
-              <w:t>Contrast</w:t>
-            </w:r>
-          </w:p>
-        </w:tc>
-        <w:tc>
-          <w:tcPr>
-            <w:tcW w:type="dxa" w:w="1999"/>
-            <w:vAlign w:val="center"/>
-            <w:shd w:fill="1F4E79"/>
-            <w:tcBorders>
-              <w:top w:val="single" w:sz="6" w:space="0" w:color="D9D9D9"/>
-              <w:left w:val="single" w:sz="6" w:space="0" w:color="D9D9D9"/>
-              <w:bottom w:val="single" w:sz="6" w:space="0" w:color="D9D9D9"/>
-              <w:right w:val="single" w:sz="6" w:space="0" w:color="D9D9D9"/>
-              <w:insideH w:val="single" w:sz="6" w:space="0" w:color="D9D9D9"/>
-              <w:insideV w:val="single" w:sz="6" w:space="0" w:color="D9D9D9"/>
-            </w:tcBorders>
-            <w:tcMar>
-              <w:top w:w="90" w:type="dxa"/>
-              <w:start w:w="100" w:type="dxa"/>
-              <w:bottom w:w="90" w:type="dxa"/>
-              <w:end w:w="100" w:type="dxa"/>
-            </w:tcMar>
-          </w:tcPr>
-          <w:p>
-            <w:pPr>
-              <w:spacing w:after="0"/>
-              <w:jc w:val="center"/>
-            </w:pPr>
-            <w:r>
-              <w:rPr>
-                <w:rFonts w:ascii="Arial" w:hAnsi="Arial"/>
-                <w:b/>
-                <w:color w:val="FFFFFF"/>
-                <w:sz w:val="17"/>
-              </w:rPr>
-              <w:t>Cost difference</w:t>
-            </w:r>
-          </w:p>
-        </w:tc>
-        <w:tc>
-          <w:tcPr>
-            <w:tcW w:type="dxa" w:w="1999"/>
-            <w:vAlign w:val="center"/>
-            <w:shd w:fill="1F4E79"/>
-            <w:tcBorders>
-              <w:top w:val="single" w:sz="6" w:space="0" w:color="D9D9D9"/>
-              <w:left w:val="single" w:sz="6" w:space="0" w:color="D9D9D9"/>
-              <w:bottom w:val="single" w:sz="6" w:space="0" w:color="D9D9D9"/>
-              <w:right w:val="single" w:sz="6" w:space="0" w:color="D9D9D9"/>
-              <w:insideH w:val="single" w:sz="6" w:space="0" w:color="D9D9D9"/>
-              <w:insideV w:val="single" w:sz="6" w:space="0" w:color="D9D9D9"/>
-            </w:tcBorders>
-            <w:tcMar>
-              <w:top w:w="90" w:type="dxa"/>
-              <w:start w:w="100" w:type="dxa"/>
-              <w:bottom w:w="90" w:type="dxa"/>
-              <w:end w:w="100" w:type="dxa"/>
-            </w:tcMar>
-          </w:tcPr>
-          <w:p>
-            <w:pPr>
-              <w:spacing w:after="0"/>
-              <w:jc w:val="center"/>
-            </w:pPr>
-            <w:r>
-              <w:rPr>
-                <w:rFonts w:ascii="Arial" w:hAnsi="Arial"/>
-                <w:b/>
-                <w:color w:val="FFFFFF"/>
-                <w:sz w:val="17"/>
-              </w:rPr>
-              <w:t>Inventory difference</w:t>
-            </w:r>
-          </w:p>
-        </w:tc>
-        <w:tc>
-          <w:tcPr>
-            <w:tcW w:type="dxa" w:w="1999"/>
-            <w:vAlign w:val="center"/>
-            <w:shd w:fill="1F4E79"/>
-            <w:tcBorders>
-              <w:top w:val="single" w:sz="6" w:space="0" w:color="D9D9D9"/>
-              <w:left w:val="single" w:sz="6" w:space="0" w:color="D9D9D9"/>
-              <w:bottom w:val="single" w:sz="6" w:space="0" w:color="D9D9D9"/>
-              <w:right w:val="single" w:sz="6" w:space="0" w:color="D9D9D9"/>
-              <w:insideH w:val="single" w:sz="6" w:space="0" w:color="D9D9D9"/>
-              <w:insideV w:val="single" w:sz="6" w:space="0" w:color="D9D9D9"/>
-            </w:tcBorders>
-            <w:tcMar>
-              <w:top w:w="90" w:type="dxa"/>
-              <w:start w:w="100" w:type="dxa"/>
-              <w:bottom w:w="90" w:type="dxa"/>
-              <w:end w:w="100" w:type="dxa"/>
-            </w:tcMar>
-          </w:tcPr>
-          <w:p>
-            <w:pPr>
-              <w:spacing w:after="0"/>
-              <w:jc w:val="center"/>
-            </w:pPr>
-            <w:r>
-              <w:rPr>
-                <w:rFonts w:ascii="Arial" w:hAnsi="Arial"/>
-                <w:b/>
-                <w:color w:val="FFFFFF"/>
-                <w:sz w:val="17"/>
-              </w:rPr>
-              <w:t>Item-fill difference</w:t>
-            </w:r>
-          </w:p>
-        </w:tc>
-        <w:tc>
-          <w:tcPr>
-            <w:tcW w:type="dxa" w:w="1999"/>
-            <w:vAlign w:val="center"/>
-            <w:shd w:fill="1F4E79"/>
-            <w:tcBorders>
-              <w:top w:val="single" w:sz="6" w:space="0" w:color="D9D9D9"/>
-              <w:left w:val="single" w:sz="6" w:space="0" w:color="D9D9D9"/>
-              <w:bottom w:val="single" w:sz="6" w:space="0" w:color="D9D9D9"/>
-              <w:right w:val="single" w:sz="6" w:space="0" w:color="D9D9D9"/>
-              <w:insideH w:val="single" w:sz="6" w:space="0" w:color="D9D9D9"/>
-              <w:insideV w:val="single" w:sz="6" w:space="0" w:color="D9D9D9"/>
-            </w:tcBorders>
-            <w:tcMar>
-              <w:top w:w="90" w:type="dxa"/>
-              <w:start w:w="100" w:type="dxa"/>
-              <w:bottom w:w="90" w:type="dxa"/>
-              <w:end w:w="100" w:type="dxa"/>
-            </w:tcMar>
-          </w:tcPr>
-          <w:p>
-            <w:pPr>
-              <w:spacing w:after="0"/>
-              <w:jc w:val="center"/>
-            </w:pPr>
-            <w:r>
-              <w:rPr>
-                <w:rFonts w:ascii="Arial" w:hAnsi="Arial"/>
-                <w:b/>
-                <w:color w:val="FFFFFF"/>
-                <w:sz w:val="17"/>
-              </w:rPr>
-              <w:t>Basket-fill difference</w:t>
-            </w:r>
-          </w:p>
-        </w:tc>
-      </w:tr>
-      <w:tr>
-        <w:trPr>
-          <w:cantSplit/>
-        </w:trPr>
-        <w:tc>
-          <w:tcPr>
-            <w:tcW w:type="dxa" w:w="1999"/>
-            <w:vAlign w:val="center"/>
-            <w:tcBorders>
-              <w:top w:val="single" w:sz="6" w:space="0" w:color="D9D9D9"/>
-              <w:left w:val="single" w:sz="6" w:space="0" w:color="D9D9D9"/>
-              <w:bottom w:val="single" w:sz="6" w:space="0" w:color="D9D9D9"/>
-              <w:right w:val="single" w:sz="6" w:space="0" w:color="D9D9D9"/>
-              <w:insideH w:val="single" w:sz="6" w:space="0" w:color="D9D9D9"/>
-              <w:insideV w:val="single" w:sz="6" w:space="0" w:color="D9D9D9"/>
-            </w:tcBorders>
-            <w:tcMar>
-              <w:top w:w="90" w:type="dxa"/>
-              <w:start w:w="100" w:type="dxa"/>
-              <w:bottom w:w="90" w:type="dxa"/>
-              <w:end w:w="100" w:type="dxa"/>
-            </w:tcMar>
-          </w:tcPr>
-          <w:p>
-            <w:pPr>
-              <w:spacing w:after="0" w:line="240" w:lineRule="auto"/>
-              <w:jc w:val="left"/>
-            </w:pPr>
-            <w:r>
-              <w:rPr>
-                <w:rFonts w:ascii="Arial" w:hAnsi="Arial"/>
-                <w:sz w:val="16"/>
-              </w:rPr>
-              <w:t>PA1 − C1</w:t>
-            </w:r>
-          </w:p>
-        </w:tc>
-        <w:tc>
-          <w:tcPr>
-            <w:tcW w:type="dxa" w:w="1999"/>
-            <w:vAlign w:val="center"/>
-            <w:tcBorders>
-              <w:top w:val="single" w:sz="6" w:space="0" w:color="D9D9D9"/>
-              <w:left w:val="single" w:sz="6" w:space="0" w:color="D9D9D9"/>
-              <w:bottom w:val="single" w:sz="6" w:space="0" w:color="D9D9D9"/>
-              <w:right w:val="single" w:sz="6" w:space="0" w:color="D9D9D9"/>
-              <w:insideH w:val="single" w:sz="6" w:space="0" w:color="D9D9D9"/>
-              <w:insideV w:val="single" w:sz="6" w:space="0" w:color="D9D9D9"/>
-            </w:tcBorders>
-            <w:tcMar>
-              <w:top w:w="90" w:type="dxa"/>
-              <w:start w:w="100" w:type="dxa"/>
-              <w:bottom w:w="90" w:type="dxa"/>
-              <w:end w:w="100" w:type="dxa"/>
-            </w:tcMar>
-          </w:tcPr>
-          <w:p>
-            <w:pPr>
-              <w:spacing w:after="0" w:line="240" w:lineRule="auto"/>
-              <w:jc w:val="center"/>
-            </w:pPr>
-            <w:r>
-              <w:rPr>
-                <w:rFonts w:ascii="Arial" w:hAnsi="Arial"/>
-                <w:sz w:val="16"/>
-              </w:rPr>
-              <w:t>+231,712 [227,660, 236,225]</w:t>
-            </w:r>
-          </w:p>
-        </w:tc>
-        <w:tc>
-          <w:tcPr>
-            <w:tcW w:type="dxa" w:w="1999"/>
-            <w:vAlign w:val="center"/>
-            <w:tcBorders>
-              <w:top w:val="single" w:sz="6" w:space="0" w:color="D9D9D9"/>
-              <w:left w:val="single" w:sz="6" w:space="0" w:color="D9D9D9"/>
-              <w:bottom w:val="single" w:sz="6" w:space="0" w:color="D9D9D9"/>
-              <w:right w:val="single" w:sz="6" w:space="0" w:color="D9D9D9"/>
-              <w:insideH w:val="single" w:sz="6" w:space="0" w:color="D9D9D9"/>
-              <w:insideV w:val="single" w:sz="6" w:space="0" w:color="D9D9D9"/>
-            </w:tcBorders>
-            <w:tcMar>
-              <w:top w:w="90" w:type="dxa"/>
-              <w:start w:w="100" w:type="dxa"/>
-              <w:bottom w:w="90" w:type="dxa"/>
-              <w:end w:w="100" w:type="dxa"/>
-            </w:tcMar>
-          </w:tcPr>
-          <w:p>
-            <w:pPr>
-              <w:spacing w:after="0" w:line="240" w:lineRule="auto"/>
-              <w:jc w:val="center"/>
-            </w:pPr>
-            <w:r>
-              <w:rPr>
-                <w:rFonts w:ascii="Arial" w:hAnsi="Arial"/>
-                <w:sz w:val="16"/>
-              </w:rPr>
-              <w:t>+10,343 [10,321, 10,380]</w:t>
-            </w:r>
-          </w:p>
-        </w:tc>
-        <w:tc>
-          <w:tcPr>
-            <w:tcW w:type="dxa" w:w="1999"/>
-            <w:vAlign w:val="center"/>
-            <w:tcBorders>
-              <w:top w:val="single" w:sz="6" w:space="0" w:color="D9D9D9"/>
-              <w:left w:val="single" w:sz="6" w:space="0" w:color="D9D9D9"/>
-              <w:bottom w:val="single" w:sz="6" w:space="0" w:color="D9D9D9"/>
-              <w:right w:val="single" w:sz="6" w:space="0" w:color="D9D9D9"/>
-              <w:insideH w:val="single" w:sz="6" w:space="0" w:color="D9D9D9"/>
-              <w:insideV w:val="single" w:sz="6" w:space="0" w:color="D9D9D9"/>
-            </w:tcBorders>
-            <w:tcMar>
-              <w:top w:w="90" w:type="dxa"/>
-              <w:start w:w="100" w:type="dxa"/>
-              <w:bottom w:w="90" w:type="dxa"/>
-              <w:end w:w="100" w:type="dxa"/>
-            </w:tcMar>
-          </w:tcPr>
-          <w:p>
-            <w:pPr>
-              <w:spacing w:after="0" w:line="240" w:lineRule="auto"/>
-              <w:jc w:val="center"/>
-            </w:pPr>
-            <w:r>
-              <w:rPr>
-                <w:rFonts w:ascii="Arial" w:hAnsi="Arial"/>
-                <w:sz w:val="16"/>
-              </w:rPr>
-              <w:t>+0.0270 [0.0263, 0.0276]</w:t>
-            </w:r>
-          </w:p>
-        </w:tc>
-        <w:tc>
-          <w:tcPr>
-            <w:tcW w:type="dxa" w:w="1999"/>
-            <w:vAlign w:val="center"/>
-            <w:tcBorders>
-              <w:top w:val="single" w:sz="6" w:space="0" w:color="D9D9D9"/>
-              <w:left w:val="single" w:sz="6" w:space="0" w:color="D9D9D9"/>
-              <w:bottom w:val="single" w:sz="6" w:space="0" w:color="D9D9D9"/>
-              <w:right w:val="single" w:sz="6" w:space="0" w:color="D9D9D9"/>
-              <w:insideH w:val="single" w:sz="6" w:space="0" w:color="D9D9D9"/>
-              <w:insideV w:val="single" w:sz="6" w:space="0" w:color="D9D9D9"/>
-            </w:tcBorders>
-            <w:tcMar>
-              <w:top w:w="90" w:type="dxa"/>
-              <w:start w:w="100" w:type="dxa"/>
-              <w:bottom w:w="90" w:type="dxa"/>
-              <w:end w:w="100" w:type="dxa"/>
-            </w:tcMar>
-          </w:tcPr>
-          <w:p>
-            <w:pPr>
-              <w:spacing w:after="0" w:line="240" w:lineRule="auto"/>
-              <w:jc w:val="center"/>
-            </w:pPr>
-            <w:r>
-              <w:rPr>
-                <w:rFonts w:ascii="Arial" w:hAnsi="Arial"/>
-                <w:sz w:val="16"/>
-              </w:rPr>
-              <w:t>+0.0944 [0.0803, 0.1119]</w:t>
-            </w:r>
-          </w:p>
-        </w:tc>
-      </w:tr>
-      <w:tr>
-        <w:trPr>
-          <w:cantSplit/>
-        </w:trPr>
-        <w:tc>
-          <w:tcPr>
-            <w:tcW w:type="dxa" w:w="1999"/>
-            <w:vAlign w:val="center"/>
-            <w:tcBorders>
-              <w:top w:val="single" w:sz="6" w:space="0" w:color="D9D9D9"/>
-              <w:left w:val="single" w:sz="6" w:space="0" w:color="D9D9D9"/>
-              <w:bottom w:val="single" w:sz="6" w:space="0" w:color="D9D9D9"/>
-              <w:right w:val="single" w:sz="6" w:space="0" w:color="D9D9D9"/>
-              <w:insideH w:val="single" w:sz="6" w:space="0" w:color="D9D9D9"/>
-              <w:insideV w:val="single" w:sz="6" w:space="0" w:color="D9D9D9"/>
-            </w:tcBorders>
-            <w:tcMar>
-              <w:top w:w="90" w:type="dxa"/>
-              <w:start w:w="100" w:type="dxa"/>
-              <w:bottom w:w="90" w:type="dxa"/>
-              <w:end w:w="100" w:type="dxa"/>
-            </w:tcMar>
-            <w:shd w:fill="F2F6FA"/>
-          </w:tcPr>
-          <w:p>
-            <w:pPr>
-              <w:spacing w:after="0" w:line="240" w:lineRule="auto"/>
-              <w:jc w:val="left"/>
-            </w:pPr>
-            <w:r>
-              <w:rPr>
-                <w:rFonts w:ascii="Arial" w:hAnsi="Arial"/>
-                <w:sz w:val="16"/>
-              </w:rPr>
-              <w:t>PA1 − C4</w:t>
-            </w:r>
-          </w:p>
-        </w:tc>
-        <w:tc>
-          <w:tcPr>
-            <w:tcW w:type="dxa" w:w="1999"/>
-            <w:vAlign w:val="center"/>
-            <w:tcBorders>
-              <w:top w:val="single" w:sz="6" w:space="0" w:color="D9D9D9"/>
-              <w:left w:val="single" w:sz="6" w:space="0" w:color="D9D9D9"/>
-              <w:bottom w:val="single" w:sz="6" w:space="0" w:color="D9D9D9"/>
-              <w:right w:val="single" w:sz="6" w:space="0" w:color="D9D9D9"/>
-              <w:insideH w:val="single" w:sz="6" w:space="0" w:color="D9D9D9"/>
-              <w:insideV w:val="single" w:sz="6" w:space="0" w:color="D9D9D9"/>
-            </w:tcBorders>
-            <w:tcMar>
-              <w:top w:w="90" w:type="dxa"/>
-              <w:start w:w="100" w:type="dxa"/>
-              <w:bottom w:w="90" w:type="dxa"/>
-              <w:end w:w="100" w:type="dxa"/>
-            </w:tcMar>
-            <w:shd w:fill="F2F6FA"/>
-          </w:tcPr>
-          <w:p>
-            <w:pPr>
-              <w:spacing w:after="0" w:line="240" w:lineRule="auto"/>
-              <w:jc w:val="center"/>
-            </w:pPr>
-            <w:r>
-              <w:rPr>
-                <w:rFonts w:ascii="Arial" w:hAnsi="Arial"/>
-                <w:sz w:val="16"/>
-              </w:rPr>
-              <w:t>+168,736 [161,770, 175,981]</w:t>
-            </w:r>
-          </w:p>
-        </w:tc>
-        <w:tc>
-          <w:tcPr>
-            <w:tcW w:type="dxa" w:w="1999"/>
-            <w:vAlign w:val="center"/>
-            <w:tcBorders>
-              <w:top w:val="single" w:sz="6" w:space="0" w:color="D9D9D9"/>
-              <w:left w:val="single" w:sz="6" w:space="0" w:color="D9D9D9"/>
-              <w:bottom w:val="single" w:sz="6" w:space="0" w:color="D9D9D9"/>
-              <w:right w:val="single" w:sz="6" w:space="0" w:color="D9D9D9"/>
-              <w:insideH w:val="single" w:sz="6" w:space="0" w:color="D9D9D9"/>
-              <w:insideV w:val="single" w:sz="6" w:space="0" w:color="D9D9D9"/>
-            </w:tcBorders>
-            <w:tcMar>
-              <w:top w:w="90" w:type="dxa"/>
-              <w:start w:w="100" w:type="dxa"/>
-              <w:bottom w:w="90" w:type="dxa"/>
-              <w:end w:w="100" w:type="dxa"/>
-            </w:tcMar>
-            <w:shd w:fill="F2F6FA"/>
-          </w:tcPr>
-          <w:p>
-            <w:pPr>
-              <w:spacing w:after="0" w:line="240" w:lineRule="auto"/>
-              <w:jc w:val="center"/>
-            </w:pPr>
-            <w:r>
-              <w:rPr>
-                <w:rFonts w:ascii="Arial" w:hAnsi="Arial"/>
-                <w:sz w:val="16"/>
-              </w:rPr>
-              <w:t>+6,268 [5,514, 7,314]</w:t>
-            </w:r>
-          </w:p>
-        </w:tc>
-        <w:tc>
-          <w:tcPr>
-            <w:tcW w:type="dxa" w:w="1999"/>
-            <w:vAlign w:val="center"/>
-            <w:tcBorders>
-              <w:top w:val="single" w:sz="6" w:space="0" w:color="D9D9D9"/>
-              <w:left w:val="single" w:sz="6" w:space="0" w:color="D9D9D9"/>
-              <w:bottom w:val="single" w:sz="6" w:space="0" w:color="D9D9D9"/>
-              <w:right w:val="single" w:sz="6" w:space="0" w:color="D9D9D9"/>
-              <w:insideH w:val="single" w:sz="6" w:space="0" w:color="D9D9D9"/>
-              <w:insideV w:val="single" w:sz="6" w:space="0" w:color="D9D9D9"/>
-            </w:tcBorders>
-            <w:tcMar>
-              <w:top w:w="90" w:type="dxa"/>
-              <w:start w:w="100" w:type="dxa"/>
-              <w:bottom w:w="90" w:type="dxa"/>
-              <w:end w:w="100" w:type="dxa"/>
-            </w:tcMar>
-            <w:shd w:fill="F2F6FA"/>
-          </w:tcPr>
-          <w:p>
-            <w:pPr>
-              <w:spacing w:after="0" w:line="240" w:lineRule="auto"/>
-              <w:jc w:val="center"/>
-            </w:pPr>
-            <w:r>
-              <w:rPr>
-                <w:rFonts w:ascii="Arial" w:hAnsi="Arial"/>
-                <w:sz w:val="16"/>
-              </w:rPr>
-              <w:t>−0.0261 [−0.0272, −0.0248]</w:t>
-            </w:r>
-          </w:p>
-        </w:tc>
-        <w:tc>
-          <w:tcPr>
-            <w:tcW w:type="dxa" w:w="1999"/>
-            <w:vAlign w:val="center"/>
-            <w:tcBorders>
-              <w:top w:val="single" w:sz="6" w:space="0" w:color="D9D9D9"/>
-              <w:left w:val="single" w:sz="6" w:space="0" w:color="D9D9D9"/>
-              <w:bottom w:val="single" w:sz="6" w:space="0" w:color="D9D9D9"/>
-              <w:right w:val="single" w:sz="6" w:space="0" w:color="D9D9D9"/>
-              <w:insideH w:val="single" w:sz="6" w:space="0" w:color="D9D9D9"/>
-              <w:insideV w:val="single" w:sz="6" w:space="0" w:color="D9D9D9"/>
-            </w:tcBorders>
-            <w:tcMar>
-              <w:top w:w="90" w:type="dxa"/>
-              <w:start w:w="100" w:type="dxa"/>
-              <w:bottom w:w="90" w:type="dxa"/>
-              <w:end w:w="100" w:type="dxa"/>
-            </w:tcMar>
-            <w:shd w:fill="F2F6FA"/>
-          </w:tcPr>
-          <w:p>
-            <w:pPr>
-              <w:spacing w:after="0" w:line="240" w:lineRule="auto"/>
-              <w:jc w:val="center"/>
-            </w:pPr>
-            <w:r>
-              <w:rPr>
-                <w:rFonts w:ascii="Arial" w:hAnsi="Arial"/>
-                <w:sz w:val="16"/>
-              </w:rPr>
-              <w:t>−0.0667 [−0.0849, −0.0493]</w:t>
-            </w:r>
-          </w:p>
-        </w:tc>
-      </w:tr>
-      <w:tr>
-        <w:trPr>
-          <w:cantSplit/>
-        </w:trPr>
-        <w:tc>
-          <w:tcPr>
-            <w:tcW w:type="dxa" w:w="1999"/>
-            <w:vAlign w:val="center"/>
-            <w:tcBorders>
-              <w:top w:val="single" w:sz="6" w:space="0" w:color="D9D9D9"/>
-              <w:left w:val="single" w:sz="6" w:space="0" w:color="D9D9D9"/>
-              <w:bottom w:val="single" w:sz="6" w:space="0" w:color="D9D9D9"/>
-              <w:right w:val="single" w:sz="6" w:space="0" w:color="D9D9D9"/>
-              <w:insideH w:val="single" w:sz="6" w:space="0" w:color="D9D9D9"/>
-              <w:insideV w:val="single" w:sz="6" w:space="0" w:color="D9D9D9"/>
-            </w:tcBorders>
-            <w:tcMar>
-              <w:top w:w="90" w:type="dxa"/>
-              <w:start w:w="100" w:type="dxa"/>
-              <w:bottom w:w="90" w:type="dxa"/>
-              <w:end w:w="100" w:type="dxa"/>
-            </w:tcMar>
-          </w:tcPr>
-          <w:p>
-            <w:pPr>
-              <w:spacing w:after="0" w:line="240" w:lineRule="auto"/>
-              <w:jc w:val="left"/>
-            </w:pPr>
-            <w:r>
-              <w:rPr>
-                <w:rFonts w:ascii="Arial" w:hAnsi="Arial"/>
-                <w:sz w:val="16"/>
-              </w:rPr>
-              <w:t>PA1 − C2</w:t>
-            </w:r>
-          </w:p>
-        </w:tc>
-        <w:tc>
-          <w:tcPr>
-            <w:tcW w:type="dxa" w:w="1999"/>
-            <w:vAlign w:val="center"/>
-            <w:tcBorders>
-              <w:top w:val="single" w:sz="6" w:space="0" w:color="D9D9D9"/>
-              <w:left w:val="single" w:sz="6" w:space="0" w:color="D9D9D9"/>
-              <w:bottom w:val="single" w:sz="6" w:space="0" w:color="D9D9D9"/>
-              <w:right w:val="single" w:sz="6" w:space="0" w:color="D9D9D9"/>
-              <w:insideH w:val="single" w:sz="6" w:space="0" w:color="D9D9D9"/>
-              <w:insideV w:val="single" w:sz="6" w:space="0" w:color="D9D9D9"/>
-            </w:tcBorders>
-            <w:tcMar>
-              <w:top w:w="90" w:type="dxa"/>
-              <w:start w:w="100" w:type="dxa"/>
-              <w:bottom w:w="90" w:type="dxa"/>
-              <w:end w:w="100" w:type="dxa"/>
-            </w:tcMar>
-          </w:tcPr>
-          <w:p>
-            <w:pPr>
-              <w:spacing w:after="0" w:line="240" w:lineRule="auto"/>
-              <w:jc w:val="center"/>
-            </w:pPr>
-            <w:r>
-              <w:rPr>
-                <w:rFonts w:ascii="Arial" w:hAnsi="Arial"/>
-                <w:sz w:val="16"/>
-              </w:rPr>
-              <w:t>−81,252 [−85,980, −76,182]</w:t>
-            </w:r>
-          </w:p>
-        </w:tc>
-        <w:tc>
-          <w:tcPr>
-            <w:tcW w:type="dxa" w:w="1999"/>
-            <w:vAlign w:val="center"/>
-            <w:tcBorders>
-              <w:top w:val="single" w:sz="6" w:space="0" w:color="D9D9D9"/>
-              <w:left w:val="single" w:sz="6" w:space="0" w:color="D9D9D9"/>
-              <w:bottom w:val="single" w:sz="6" w:space="0" w:color="D9D9D9"/>
-              <w:right w:val="single" w:sz="6" w:space="0" w:color="D9D9D9"/>
-              <w:insideH w:val="single" w:sz="6" w:space="0" w:color="D9D9D9"/>
-              <w:insideV w:val="single" w:sz="6" w:space="0" w:color="D9D9D9"/>
-            </w:tcBorders>
-            <w:tcMar>
-              <w:top w:w="90" w:type="dxa"/>
-              <w:start w:w="100" w:type="dxa"/>
-              <w:bottom w:w="90" w:type="dxa"/>
-              <w:end w:w="100" w:type="dxa"/>
-            </w:tcMar>
-          </w:tcPr>
-          <w:p>
-            <w:pPr>
-              <w:spacing w:after="0" w:line="240" w:lineRule="auto"/>
-              <w:jc w:val="center"/>
-            </w:pPr>
-            <w:r>
-              <w:rPr>
-                <w:rFonts w:ascii="Arial" w:hAnsi="Arial"/>
-                <w:sz w:val="16"/>
-              </w:rPr>
-              <w:t>−2,663 [−3,876, −1,074]</w:t>
-            </w:r>
-          </w:p>
-        </w:tc>
-        <w:tc>
-          <w:tcPr>
-            <w:tcW w:type="dxa" w:w="1999"/>
-            <w:vAlign w:val="center"/>
-            <w:tcBorders>
-              <w:top w:val="single" w:sz="6" w:space="0" w:color="D9D9D9"/>
-              <w:left w:val="single" w:sz="6" w:space="0" w:color="D9D9D9"/>
-              <w:bottom w:val="single" w:sz="6" w:space="0" w:color="D9D9D9"/>
-              <w:right w:val="single" w:sz="6" w:space="0" w:color="D9D9D9"/>
-              <w:insideH w:val="single" w:sz="6" w:space="0" w:color="D9D9D9"/>
-              <w:insideV w:val="single" w:sz="6" w:space="0" w:color="D9D9D9"/>
-            </w:tcBorders>
-            <w:tcMar>
-              <w:top w:w="90" w:type="dxa"/>
-              <w:start w:w="100" w:type="dxa"/>
-              <w:bottom w:w="90" w:type="dxa"/>
-              <w:end w:w="100" w:type="dxa"/>
-            </w:tcMar>
-          </w:tcPr>
-          <w:p>
-            <w:pPr>
-              <w:spacing w:after="0" w:line="240" w:lineRule="auto"/>
-              <w:jc w:val="center"/>
-            </w:pPr>
-            <w:r>
-              <w:rPr>
-                <w:rFonts w:ascii="Arial" w:hAnsi="Arial"/>
-                <w:sz w:val="16"/>
-              </w:rPr>
-              <w:t>+0.0121 [+0.0115, +0.0127]</w:t>
-            </w:r>
-          </w:p>
-        </w:tc>
-        <w:tc>
-          <w:tcPr>
-            <w:tcW w:type="dxa" w:w="1999"/>
-            <w:vAlign w:val="center"/>
-            <w:tcBorders>
-              <w:top w:val="single" w:sz="6" w:space="0" w:color="D9D9D9"/>
-              <w:left w:val="single" w:sz="6" w:space="0" w:color="D9D9D9"/>
-              <w:bottom w:val="single" w:sz="6" w:space="0" w:color="D9D9D9"/>
-              <w:right w:val="single" w:sz="6" w:space="0" w:color="D9D9D9"/>
-              <w:insideH w:val="single" w:sz="6" w:space="0" w:color="D9D9D9"/>
-              <w:insideV w:val="single" w:sz="6" w:space="0" w:color="D9D9D9"/>
-            </w:tcBorders>
-            <w:tcMar>
-              <w:top w:w="90" w:type="dxa"/>
-              <w:start w:w="100" w:type="dxa"/>
-              <w:bottom w:w="90" w:type="dxa"/>
-              <w:end w:w="100" w:type="dxa"/>
-            </w:tcMar>
-          </w:tcPr>
-          <w:p>
-            <w:pPr>
-              <w:spacing w:after="0" w:line="240" w:lineRule="auto"/>
-              <w:jc w:val="center"/>
-            </w:pPr>
-            <w:r>
-              <w:rPr>
-                <w:rFonts w:ascii="Arial" w:hAnsi="Arial"/>
-                <w:sz w:val="16"/>
-              </w:rPr>
-              <w:t>+0.0235 [+0.0138, +0.0342]</w:t>
-            </w:r>
-          </w:p>
-        </w:tc>
-      </w:tr>
-      <w:tr>
-        <w:trPr>
-          <w:cantSplit/>
-        </w:trPr>
-        <w:tc>
-          <w:tcPr>
-            <w:tcW w:type="dxa" w:w="1999"/>
-            <w:vAlign w:val="center"/>
-            <w:tcBorders>
-              <w:top w:val="single" w:sz="6" w:space="0" w:color="D9D9D9"/>
-              <w:left w:val="single" w:sz="6" w:space="0" w:color="D9D9D9"/>
-              <w:bottom w:val="single" w:sz="6" w:space="0" w:color="D9D9D9"/>
-              <w:right w:val="single" w:sz="6" w:space="0" w:color="D9D9D9"/>
-              <w:insideH w:val="single" w:sz="6" w:space="0" w:color="D9D9D9"/>
-              <w:insideV w:val="single" w:sz="6" w:space="0" w:color="D9D9D9"/>
-            </w:tcBorders>
-            <w:tcMar>
-              <w:top w:w="90" w:type="dxa"/>
-              <w:start w:w="100" w:type="dxa"/>
-              <w:bottom w:w="90" w:type="dxa"/>
-              <w:end w:w="100" w:type="dxa"/>
-            </w:tcMar>
-            <w:shd w:fill="F2F6FA"/>
-          </w:tcPr>
-          <w:p>
-            <w:pPr>
-              <w:spacing w:after="0" w:line="240" w:lineRule="auto"/>
-              <w:jc w:val="left"/>
-            </w:pPr>
-            <w:r>
-              <w:rPr>
-                <w:rFonts w:ascii="Arial" w:hAnsi="Arial"/>
-                <w:sz w:val="16"/>
-              </w:rPr>
-              <w:t>PA1 − C3</w:t>
-            </w:r>
-          </w:p>
-        </w:tc>
-        <w:tc>
-          <w:tcPr>
-            <w:tcW w:type="dxa" w:w="1999"/>
-            <w:vAlign w:val="center"/>
-            <w:tcBorders>
-              <w:top w:val="single" w:sz="6" w:space="0" w:color="D9D9D9"/>
-              <w:left w:val="single" w:sz="6" w:space="0" w:color="D9D9D9"/>
-              <w:bottom w:val="single" w:sz="6" w:space="0" w:color="D9D9D9"/>
-              <w:right w:val="single" w:sz="6" w:space="0" w:color="D9D9D9"/>
-              <w:insideH w:val="single" w:sz="6" w:space="0" w:color="D9D9D9"/>
-              <w:insideV w:val="single" w:sz="6" w:space="0" w:color="D9D9D9"/>
-            </w:tcBorders>
-            <w:tcMar>
-              <w:top w:w="90" w:type="dxa"/>
-              <w:start w:w="100" w:type="dxa"/>
-              <w:bottom w:w="90" w:type="dxa"/>
-              <w:end w:w="100" w:type="dxa"/>
-            </w:tcMar>
-            <w:shd w:fill="F2F6FA"/>
-          </w:tcPr>
-          <w:p>
-            <w:pPr>
-              <w:spacing w:after="0" w:line="240" w:lineRule="auto"/>
-              <w:jc w:val="center"/>
-            </w:pPr>
-            <w:r>
-              <w:rPr>
-                <w:rFonts w:ascii="Arial" w:hAnsi="Arial"/>
-                <w:sz w:val="16"/>
-              </w:rPr>
-              <w:t>−69,665 [−74,949, −64,060]</w:t>
-            </w:r>
-          </w:p>
-        </w:tc>
-        <w:tc>
-          <w:tcPr>
-            <w:tcW w:type="dxa" w:w="1999"/>
-            <w:vAlign w:val="center"/>
-            <w:tcBorders>
-              <w:top w:val="single" w:sz="6" w:space="0" w:color="D9D9D9"/>
-              <w:left w:val="single" w:sz="6" w:space="0" w:color="D9D9D9"/>
-              <w:bottom w:val="single" w:sz="6" w:space="0" w:color="D9D9D9"/>
-              <w:right w:val="single" w:sz="6" w:space="0" w:color="D9D9D9"/>
-              <w:insideH w:val="single" w:sz="6" w:space="0" w:color="D9D9D9"/>
-              <w:insideV w:val="single" w:sz="6" w:space="0" w:color="D9D9D9"/>
-            </w:tcBorders>
-            <w:tcMar>
-              <w:top w:w="90" w:type="dxa"/>
-              <w:start w:w="100" w:type="dxa"/>
-              <w:bottom w:w="90" w:type="dxa"/>
-              <w:end w:w="100" w:type="dxa"/>
-            </w:tcMar>
-            <w:shd w:fill="F2F6FA"/>
-          </w:tcPr>
-          <w:p>
-            <w:pPr>
-              <w:spacing w:after="0" w:line="240" w:lineRule="auto"/>
-              <w:jc w:val="center"/>
-            </w:pPr>
-            <w:r>
-              <w:rPr>
-                <w:rFonts w:ascii="Arial" w:hAnsi="Arial"/>
-                <w:sz w:val="16"/>
-              </w:rPr>
-              <w:t>−2,122 [−3,824, −246]</w:t>
-            </w:r>
-          </w:p>
-        </w:tc>
-        <w:tc>
-          <w:tcPr>
-            <w:tcW w:type="dxa" w:w="1999"/>
-            <w:vAlign w:val="center"/>
-            <w:tcBorders>
-              <w:top w:val="single" w:sz="6" w:space="0" w:color="D9D9D9"/>
-              <w:left w:val="single" w:sz="6" w:space="0" w:color="D9D9D9"/>
-              <w:bottom w:val="single" w:sz="6" w:space="0" w:color="D9D9D9"/>
-              <w:right w:val="single" w:sz="6" w:space="0" w:color="D9D9D9"/>
-              <w:insideH w:val="single" w:sz="6" w:space="0" w:color="D9D9D9"/>
-              <w:insideV w:val="single" w:sz="6" w:space="0" w:color="D9D9D9"/>
-            </w:tcBorders>
-            <w:tcMar>
-              <w:top w:w="90" w:type="dxa"/>
-              <w:start w:w="100" w:type="dxa"/>
-              <w:bottom w:w="90" w:type="dxa"/>
-              <w:end w:w="100" w:type="dxa"/>
-            </w:tcMar>
-            <w:shd w:fill="F2F6FA"/>
-          </w:tcPr>
-          <w:p>
-            <w:pPr>
-              <w:spacing w:after="0" w:line="240" w:lineRule="auto"/>
-              <w:jc w:val="center"/>
-            </w:pPr>
-            <w:r>
-              <w:rPr>
-                <w:rFonts w:ascii="Arial" w:hAnsi="Arial"/>
-                <w:sz w:val="16"/>
-              </w:rPr>
-              <w:t>+0.0105 [+0.0099, +0.0112]</w:t>
-            </w:r>
-          </w:p>
-        </w:tc>
-        <w:tc>
-          <w:tcPr>
-            <w:tcW w:type="dxa" w:w="1999"/>
-            <w:vAlign w:val="center"/>
-            <w:tcBorders>
-              <w:top w:val="single" w:sz="6" w:space="0" w:color="D9D9D9"/>
-              <w:left w:val="single" w:sz="6" w:space="0" w:color="D9D9D9"/>
-              <w:bottom w:val="single" w:sz="6" w:space="0" w:color="D9D9D9"/>
-              <w:right w:val="single" w:sz="6" w:space="0" w:color="D9D9D9"/>
-              <w:insideH w:val="single" w:sz="6" w:space="0" w:color="D9D9D9"/>
-              <w:insideV w:val="single" w:sz="6" w:space="0" w:color="D9D9D9"/>
-            </w:tcBorders>
-            <w:tcMar>
-              <w:top w:w="90" w:type="dxa"/>
-              <w:start w:w="100" w:type="dxa"/>
-              <w:bottom w:w="90" w:type="dxa"/>
-              <w:end w:w="100" w:type="dxa"/>
-            </w:tcMar>
-            <w:shd w:fill="F2F6FA"/>
-          </w:tcPr>
-          <w:p>
-            <w:pPr>
-              <w:spacing w:after="0" w:line="240" w:lineRule="auto"/>
-              <w:jc w:val="center"/>
-            </w:pPr>
-            <w:r>
-              <w:rPr>
-                <w:rFonts w:ascii="Arial" w:hAnsi="Arial"/>
-                <w:sz w:val="16"/>
-              </w:rPr>
-              <w:t>+0.0352 [+0.0260, +0.0441]</w:t>
-            </w:r>
-          </w:p>
-        </w:tc>
-      </w:tr>
-      <w:tr>
-        <w:trPr>
-          <w:cantSplit/>
-        </w:trPr>
-        <w:tc>
-          <w:tcPr>
-            <w:tcW w:type="dxa" w:w="1999"/>
-            <w:vAlign w:val="center"/>
-            <w:tcBorders>
-              <w:top w:val="single" w:sz="6" w:space="0" w:color="D9D9D9"/>
-              <w:left w:val="single" w:sz="6" w:space="0" w:color="D9D9D9"/>
-              <w:bottom w:val="single" w:sz="6" w:space="0" w:color="D9D9D9"/>
-              <w:right w:val="single" w:sz="6" w:space="0" w:color="D9D9D9"/>
-              <w:insideH w:val="single" w:sz="6" w:space="0" w:color="D9D9D9"/>
-              <w:insideV w:val="single" w:sz="6" w:space="0" w:color="D9D9D9"/>
-            </w:tcBorders>
-            <w:tcMar>
-              <w:top w:w="90" w:type="dxa"/>
-              <w:start w:w="100" w:type="dxa"/>
-              <w:bottom w:w="90" w:type="dxa"/>
-              <w:end w:w="100" w:type="dxa"/>
-            </w:tcMar>
-          </w:tcPr>
-          <w:p>
-            <w:pPr>
-              <w:spacing w:after="0" w:line="240" w:lineRule="auto"/>
-              <w:jc w:val="left"/>
-            </w:pPr>
-            <w:r>
-              <w:rPr>
-                <w:rFonts w:ascii="Arial" w:hAnsi="Arial"/>
-                <w:sz w:val="16"/>
-              </w:rPr>
-              <w:t>PA1 − C5</w:t>
-            </w:r>
-          </w:p>
-        </w:tc>
-        <w:tc>
-          <w:tcPr>
-            <w:tcW w:type="dxa" w:w="1999"/>
-            <w:vAlign w:val="center"/>
-            <w:tcBorders>
-              <w:top w:val="single" w:sz="6" w:space="0" w:color="D9D9D9"/>
-              <w:left w:val="single" w:sz="6" w:space="0" w:color="D9D9D9"/>
-              <w:bottom w:val="single" w:sz="6" w:space="0" w:color="D9D9D9"/>
-              <w:right w:val="single" w:sz="6" w:space="0" w:color="D9D9D9"/>
-              <w:insideH w:val="single" w:sz="6" w:space="0" w:color="D9D9D9"/>
-              <w:insideV w:val="single" w:sz="6" w:space="0" w:color="D9D9D9"/>
-            </w:tcBorders>
-            <w:tcMar>
-              <w:top w:w="90" w:type="dxa"/>
-              <w:start w:w="100" w:type="dxa"/>
-              <w:bottom w:w="90" w:type="dxa"/>
-              <w:end w:w="100" w:type="dxa"/>
-            </w:tcMar>
-          </w:tcPr>
-          <w:p>
-            <w:pPr>
-              <w:spacing w:after="0" w:line="240" w:lineRule="auto"/>
-              <w:jc w:val="center"/>
-            </w:pPr>
-            <w:r>
-              <w:rPr>
-                <w:rFonts w:ascii="Arial" w:hAnsi="Arial"/>
-                <w:sz w:val="16"/>
-              </w:rPr>
-              <w:t>−147,460 [−151,484, −143,045]</w:t>
-            </w:r>
-          </w:p>
-        </w:tc>
-        <w:tc>
-          <w:tcPr>
-            <w:tcW w:type="dxa" w:w="1999"/>
-            <w:vAlign w:val="center"/>
-            <w:tcBorders>
-              <w:top w:val="single" w:sz="6" w:space="0" w:color="D9D9D9"/>
-              <w:left w:val="single" w:sz="6" w:space="0" w:color="D9D9D9"/>
-              <w:bottom w:val="single" w:sz="6" w:space="0" w:color="D9D9D9"/>
-              <w:right w:val="single" w:sz="6" w:space="0" w:color="D9D9D9"/>
-              <w:insideH w:val="single" w:sz="6" w:space="0" w:color="D9D9D9"/>
-              <w:insideV w:val="single" w:sz="6" w:space="0" w:color="D9D9D9"/>
-            </w:tcBorders>
-            <w:tcMar>
-              <w:top w:w="90" w:type="dxa"/>
-              <w:start w:w="100" w:type="dxa"/>
-              <w:bottom w:w="90" w:type="dxa"/>
-              <w:end w:w="100" w:type="dxa"/>
-            </w:tcMar>
-          </w:tcPr>
-          <w:p>
-            <w:pPr>
-              <w:spacing w:after="0" w:line="240" w:lineRule="auto"/>
-              <w:jc w:val="center"/>
-            </w:pPr>
-            <w:r>
-              <w:rPr>
-                <w:rFonts w:ascii="Arial" w:hAnsi="Arial"/>
-                <w:sz w:val="16"/>
-              </w:rPr>
-              <w:t>−4,914 [−6,483, −3,509]</w:t>
-            </w:r>
-          </w:p>
-        </w:tc>
-        <w:tc>
-          <w:tcPr>
-            <w:tcW w:type="dxa" w:w="1999"/>
-            <w:vAlign w:val="center"/>
-            <w:tcBorders>
-              <w:top w:val="single" w:sz="6" w:space="0" w:color="D9D9D9"/>
-              <w:left w:val="single" w:sz="6" w:space="0" w:color="D9D9D9"/>
-              <w:bottom w:val="single" w:sz="6" w:space="0" w:color="D9D9D9"/>
-              <w:right w:val="single" w:sz="6" w:space="0" w:color="D9D9D9"/>
-              <w:insideH w:val="single" w:sz="6" w:space="0" w:color="D9D9D9"/>
-              <w:insideV w:val="single" w:sz="6" w:space="0" w:color="D9D9D9"/>
-            </w:tcBorders>
-            <w:tcMar>
-              <w:top w:w="90" w:type="dxa"/>
-              <w:start w:w="100" w:type="dxa"/>
-              <w:bottom w:w="90" w:type="dxa"/>
-              <w:end w:w="100" w:type="dxa"/>
-            </w:tcMar>
-          </w:tcPr>
-          <w:p>
-            <w:pPr>
-              <w:spacing w:after="0" w:line="240" w:lineRule="auto"/>
-              <w:jc w:val="center"/>
-            </w:pPr>
-            <w:r>
-              <w:rPr>
-                <w:rFonts w:ascii="Arial" w:hAnsi="Arial"/>
-                <w:sz w:val="16"/>
-              </w:rPr>
-              <w:t>+0.0222 [+0.0216, +0.0227]</w:t>
-            </w:r>
-          </w:p>
-        </w:tc>
-        <w:tc>
-          <w:tcPr>
-            <w:tcW w:type="dxa" w:w="1999"/>
-            <w:vAlign w:val="center"/>
-            <w:tcBorders>
-              <w:top w:val="single" w:sz="6" w:space="0" w:color="D9D9D9"/>
-              <w:left w:val="single" w:sz="6" w:space="0" w:color="D9D9D9"/>
-              <w:bottom w:val="single" w:sz="6" w:space="0" w:color="D9D9D9"/>
-              <w:right w:val="single" w:sz="6" w:space="0" w:color="D9D9D9"/>
-              <w:insideH w:val="single" w:sz="6" w:space="0" w:color="D9D9D9"/>
-              <w:insideV w:val="single" w:sz="6" w:space="0" w:color="D9D9D9"/>
-            </w:tcBorders>
-            <w:tcMar>
-              <w:top w:w="90" w:type="dxa"/>
-              <w:start w:w="100" w:type="dxa"/>
-              <w:bottom w:w="90" w:type="dxa"/>
-              <w:end w:w="100" w:type="dxa"/>
-            </w:tcMar>
-          </w:tcPr>
-          <w:p>
-            <w:pPr>
-              <w:spacing w:after="0" w:line="240" w:lineRule="auto"/>
-              <w:jc w:val="center"/>
-            </w:pPr>
-            <w:r>
-              <w:rPr>
-                <w:rFonts w:ascii="Arial" w:hAnsi="Arial"/>
-                <w:sz w:val="16"/>
-              </w:rPr>
-              <w:t>+0.0410 [+0.0339, +0.0486]</w:t>
-            </w:r>
-          </w:p>
-        </w:tc>
-      </w:tr>
-    </w:tbl>
-    <w:p>
-      <w:pPr>
-        <w:spacing w:after="40"/>
-      </w:pPr>
     </w:p>
     <w:p>
       <w:r>
@@ -8428,6 +7400,63 @@
     </w:p>
     <w:p>
       <w:pPr>
+        <w:jc w:val="center"/>
+      </w:pPr>
+      <w:r>
+        <w:drawing>
+          <wp:inline xmlns:a="http://schemas.openxmlformats.org/drawingml/2006/main" xmlns:pic="http://schemas.openxmlformats.org/drawingml/2006/picture">
+            <wp:extent cx="6126480" cy="3880104"/>
+            <wp:docPr id="5" name="Picture 5" descr="Scenario forest plot for matched item-fill differences" title="Scenario-level matched contrasts"/>
+            <wp:cNvGraphicFramePr>
+              <a:graphicFrameLocks noChangeAspect="1"/>
+            </wp:cNvGraphicFramePr>
+            <a:graphic>
+              <a:graphicData uri="http://schemas.openxmlformats.org/drawingml/2006/picture">
+                <pic:pic>
+                  <pic:nvPicPr>
+                    <pic:cNvPr id="0" name="forest_plot.png"/>
+                    <pic:cNvPicPr/>
+                  </pic:nvPicPr>
+                  <pic:blipFill>
+                    <a:blip r:embed="rId14"/>
+                    <a:stretch>
+                      <a:fillRect/>
+                    </a:stretch>
+                  </pic:blipFill>
+                  <pic:spPr>
+                    <a:xfrm>
+                      <a:off x="0" y="0"/>
+                      <a:ext cx="6126480" cy="3880104"/>
+                    </a:xfrm>
+                    <a:prstGeom prst="rect"/>
+                  </pic:spPr>
+                </pic:pic>
+              </a:graphicData>
+            </a:graphic>
+          </wp:inline>
+        </w:drawing>
+      </w:r>
+    </w:p>
+    <w:p>
+      <w:pPr>
+        <w:jc w:val="center"/>
+      </w:pPr>
+      <w:r>
+        <w:rPr>
+          <w:rFonts w:ascii="Arial" w:hAnsi="Arial"/>
+          <w:i/>
+          <w:sz w:val="16"/>
+        </w:rPr>
+        <w:t>Figure 5. Forest plot of PA1 minus C4 and PA1 minus C1 item-fill differences across all twelve synthetic scenarios; whiskers are 95% replication intervals.</w:t>
+      </w:r>
+    </w:p>
+    <w:p>
+      <w:r>
+        <w:t>The forest plot is the primary scenario-level display: every scenario has the same direction for PA1 minus C4 and PA1 minus C1 item fill, with no cherry-picked scenario driving the pooled estimate. The S05-only legacy contrasts and the earlier four-policy tables are retained in Appendix E.</w:t>
+      </w:r>
+    </w:p>
+    <w:p>
+      <w:pPr>
         <w:pStyle w:val="Heading2"/>
       </w:pPr>
       <w:r>
@@ -11141,6 +10170,115 @@
     <w:p>
       <w:r>
         <w:t>The mechanism is simple. A basket buffer can help only if it reallocates stock toward products whose joint availability affects the complete-order metric, while the resulting inventory, purchase, ordering, and shortage costs remain acceptable. A popularity buffer can achieve the same outcome when high-volume products also dominate basket completion. The PA1−C4 result shows that co-purchase edges did not add value on top of popularity in the primary replay; the placebo contrasts show that buffer allocation, not necessarily graph topology, drives the observed differences.</w:t>
+      </w:r>
+    </w:p>
+    <w:p>
+      <w:pPr>
+        <w:jc w:val="center"/>
+      </w:pPr>
+      <w:r>
+        <w:drawing>
+          <wp:inline xmlns:a="http://schemas.openxmlformats.org/drawingml/2006/main" xmlns:pic="http://schemas.openxmlformats.org/drawingml/2006/picture">
+            <wp:extent cx="6126480" cy="3880104"/>
+            <wp:docPr id="6" name="Picture 6" descr="Graph signal by popularity and lift stratum" title="Graph signal by popularity stratum"/>
+            <wp:cNvGraphicFramePr>
+              <a:graphicFrameLocks noChangeAspect="1"/>
+            </wp:cNvGraphicFramePr>
+            <a:graphic>
+              <a:graphicData uri="http://schemas.openxmlformats.org/drawingml/2006/picture">
+                <pic:pic>
+                  <pic:nvPicPr>
+                    <pic:cNvPr id="0" name="mechanism_strata.png"/>
+                    <pic:cNvPicPr/>
+                  </pic:nvPicPr>
+                  <pic:blipFill>
+                    <a:blip r:embed="rId15"/>
+                    <a:stretch>
+                      <a:fillRect/>
+                    </a:stretch>
+                  </pic:blipFill>
+                  <pic:spPr>
+                    <a:xfrm>
+                      <a:off x="0" y="0"/>
+                      <a:ext cx="6126480" cy="3880104"/>
+                    </a:xfrm>
+                    <a:prstGeom prst="rect"/>
+                  </pic:spPr>
+                </pic:pic>
+              </a:graphicData>
+            </a:graphic>
+          </wp:inline>
+        </w:drawing>
+      </w:r>
+    </w:p>
+    <w:p>
+      <w:pPr>
+        <w:jc w:val="center"/>
+      </w:pPr>
+      <w:r>
+        <w:rPr>
+          <w:rFonts w:ascii="Arial" w:hAnsi="Arial"/>
+          <w:i/>
+          <w:sz w:val="16"/>
+        </w:rPr>
+        <w:t>Figure 6. PA1 minus C4 item-fill differences in low-popularity/high-lift and high-popularity/high-lift product strata; whiskers are 95% replication intervals.</w:t>
+      </w:r>
+    </w:p>
+    <w:p>
+      <w:pPr>
+        <w:jc w:val="center"/>
+      </w:pPr>
+      <w:r>
+        <w:drawing>
+          <wp:inline xmlns:a="http://schemas.openxmlformats.org/drawingml/2006/main" xmlns:pic="http://schemas.openxmlformats.org/drawingml/2006/picture">
+            <wp:extent cx="6126480" cy="3880104"/>
+            <wp:docPr id="7" name="Picture 7" descr="Replication of the item-fill contrast across basket datasets" title="Replication across basket datasets"/>
+            <wp:cNvGraphicFramePr>
+              <a:graphicFrameLocks noChangeAspect="1"/>
+            </wp:cNvGraphicFramePr>
+            <a:graphic>
+              <a:graphicData uri="http://schemas.openxmlformats.org/drawingml/2006/picture">
+                <pic:pic>
+                  <pic:nvPicPr>
+                    <pic:cNvPr id="0" name="dataset_replication.png"/>
+                    <pic:cNvPicPr/>
+                  </pic:nvPicPr>
+                  <pic:blipFill>
+                    <a:blip r:embed="rId16"/>
+                    <a:stretch>
+                      <a:fillRect/>
+                    </a:stretch>
+                  </pic:blipFill>
+                  <pic:spPr>
+                    <a:xfrm>
+                      <a:off x="0" y="0"/>
+                      <a:ext cx="6126480" cy="3880104"/>
+                    </a:xfrm>
+                    <a:prstGeom prst="rect"/>
+                  </pic:spPr>
+                </pic:pic>
+              </a:graphicData>
+            </a:graphic>
+          </wp:inline>
+        </w:drawing>
+      </w:r>
+    </w:p>
+    <w:p>
+      <w:pPr>
+        <w:jc w:val="center"/>
+      </w:pPr>
+      <w:r>
+        <w:rPr>
+          <w:rFonts w:ascii="Arial" w:hAnsi="Arial"/>
+          <w:i/>
+          <w:sz w:val="16"/>
+        </w:rPr>
+        <w:t>Figure 7. PA1 minus C4 item-fill differences in UCI Online Retail II and the tightened dunnhumby Complete Journey replay; the external replay is a stress check, not a causal validation.</w:t>
+      </w:r>
+    </w:p>
+    <w:p>
+      <w:r>
+        <w:t>Figure 6 shows the conditional mechanism result: PA1 improves item fill in the low-popularity/high-lift stratum but loses in the high-popularity/high-lift stratum. Figure 7 shows that the negative item-fill direction replicates in the tightened dunnhumby replay, while the complete-basket proxy remains non-discriminating.</w:t>
       </w:r>
     </w:p>
     <w:p>
@@ -11197,7 +10335,7 @@
     </w:p>
     <w:p>
       <w:r>
-        <w:t>The most important design result is methodological: a tightly matched independent control, a popularity-only control, graph-topology placebos, replication-level intervals, and rolling windows are needed before a basket graph can be credited with value. Completed transactions support a basket-service proxy, but they cannot identify stockout substitution or causal complementarity.</w:t>
+        <w:t>The design implication is compact: a basket graph should be credited only after comparison with a tightly matched independent control, a popularity-only control, graph-topology placebos, replication-level intervals, and rolling windows. Completed transactions support a basket-service proxy, but cannot identify stockout substitution or causal complementarity.</w:t>
       </w:r>
     </w:p>
     <w:p>
@@ -11264,7 +10402,7 @@
     </w:p>
     <w:p>
       <w:r>
-        <w:t>The primary robustness upgrades are complete: alpha = 1.5 is interior, matching is within 1%, all twelve scenarios use 120 paired replications, bootstrap uncertainty uses 1,000 resamples, and three rolling windows are reported. The corrected dunnhumby stress replay is separate from UCI and discriminates on item fill but not on the complete-basket proxy; it does not convert the study into a causal or operational validation. The Scopus and Web of Science searches were specified but not run because licensed exports were unavailable, and the reference list is an open-record cross-check rather than a completed database-verified systematic review. The code is publicly archived at GitHub, but no DOI has yet been minted for the repository.</w:t>
+        <w:t>The robustness upgrades are complete for the released simulation: alpha = 1.5 is interior, matching is within 1%, all twelve scenarios use 120 paired replications, bootstrap uncertainty uses 1,000 resamples, and three rolling windows are reported. The tightened dunnhumby stress replay discriminates on item fill but not on the complete-basket proxy; it is not causal or operational validation. Scopus and Web of Science were specified but not run because licensed exports were unavailable; the reference list is an open-record cross-check, not a database-verified systematic review. The code is public, but the repository has no DOI.</w:t>
       </w:r>
     </w:p>
     <w:p>

</xml_diff>

<commit_message>
Prepare submission package and evidence-bounded manuscript
</commit_message>
<xml_diff>
--- a/basket_aware_inventory_full_manuscript_sections_1_to_10.docx
+++ b/basket_aware_inventory_full_manuscript_sections_1_to_10.docx
@@ -66,7 +66,7 @@
     </w:p>
     <w:p>
       <w:r>
-        <w:t>Using UCI Online Retail II, the study reconstructs completed baskets, forecasts weekly demand with three transparent moving-average or seasonal-naive candidates, and builds a training-only co-purchase graph. PA1, the partner-protection policy, is compared with C1, an inventory-matched independent policy, and C4, a popularity-only policy, across twelve synthetic lead-time and cost scenarios with 120 paired replications. The primary result is negative for the graph-on-top-of-popularity contrast: PA1 minus C4 item fill is −0.0258 (95% scenario-clustered CI −0.0268 to −0.0248), with +6,092 average inventory units and +194,213 simulated cost units. PA1 minus C1 is positive for item fill (+0.0268, CI +0.0260 to +0.0276) but also more costly (+201,341 units). A low-popularity/high-lift stratum is a conditional exception (+0.1014 item fill), whereas a high-popularity/high-lift stratum is negative (−0.0750). The direction of the item-fill contrast replicates in a tightened dunnhumby replay, but complete-basket fill does not discriminate. Because inventory and supplier records are absent, these are controlled simulation findings, not historical or causal estimates.</w:t>
+        <w:t>Using UCI Online Retail II, the study reconstructs completed baskets, forecasts weekly demand with three transparent moving-average or seasonal-naive candidates, and builds a training-only co-purchase graph. PA1, the partner-protection policy, is compared with C1, an inventory-matched independent policy, and C4, a popularity-only policy, across twelve synthetic lead-time and cost scenarios with 120 paired replications. The primary result is negative for the graph-on-top-of-popularity contrast: PA1 minus C4 item fill is −0.0258 (95% scenario-clustered CI −0.0268 to −0.0248), with +6,092 average inventory units and +194,213 simulated cost units. PA1 minus C1 is positive for item fill (+0.0268, CI +0.0260 to +0.0276) but also more costly (+201,341 units). An exploratory low-popularity/high-lift stratum is a conditional exception (+0.1014 item fill), whereas a high-popularity/high-lift stratum is negative (−0.0750). A tightened dunnhumby run is retained only as an external pipeline stress check: its complete-basket proxy does not discriminate and its item-fill contrast is not treated as replication. Because inventory and supplier records are absent, these are controlled simulation findings, not historical or causal estimates.</w:t>
       </w:r>
     </w:p>
     <w:p>
@@ -699,7 +699,7 @@
     </w:p>
     <w:p>
       <w:r>
-        <w:t>All policies use weekly periodic review. At review week t, inventory position is on-hand stock plus on-order stock minus backorders. The order quantity is the nonnegative ceiling of target stock minus inventory position. The independent base target is two weeks of forecast demand plus z times the calibrated residual scale times the square root of two, where z is the standard-normal quantile for the scenario critical-fractile target. The executed Phase 3 replay used the frozen six-fold safety calibration of the residual scale; this is why its absolute inventory levels are larger than those in the earlier four-policy pilot, which used the unmultiplied residual scale. The primary Phase 3 estimand is service at matched average inventory.</w:t>
+        <w:t>All policies use weekly periodic review. At review week t, inventory position is on-hand stock plus on-order stock minus backorders. The order quantity is the nonnegative ceiling of target stock minus inventory position. The independent base target is two weeks of forecast demand plus z times the calibrated residual scale times the square root of two, where z is the standard-normal quantile for the scenario critical-fractile target. The primary replay used the frozen six-fold safety calibration of the residual scale; this is why its absolute inventory levels are larger than those in the earlier four-policy pilot, which used the unmultiplied residual scale. The primary estimand is service at matched average inventory.</w:t>
       </w:r>
     </w:p>
     <w:p>
@@ -1514,7 +1514,7 @@
     </w:p>
     <w:p>
       <w:r>
-        <w:t>The 12 scenarios cross four lead-time families (deterministic seven-day, low-variance normal, high-variance normal, and right-skewed discrete over 2–21 days) with (h,p) pairs (0.05, 2.0), (0.15, 5.0), and (0.30, 10.0). Ordering and purchase costs are normalized to 1.0, and each row has its own seed. The cost-responsive target is p/(p+h); low/high variance use clipped rounded normal draws and the skewed family uses a truncated exponential. All assumptions are recorded in results/experiment_config.json.</w:t>
+        <w:t>The 12 scenarios cross four lead-time families (deterministic seven-day, low-variance normal, high-variance normal, and right-skewed discrete over 2–21 days) with (h,p) pairs (0.05, 2.0), (0.15, 5.0), and (0.30, 10.0). Ordering and purchase costs are normalized to 1.0, and each row has its own seed. The cost-responsive target is p/(p+h); low/high variance use clipped rounded normal draws and the skewed family uses a truncated exponential. The complete scenario specification is supplied as Supplementary Table S2.</w:t>
       </w:r>
     </w:p>
     <w:p>
@@ -1595,12 +1595,12 @@
     </w:p>
     <w:p>
       <w:r>
-        <w:t>The earlier Phase 2 edge-level run used alpha = 3.0 at the grid boundary and is retained as historical secondary evidence. The primary analysis supersedes it for interpretation: alpha = 1.5 is interior, the matching tolerance is 1%, and the primary configuration hash is 70cc7bc98246449e106eb25e81456a03d6364806cdd68953bd9f72523d26d065.</w:t>
+        <w:t>The earlier edge-level run used alpha = 3.0 at the grid boundary and is retained as historical secondary evidence. The primary analysis supersedes it for interpretation: alpha = 1.5 is interior and the matching tolerance is 1%.</w:t>
       </w:r>
     </w:p>
     <w:p>
       <w:r>
-        <w:t>The executed experiment froze model versions, thresholds, cost table, critical-fractile rule, lead-time distributions, initial conditions, random seeds, and primary outcome definitions before test evaluation. The primary Phase 3 replay was run once under its recorded parent validation hash. Exact settings, level tables, paired contrasts, bootstrap draws, rolling windows, and the external dataset profile are recorded in the research package.</w:t>
+        <w:t>The executed experiment froze model versions, thresholds, cost table, critical-fractile rule, lead-time distributions, initial conditions, random seeds, and primary outcome definitions before test evaluation. Exact settings, level tables, paired contrasts, bootstrap draws, rolling windows, and the external dataset profile are supplied in the supplementary package.</w:t>
       </w:r>
     </w:p>
     <w:p>
@@ -1626,7 +1626,7 @@
     </w:p>
     <w:p>
       <w:r>
-        <w:t>The results are comparative simulations based on cleaned UCI demand, observed test-week baskets, and the frozen assumptions in results/experiment_config.json; they are not historical inventory observations or retailer savings. M5 remains a separate appendix benchmark.</w:t>
+        <w:t>The results are comparative simulations based on cleaned UCI demand, observed test-week baskets, and the frozen assumptions in the supplementary package; they are not historical inventory observations or retailer savings. M5 remains a separate appendix benchmark.</w:t>
       </w:r>
     </w:p>
     <w:p>
@@ -2533,55 +2533,8 @@
       </w:r>
     </w:p>
     <w:p>
-      <w:pPr>
-        <w:jc w:val="center"/>
-      </w:pPr>
       <w:r>
-        <w:drawing>
-          <wp:inline xmlns:a="http://schemas.openxmlformats.org/drawingml/2006/main" xmlns:pic="http://schemas.openxmlformats.org/drawingml/2006/picture">
-            <wp:extent cx="6126480" cy="3675888"/>
-            <wp:docPr id="1" name="Picture 1" descr="Distribution of retained basket sizes measured in transaction lines" title="Basket-size distribution"/>
-            <wp:cNvGraphicFramePr>
-              <a:graphicFrameLocks noChangeAspect="1"/>
-            </wp:cNvGraphicFramePr>
-            <a:graphic>
-              <a:graphicData uri="http://schemas.openxmlformats.org/drawingml/2006/picture">
-                <pic:pic>
-                  <pic:nvPicPr>
-                    <pic:cNvPr id="0" name="basket_size_distribution.png"/>
-                    <pic:cNvPicPr/>
-                  </pic:nvPicPr>
-                  <pic:blipFill>
-                    <a:blip r:embed="rId10"/>
-                    <a:stretch>
-                      <a:fillRect/>
-                    </a:stretch>
-                  </pic:blipFill>
-                  <pic:spPr>
-                    <a:xfrm>
-                      <a:off x="0" y="0"/>
-                      <a:ext cx="6126480" cy="3675888"/>
-                    </a:xfrm>
-                    <a:prstGeom prst="rect"/>
-                  </pic:spPr>
-                </pic:pic>
-              </a:graphicData>
-            </a:graphic>
-          </wp:inline>
-        </w:drawing>
-      </w:r>
-    </w:p>
-    <w:p>
-      <w:pPr>
-        <w:jc w:val="center"/>
-      </w:pPr>
-      <w:r>
-        <w:rPr>
-          <w:rFonts w:ascii="Arial" w:hAnsi="Arial"/>
-          <w:i/>
-          <w:sz w:val="16"/>
-        </w:rPr>
-        <w:t>Figure 1. Distribution of retained transaction-line basket sizes in the cleaned UCI data.</w:t>
+        <w:t>Figure 1. Distribution of retained transaction-line basket sizes in the cleaned UCI data. Plot unavailable; see `results/basket_size_distribution.png` in the research package.</w:t>
       </w:r>
     </w:p>
     <w:p>
@@ -2590,55 +2543,8 @@
       </w:r>
     </w:p>
     <w:p>
-      <w:pPr>
-        <w:jc w:val="center"/>
-      </w:pPr>
       <w:r>
-        <w:drawing>
-          <wp:inline xmlns:a="http://schemas.openxmlformats.org/drawingml/2006/main" xmlns:pic="http://schemas.openxmlformats.org/drawingml/2006/picture">
-            <wp:extent cx="6126480" cy="3318510"/>
-            <wp:docPr id="2" name="Picture 2" descr="Training-only co-purchase graph degree and edge-weight summary" title="Co-purchase graph summary"/>
-            <wp:cNvGraphicFramePr>
-              <a:graphicFrameLocks noChangeAspect="1"/>
-            </wp:cNvGraphicFramePr>
-            <a:graphic>
-              <a:graphicData uri="http://schemas.openxmlformats.org/drawingml/2006/picture">
-                <pic:pic>
-                  <pic:nvPicPr>
-                    <pic:cNvPr id="0" name="graph_summary.png"/>
-                    <pic:cNvPicPr/>
-                  </pic:nvPicPr>
-                  <pic:blipFill>
-                    <a:blip r:embed="rId11"/>
-                    <a:stretch>
-                      <a:fillRect/>
-                    </a:stretch>
-                  </pic:blipFill>
-                  <pic:spPr>
-                    <a:xfrm>
-                      <a:off x="0" y="0"/>
-                      <a:ext cx="6126480" cy="3318510"/>
-                    </a:xfrm>
-                    <a:prstGeom prst="rect"/>
-                  </pic:spPr>
-                </pic:pic>
-              </a:graphicData>
-            </a:graphic>
-          </wp:inline>
-        </w:drawing>
-      </w:r>
-    </w:p>
-    <w:p>
-      <w:pPr>
-        <w:jc w:val="center"/>
-      </w:pPr>
-      <w:r>
-        <w:rPr>
-          <w:rFonts w:ascii="Arial" w:hAnsi="Arial"/>
-          <w:i/>
-          <w:sz w:val="16"/>
-        </w:rPr>
-        <w:t>Figure 2. Training-only co-purchase graph summary for the executed product universe.</w:t>
+        <w:t>Figure 2. Training-only co-purchase graph summary for the executed product universe. Plot unavailable; see `results/graph_summary.png` in the research package.</w:t>
       </w:r>
     </w:p>
     <w:p>
@@ -7281,7 +7187,7 @@
     </w:p>
     <w:p>
       <w:r>
-        <w:t>The direction is unchanged in every scenario: PA1−C1 is positive for item and basket fill in S01–S12, whereas PA1−C4 is negative for both. Cost differences are positive in every scenario for both contrasts. The per-scenario table, matching-quality table, and forest-plot-ready values are results/phase3_scenario_contrast_summary.csv and results/phase3_matching_quality.csv. Maximum accepted inventory gaps were 0.80% for PA1−C1 and 0.99% for C4−C1; no comparison violated the 1% band.</w:t>
+        <w:t>The direction is unchanged across the effectively 4 × 3 factorial settings: PA1−C1 is positive for item and basket fill, whereas PA1−C4 is negative for both. Cost differences are positive for both contrasts across the factorial cells. The per-setting estimates and matching-quality checks are supplied as Supplementary Tables S1 and S3. Maximum accepted inventory gaps were 0.80% for PA1−C1 and 0.99% for C4−C1; no comparison violated the 1% band.</w:t>
       </w:r>
     </w:p>
     <w:p>
@@ -7291,163 +7197,22 @@
     </w:p>
     <w:p>
       <w:r>
-        <w:t>Six-fold calibration was chosen on the validation window, before test evaluation, by selecting the candidate multiplier closest to the critical-fractile item-fill target. Across the 24 scenario-policy validation rows, six-fold had mean item fill 0.9487 against mean target 0.9725, versus 0.9152 at three-fold and 0.9625 at nine-fold; the six-fold candidate was the lowest-cost eligible interior calibration satisfying the pre-registered three-percentage-point acceptance rule. In the held-out test, however, the matched C1 target was approximately 0.993 on average while realised C1 item fill was approximately 0.83–0.84, reflecting peak-period under-forecasting and showing that validation calibration is optimistic for the test window. The three-/six-/nine-fold table is results/phase3_calibration_robustness.csv.</w:t>
+        <w:t>Six-fold calibration was chosen on the validation window, before test evaluation, by selecting the candidate multiplier closest to the critical-fractile item-fill target. Across the validation cells, six-fold had mean item fill 0.9487 against mean target 0.9725, versus 0.9152 at three-fold and 0.9625 at nine-fold; the six-fold candidate was the lowest-cost eligible interior calibration satisfying the pre-registered three-percentage-point acceptance rule. In the held-out test, however, the matched C1 target was approximately 0.993 on average while realised C1 item fill was approximately 0.83–0.84, reflecting peak-period under-forecasting and showing that validation calibration is optimistic for the test window. The three-, six-, and nine-fold comparison is Supplementary Table S6.</w:t>
       </w:r>
     </w:p>
     <w:p>
-      <w:pPr>
-        <w:jc w:val="center"/>
-      </w:pPr>
       <w:r>
-        <w:drawing>
-          <wp:inline xmlns:a="http://schemas.openxmlformats.org/drawingml/2006/main" xmlns:pic="http://schemas.openxmlformats.org/drawingml/2006/picture">
-            <wp:extent cx="6126480" cy="4594860"/>
-            <wp:docPr id="3" name="Picture 3" descr="Service versus average inventory frontier for independent and basket-aware policies across representative scenarios" title="Service versus average inventory frontier"/>
-            <wp:cNvGraphicFramePr>
-              <a:graphicFrameLocks noChangeAspect="1"/>
-            </wp:cNvGraphicFramePr>
-            <a:graphic>
-              <a:graphicData uri="http://schemas.openxmlformats.org/drawingml/2006/picture">
-                <pic:pic>
-                  <pic:nvPicPr>
-                    <pic:cNvPr id="0" name="frontier_plot.png"/>
-                    <pic:cNvPicPr/>
-                  </pic:nvPicPr>
-                  <pic:blipFill>
-                    <a:blip r:embed="rId12"/>
-                    <a:stretch>
-                      <a:fillRect/>
-                    </a:stretch>
-                  </pic:blipFill>
-                  <pic:spPr>
-                    <a:xfrm>
-                      <a:off x="0" y="0"/>
-                      <a:ext cx="6126480" cy="4594860"/>
-                    </a:xfrm>
-                    <a:prstGeom prst="rect"/>
-                  </pic:spPr>
-                </pic:pic>
-              </a:graphicData>
-            </a:graphic>
-          </wp:inline>
-        </w:drawing>
+        <w:t>Figure 3. Service versus average inventory frontier across representative scenarios; the primary alpha is selected by matched-inventory validation. Plot unavailable; see `results/frontier_plot.png` in the research package.</w:t>
       </w:r>
     </w:p>
     <w:p>
-      <w:pPr>
-        <w:jc w:val="center"/>
-      </w:pPr>
       <w:r>
-        <w:rPr>
-          <w:rFonts w:ascii="Arial" w:hAnsi="Arial"/>
-          <w:i/>
-          <w:sz w:val="16"/>
-        </w:rPr>
-        <w:t>Figure 3. Service versus average inventory frontier across representative scenarios; the primary alpha is selected by matched-inventory validation.</w:t>
+        <w:t>Figure 4. Cost differences as the shortage penalty changes; crossings follow arithmetically from the frozen cost formula and break-even p/h ratios. Plot unavailable; see `results/cost_vs_penalty.png` in the research package.</w:t>
       </w:r>
     </w:p>
     <w:p>
-      <w:pPr>
-        <w:jc w:val="center"/>
-      </w:pPr>
       <w:r>
-        <w:drawing>
-          <wp:inline xmlns:a="http://schemas.openxmlformats.org/drawingml/2006/main" xmlns:pic="http://schemas.openxmlformats.org/drawingml/2006/picture">
-            <wp:extent cx="6126480" cy="3675888"/>
-            <wp:docPr id="4" name="Picture 4" descr="Simulated policy cost differences as the shortage penalty varies" title="Cost versus shortage penalty"/>
-            <wp:cNvGraphicFramePr>
-              <a:graphicFrameLocks noChangeAspect="1"/>
-            </wp:cNvGraphicFramePr>
-            <a:graphic>
-              <a:graphicData uri="http://schemas.openxmlformats.org/drawingml/2006/picture">
-                <pic:pic>
-                  <pic:nvPicPr>
-                    <pic:cNvPr id="0" name="cost_vs_penalty.png"/>
-                    <pic:cNvPicPr/>
-                  </pic:nvPicPr>
-                  <pic:blipFill>
-                    <a:blip r:embed="rId13"/>
-                    <a:stretch>
-                      <a:fillRect/>
-                    </a:stretch>
-                  </pic:blipFill>
-                  <pic:spPr>
-                    <a:xfrm>
-                      <a:off x="0" y="0"/>
-                      <a:ext cx="6126480" cy="3675888"/>
-                    </a:xfrm>
-                    <a:prstGeom prst="rect"/>
-                  </pic:spPr>
-                </pic:pic>
-              </a:graphicData>
-            </a:graphic>
-          </wp:inline>
-        </w:drawing>
-      </w:r>
-    </w:p>
-    <w:p>
-      <w:pPr>
-        <w:jc w:val="center"/>
-      </w:pPr>
-      <w:r>
-        <w:rPr>
-          <w:rFonts w:ascii="Arial" w:hAnsi="Arial"/>
-          <w:i/>
-          <w:sz w:val="16"/>
-        </w:rPr>
-        <w:t>Figure 4. Cost differences as the shortage penalty changes; crossings follow arithmetically from the frozen cost formula and break-even p/h ratios.</w:t>
-      </w:r>
-    </w:p>
-    <w:p>
-      <w:pPr>
-        <w:jc w:val="center"/>
-      </w:pPr>
-      <w:r>
-        <w:drawing>
-          <wp:inline xmlns:a="http://schemas.openxmlformats.org/drawingml/2006/main" xmlns:pic="http://schemas.openxmlformats.org/drawingml/2006/picture">
-            <wp:extent cx="6126480" cy="3880104"/>
-            <wp:docPr id="5" name="Picture 5" descr="Scenario forest plot for matched item-fill differences" title="Scenario-level matched contrasts"/>
-            <wp:cNvGraphicFramePr>
-              <a:graphicFrameLocks noChangeAspect="1"/>
-            </wp:cNvGraphicFramePr>
-            <a:graphic>
-              <a:graphicData uri="http://schemas.openxmlformats.org/drawingml/2006/picture">
-                <pic:pic>
-                  <pic:nvPicPr>
-                    <pic:cNvPr id="0" name="forest_plot.png"/>
-                    <pic:cNvPicPr/>
-                  </pic:nvPicPr>
-                  <pic:blipFill>
-                    <a:blip r:embed="rId14"/>
-                    <a:stretch>
-                      <a:fillRect/>
-                    </a:stretch>
-                  </pic:blipFill>
-                  <pic:spPr>
-                    <a:xfrm>
-                      <a:off x="0" y="0"/>
-                      <a:ext cx="6126480" cy="3880104"/>
-                    </a:xfrm>
-                    <a:prstGeom prst="rect"/>
-                  </pic:spPr>
-                </pic:pic>
-              </a:graphicData>
-            </a:graphic>
-          </wp:inline>
-        </w:drawing>
-      </w:r>
-    </w:p>
-    <w:p>
-      <w:pPr>
-        <w:jc w:val="center"/>
-      </w:pPr>
-      <w:r>
-        <w:rPr>
-          <w:rFonts w:ascii="Arial" w:hAnsi="Arial"/>
-          <w:i/>
-          <w:sz w:val="16"/>
-        </w:rPr>
-        <w:t>Figure 5. Forest plot of PA1 minus C4 and PA1 minus C1 item-fill differences across all twelve synthetic scenarios; whiskers are 95% replication intervals.</w:t>
+        <w:t>Figure 5. Forest plot of PA1 minus C4 and PA1 minus C1 item-fill differences across all twelve synthetic scenarios; whiskers are 95% replication intervals. Plot unavailable; see `results/forest_plot.png` in the research package.</w:t>
       </w:r>
     </w:p>
     <w:p>
@@ -9424,7 +9189,7 @@
     </w:p>
     <w:p>
       <w:r>
-        <w:t>PA1 item fill was below C4 in all three windows, while basket fill was higher in W1, lower in W2, and nearly equal in W3. These rolling outputs are level checks; the corresponding paired contrast file reports PA1−C4 and PA1−C1 with window-specific intervals. The direction is therefore not a universal graph benefit. Sensitivity settings were not merely listed: top-k, minimum pair count, service target, h/p ratio, fixed order cost K, lost-sales versus backorder, and all-units versus distinct-item basket definitions each changed at least one output in the released sensitivity audit. The audit is in results/gate_sensitivity_summary.csv; threshold and top-k checks remain one-scenario diagnostics.</w:t>
+        <w:t>PA1 item fill was below C4 in all three windows, while basket fill was higher in W1, lower in W2, and nearly equal in W3. These rolling outputs are level checks; the corresponding paired contrasts are reported in Supplementary Table S4. The direction is therefore not a universal graph benefit. Sensitivity settings were not merely listed: top-k, minimum pair count, service target, h/p ratio, fixed order cost K, lost-sales versus backorder, and all-units versus distinct-item basket definitions each changed at least one output in the released sensitivity audit. Threshold and top-k checks remain one-scenario diagnostics and are reported in Supplementary Table S5.</w:t>
       </w:r>
     </w:p>
     <w:p>
@@ -10159,12 +9924,684 @@
     </w:p>
     <w:p>
       <w:r>
-        <w:t>The corrected dunnhumby replay expands the training-only universe from 300 to 1,000 products and applies a declared stock-tightening factor of 0.01 to both policy targets. Under the same chronological split, alpha, graph logic, one-week lead-time assumption, and normalized costs, C4 item fill is 0.9482 and PA1 item fill is 0.0325, giving PA1−C4 = −0.9157; the cost difference is positive. The complete-basket proxy remains tied at 1.0, so only item fill discriminates. The direction of PA1−C4 therefore replicates the UCI item-fill result, although the magnitude is not comparable because the external universe and stress calibration differ. The original top-300/full-stock run remains as an audit file and was correctly classified as non-discriminating. No third dataset was added because a clean, license-compatible, reproducible source was not available in this release.</w:t>
+        <w:t>The corrected dunnhumby run expands the training-only universe from 300 to 1,000 products and applies a declared stock-tightening factor of 0.01 to both policy targets. Under the same chronological split, alpha, graph logic, one-week lead-time assumption, and normalized costs, C4 item fill is 0.9482 and PA1 item fill is 0.0325, giving PA1−C4 = −0.9157; the cost difference is positive. The complete-basket proxy remains tied at 1.0, so only item fill discriminates. Because the stock factor, inventory model, and graph allocation behave differently in this dataset, the run is retained as a pipeline stress check rather than an external replication. The original top-300/full-stock run remains a non-discriminating audit condition. No third dataset was added because a clean, license-compatible, reproducible source was not available in this release.</w:t>
       </w:r>
     </w:p>
     <w:p>
       <w:r>
-        <w:t>The external contrast was recorded with 120 paired deterministic paths and 1,000 bootstrap resamples to match the primary count; because the path is deterministic, those intervals are degenerate and are not treated as independent sampling evidence.</w:t>
+        <w:t>The external contrast was recorded with 120 repeated deterministic paths and 1,000 resamples to match the primary count; because the path is deterministic, those intervals are degenerate and are not treated as independent sampling evidence.</w:t>
+      </w:r>
+    </w:p>
+    <w:p>
+      <w:pPr>
+        <w:pStyle w:val="Heading3"/>
+      </w:pPr>
+      <w:r>
+        <w:t>Exploratory stratum analysis</w:t>
+      </w:r>
+    </w:p>
+    <w:p>
+      <w:r>
+        <w:t>The exploratory strata were defined from training data only. Product popularity was total training units; low and high popularity were the bottom and top quartiles, with cut points 434.5 and 2,814.5 units. An edge was high-lift and sufficiently supported when its training lift exceeded the 90th percentile, 17.958, and its co-purchase count was at least the 75th percentile, 18 baskets. A product entered the low-popularity/high-lift stratum when both endpoints were below the popularity lower quartile and connected by at least one qualifying edge; the corresponding high-popularity stratum required both endpoints above the upper quartile. The resulting masks contained 235 and 343 products. These thresholds were frozen from training data and the analysis was exploratory rather than pre-registered; the table reports service differences, not a separate cost experiment, because masking the outcome does not change the full-system replay.</w:t>
+      </w:r>
+    </w:p>
+    <w:tbl>
+      <w:tblPr>
+        <w:tblStyle w:val="TableGrid"/>
+        <w:tblW w:type="auto" w:w="0"/>
+        <w:jc w:val="center"/>
+        <w:tblLook w:firstColumn="1" w:firstRow="1" w:lastColumn="0" w:lastRow="0" w:noHBand="0" w:noVBand="1" w:val="04A0"/>
+      </w:tblPr>
+      <w:tblGrid>
+        <w:gridCol w:w="1666"/>
+        <w:gridCol w:w="1666"/>
+        <w:gridCol w:w="1666"/>
+        <w:gridCol w:w="1666"/>
+        <w:gridCol w:w="1666"/>
+        <w:gridCol w:w="1666"/>
+      </w:tblGrid>
+      <w:tr>
+        <w:trPr>
+          <w:tblHeader w:val="true"/>
+        </w:trPr>
+        <w:tc>
+          <w:tcPr>
+            <w:tcW w:type="dxa" w:w="1666"/>
+            <w:vAlign w:val="center"/>
+            <w:shd w:fill="1F4E79"/>
+            <w:tcBorders>
+              <w:top w:val="single" w:sz="6" w:space="0" w:color="D9D9D9"/>
+              <w:left w:val="single" w:sz="6" w:space="0" w:color="D9D9D9"/>
+              <w:bottom w:val="single" w:sz="6" w:space="0" w:color="D9D9D9"/>
+              <w:right w:val="single" w:sz="6" w:space="0" w:color="D9D9D9"/>
+              <w:insideH w:val="single" w:sz="6" w:space="0" w:color="D9D9D9"/>
+              <w:insideV w:val="single" w:sz="6" w:space="0" w:color="D9D9D9"/>
+            </w:tcBorders>
+            <w:tcMar>
+              <w:top w:w="90" w:type="dxa"/>
+              <w:start w:w="100" w:type="dxa"/>
+              <w:bottom w:w="90" w:type="dxa"/>
+              <w:end w:w="100" w:type="dxa"/>
+            </w:tcMar>
+          </w:tcPr>
+          <w:p>
+            <w:pPr>
+              <w:spacing w:after="0"/>
+              <w:jc w:val="center"/>
+            </w:pPr>
+            <w:r>
+              <w:rPr>
+                <w:rFonts w:ascii="Arial" w:hAnsi="Arial"/>
+                <w:b/>
+                <w:color w:val="FFFFFF"/>
+                <w:sz w:val="17"/>
+              </w:rPr>
+              <w:t>Exploratory regime</w:t>
+            </w:r>
+          </w:p>
+        </w:tc>
+        <w:tc>
+          <w:tcPr>
+            <w:tcW w:type="dxa" w:w="1666"/>
+            <w:vAlign w:val="center"/>
+            <w:shd w:fill="1F4E79"/>
+            <w:tcBorders>
+              <w:top w:val="single" w:sz="6" w:space="0" w:color="D9D9D9"/>
+              <w:left w:val="single" w:sz="6" w:space="0" w:color="D9D9D9"/>
+              <w:bottom w:val="single" w:sz="6" w:space="0" w:color="D9D9D9"/>
+              <w:right w:val="single" w:sz="6" w:space="0" w:color="D9D9D9"/>
+              <w:insideH w:val="single" w:sz="6" w:space="0" w:color="D9D9D9"/>
+              <w:insideV w:val="single" w:sz="6" w:space="0" w:color="D9D9D9"/>
+            </w:tcBorders>
+            <w:tcMar>
+              <w:top w:w="90" w:type="dxa"/>
+              <w:start w:w="100" w:type="dxa"/>
+              <w:bottom w:w="90" w:type="dxa"/>
+              <w:end w:w="100" w:type="dxa"/>
+            </w:tcMar>
+          </w:tcPr>
+          <w:p>
+            <w:pPr>
+              <w:spacing w:after="0"/>
+              <w:jc w:val="center"/>
+            </w:pPr>
+            <w:r>
+              <w:rPr>
+                <w:rFonts w:ascii="Arial" w:hAnsi="Arial"/>
+                <w:b/>
+                <w:color w:val="FFFFFF"/>
+                <w:sz w:val="17"/>
+              </w:rPr>
+              <w:t>Products</w:t>
+            </w:r>
+          </w:p>
+        </w:tc>
+        <w:tc>
+          <w:tcPr>
+            <w:tcW w:type="dxa" w:w="1666"/>
+            <w:vAlign w:val="center"/>
+            <w:shd w:fill="1F4E79"/>
+            <w:tcBorders>
+              <w:top w:val="single" w:sz="6" w:space="0" w:color="D9D9D9"/>
+              <w:left w:val="single" w:sz="6" w:space="0" w:color="D9D9D9"/>
+              <w:bottom w:val="single" w:sz="6" w:space="0" w:color="D9D9D9"/>
+              <w:right w:val="single" w:sz="6" w:space="0" w:color="D9D9D9"/>
+              <w:insideH w:val="single" w:sz="6" w:space="0" w:color="D9D9D9"/>
+              <w:insideV w:val="single" w:sz="6" w:space="0" w:color="D9D9D9"/>
+            </w:tcBorders>
+            <w:tcMar>
+              <w:top w:w="90" w:type="dxa"/>
+              <w:start w:w="100" w:type="dxa"/>
+              <w:bottom w:w="90" w:type="dxa"/>
+              <w:end w:w="100" w:type="dxa"/>
+            </w:tcMar>
+          </w:tcPr>
+          <w:p>
+            <w:pPr>
+              <w:spacing w:after="0"/>
+              <w:jc w:val="center"/>
+            </w:pPr>
+            <w:r>
+              <w:rPr>
+                <w:rFonts w:ascii="Arial" w:hAnsi="Arial"/>
+                <w:b/>
+                <w:color w:val="FFFFFF"/>
+                <w:sz w:val="17"/>
+              </w:rPr>
+              <w:t>PA1 minus C4 item fill</w:t>
+            </w:r>
+          </w:p>
+        </w:tc>
+        <w:tc>
+          <w:tcPr>
+            <w:tcW w:type="dxa" w:w="1666"/>
+            <w:vAlign w:val="center"/>
+            <w:shd w:fill="1F4E79"/>
+            <w:tcBorders>
+              <w:top w:val="single" w:sz="6" w:space="0" w:color="D9D9D9"/>
+              <w:left w:val="single" w:sz="6" w:space="0" w:color="D9D9D9"/>
+              <w:bottom w:val="single" w:sz="6" w:space="0" w:color="D9D9D9"/>
+              <w:right w:val="single" w:sz="6" w:space="0" w:color="D9D9D9"/>
+              <w:insideH w:val="single" w:sz="6" w:space="0" w:color="D9D9D9"/>
+              <w:insideV w:val="single" w:sz="6" w:space="0" w:color="D9D9D9"/>
+            </w:tcBorders>
+            <w:tcMar>
+              <w:top w:w="90" w:type="dxa"/>
+              <w:start w:w="100" w:type="dxa"/>
+              <w:bottom w:w="90" w:type="dxa"/>
+              <w:end w:w="100" w:type="dxa"/>
+            </w:tcMar>
+          </w:tcPr>
+          <w:p>
+            <w:pPr>
+              <w:spacing w:after="0"/>
+              <w:jc w:val="center"/>
+            </w:pPr>
+            <w:r>
+              <w:rPr>
+                <w:rFonts w:ascii="Arial" w:hAnsi="Arial"/>
+                <w:b/>
+                <w:color w:val="FFFFFF"/>
+                <w:sz w:val="17"/>
+              </w:rPr>
+              <w:t>95% replication CI</w:t>
+            </w:r>
+          </w:p>
+        </w:tc>
+        <w:tc>
+          <w:tcPr>
+            <w:tcW w:type="dxa" w:w="1666"/>
+            <w:vAlign w:val="center"/>
+            <w:shd w:fill="1F4E79"/>
+            <w:tcBorders>
+              <w:top w:val="single" w:sz="6" w:space="0" w:color="D9D9D9"/>
+              <w:left w:val="single" w:sz="6" w:space="0" w:color="D9D9D9"/>
+              <w:bottom w:val="single" w:sz="6" w:space="0" w:color="D9D9D9"/>
+              <w:right w:val="single" w:sz="6" w:space="0" w:color="D9D9D9"/>
+              <w:insideH w:val="single" w:sz="6" w:space="0" w:color="D9D9D9"/>
+              <w:insideV w:val="single" w:sz="6" w:space="0" w:color="D9D9D9"/>
+            </w:tcBorders>
+            <w:tcMar>
+              <w:top w:w="90" w:type="dxa"/>
+              <w:start w:w="100" w:type="dxa"/>
+              <w:bottom w:w="90" w:type="dxa"/>
+              <w:end w:w="100" w:type="dxa"/>
+            </w:tcMar>
+          </w:tcPr>
+          <w:p>
+            <w:pPr>
+              <w:spacing w:after="0"/>
+              <w:jc w:val="center"/>
+            </w:pPr>
+            <w:r>
+              <w:rPr>
+                <w:rFonts w:ascii="Arial" w:hAnsi="Arial"/>
+                <w:b/>
+                <w:color w:val="FFFFFF"/>
+                <w:sz w:val="17"/>
+              </w:rPr>
+              <w:t>PA1 minus C4 unmet units</w:t>
+            </w:r>
+          </w:p>
+        </w:tc>
+        <w:tc>
+          <w:tcPr>
+            <w:tcW w:type="dxa" w:w="1666"/>
+            <w:vAlign w:val="center"/>
+            <w:shd w:fill="1F4E79"/>
+            <w:tcBorders>
+              <w:top w:val="single" w:sz="6" w:space="0" w:color="D9D9D9"/>
+              <w:left w:val="single" w:sz="6" w:space="0" w:color="D9D9D9"/>
+              <w:bottom w:val="single" w:sz="6" w:space="0" w:color="D9D9D9"/>
+              <w:right w:val="single" w:sz="6" w:space="0" w:color="D9D9D9"/>
+              <w:insideH w:val="single" w:sz="6" w:space="0" w:color="D9D9D9"/>
+              <w:insideV w:val="single" w:sz="6" w:space="0" w:color="D9D9D9"/>
+            </w:tcBorders>
+            <w:tcMar>
+              <w:top w:w="90" w:type="dxa"/>
+              <w:start w:w="100" w:type="dxa"/>
+              <w:bottom w:w="90" w:type="dxa"/>
+              <w:end w:w="100" w:type="dxa"/>
+            </w:tcMar>
+          </w:tcPr>
+          <w:p>
+            <w:pPr>
+              <w:spacing w:after="0"/>
+              <w:jc w:val="center"/>
+            </w:pPr>
+            <w:r>
+              <w:rPr>
+                <w:rFonts w:ascii="Arial" w:hAnsi="Arial"/>
+                <w:b/>
+                <w:color w:val="FFFFFF"/>
+                <w:sz w:val="17"/>
+              </w:rPr>
+              <w:t>95% replication CI</w:t>
+            </w:r>
+          </w:p>
+        </w:tc>
+      </w:tr>
+      <w:tr>
+        <w:trPr>
+          <w:cantSplit/>
+        </w:trPr>
+        <w:tc>
+          <w:tcPr>
+            <w:tcW w:type="dxa" w:w="1666"/>
+            <w:vAlign w:val="center"/>
+            <w:tcBorders>
+              <w:top w:val="single" w:sz="6" w:space="0" w:color="D9D9D9"/>
+              <w:left w:val="single" w:sz="6" w:space="0" w:color="D9D9D9"/>
+              <w:bottom w:val="single" w:sz="6" w:space="0" w:color="D9D9D9"/>
+              <w:right w:val="single" w:sz="6" w:space="0" w:color="D9D9D9"/>
+              <w:insideH w:val="single" w:sz="6" w:space="0" w:color="D9D9D9"/>
+              <w:insideV w:val="single" w:sz="6" w:space="0" w:color="D9D9D9"/>
+            </w:tcBorders>
+            <w:tcMar>
+              <w:top w:w="90" w:type="dxa"/>
+              <w:start w:w="100" w:type="dxa"/>
+              <w:bottom w:w="90" w:type="dxa"/>
+              <w:end w:w="100" w:type="dxa"/>
+            </w:tcMar>
+          </w:tcPr>
+          <w:p>
+            <w:pPr>
+              <w:spacing w:after="0" w:line="240" w:lineRule="auto"/>
+              <w:jc w:val="left"/>
+            </w:pPr>
+            <w:r>
+              <w:rPr>
+                <w:rFonts w:ascii="Arial" w:hAnsi="Arial"/>
+                <w:sz w:val="16"/>
+              </w:rPr>
+              <w:t>Low popularity and high lift</w:t>
+            </w:r>
+          </w:p>
+        </w:tc>
+        <w:tc>
+          <w:tcPr>
+            <w:tcW w:type="dxa" w:w="1666"/>
+            <w:vAlign w:val="center"/>
+            <w:tcBorders>
+              <w:top w:val="single" w:sz="6" w:space="0" w:color="D9D9D9"/>
+              <w:left w:val="single" w:sz="6" w:space="0" w:color="D9D9D9"/>
+              <w:bottom w:val="single" w:sz="6" w:space="0" w:color="D9D9D9"/>
+              <w:right w:val="single" w:sz="6" w:space="0" w:color="D9D9D9"/>
+              <w:insideH w:val="single" w:sz="6" w:space="0" w:color="D9D9D9"/>
+              <w:insideV w:val="single" w:sz="6" w:space="0" w:color="D9D9D9"/>
+            </w:tcBorders>
+            <w:tcMar>
+              <w:top w:w="90" w:type="dxa"/>
+              <w:start w:w="100" w:type="dxa"/>
+              <w:bottom w:w="90" w:type="dxa"/>
+              <w:end w:w="100" w:type="dxa"/>
+            </w:tcMar>
+          </w:tcPr>
+          <w:p>
+            <w:pPr>
+              <w:spacing w:after="0" w:line="240" w:lineRule="auto"/>
+              <w:jc w:val="center"/>
+            </w:pPr>
+            <w:r>
+              <w:rPr>
+                <w:rFonts w:ascii="Arial" w:hAnsi="Arial"/>
+                <w:sz w:val="16"/>
+              </w:rPr>
+              <w:t>235</w:t>
+            </w:r>
+          </w:p>
+        </w:tc>
+        <w:tc>
+          <w:tcPr>
+            <w:tcW w:type="dxa" w:w="1666"/>
+            <w:vAlign w:val="center"/>
+            <w:tcBorders>
+              <w:top w:val="single" w:sz="6" w:space="0" w:color="D9D9D9"/>
+              <w:left w:val="single" w:sz="6" w:space="0" w:color="D9D9D9"/>
+              <w:bottom w:val="single" w:sz="6" w:space="0" w:color="D9D9D9"/>
+              <w:right w:val="single" w:sz="6" w:space="0" w:color="D9D9D9"/>
+              <w:insideH w:val="single" w:sz="6" w:space="0" w:color="D9D9D9"/>
+              <w:insideV w:val="single" w:sz="6" w:space="0" w:color="D9D9D9"/>
+            </w:tcBorders>
+            <w:tcMar>
+              <w:top w:w="90" w:type="dxa"/>
+              <w:start w:w="100" w:type="dxa"/>
+              <w:bottom w:w="90" w:type="dxa"/>
+              <w:end w:w="100" w:type="dxa"/>
+            </w:tcMar>
+          </w:tcPr>
+          <w:p>
+            <w:pPr>
+              <w:spacing w:after="0" w:line="240" w:lineRule="auto"/>
+              <w:jc w:val="center"/>
+            </w:pPr>
+            <w:r>
+              <w:rPr>
+                <w:rFonts w:ascii="Arial" w:hAnsi="Arial"/>
+                <w:sz w:val="16"/>
+              </w:rPr>
+              <w:t>+0.1014</w:t>
+            </w:r>
+          </w:p>
+        </w:tc>
+        <w:tc>
+          <w:tcPr>
+            <w:tcW w:type="dxa" w:w="1666"/>
+            <w:vAlign w:val="center"/>
+            <w:tcBorders>
+              <w:top w:val="single" w:sz="6" w:space="0" w:color="D9D9D9"/>
+              <w:left w:val="single" w:sz="6" w:space="0" w:color="D9D9D9"/>
+              <w:bottom w:val="single" w:sz="6" w:space="0" w:color="D9D9D9"/>
+              <w:right w:val="single" w:sz="6" w:space="0" w:color="D9D9D9"/>
+              <w:insideH w:val="single" w:sz="6" w:space="0" w:color="D9D9D9"/>
+              <w:insideV w:val="single" w:sz="6" w:space="0" w:color="D9D9D9"/>
+            </w:tcBorders>
+            <w:tcMar>
+              <w:top w:w="90" w:type="dxa"/>
+              <w:start w:w="100" w:type="dxa"/>
+              <w:bottom w:w="90" w:type="dxa"/>
+              <w:end w:w="100" w:type="dxa"/>
+            </w:tcMar>
+          </w:tcPr>
+          <w:p>
+            <w:pPr>
+              <w:spacing w:after="0" w:line="240" w:lineRule="auto"/>
+              <w:jc w:val="center"/>
+            </w:pPr>
+            <w:r>
+              <w:rPr>
+                <w:rFonts w:ascii="Arial" w:hAnsi="Arial"/>
+                <w:sz w:val="16"/>
+              </w:rPr>
+              <w:t>[+0.1008, +0.1021]</w:t>
+            </w:r>
+          </w:p>
+        </w:tc>
+        <w:tc>
+          <w:tcPr>
+            <w:tcW w:type="dxa" w:w="1666"/>
+            <w:vAlign w:val="center"/>
+            <w:tcBorders>
+              <w:top w:val="single" w:sz="6" w:space="0" w:color="D9D9D9"/>
+              <w:left w:val="single" w:sz="6" w:space="0" w:color="D9D9D9"/>
+              <w:bottom w:val="single" w:sz="6" w:space="0" w:color="D9D9D9"/>
+              <w:right w:val="single" w:sz="6" w:space="0" w:color="D9D9D9"/>
+              <w:insideH w:val="single" w:sz="6" w:space="0" w:color="D9D9D9"/>
+              <w:insideV w:val="single" w:sz="6" w:space="0" w:color="D9D9D9"/>
+            </w:tcBorders>
+            <w:tcMar>
+              <w:top w:w="90" w:type="dxa"/>
+              <w:start w:w="100" w:type="dxa"/>
+              <w:bottom w:w="90" w:type="dxa"/>
+              <w:end w:w="100" w:type="dxa"/>
+            </w:tcMar>
+          </w:tcPr>
+          <w:p>
+            <w:pPr>
+              <w:spacing w:after="0" w:line="240" w:lineRule="auto"/>
+              <w:jc w:val="center"/>
+            </w:pPr>
+            <w:r>
+              <w:rPr>
+                <w:rFonts w:ascii="Arial" w:hAnsi="Arial"/>
+                <w:sz w:val="16"/>
+              </w:rPr>
+              <w:t>−1,315</w:t>
+            </w:r>
+          </w:p>
+        </w:tc>
+        <w:tc>
+          <w:tcPr>
+            <w:tcW w:type="dxa" w:w="1666"/>
+            <w:vAlign w:val="center"/>
+            <w:tcBorders>
+              <w:top w:val="single" w:sz="6" w:space="0" w:color="D9D9D9"/>
+              <w:left w:val="single" w:sz="6" w:space="0" w:color="D9D9D9"/>
+              <w:bottom w:val="single" w:sz="6" w:space="0" w:color="D9D9D9"/>
+              <w:right w:val="single" w:sz="6" w:space="0" w:color="D9D9D9"/>
+              <w:insideH w:val="single" w:sz="6" w:space="0" w:color="D9D9D9"/>
+              <w:insideV w:val="single" w:sz="6" w:space="0" w:color="D9D9D9"/>
+            </w:tcBorders>
+            <w:tcMar>
+              <w:top w:w="90" w:type="dxa"/>
+              <w:start w:w="100" w:type="dxa"/>
+              <w:bottom w:w="90" w:type="dxa"/>
+              <w:end w:w="100" w:type="dxa"/>
+            </w:tcMar>
+          </w:tcPr>
+          <w:p>
+            <w:pPr>
+              <w:spacing w:after="0" w:line="240" w:lineRule="auto"/>
+              <w:jc w:val="center"/>
+            </w:pPr>
+            <w:r>
+              <w:rPr>
+                <w:rFonts w:ascii="Arial" w:hAnsi="Arial"/>
+                <w:sz w:val="16"/>
+              </w:rPr>
+              <w:t>[−1,324, −1,307]</w:t>
+            </w:r>
+          </w:p>
+        </w:tc>
+      </w:tr>
+      <w:tr>
+        <w:trPr>
+          <w:cantSplit/>
+        </w:trPr>
+        <w:tc>
+          <w:tcPr>
+            <w:tcW w:type="dxa" w:w="1666"/>
+            <w:vAlign w:val="center"/>
+            <w:tcBorders>
+              <w:top w:val="single" w:sz="6" w:space="0" w:color="D9D9D9"/>
+              <w:left w:val="single" w:sz="6" w:space="0" w:color="D9D9D9"/>
+              <w:bottom w:val="single" w:sz="6" w:space="0" w:color="D9D9D9"/>
+              <w:right w:val="single" w:sz="6" w:space="0" w:color="D9D9D9"/>
+              <w:insideH w:val="single" w:sz="6" w:space="0" w:color="D9D9D9"/>
+              <w:insideV w:val="single" w:sz="6" w:space="0" w:color="D9D9D9"/>
+            </w:tcBorders>
+            <w:tcMar>
+              <w:top w:w="90" w:type="dxa"/>
+              <w:start w:w="100" w:type="dxa"/>
+              <w:bottom w:w="90" w:type="dxa"/>
+              <w:end w:w="100" w:type="dxa"/>
+            </w:tcMar>
+            <w:shd w:fill="F2F6FA"/>
+          </w:tcPr>
+          <w:p>
+            <w:pPr>
+              <w:spacing w:after="0" w:line="240" w:lineRule="auto"/>
+              <w:jc w:val="left"/>
+            </w:pPr>
+            <w:r>
+              <w:rPr>
+                <w:rFonts w:ascii="Arial" w:hAnsi="Arial"/>
+                <w:sz w:val="16"/>
+              </w:rPr>
+              <w:t>High popularity and high lift</w:t>
+            </w:r>
+          </w:p>
+        </w:tc>
+        <w:tc>
+          <w:tcPr>
+            <w:tcW w:type="dxa" w:w="1666"/>
+            <w:vAlign w:val="center"/>
+            <w:tcBorders>
+              <w:top w:val="single" w:sz="6" w:space="0" w:color="D9D9D9"/>
+              <w:left w:val="single" w:sz="6" w:space="0" w:color="D9D9D9"/>
+              <w:bottom w:val="single" w:sz="6" w:space="0" w:color="D9D9D9"/>
+              <w:right w:val="single" w:sz="6" w:space="0" w:color="D9D9D9"/>
+              <w:insideH w:val="single" w:sz="6" w:space="0" w:color="D9D9D9"/>
+              <w:insideV w:val="single" w:sz="6" w:space="0" w:color="D9D9D9"/>
+            </w:tcBorders>
+            <w:tcMar>
+              <w:top w:w="90" w:type="dxa"/>
+              <w:start w:w="100" w:type="dxa"/>
+              <w:bottom w:w="90" w:type="dxa"/>
+              <w:end w:w="100" w:type="dxa"/>
+            </w:tcMar>
+            <w:shd w:fill="F2F6FA"/>
+          </w:tcPr>
+          <w:p>
+            <w:pPr>
+              <w:spacing w:after="0" w:line="240" w:lineRule="auto"/>
+              <w:jc w:val="center"/>
+            </w:pPr>
+            <w:r>
+              <w:rPr>
+                <w:rFonts w:ascii="Arial" w:hAnsi="Arial"/>
+                <w:sz w:val="16"/>
+              </w:rPr>
+              <w:t>343</w:t>
+            </w:r>
+          </w:p>
+        </w:tc>
+        <w:tc>
+          <w:tcPr>
+            <w:tcW w:type="dxa" w:w="1666"/>
+            <w:vAlign w:val="center"/>
+            <w:tcBorders>
+              <w:top w:val="single" w:sz="6" w:space="0" w:color="D9D9D9"/>
+              <w:left w:val="single" w:sz="6" w:space="0" w:color="D9D9D9"/>
+              <w:bottom w:val="single" w:sz="6" w:space="0" w:color="D9D9D9"/>
+              <w:right w:val="single" w:sz="6" w:space="0" w:color="D9D9D9"/>
+              <w:insideH w:val="single" w:sz="6" w:space="0" w:color="D9D9D9"/>
+              <w:insideV w:val="single" w:sz="6" w:space="0" w:color="D9D9D9"/>
+            </w:tcBorders>
+            <w:tcMar>
+              <w:top w:w="90" w:type="dxa"/>
+              <w:start w:w="100" w:type="dxa"/>
+              <w:bottom w:w="90" w:type="dxa"/>
+              <w:end w:w="100" w:type="dxa"/>
+            </w:tcMar>
+            <w:shd w:fill="F2F6FA"/>
+          </w:tcPr>
+          <w:p>
+            <w:pPr>
+              <w:spacing w:after="0" w:line="240" w:lineRule="auto"/>
+              <w:jc w:val="center"/>
+            </w:pPr>
+            <w:r>
+              <w:rPr>
+                <w:rFonts w:ascii="Arial" w:hAnsi="Arial"/>
+                <w:sz w:val="16"/>
+              </w:rPr>
+              <w:t>−0.0750</w:t>
+            </w:r>
+          </w:p>
+        </w:tc>
+        <w:tc>
+          <w:tcPr>
+            <w:tcW w:type="dxa" w:w="1666"/>
+            <w:vAlign w:val="center"/>
+            <w:tcBorders>
+              <w:top w:val="single" w:sz="6" w:space="0" w:color="D9D9D9"/>
+              <w:left w:val="single" w:sz="6" w:space="0" w:color="D9D9D9"/>
+              <w:bottom w:val="single" w:sz="6" w:space="0" w:color="D9D9D9"/>
+              <w:right w:val="single" w:sz="6" w:space="0" w:color="D9D9D9"/>
+              <w:insideH w:val="single" w:sz="6" w:space="0" w:color="D9D9D9"/>
+              <w:insideV w:val="single" w:sz="6" w:space="0" w:color="D9D9D9"/>
+            </w:tcBorders>
+            <w:tcMar>
+              <w:top w:w="90" w:type="dxa"/>
+              <w:start w:w="100" w:type="dxa"/>
+              <w:bottom w:w="90" w:type="dxa"/>
+              <w:end w:w="100" w:type="dxa"/>
+            </w:tcMar>
+            <w:shd w:fill="F2F6FA"/>
+          </w:tcPr>
+          <w:p>
+            <w:pPr>
+              <w:spacing w:after="0" w:line="240" w:lineRule="auto"/>
+              <w:jc w:val="center"/>
+            </w:pPr>
+            <w:r>
+              <w:rPr>
+                <w:rFonts w:ascii="Arial" w:hAnsi="Arial"/>
+                <w:sz w:val="16"/>
+              </w:rPr>
+              <w:t>[−0.0753, −0.0748]</w:t>
+            </w:r>
+          </w:p>
+        </w:tc>
+        <w:tc>
+          <w:tcPr>
+            <w:tcW w:type="dxa" w:w="1666"/>
+            <w:vAlign w:val="center"/>
+            <w:tcBorders>
+              <w:top w:val="single" w:sz="6" w:space="0" w:color="D9D9D9"/>
+              <w:left w:val="single" w:sz="6" w:space="0" w:color="D9D9D9"/>
+              <w:bottom w:val="single" w:sz="6" w:space="0" w:color="D9D9D9"/>
+              <w:right w:val="single" w:sz="6" w:space="0" w:color="D9D9D9"/>
+              <w:insideH w:val="single" w:sz="6" w:space="0" w:color="D9D9D9"/>
+              <w:insideV w:val="single" w:sz="6" w:space="0" w:color="D9D9D9"/>
+            </w:tcBorders>
+            <w:tcMar>
+              <w:top w:w="90" w:type="dxa"/>
+              <w:start w:w="100" w:type="dxa"/>
+              <w:bottom w:w="90" w:type="dxa"/>
+              <w:end w:w="100" w:type="dxa"/>
+            </w:tcMar>
+            <w:shd w:fill="F2F6FA"/>
+          </w:tcPr>
+          <w:p>
+            <w:pPr>
+              <w:spacing w:after="0" w:line="240" w:lineRule="auto"/>
+              <w:jc w:val="center"/>
+            </w:pPr>
+            <w:r>
+              <w:rPr>
+                <w:rFonts w:ascii="Arial" w:hAnsi="Arial"/>
+                <w:sz w:val="16"/>
+              </w:rPr>
+              <w:t>+34,918</w:t>
+            </w:r>
+          </w:p>
+        </w:tc>
+        <w:tc>
+          <w:tcPr>
+            <w:tcW w:type="dxa" w:w="1666"/>
+            <w:vAlign w:val="center"/>
+            <w:tcBorders>
+              <w:top w:val="single" w:sz="6" w:space="0" w:color="D9D9D9"/>
+              <w:left w:val="single" w:sz="6" w:space="0" w:color="D9D9D9"/>
+              <w:bottom w:val="single" w:sz="6" w:space="0" w:color="D9D9D9"/>
+              <w:right w:val="single" w:sz="6" w:space="0" w:color="D9D9D9"/>
+              <w:insideH w:val="single" w:sz="6" w:space="0" w:color="D9D9D9"/>
+              <w:insideV w:val="single" w:sz="6" w:space="0" w:color="D9D9D9"/>
+            </w:tcBorders>
+            <w:tcMar>
+              <w:top w:w="90" w:type="dxa"/>
+              <w:start w:w="100" w:type="dxa"/>
+              <w:bottom w:w="90" w:type="dxa"/>
+              <w:end w:w="100" w:type="dxa"/>
+            </w:tcMar>
+            <w:shd w:fill="F2F6FA"/>
+          </w:tcPr>
+          <w:p>
+            <w:pPr>
+              <w:spacing w:after="0" w:line="240" w:lineRule="auto"/>
+              <w:jc w:val="center"/>
+            </w:pPr>
+            <w:r>
+              <w:rPr>
+                <w:rFonts w:ascii="Arial" w:hAnsi="Arial"/>
+                <w:sz w:val="16"/>
+              </w:rPr>
+              <w:t>[+34,798, +35,037]</w:t>
+            </w:r>
+          </w:p>
+        </w:tc>
+      </w:tr>
+    </w:tbl>
+    <w:p>
+      <w:pPr>
+        <w:spacing w:after="40"/>
+      </w:pPr>
+    </w:p>
+    <w:p>
+      <w:r>
+        <w:t>The regime pattern is the central conditional result: the graph effect is large when products are under-served by popularity-only allocation, but near zero in calibrated rolling windows, where PA1 minus C4 item fill ranged from −0.0003 to −0.0032. The pattern is consistent with a reallocation mechanism, not evidence that lift alone creates a causal complementarity effect.</w:t>
       </w:r>
     </w:p>
     <w:p>
@@ -10173,117 +10610,23 @@
       </w:r>
     </w:p>
     <w:p>
-      <w:pPr>
-        <w:jc w:val="center"/>
-      </w:pPr>
       <w:r>
-        <w:drawing>
-          <wp:inline xmlns:a="http://schemas.openxmlformats.org/drawingml/2006/main" xmlns:pic="http://schemas.openxmlformats.org/drawingml/2006/picture">
-            <wp:extent cx="6126480" cy="3880104"/>
-            <wp:docPr id="6" name="Picture 6" descr="Graph signal by popularity and lift stratum" title="Graph signal by popularity stratum"/>
-            <wp:cNvGraphicFramePr>
-              <a:graphicFrameLocks noChangeAspect="1"/>
-            </wp:cNvGraphicFramePr>
-            <a:graphic>
-              <a:graphicData uri="http://schemas.openxmlformats.org/drawingml/2006/picture">
-                <pic:pic>
-                  <pic:nvPicPr>
-                    <pic:cNvPr id="0" name="mechanism_strata.png"/>
-                    <pic:cNvPicPr/>
-                  </pic:nvPicPr>
-                  <pic:blipFill>
-                    <a:blip r:embed="rId15"/>
-                    <a:stretch>
-                      <a:fillRect/>
-                    </a:stretch>
-                  </pic:blipFill>
-                  <pic:spPr>
-                    <a:xfrm>
-                      <a:off x="0" y="0"/>
-                      <a:ext cx="6126480" cy="3880104"/>
-                    </a:xfrm>
-                    <a:prstGeom prst="rect"/>
-                  </pic:spPr>
-                </pic:pic>
-              </a:graphicData>
-            </a:graphic>
-          </wp:inline>
-        </w:drawing>
-      </w:r>
-    </w:p>
-    <w:p>
-      <w:pPr>
-        <w:jc w:val="center"/>
-      </w:pPr>
-      <w:r>
-        <w:rPr>
-          <w:rFonts w:ascii="Arial" w:hAnsi="Arial"/>
-          <w:i/>
-          <w:sz w:val="16"/>
-        </w:rPr>
-        <w:t>Figure 6. PA1 minus C4 item-fill differences in low-popularity/high-lift and high-popularity/high-lift product strata; whiskers are 95% replication intervals.</w:t>
-      </w:r>
-    </w:p>
-    <w:p>
-      <w:pPr>
-        <w:jc w:val="center"/>
-      </w:pPr>
-      <w:r>
-        <w:drawing>
-          <wp:inline xmlns:a="http://schemas.openxmlformats.org/drawingml/2006/main" xmlns:pic="http://schemas.openxmlformats.org/drawingml/2006/picture">
-            <wp:extent cx="6126480" cy="3880104"/>
-            <wp:docPr id="7" name="Picture 7" descr="Replication of the item-fill contrast across basket datasets" title="Replication across basket datasets"/>
-            <wp:cNvGraphicFramePr>
-              <a:graphicFrameLocks noChangeAspect="1"/>
-            </wp:cNvGraphicFramePr>
-            <a:graphic>
-              <a:graphicData uri="http://schemas.openxmlformats.org/drawingml/2006/picture">
-                <pic:pic>
-                  <pic:nvPicPr>
-                    <pic:cNvPr id="0" name="dataset_replication.png"/>
-                    <pic:cNvPicPr/>
-                  </pic:nvPicPr>
-                  <pic:blipFill>
-                    <a:blip r:embed="rId16"/>
-                    <a:stretch>
-                      <a:fillRect/>
-                    </a:stretch>
-                  </pic:blipFill>
-                  <pic:spPr>
-                    <a:xfrm>
-                      <a:off x="0" y="0"/>
-                      <a:ext cx="6126480" cy="3880104"/>
-                    </a:xfrm>
-                    <a:prstGeom prst="rect"/>
-                  </pic:spPr>
-                </pic:pic>
-              </a:graphicData>
-            </a:graphic>
-          </wp:inline>
-        </w:drawing>
-      </w:r>
-    </w:p>
-    <w:p>
-      <w:pPr>
-        <w:jc w:val="center"/>
-      </w:pPr>
-      <w:r>
-        <w:rPr>
-          <w:rFonts w:ascii="Arial" w:hAnsi="Arial"/>
-          <w:i/>
-          <w:sz w:val="16"/>
-        </w:rPr>
-        <w:t>Figure 7. PA1 minus C4 item-fill differences in UCI Online Retail II and the tightened dunnhumby Complete Journey replay; the external replay is a stress check, not a causal validation.</w:t>
+        <w:t>Figure 6. PA1 minus C4 item-fill differences in low-popularity/high-lift and high-popularity/high-lift product strata; whiskers are 95% replication intervals. Plot unavailable; see `results/mechanism_strata.png` in the research package.</w:t>
       </w:r>
     </w:p>
     <w:p>
       <w:r>
-        <w:t>Figure 6 shows the conditional mechanism result: PA1 improves item fill in the low-popularity/high-lift stratum but loses in the high-popularity/high-lift stratum. Figure 7 shows that the negative item-fill direction replicates in the tightened dunnhumby replay, while the complete-basket proxy remains non-discriminating.</w:t>
+        <w:t>Figure 7. PA1 minus C4 item-fill differences in the primary UCI analysis and the tightened dunnhumby pipeline stress check; the external replay is not treated as replication or causal validation. Plot unavailable; see `results/external_pipeline_check.png` in the research package.</w:t>
       </w:r>
     </w:p>
     <w:p>
       <w:r>
-        <w:t>All scenario-level rows, matched comparisons, configuration hashes, figures, rolling-window outputs, external source profile, and phase reports are retained in research_data_package/results/.</w:t>
+        <w:t>Figure 6 shows the conditional mechanism result: PA1 improves item fill in the low-popularity/high-lift stratum but loses in the high-popularity/high-lift stratum. Figure 7 is an external pipeline stress check: the tightened dunnhumby replay has an extreme negative item-fill contrast, while its complete-basket proxy remains non-discriminating. It is not treated as a replication.</w:t>
+      </w:r>
+    </w:p>
+    <w:p>
+      <w:r>
+        <w:t>The complete numerical audit, configuration, and legacy tables are supplied as supplementary material; the manuscript reports the primary estimands and the exploratory stratum table directly.</w:t>
       </w:r>
     </w:p>
     <w:p>
@@ -10309,7 +10652,7 @@
     </w:p>
     <w:p>
       <w:r>
-        <w:t>The all-scenario Phase 3 replay shows a conditional service gain against the inventory-matched independent control, but not a graph-specific gain over popularity. PA1−C1 is positive for item and basket fill, while PA1−C4 is negative for both and more costly in every scenario. The tighter 1% match, 120 replications, 1,000-resample bootstrap, and three rolling windows strengthen the uncertainty statement, but the extra-buffer explanation is not fully ruled out because PA1 remains slightly higher in inventory than its matched control and C4 is not a causal experiment. Positive service differences should not be read as evidence that making one product available changes demand for its partner.</w:t>
+        <w:t>The all-scenario primary replay shows a conditional service gain against the inventory-matched independent control, but not a graph-specific gain over popularity. PA1−C1 is positive for item and basket fill, while PA1−C4 is negative for both and more costly across the factorial settings. The tighter 1% match, 120 replications, 1,000-resample bootstrap, and three rolling windows strengthen the uncertainty statement, but the extra-buffer explanation is not fully ruled out because PA1 remains slightly higher in inventory than its matched control and C4 is not a causal experiment. Positive service differences should not be read as evidence that making one product available changes demand for its partner.</w:t>
       </w:r>
     </w:p>
     <w:p>
@@ -10336,6 +10679,54 @@
     <w:p>
       <w:r>
         <w:t>The design implication is compact: a basket graph should be credited only after comparison with a tightly matched independent control, a popularity-only control, graph-topology placebos, replication-level intervals, and rolling windows. Completed transactions support a basket-service proxy, but cannot identify stockout substitution or causal complementarity.</w:t>
+      </w:r>
+    </w:p>
+    <w:p>
+      <w:pPr>
+        <w:pStyle w:val="Heading2"/>
+      </w:pPr>
+      <w:r>
+        <w:t>6.4 Why popularity wins and when pairs can matter</w:t>
+      </w:r>
+    </w:p>
+    <w:p>
+      <w:r>
+        <w:t>The empirical result is easier to interpret with a stylised basket model. Consider a basket made of one high-volume hub item H and several lower-volume companion items L1 through Lm. Let qH and qj denote the probabilities that the corresponding item is available when the basket arrives. Under a simple conditional-independence approximation, the probability of completing the basket is</w:t>
+      </w:r>
+    </w:p>
+    <w:p>
+      <w:r>
+        <w:t>P(complete) = qH multiplied by q1 multiplied by q2 and so on through qm.</w:t>
+      </w:r>
+    </w:p>
+    <w:p>
+      <w:r>
+        <w:t>The marginal value of improving availability for item i is therefore the product of the availability probabilities of the other items. An item that appears in many baskets has this marginal effect repeated across many orders. If H is present in a large share of baskets, a shortage of H can block many baskets at once, even when each companion is individually less popular. A popularity-only policy naturally allocates protection to H because its forecast volume and residual exposure are high. In a star-shaped basket network, this can dominate a graph policy that spreads a fixed buffer over many leaves.</w:t>
+      </w:r>
+    </w:p>
+    <w:p>
+      <w:r>
+        <w:t>The same model shows why a pair signal can sometimes add value. Suppose a low-volume leaf L is purchased almost exclusively with H, so the conditional probability of L given H is high. If L has low marginal volume, a popularity rule may assign it too little protection. A targeted graph buffer can then raise qL with little displacement of H, improving the probability that the H-L basket is complete. The gain is largest when three conditions coincide: the pair is conditionally concentrated, the leaf is not already protected by its marginal popularity, and the graph edge is stable enough that the relationship persists in the evaluation period. The gain is small when both endpoints are already popular, when the edge is supported by few baskets, or when the graph buffer takes stock away from a hub that serves many other baskets.</w:t>
+      </w:r>
+    </w:p>
+    <w:p>
+      <w:r>
+        <w:t>Lift is useful for screening this condition but is not sufficient by itself. Lift divides conditional co-purchase by the marginal frequency of the second item. It can be high because the denominator is small, because of assortment restrictions, or because of a temporary promotion. Pair count and edge stability are therefore needed alongside lift. A high-lift pair with very low support may be a noisy rule; a high-lift pair whose endpoints are both high-volume may add no information beyond popularity. The exploratory analysis used both a high-lift threshold and a minimum pair-count threshold, then separated low-popularity from high-popularity endpoints.</w:t>
+      </w:r>
+    </w:p>
+    <w:p>
+      <w:r>
+        <w:t>The results fit this mechanism. In the low-popularity/high-lift regime, defined using training-only quartiles and edge thresholds, the graph policy improved item fill relative to C4 by 0.1014, with a 95% replication interval from 0.1008 to 0.1021. Unmet units fell by about 1,315. In the high-popularity/high-lift regime, the same graph policy reduced item fill by 0.0750 and increased unmet units by about 34,918. Thus, high lift did not rescue the graph when popularity already identified the products that mattered most. The conditional result is consistent with pair information helping mainly when it supplies information about under-served products that popularity misses.</w:t>
+      </w:r>
+    </w:p>
+    <w:p>
+      <w:r>
+        <w:t>The rolling windows provide a complementary calibration check. In the three chronological windows, the PA1 minus C4 item-fill differences were approximately −0.0003, −0.0031, and −0.0032. These are near-zero effects compared with the exploratory low-popularity/high-lift contrast. The pattern suggests a regime distinction: when the system is broadly calibrated and the policy targets are already adequate, the graph has little incremental service value; when a subset of products is under-served relative to the basket relationships that connect them to demand, the graph can change item-level allocation more visibly. This is a hypothesis about the replay mechanism, not a causal claim about customer behaviour.</w:t>
+      </w:r>
+    </w:p>
+    <w:p>
+      <w:r>
+        <w:t>The mechanism also clarifies the economic boundary. The exploratory masks were applied to the outcome metrics after the same full-system policies were replayed, so the reported stratum differences are service diagnostics. They do not prove that a manager can obtain the 10-point service improvement without paying for the additional buffer or without harming other products. The all-scenario primary analysis remains the correct economic result: PA1 costs more and performs worse than popularity-only C4 at the tested matched scale. A practical decision rule follows: use popularity-only control by default; consider a graph buffer only after a training-only audit finds a stable low-popularity/high-lift regime, and require a matched-inventory pilot to show a positive service interval without an unacceptable cost increase.</w:t>
       </w:r>
     </w:p>
     <w:p>
@@ -10659,7 +11050,7 @@
     </w:p>
     <w:p>
       <w:r>
-        <w:t>The reproducible code and data package is publicly archived at GitHub (https://github.com/TalhaZabir/basket-aware-inventory-research). The public data records are UCI Online Retail II (https://doi.org/10.24432/C5CG6D), the separate M5 data release on Zenodo (https://doi.org/10.5281/zenodo.10203108), and the documented dunnhumby Complete Journey release (https://github.com/bltap-plmarket/dunnhumby-complete-journey/releases/tag/v1.0-data), whose source page is dunnhumby Source Files (https://www.dunnhumby.com/source-files/). The repository has no DOI yet. UCI identifies Online Retail II as licensed under the Creative Commons Attribution 4.0 International license (CC BY 4.0). Redistribution or adaptation of that source requires appropriate attribution to Daqing Chen and the UCI Machine Learning Repository. The dunnhumby mirror states DbCL-1.0; its terms should be reviewed before redistribution. The M5 files remain subject to their own source terms. The search and metadata-verification boundary is recorded in results/gate5_literature_audit.md.</w:t>
+        <w:t>The reproducible code and data package is publicly archived at GitHub (https://github.com/TalhaZabir/basket-aware-inventory-research). The public data records are UCI Online Retail II, the separate M5 release, and the documented dunnhumby Complete Journey release. The repository release and DOI status are recorded in the supplementary materials. UCI identifies Online Retail II as licensed under CC BY 4.0; redistribution or adaptation requires attribution to Daqing Chen and UCI. The dunnhumby mirror states DbCL-1.0 and its terms should be reviewed before redistribution. The targeted-search and metadata boundary is documented in the supplementary audit.</w:t>
       </w:r>
     </w:p>
     <w:tbl>
@@ -12297,7 +12688,7 @@
                 <w:rFonts w:ascii="Arial" w:hAnsi="Arial"/>
                 <w:sz w:val="16"/>
               </w:rPr>
-              <w:t>P0 outputs</w:t>
+              <w:t>Robustness analyses</w:t>
             </w:r>
           </w:p>
         </w:tc>
@@ -12330,7 +12721,7 @@
                 <w:rFonts w:ascii="Arial" w:hAnsi="Arial"/>
                 <w:sz w:val="16"/>
               </w:rPr>
-              <w:t>results/frontier_results.csv, results/frontier_plot.svg, results/frontier_plot.png, results/cost_vs_penalty.svg, results/cost_vs_penalty.png, results/basket_size_distribution.svg, results/basket_size_distribution.png, results/graph_summary.svg, results/graph_summary.png, results/placebo_results.csv, results/placebo_comparison_summary.csv, results/inventory_matched_baseline.csv, results/break_even_analysis.csv, results/sensitivity_results.csv</w:t>
+              <w:t>Reproducible analysis scripts and supplementary tables</w:t>
             </w:r>
           </w:p>
         </w:tc>
@@ -12363,7 +12754,7 @@
                 <w:rFonts w:ascii="Arial" w:hAnsi="Arial"/>
                 <w:sz w:val="16"/>
               </w:rPr>
-              <w:t>Verified analysis outputs; inventory, lead-time, costs, and service outcomes are simulated</w:t>
+              <w:t>Inventory-matched baseline, service-inventory frontier, placebo, break-even ratios, sensitivity, bootstrap intervals, extended alpha calibration, rolling-origin replay, and forecast test diagnostics</w:t>
             </w:r>
           </w:p>
         </w:tc>
@@ -12402,7 +12793,7 @@
                 <w:rFonts w:ascii="Arial" w:hAnsi="Arial"/>
                 <w:sz w:val="16"/>
               </w:rPr>
-              <w:t>P1 robustness analyses</w:t>
+              <w:t>Supplementary outputs</w:t>
             </w:r>
           </w:p>
         </w:tc>
@@ -12436,7 +12827,7 @@
                 <w:rFonts w:ascii="Arial" w:hAnsi="Arial"/>
                 <w:sz w:val="16"/>
               </w:rPr>
-              <w:t>scripts/run_p1_analyses.py</w:t>
+              <w:t>Supplementary Tables S1–S8 and archived analysis files</w:t>
             </w:r>
           </w:p>
         </w:tc>
@@ -12470,7 +12861,7 @@
                 <w:rFonts w:ascii="Arial" w:hAnsi="Arial"/>
                 <w:sz w:val="16"/>
               </w:rPr>
-              <w:t>Explicit missing contrasts, test-week bootstrap intervals, extended alpha calibration, and rolling-origin replay</w:t>
+              <w:t>Verified analysis outputs; inventory, lead-time, costs, and service outcomes are simulated</w:t>
             </w:r>
           </w:p>
         </w:tc>
@@ -12508,7 +12899,7 @@
                 <w:rFonts w:ascii="Arial" w:hAnsi="Arial"/>
                 <w:sz w:val="16"/>
               </w:rPr>
-              <w:t>P1 outputs</w:t>
+              <w:t>Figure generation</w:t>
             </w:r>
           </w:p>
         </w:tc>
@@ -12541,7 +12932,7 @@
                 <w:rFonts w:ascii="Arial" w:hAnsi="Arial"/>
                 <w:sz w:val="16"/>
               </w:rPr>
-              <w:t>results/bootstrap_test_week_results.csv, results/bootstrap_test_week_summary.csv, results/bootstrap_test_week_pooled_summary.csv, results/alpha_extended_validation_calibration.csv, results/rolling_origin_results.csv, results/rolling_origin_summary.csv, results/forecast_test_summary.csv, results/p1_analysis_report.md</w:t>
+              <w:t>scripts/make_results_figures.py</w:t>
             </w:r>
           </w:p>
         </w:tc>
@@ -12574,7 +12965,7 @@
                 <w:rFonts w:ascii="Arial" w:hAnsi="Arial"/>
                 <w:sz w:val="16"/>
               </w:rPr>
-              <w:t>Sampling and window-robustness outputs; all inventory outcomes remain simulated</w:t>
+              <w:t>Recreates the cost/penalty, basket-size, and graph-summary figures from package outputs</w:t>
             </w:r>
           </w:p>
         </w:tc>
@@ -12613,7 +13004,7 @@
                 <w:rFonts w:ascii="Arial" w:hAnsi="Arial"/>
                 <w:sz w:val="16"/>
               </w:rPr>
-              <w:t>Figure generation</w:t>
+              <w:t>Primary replay</w:t>
             </w:r>
           </w:p>
         </w:tc>
@@ -12647,7 +13038,7 @@
                 <w:rFonts w:ascii="Arial" w:hAnsi="Arial"/>
                 <w:sz w:val="16"/>
               </w:rPr>
-              <w:t>scripts/make_results_figures.py</w:t>
+              <w:t>Paired replay and summary scripts</w:t>
             </w:r>
           </w:p>
         </w:tc>
@@ -12681,7 +13072,7 @@
                 <w:rFonts w:ascii="Arial" w:hAnsi="Arial"/>
                 <w:sz w:val="16"/>
               </w:rPr>
-              <w:t>Recreates the cost/penalty, basket-size, and graph-summary figures from package outputs</w:t>
+              <w:t>Alpha 1.5, 1% match, 120 stochastic replications, 1,000 bootstrap resamples</w:t>
             </w:r>
           </w:p>
         </w:tc>
@@ -12719,7 +13110,7 @@
                 <w:rFonts w:ascii="Arial" w:hAnsi="Arial"/>
                 <w:sz w:val="16"/>
               </w:rPr>
-              <w:t>Primary Phase 3 replay</w:t>
+              <w:t>Rolling and external checks</w:t>
             </w:r>
           </w:p>
         </w:tc>
@@ -12752,7 +13143,7 @@
                 <w:rFonts w:ascii="Arial" w:hAnsi="Arial"/>
                 <w:sz w:val="16"/>
               </w:rPr>
-              <w:t>scripts/run_phase3_test.py, scripts/summarize_phase3_primary.py</w:t>
+              <w:t>scripts/run_three_rolling_windows.py, scripts/prepare_and_run_dunnhumby.py</w:t>
             </w:r>
           </w:p>
         </w:tc>
@@ -12774,113 +13165,6 @@
               <w:bottom w:w="90" w:type="dxa"/>
               <w:end w:w="100" w:type="dxa"/>
             </w:tcMar>
-          </w:tcPr>
-          <w:p>
-            <w:pPr>
-              <w:spacing w:after="0" w:line="240" w:lineRule="auto"/>
-              <w:jc w:val="left"/>
-            </w:pPr>
-            <w:r>
-              <w:rPr>
-                <w:rFonts w:ascii="Arial" w:hAnsi="Arial"/>
-                <w:sz w:val="16"/>
-              </w:rPr>
-              <w:t>Alpha 1.5, 1% match, 120 stochastic replications, 1,000 bootstrap resamples</w:t>
-            </w:r>
-          </w:p>
-        </w:tc>
-      </w:tr>
-      <w:tr>
-        <w:trPr>
-          <w:cantSplit/>
-        </w:trPr>
-        <w:tc>
-          <w:tcPr>
-            <w:tcW w:type="dxa" w:w="3331"/>
-            <w:vAlign w:val="center"/>
-            <w:tcBorders>
-              <w:top w:val="single" w:sz="6" w:space="0" w:color="D9D9D9"/>
-              <w:left w:val="single" w:sz="6" w:space="0" w:color="D9D9D9"/>
-              <w:bottom w:val="single" w:sz="6" w:space="0" w:color="D9D9D9"/>
-              <w:right w:val="single" w:sz="6" w:space="0" w:color="D9D9D9"/>
-              <w:insideH w:val="single" w:sz="6" w:space="0" w:color="D9D9D9"/>
-              <w:insideV w:val="single" w:sz="6" w:space="0" w:color="D9D9D9"/>
-            </w:tcBorders>
-            <w:tcMar>
-              <w:top w:w="90" w:type="dxa"/>
-              <w:start w:w="100" w:type="dxa"/>
-              <w:bottom w:w="90" w:type="dxa"/>
-              <w:end w:w="100" w:type="dxa"/>
-            </w:tcMar>
-            <w:shd w:fill="F2F6FA"/>
-          </w:tcPr>
-          <w:p>
-            <w:pPr>
-              <w:spacing w:after="0" w:line="240" w:lineRule="auto"/>
-              <w:jc w:val="left"/>
-            </w:pPr>
-            <w:r>
-              <w:rPr>
-                <w:rFonts w:ascii="Arial" w:hAnsi="Arial"/>
-                <w:sz w:val="16"/>
-              </w:rPr>
-              <w:t>Rolling and external checks</w:t>
-            </w:r>
-          </w:p>
-        </w:tc>
-        <w:tc>
-          <w:tcPr>
-            <w:tcW w:type="dxa" w:w="3331"/>
-            <w:vAlign w:val="center"/>
-            <w:tcBorders>
-              <w:top w:val="single" w:sz="6" w:space="0" w:color="D9D9D9"/>
-              <w:left w:val="single" w:sz="6" w:space="0" w:color="D9D9D9"/>
-              <w:bottom w:val="single" w:sz="6" w:space="0" w:color="D9D9D9"/>
-              <w:right w:val="single" w:sz="6" w:space="0" w:color="D9D9D9"/>
-              <w:insideH w:val="single" w:sz="6" w:space="0" w:color="D9D9D9"/>
-              <w:insideV w:val="single" w:sz="6" w:space="0" w:color="D9D9D9"/>
-            </w:tcBorders>
-            <w:tcMar>
-              <w:top w:w="90" w:type="dxa"/>
-              <w:start w:w="100" w:type="dxa"/>
-              <w:bottom w:w="90" w:type="dxa"/>
-              <w:end w:w="100" w:type="dxa"/>
-            </w:tcMar>
-            <w:shd w:fill="F2F6FA"/>
-          </w:tcPr>
-          <w:p>
-            <w:pPr>
-              <w:spacing w:after="0" w:line="240" w:lineRule="auto"/>
-              <w:jc w:val="left"/>
-            </w:pPr>
-            <w:r>
-              <w:rPr>
-                <w:rFonts w:ascii="Arial" w:hAnsi="Arial"/>
-                <w:sz w:val="16"/>
-              </w:rPr>
-              <w:t>scripts/run_three_rolling_windows.py, scripts/prepare_and_run_dunnhumby.py</w:t>
-            </w:r>
-          </w:p>
-        </w:tc>
-        <w:tc>
-          <w:tcPr>
-            <w:tcW w:type="dxa" w:w="3331"/>
-            <w:vAlign w:val="center"/>
-            <w:tcBorders>
-              <w:top w:val="single" w:sz="6" w:space="0" w:color="D9D9D9"/>
-              <w:left w:val="single" w:sz="6" w:space="0" w:color="D9D9D9"/>
-              <w:bottom w:val="single" w:sz="6" w:space="0" w:color="D9D9D9"/>
-              <w:right w:val="single" w:sz="6" w:space="0" w:color="D9D9D9"/>
-              <w:insideH w:val="single" w:sz="6" w:space="0" w:color="D9D9D9"/>
-              <w:insideV w:val="single" w:sz="6" w:space="0" w:color="D9D9D9"/>
-            </w:tcBorders>
-            <w:tcMar>
-              <w:top w:w="90" w:type="dxa"/>
-              <w:start w:w="100" w:type="dxa"/>
-              <w:bottom w:w="90" w:type="dxa"/>
-              <w:end w:w="100" w:type="dxa"/>
-            </w:tcMar>
-            <w:shd w:fill="F2F6FA"/>
           </w:tcPr>
           <w:p>
             <w:pPr>
@@ -14000,7 +14284,7 @@
     </w:p>
     <w:p>
       <w:r>
-        <w:t>This appendix records the configuration that was frozen for the executed analyses. It is an audit record of completed runs, not a pre-run checklist. The machine-readable originals are results/experiment_config.json, results/phase3_alpha_validation_config.json, results/phase3_test_config.json, results/phase3_primary_diagnostics.json, data/processed/dunnhumby/dunnhumby_source_profile.json, and data/synthetic/inventory_scenarios.csv in the research package. Earlier Phase 1/2 configurations remain as historical audit records.</w:t>
+        <w:t>This appendix records the configuration that was frozen for the executed analyses. It is an audit record of completed runs, not a pre-run checklist. The machine-readable configuration and scenario files are supplied in the supplementary archive; earlier exploratory configurations are retained there as historical audit records.</w:t>
       </w:r>
     </w:p>
     <w:p>
@@ -14741,7 +15025,7 @@
                 <w:rFonts w:ascii="Arial" w:hAnsi="Arial"/>
                 <w:sz w:val="16"/>
               </w:rPr>
-              <w:t>1.5 in the Phase 3 primary analysis</w:t>
+              <w:t>1.5 in the primary analysis</w:t>
             </w:r>
           </w:p>
         </w:tc>
@@ -14958,7 +15242,7 @@
                 <w:rFonts w:ascii="Arial" w:hAnsi="Arial"/>
                 <w:sz w:val="16"/>
               </w:rPr>
-              <w:t>Phase 2 PA1 uses top-five supported directed partners; PA2 uses training-basket coverage; PA3 thresholds PA1 scores</w:t>
+              <w:t>PA1 uses top-five supported directed partners; PA2 uses training-basket coverage; PA3 thresholds PA1 scores</w:t>
             </w:r>
           </w:p>
         </w:tc>
@@ -15534,7 +15818,7 @@
                 <w:rFonts w:ascii="Arial" w:hAnsi="Arial"/>
                 <w:sz w:val="16"/>
               </w:rPr>
-              <w:t>Phase 3 all-scenario replay: 120 / 120; earlier Phase 2 grid: 30 / 1</w:t>
+              <w:t>Primary all-scenario replay: 120 / 120; earlier grid: 30 / 1</w:t>
             </w:r>
           </w:p>
         </w:tc>
@@ -15979,7 +16263,7 @@
     </w:p>
     <w:p>
       <w:r>
-        <w:t>The Phase 3 primary test configuration hash is 70cc7bc98246449e106eb25e81456a03d6364806cdd68953bd9f72523d26d065, under parent alpha-validation hash ac87a2e332c1c82cff38e93a053770ebe97b744c7af8931e9f3269582ef05866. It produced 4,320 policy rows, 1,440 rows for each headline contrast, 120 replications in each of twelve scenarios, and 1,000 bootstrap draws per contrast. No matching comparison exceeded the 1% band. The rolling-origin file contains three windows, and the dunnhumby source profile records the external checksum and license statement.</w:t>
+        <w:t>The primary analysis produced 4,320 policy rows, 1,440 rows for each headline contrast, 120 replications in each of twelve factorial cells, and 1,000 bootstrap draws per contrast. No matching comparison exceeded the 1% band. The three rolling windows and dunnhumby source profile are included in the supplementary archive.</w:t>
       </w:r>
     </w:p>
     <w:p>
@@ -18396,7 +18680,7 @@
     </w:p>
     <w:p>
       <w:r>
-        <w:t>Phase status is recorded in results/final_phase_status.md. Phase 3 precision targets and Phase 4 external replay are complete as separate simulated analyses. Licensed Scopus/Web of Science screening and automated all-number regeneration remain open; they are not presented as completed.</w:t>
+        <w:t>Evidence status is recorded in the supplementary archive. The precision targets and external pipeline stress check are complete as separate simulated analyses. Licensed Scopus/Web of Science screening and automated all-number regeneration remain open; they are not presented as completed.</w:t>
       </w:r>
     </w:p>
     <w:p>
@@ -18409,7 +18693,7 @@
     </w:p>
     <w:p>
       <w:r>
-        <w:t>The pooled table in Section 5 is a descriptive summary only. Because the scenarios use different holding and shortage-cost pairs, the following appendix preserves the legacy four-policy scenario-level comparisons. These rows are not substitutes for equivalent PA1-versus-C4 Phase 3 tests in all twelve scenarios. Costs are normalized simulation units; service values are means over the available replications.</w:t>
+        <w:t>The pooled table in Section 5 is a descriptive summary only. Because the scenarios use different holding and shortage-cost pairs, the following appendix preserves the legacy four-policy scenario-level comparisons. These rows are not substitutes for the all-cell PA1-versus-C4 tests reported in the primary analysis. Costs are normalized simulation units; service values are means over the available replications.</w:t>
       </w:r>
     </w:p>
     <w:tbl>

</xml_diff>